<commit_message>
Buch 4: Manuskript ausgebaut, DOCX neu, Klappentext + KDP-Keywords
- Alle 14 Kapitel auf Bestseller-Qualität überarbeitet und ausgebaut (~11.700 Wörter)
- Abschlussbrief und Backmatter ergänzt
- KDP-DOCX neu generiert (5.5"×8.5", Georgia 11pt, TOC, Titelblatt)
- Klappentext, 7 Keywords, 2 Kategorien, HTML-Beschreibung, Coverhinweise
</commit_message>
<xml_diff>
--- a/outputs/buch-schuldgefuehle/das-schlechte-gewissen-KDP.docx
+++ b/outputs/buch-schuldgefuehle/das-schlechte-gewissen-KDP.docx
@@ -434,7 +434,7 @@
           <w:rFonts w:ascii="Georgia" w:hAnsi="Georgia"/>
           <w:sz w:val="22"/>
         </w:rPr>
-        <w:t>Ich arbeite seit vielen Jahren als Therapeutin. Ich habe Hunderte von Frauen begleitet, an Punkten in ihrem Leben, wo etwas nicht mehr stimmte. Wo der Körper Nein sagte. Wo die Erschöpfung so tief sass, dass Schlafen nicht mehr half.</w:t>
+        <w:t>Ich arbeite seit vielen Jahren als Therapeutin. Ich habe Hunderte von Frauen begleitet, an Punkten in ihrem Leben, wo etwas nicht mehr stimmte. Wo der Körper Nein sagte. Wo die Erschöpfung so tief sass, dass Schlafen nicht mehr half. Wo die Freundlichkeit so weit aussen war, dass der eigene Kern kaum noch zu finden war.</w:t>
       </w:r>
     </w:p>
     <w:p>
@@ -482,19 +482,19 @@
           <w:rFonts w:ascii="Georgia" w:hAnsi="Georgia"/>
           <w:sz w:val="22"/>
         </w:rPr>
-        <w:t>Das schlechte Gewissen sass bei diesen Frauen wie ein stiller Dauergast, der nie gefragt hatte ob er willkommen ist, der aber trotzdem immer am Tisch sitzt.</w:t>
-      </w:r>
-    </w:p>
-    <w:p>
-      <w:pPr>
-        <w:spacing w:after="160" w:line="320" w:lineRule="exact"/>
-      </w:pPr>
-      <w:r>
-        <w:rPr>
-          <w:rFonts w:ascii="Georgia" w:hAnsi="Georgia"/>
-          <w:sz w:val="22"/>
-        </w:rPr>
-        <w:t>Was mich über die Jahre immer wieder bewegt hat: Diese Frauen waren keine schwachen Menschen. Im Gegenteil. Sie waren stark, zuverlässig, belastbar. Sie organisierten, trugen, hielten zusammen. Aussen war alles in Ordnung. Innen war ein Dauerlärm, den sie kaum noch wahrnahmen, weil er so selbstverständlich geworden war.</w:t>
+        <w:t>Das schlechte Gewissen sass bei diesen Frauen wie ein stiller Dauergast, der nie gefragt hatte ob er willkommen ist, der aber trotzdem immer am Tisch sitzt, immer einen Platz belegt, immer etwas kostet.</w:t>
+      </w:r>
+    </w:p>
+    <w:p>
+      <w:pPr>
+        <w:spacing w:after="160" w:line="320" w:lineRule="exact"/>
+      </w:pPr>
+      <w:r>
+        <w:rPr>
+          <w:rFonts w:ascii="Georgia" w:hAnsi="Georgia"/>
+          <w:sz w:val="22"/>
+        </w:rPr>
+        <w:t>Was mich über die Jahre immer wieder bewegt hat: Diese Frauen waren keine schwachen Menschen. Im Gegenteil. Sie waren stark, zuverlässig, belastbar. Sie organisierten, trugen, hielten zusammen. Aussen war alles in Ordnung. Innen war ein Dauerlärm, den sie kaum noch wahrnahmen, weil er so selbstverständlich geworden war. Es ist wie das Rauschen des Kühlschranks. Man hört es erst, wenn er aufhört.</w:t>
       </w:r>
     </w:p>
     <w:p>
@@ -542,19 +542,43 @@
           <w:rFonts w:ascii="Georgia" w:hAnsi="Georgia"/>
           <w:sz w:val="22"/>
         </w:rPr>
-        <w:t>Es gibt dabei keine Schnellösungen. Wer dir sagt, dass drei Übungen und eine neue Morgenroutine ein lebenslang gelerntes Muster verändern, lügt dich an. Was ich dir anbiete, ist Verstehen. Und Verstehen ist der Anfang von allem.</w:t>
-      </w:r>
-    </w:p>
-    <w:p>
-      <w:pPr>
-        <w:spacing w:after="160" w:line="320" w:lineRule="exact"/>
-      </w:pPr>
-      <w:r>
-        <w:rPr>
-          <w:rFonts w:ascii="Georgia" w:hAnsi="Georgia"/>
-          <w:sz w:val="22"/>
-        </w:rPr>
-        <w:t>Du kannst dieses Buch von vorne nach hinten lesen. Du kannst auch dort einsteigen, wo dich etwas besonders anspricht. Die Fragen am Ende jedes Kapitels sind keine Hausaufgaben — aber sie bringen oft das ans Licht, was im Kopf verschwommen bleibt. Schreib die Antworten irgendwo auf, wenn du kannst. Das Schreiben macht aus Gefühlen Worte, und aus Worten wird manchmal Klarheit.</w:t>
+        <w:t>Es gibt dabei keine Schnellösungen. Wer dir sagt, dass drei Atemübungen und eine neue Morgenroutine ein lebenslang gelerntes Muster verändern, lügt dich an. Was ich dir anbiete, ist Verstehen. Und Verstehen ist der Anfang von allem. Nicht das Ende — aber das, ohne das nichts beginnt.</w:t>
+      </w:r>
+    </w:p>
+    <w:p>
+      <w:pPr>
+        <w:spacing w:after="160" w:line="320" w:lineRule="exact"/>
+      </w:pPr>
+      <w:r>
+        <w:rPr>
+          <w:rFonts w:ascii="Georgia" w:hAnsi="Georgia"/>
+          <w:sz w:val="22"/>
+        </w:rPr>
+        <w:t>Ich schreibe nicht aus einer Position der Überlegenheit. Ich kenne das Schuldgefühl aus eigener Erfahrung. Ich kenne den Moment, in dem man sich erklärt, bevor man überhaupt gefragt wurde. Den Reflex, die eigenen Bedürfnisse zu verkleinern, damit sie niemanden stören. Das leise Unbehagen, wenn man etwas für sich tut, als müsste man dafür irgendwo Rechenschaft ablegen.</w:t>
+      </w:r>
+    </w:p>
+    <w:p>
+      <w:pPr>
+        <w:spacing w:after="160" w:line="320" w:lineRule="exact"/>
+      </w:pPr>
+      <w:r>
+        <w:rPr>
+          <w:rFonts w:ascii="Georgia" w:hAnsi="Georgia"/>
+          <w:sz w:val="22"/>
+        </w:rPr>
+        <w:t>Das macht mich nicht weniger qualifiziert, dir davon zu erzählen. Es macht mich vielleicht zu jemandem, der den Weg kennt. Nicht von oben herab, sondern von innen heraus.</w:t>
+      </w:r>
+    </w:p>
+    <w:p>
+      <w:pPr>
+        <w:spacing w:after="160" w:line="320" w:lineRule="exact"/>
+      </w:pPr>
+      <w:r>
+        <w:rPr>
+          <w:rFonts w:ascii="Georgia" w:hAnsi="Georgia"/>
+          <w:sz w:val="22"/>
+        </w:rPr>
+        <w:t>Du kannst dieses Buch von vorne nach hinten lesen. Du kannst auch dort einsteigen, wo dich etwas besonders anspricht. Die Fragen am Ende jedes Kapitels sind keine Hausaufgaben — du kannst sie überspringen, wenn du willst. Aber sie bringen oft das ans Licht, was im Kopf verschwommen bleibt. Schreib die Antworten irgendwo auf, wenn du kannst. Das Schreiben macht aus Gefühlen Worte, und aus Worten wird manchmal Klarheit.</w:t>
       </w:r>
     </w:p>
     <w:p>
@@ -611,7 +635,7 @@
           <w:rFonts w:ascii="Georgia" w:hAnsi="Georgia"/>
           <w:sz w:val="36"/>
         </w:rPr>
-        <w:t>Kapitel 1: Das Gewissen das nie schläft</w:t>
+        <w:t>Kapitel 1: Das Gewissen, das nie schläft</w:t>
       </w:r>
     </w:p>
     <w:p>
@@ -635,19 +659,7 @@
           <w:rFonts w:ascii="Georgia" w:hAnsi="Georgia"/>
           <w:sz w:val="22"/>
         </w:rPr>
-        <w:t>Noch bevor sie weiss, was heute ansteht. Noch bevor sie aufs Handy schaut. Noch bevor der erste Gedanke fertig gedacht ist. Da ist dieses Gefühl. Diffus. Schwer. Irgendwie vertraut.</w:t>
-      </w:r>
-    </w:p>
-    <w:p>
-      <w:pPr>
-        <w:spacing w:after="160" w:line="320" w:lineRule="exact"/>
-      </w:pPr>
-      <w:r>
-        <w:rPr>
-          <w:rFonts w:ascii="Georgia" w:hAnsi="Georgia"/>
-          <w:sz w:val="22"/>
-        </w:rPr>
-        <w:t>Als hätte sie etwas vergessen. Oder etwas versäumt. Oder jemanden enttäuscht.</w:t>
+        <w:t>Noch bevor sie weiss, was heute ansteht. Noch bevor sie aufs Handy schaut. Noch bevor der erste Gedanke fertig gedacht ist. Da ist dieses Gefühl. Diffus. Schwer. Irgendwie vertraut. Als hätte sie etwas vergessen. Oder etwas versäumt. Oder jemanden enttäuscht.</w:t>
       </w:r>
     </w:p>
     <w:p>
@@ -683,19 +695,7 @@
           <w:rFonts w:ascii="Georgia" w:hAnsi="Georgia"/>
           <w:sz w:val="22"/>
         </w:rPr>
-        <w:t>Sarah ist zweiundvierzig. Sie ist Lehrerin, Mutter von zwei Kindern, Tochter einer anspruchsvollen Mutter, Freundin für viele. Sie ist die, bei der man anruft wenn etwas ist. Sie ist die, die organisiert wenn niemand sonst es tut. Sie ist verlässlich, warmherzig, zugewandt.</w:t>
-      </w:r>
-    </w:p>
-    <w:p>
-      <w:pPr>
-        <w:spacing w:after="160" w:line="320" w:lineRule="exact"/>
-      </w:pPr>
-      <w:r>
-        <w:rPr>
-          <w:rFonts w:ascii="Georgia" w:hAnsi="Georgia"/>
-          <w:sz w:val="22"/>
-        </w:rPr>
-        <w:t>Und sie fängt jeden Tag mit diesem Gewicht an.</w:t>
+        <w:t>Sarah ist zweiundvierzig. Sie ist Lehrerin, Mutter von zwei Kindern, Tochter einer anspruchsvollen Mutter, Freundin für viele. Sie ist die, bei der man anruft wenn etwas ist. Sie ist die, die organisiert wenn niemand sonst es tut. Sie ist verlässlich, warmherzig, zugewandt. Und sie fängt jeden Tag mit diesem Gewicht an.</w:t>
       </w:r>
     </w:p>
     <w:p>
@@ -719,43 +719,43 @@
           <w:rFonts w:ascii="Georgia" w:hAnsi="Georgia"/>
           <w:sz w:val="22"/>
         </w:rPr>
-        <w:t>Das ist wichtig zu verstehen, weil es den Unterschied macht zwischen einem Gefühl, das man konkret angehen kann, und einem, das man versteht, bevor man etwas damit anfangen kann.</w:t>
-      </w:r>
-    </w:p>
-    <w:p>
-      <w:pPr>
-        <w:spacing w:after="160" w:line="320" w:lineRule="exact"/>
-      </w:pPr>
-      <w:r>
-        <w:rPr>
-          <w:rFonts w:ascii="Georgia" w:hAnsi="Georgia"/>
-          <w:sz w:val="22"/>
-        </w:rPr>
-        <w:t>Ein gesundes Gewissen ist präzise. Es meldet sich, wenn du etwas getan oder unterlassen hast, das gegen deine eigenen Werte verstösst. Es zeigt auf etwas Konkretes. Du weisst, wofür du dich schämst. Es motiviert zur Wiedergutmachung. Und wenn die Wiedergutmachung geschehen ist — oder wenn du verstanden hast, was du beim nächsten Mal anders machen möchtest — dann löst es sich auf. Das gesunde Gewissen hat ein Ende.</w:t>
-      </w:r>
-    </w:p>
-    <w:p>
-      <w:pPr>
-        <w:spacing w:after="160" w:line="320" w:lineRule="exact"/>
-      </w:pPr>
-      <w:r>
-        <w:rPr>
-          <w:rFonts w:ascii="Georgia" w:hAnsi="Georgia"/>
-          <w:sz w:val="22"/>
-        </w:rPr>
-        <w:t>Das chronische Schuldgefühl funktioniert anders. Es ist unspezifisch. Es lässt sich nicht festmachen. Es reagiert nicht auf Entschuldigungen, weil es kein konkretes Vergehen gibt, für das man sich entschuldigen könnte. Es ist einfach da. Wie Hintergrundmusik, die du nicht ausschalten kannst.</w:t>
-      </w:r>
-    </w:p>
-    <w:p>
-      <w:pPr>
-        <w:spacing w:after="160" w:line="320" w:lineRule="exact"/>
-      </w:pPr>
-      <w:r>
-        <w:rPr>
-          <w:rFonts w:ascii="Georgia" w:hAnsi="Georgia"/>
-          <w:sz w:val="22"/>
-        </w:rPr>
-        <w:t>Viele Frauen die ich kenne, haben gelernt, damit zu leben. Sie schieben es beiseite, gehen ihrem Tag nach, funktionieren. Die meisten von ihnen würden nicht einmal sagen, dass sie ein ausgeprägtes Schuldgefühl haben — weil es so zum Alltag gehört, dass sie es kaum noch wahrnehmen. Es ist wie das Rauschen des Kühlschranks. Man hört es erst, wenn er aufhört.</w:t>
+        <w:t>Das ist wichtig zu verstehen, weil es den Unterschied macht zwischen einem Gefühl, das man konkret angehen kann, und einem, das man zunächst verstehen muss, bevor man etwas damit anfangen kann.</w:t>
+      </w:r>
+    </w:p>
+    <w:p>
+      <w:pPr>
+        <w:spacing w:after="160" w:line="320" w:lineRule="exact"/>
+      </w:pPr>
+      <w:r>
+        <w:rPr>
+          <w:rFonts w:ascii="Georgia" w:hAnsi="Georgia"/>
+          <w:sz w:val="22"/>
+        </w:rPr>
+        <w:t>Ein gesundes Gewissen ist präzise. Es meldet sich, wenn du etwas getan oder unterlassen hast, das gegen deine eigenen Werte verstösst. Es zeigt auf etwas Konkretes. Du weisst, wofür du dich schämst oder bereust. Es motiviert zur Wiedergutmachung. Und wenn die Wiedergutmachung geschehen ist — oder wenn du verstanden hast, was du beim nächsten Mal anders machen möchtest — dann löst es sich auf. Das gesunde Gewissen hat ein Ende. Es kommt, tut seine Arbeit, und geht.</w:t>
+      </w:r>
+    </w:p>
+    <w:p>
+      <w:pPr>
+        <w:spacing w:after="160" w:line="320" w:lineRule="exact"/>
+      </w:pPr>
+      <w:r>
+        <w:rPr>
+          <w:rFonts w:ascii="Georgia" w:hAnsi="Georgia"/>
+          <w:sz w:val="22"/>
+        </w:rPr>
+        <w:t>Das chronische Schuldgefühl funktioniert anders. Es ist unspezifisch. Es lässt sich nicht festmachen. Es reagiert nicht auf Entschuldigungen, weil es kein konkretes Vergehen gibt, für das man sich entschuldigen könnte. Es ist einfach da. Wie Hintergrundmusik, die du nicht ausschalten kannst. Wie ein Radio, das immer leise läuft, auch dann, wenn du schläfst.</w:t>
+      </w:r>
+    </w:p>
+    <w:p>
+      <w:pPr>
+        <w:spacing w:after="160" w:line="320" w:lineRule="exact"/>
+      </w:pPr>
+      <w:r>
+        <w:rPr>
+          <w:rFonts w:ascii="Georgia" w:hAnsi="Georgia"/>
+          <w:sz w:val="22"/>
+        </w:rPr>
+        <w:t>Viele Frauen, die ich kenne, haben gelernt, damit zu leben. Sie schieben es beiseite, gehen ihrem Tag nach, funktionieren. Die meisten von ihnen würden nicht einmal sagen, dass sie ein ausgeprägtes Schuldgefühl haben — weil es so zum Alltag gehört, dass sie es kaum noch wahrnehmen. Es ist wie das Rauschen des Kühlschranks. Man hört es erst, wenn er aufhört.</w:t>
       </w:r>
     </w:p>
     <w:p>
@@ -779,43 +779,43 @@
           <w:rFonts w:ascii="Georgia" w:hAnsi="Georgia"/>
           <w:sz w:val="22"/>
         </w:rPr>
-        <w:t>Körperlich macht sich das chronische Schuldgefühl auf verschiedene Arten bemerkbar. Manchen Frauen sitzt es im Bauch, ein leichtes Zusammenziehen, ein Unbehagen das bleibt. Anderen im Nacken oder in den Schultern. Manche beschreiben es als eine Art innerer Unruhe, eine Nervosität ohne Anlass. Ein Gefühl, nie ganz ankommen zu können. Als würde man in einem Zimmer stehen und nicht wissen ob man bleiben darf.</w:t>
-      </w:r>
-    </w:p>
-    <w:p>
-      <w:pPr>
-        <w:spacing w:after="160" w:line="320" w:lineRule="exact"/>
-      </w:pPr>
-      <w:r>
-        <w:rPr>
-          <w:rFonts w:ascii="Georgia" w:hAnsi="Georgia"/>
-          <w:sz w:val="22"/>
-        </w:rPr>
-        <w:t>Das ist kein Zufall. Schuldgefühle aktivieren das Stresssystem. Der Körper unterscheidet nicht zwischen einer konkreten Bedrohung und einem diffusen inneren Vorwurf. Er reagiert auf beides mit Anspannung. Cortisol wird ausgeschüttet. Der Sympathikus ist aktiv. Der Körper ist bereit, auf eine Gefahr zu reagieren, die er nicht greifen kann.</w:t>
-      </w:r>
-    </w:p>
-    <w:p>
-      <w:pPr>
-        <w:spacing w:after="160" w:line="320" w:lineRule="exact"/>
-      </w:pPr>
-      <w:r>
-        <w:rPr>
-          <w:rFonts w:ascii="Georgia" w:hAnsi="Georgia"/>
-          <w:sz w:val="22"/>
-        </w:rPr>
-        <w:t>Wenn diese Anspannung zum Dauerzustand wird, zahlt der Körper einen Preis. Dazu kommen wir später noch.</w:t>
-      </w:r>
-    </w:p>
-    <w:p>
-      <w:pPr>
-        <w:spacing w:after="160" w:line="320" w:lineRule="exact"/>
-      </w:pPr>
-      <w:r>
-        <w:rPr>
-          <w:rFonts w:ascii="Georgia" w:hAnsi="Georgia"/>
-          <w:sz w:val="22"/>
-        </w:rPr>
-        <w:t>Etwas anderes, das ich immer wieder beobachte: Das chronische Schuldgefühl beeinflusst auch Entscheidungen. Frauen, die in diesem Zustand leben, entscheiden häufig nicht danach, was sie wollen oder was richtig ist. Sie entscheiden danach, was das Schuldgefühl am wirksamsten zum Schweigen bringt. Das klingt vernünftig, ist aber ein Problem. Weil das Schuldgefühl dadurch zur heimlichen Chefin wird.</w:t>
+        <w:t>Körperlich macht sich das chronische Schuldgefühl auf verschiedene Arten bemerkbar. Manchen Frauen sitzt es im Bauch, ein leichtes Zusammenziehen, ein Unbehagen das bleibt. Anderen im Nacken oder in den Schultern. Manche beschreiben es als eine Art innerer Unruhe, eine Nervosität ohne Anlass. Ein Gefühl, nie ganz ankommen zu können. Als würde man in einem Zimmer stehen und nicht wissen ob man bleiben darf. Als wäre man Gast im eigenen Leben.</w:t>
+      </w:r>
+    </w:p>
+    <w:p>
+      <w:pPr>
+        <w:spacing w:after="160" w:line="320" w:lineRule="exact"/>
+      </w:pPr>
+      <w:r>
+        <w:rPr>
+          <w:rFonts w:ascii="Georgia" w:hAnsi="Georgia"/>
+          <w:sz w:val="22"/>
+        </w:rPr>
+        <w:t>Das ist kein Zufall. Schuldgefühle aktivieren das Stresssystem. Das Nervensystem unterscheidet nicht zwischen einer konkreten äusseren Bedrohung und einem diffusen inneren Vorwurf. Es reagiert auf beides mit Anspannung. Cortisol wird ausgeschüttet. Der Sympathikus ist aktiv. Der Körper ist bereit, auf eine Gefahr zu reagieren, die er nicht greifen kann.</w:t>
+      </w:r>
+    </w:p>
+    <w:p>
+      <w:pPr>
+        <w:spacing w:after="160" w:line="320" w:lineRule="exact"/>
+      </w:pPr>
+      <w:r>
+        <w:rPr>
+          <w:rFonts w:ascii="Georgia" w:hAnsi="Georgia"/>
+          <w:sz w:val="22"/>
+        </w:rPr>
+        <w:t>Wenn diese Anspannung zum Dauerzustand wird, zahlt der Körper einen Preis. Schlafprobleme, weil das Nervensystem nicht abschaltet. Erschöpfung, die durch Schlaf allein nicht behoben wird. Verspannungen, Kopfschmerzen, Verdauungsprobleme. Ein Immunsystem, das anfälliger wird. Dazu kommen wir in Kapitel 8 noch genauer.</w:t>
+      </w:r>
+    </w:p>
+    <w:p>
+      <w:pPr>
+        <w:spacing w:after="160" w:line="320" w:lineRule="exact"/>
+      </w:pPr>
+      <w:r>
+        <w:rPr>
+          <w:rFonts w:ascii="Georgia" w:hAnsi="Georgia"/>
+          <w:sz w:val="22"/>
+        </w:rPr>
+        <w:t>Etwas anderes, das ich immer wieder beobachte: Das chronische Schuldgefühl beeinflusst auch Entscheidungen, und zwar auf eine Weise, die man von aussen kaum sieht. Frauen, die in diesem Zustand leben, entscheiden häufig nicht danach, was sie wollen oder was richtig ist. Sie entscheiden danach, was das Schuldgefühl am wirksamsten zum Schweigen bringt. Das klingt vernünftig, ist aber ein fundamentales Problem. Weil das Schuldgefühl dadurch zur heimlichen Chefin wird — und niemand weiss es ausser dir.</w:t>
       </w:r>
     </w:p>
     <w:p>
@@ -863,31 +863,67 @@
           <w:rFonts w:ascii="Georgia" w:hAnsi="Georgia"/>
           <w:sz w:val="22"/>
         </w:rPr>
-        <w:t>Das ist kein freies Leben. Das ist ein Leben, das von einem inneren Aufseher verwaltet wird.</w:t>
-      </w:r>
-    </w:p>
-    <w:p>
-      <w:pPr>
-        <w:spacing w:after="160" w:line="320" w:lineRule="exact"/>
-      </w:pPr>
-      <w:r>
-        <w:rPr>
-          <w:rFonts w:ascii="Georgia" w:hAnsi="Georgia"/>
-          <w:sz w:val="22"/>
-        </w:rPr>
-        <w:t>Was Sarah nicht weiss, und was viele Frauen nicht wissen: Dieses Gewissen, das nie schläft, hat eine Geschichte. Es ist nicht einfach so da. Es wurde irgendwann gelernt. Und was gelernt wurde, kann auch verändert werden.</w:t>
-      </w:r>
-    </w:p>
-    <w:p>
-      <w:pPr>
-        <w:spacing w:after="160" w:line="320" w:lineRule="exact"/>
-      </w:pPr>
-      <w:r>
-        <w:rPr>
-          <w:rFonts w:ascii="Georgia" w:hAnsi="Georgia"/>
-          <w:sz w:val="22"/>
-        </w:rPr>
-        <w:t>Dazu kommen wir.</w:t>
+        <w:t>Sie kauft das Geschenk, schreibt die Karte, organisiert das Essen, bringt die Kinder, holt die Mutter ab — nicht aus Freude, sondern weil das der einzige Weg ist, den inneren Lärm kurzfristig leiser zu machen.</w:t>
+      </w:r>
+    </w:p>
+    <w:p>
+      <w:pPr>
+        <w:spacing w:after="160" w:line="320" w:lineRule="exact"/>
+      </w:pPr>
+      <w:r>
+        <w:rPr>
+          <w:rFonts w:ascii="Georgia" w:hAnsi="Georgia"/>
+          <w:sz w:val="22"/>
+        </w:rPr>
+        <w:t>Das ist kein freies Leben. Das ist ein Leben, das von einem inneren Aufseher verwaltet wird. Einem Aufseher, der nie schläft, der keine freien Tage kennt und der jede Lücke nutzt, um zu erinnern: Du hast noch nicht genug getan. Jemand ist noch nicht zufrieden. Etwas fehlt.</w:t>
+      </w:r>
+    </w:p>
+    <w:p>
+      <w:pPr>
+        <w:spacing w:after="160" w:line="320" w:lineRule="exact"/>
+      </w:pPr>
+      <w:r>
+        <w:rPr>
+          <w:rFonts w:ascii="Georgia" w:hAnsi="Georgia"/>
+          <w:sz w:val="22"/>
+        </w:rPr>
+        <w:t>Die gute Nachricht, und ich sage das mit voller Überzeugung: Dieser Aufseher ist nicht du. Er fühlt sich wie du an, weil er von innen spricht. Aber er ist nicht du. Er ist ein erlerntes Muster. Eine Reaktion, die irgendwann sinnvoll war. Eine Anpassung, die du gemacht hast, weil du musst.</w:t>
+      </w:r>
+    </w:p>
+    <w:p>
+      <w:pPr>
+        <w:spacing w:after="160" w:line="320" w:lineRule="exact"/>
+      </w:pPr>
+      <w:r>
+        <w:rPr>
+          <w:rFonts w:ascii="Georgia" w:hAnsi="Georgia"/>
+          <w:sz w:val="22"/>
+        </w:rPr>
+        <w:t>Und was gelernt wurde, kann auch verändert werden.</w:t>
+      </w:r>
+    </w:p>
+    <w:p>
+      <w:pPr>
+        <w:spacing w:after="160" w:line="320" w:lineRule="exact"/>
+      </w:pPr>
+      <w:r>
+        <w:rPr>
+          <w:rFonts w:ascii="Georgia" w:hAnsi="Georgia"/>
+          <w:sz w:val="22"/>
+        </w:rPr>
+        <w:t>Sarah hat angefangen, das schlechte Gewissen zu verstehen — woher es kommt, was es will, was es wirklich aussagt über die Welt und über sie. Das hat nicht sofort alles verändert. Aber es hat etwas verändert: Sie hat aufgehört, dem Schuldgefühl zu glauben, dass es die Wahrheit sagt.</w:t>
+      </w:r>
+    </w:p>
+    <w:p>
+      <w:pPr>
+        <w:spacing w:after="160" w:line="320" w:lineRule="exact"/>
+      </w:pPr>
+      <w:r>
+        <w:rPr>
+          <w:rFonts w:ascii="Georgia" w:hAnsi="Georgia"/>
+          <w:sz w:val="22"/>
+        </w:rPr>
+        <w:t>Das war der Anfang.</w:t>
       </w:r>
     </w:p>
     <w:p>
@@ -939,7 +975,7 @@
           <w:i/>
           <w:sz w:val="22"/>
         </w:rPr>
-        <w:t>Wo spürst du es im Körper?</w:t>
+        <w:t>Wo spürst du es im Körper — und seit wann begleitet dich dieses Gefühl?</w:t>
       </w:r>
     </w:p>
     <w:p>
@@ -952,7 +988,7 @@
           <w:i/>
           <w:sz w:val="22"/>
         </w:rPr>
-        <w:t>Wie lange begleitet dich dieses Gefühl schon?</w:t>
+        <w:t>Welche Entscheidungen hast du zuletzt nicht aus Überzeugung getroffen, sondern um das Schuldgefühl zu beruhigen?</w:t>
       </w:r>
     </w:p>
     <w:p>
@@ -1033,19 +1069,19 @@
           <w:rFonts w:ascii="Georgia" w:hAnsi="Georgia"/>
           <w:sz w:val="22"/>
         </w:rPr>
-        <w:t>Nicht weil ihre Mutter ihr verboten hätte zu gehen. Sondern weil dieses eine ruhige Kommentar genügte, um Ninas Wunsch in etwas Gefährliches zu verwandeln. In etwas, für das sie sich schuldig fühlen würde. In etwas, das bedeutete: Wenn ich gehe, bin ich eine schlechte Tochter.</w:t>
-      </w:r>
-    </w:p>
-    <w:p>
-      <w:pPr>
-        <w:spacing w:after="160" w:line="320" w:lineRule="exact"/>
-      </w:pPr>
-      <w:r>
-        <w:rPr>
-          <w:rFonts w:ascii="Georgia" w:hAnsi="Georgia"/>
-          <w:sz w:val="22"/>
-        </w:rPr>
-        <w:t>Nina erinnert sich nicht daran, dass ihr Wunsch zu gehen jemals erklärt oder verboten wurde. Sie erinnert sich nur an das Gefühl, das entstand: Mein Wollen verursacht Schmerz. Wenn ich für mich sorge, lasse ich jemanden im Stich.</w:t>
+        <w:t>Nicht weil ihre Mutter ihr verboten hätte zu gehen. Sondern weil dieser eine ruhige Kommentar genügte, um Ninas Wunsch in etwas Gefährliches zu verwandeln. In etwas, für das sie sich schuldig fühlen würde, egal was sie wählte. In etwas, das bedeutete: Wenn ich gehe, bin ich eine schlechte Tochter.</w:t>
+      </w:r>
+    </w:p>
+    <w:p>
+      <w:pPr>
+        <w:spacing w:after="160" w:line="320" w:lineRule="exact"/>
+      </w:pPr>
+      <w:r>
+        <w:rPr>
+          <w:rFonts w:ascii="Georgia" w:hAnsi="Georgia"/>
+          <w:sz w:val="22"/>
+        </w:rPr>
+        <w:t>Nina erinnert sich nicht daran, dass ihr Wunsch je erklärt oder verboten wurde. Sie erinnert sich nur an das Gefühl, das entstand: Mein Wollen verursacht Schmerz. Wenn ich für mich sorge, lasse ich jemanden im Stich.</w:t>
       </w:r>
     </w:p>
     <w:p>
@@ -1069,19 +1105,31 @@
           <w:rFonts w:ascii="Georgia" w:hAnsi="Georgia"/>
           <w:sz w:val="22"/>
         </w:rPr>
-        <w:t>Nicht unbedingt in einer dramatischen Geschichte. Nicht unbedingt in offensichtlicher Vernachlässigung oder Misshandlung. Oft in kleinen, wiederholten Momenten, die allein betrachtet harmlos erscheinen, aber zusammengenommen eine Botschaft formen.</w:t>
-      </w:r>
-    </w:p>
-    <w:p>
-      <w:pPr>
-        <w:spacing w:after="160" w:line="320" w:lineRule="exact"/>
-      </w:pPr>
-      <w:r>
-        <w:rPr>
-          <w:rFonts w:ascii="Georgia" w:hAnsi="Georgia"/>
-          <w:sz w:val="22"/>
-        </w:rPr>
-        <w:t>Kinder brauchen Liebe und Zugehörigkeit wie Essen und Schlaf. Das ist keine Übertreibung — das ist Biologie. Ein kleines Kind, das ohne Zugehörigkeit aufwächst, überlebt buchstäblich nicht. Das Nervensystem des Kindes ist darauf ausgerichtet, Signale zu lesen: Bin ich sicher? Werde ich geliebt? Gehöre ich dazu?</w:t>
+        <w:t>Nicht unbedingt in einer dramatischen Geschichte. Nicht unbedingt in offensichtlicher Vernachlässigung oder Misshandlung. Oft in kleinen, wiederholten Momenten, die allein betrachtet harmlos erscheinen, aber zusammengenommen eine Botschaft formen, die sich ins Nervensystem einschreibt. Lautlos, aber tief.</w:t>
+      </w:r>
+    </w:p>
+    <w:p>
+      <w:pPr>
+        <w:spacing w:after="160" w:line="320" w:lineRule="exact"/>
+      </w:pPr>
+      <w:r>
+        <w:rPr>
+          <w:rFonts w:ascii="Georgia" w:hAnsi="Georgia"/>
+          <w:sz w:val="22"/>
+        </w:rPr>
+        <w:t>Kinder brauchen Liebe und Zugehörigkeit wie Essen und Schlaf. Das ist keine Metapher — das ist Biologie. Ein kleines Kind, das ohne Zugehörigkeit und emotionale Verbindung aufwächst, überlebt buchstäblich nicht. Das Nervensystem des Kindes ist evolutionär darauf ausgerichtet, Signale zu lesen: Bin ich sicher? Werde ich geliebt? Gehöre ich dazu?</w:t>
+      </w:r>
+    </w:p>
+    <w:p>
+      <w:pPr>
+        <w:spacing w:after="160" w:line="320" w:lineRule="exact"/>
+      </w:pPr>
+      <w:r>
+        <w:rPr>
+          <w:rFonts w:ascii="Georgia" w:hAnsi="Georgia"/>
+          <w:sz w:val="22"/>
+        </w:rPr>
+        <w:t>Die Bindungsforschung — begründet von John Bowlby und weiterentwickelt von vielen anderen — hat gezeigt, wie fundamental dieses Grundbedürfnis ist. Kinder passen ihr Verhalten an die verfügbaren Bezugspersonen an. Sie lernen, was sie tun müssen, um Nähe zu bekommen. Was sie vermeiden müssen, um keine Kälte oder Ablehnung zu riskieren.</w:t>
       </w:r>
     </w:p>
     <w:p>
@@ -1117,31 +1165,31 @@
           <w:rFonts w:ascii="Georgia" w:hAnsi="Georgia"/>
           <w:sz w:val="22"/>
         </w:rPr>
-        <w:t>Das Problem: Diese Anpassung wird automatisch. Das Kind trägt sie ins Erwachsenenalter, ohne es zu merken. Und dann, mit dreissig, mit vierzig, mit fünfzig, sitzt da eine Frau die reflexartig Nein zu sich selbst sagt, noch bevor sie bewusst darüber nachgedacht hat. Die sich entschuldigt, bevor sie weiss wofür. Die ihre Bedürfnisse so weit nach hinten schiebt, dass sie manchmal gar nicht mehr weiss was sie eigentlich möchte.</w:t>
-      </w:r>
-    </w:p>
-    <w:p>
-      <w:pPr>
-        <w:spacing w:after="160" w:line="320" w:lineRule="exact"/>
-      </w:pPr>
-      <w:r>
-        <w:rPr>
-          <w:rFonts w:ascii="Georgia" w:hAnsi="Georgia"/>
-          <w:sz w:val="22"/>
-        </w:rPr>
-        <w:t>Das Gewissen übernimmt die Funktion des früheren Aussenrufers. Früher war es die Mutter, der Vater, die Lehrerin, die signalisiert haben: So nicht. Das Schuldgefühl. Der Rückzug. Jetzt ist das Gewissen verinnerlicht. Es macht die Arbeit von innen.</w:t>
-      </w:r>
-    </w:p>
-    <w:p>
-      <w:pPr>
-        <w:spacing w:after="160" w:line="320" w:lineRule="exact"/>
-      </w:pPr>
-      <w:r>
-        <w:rPr>
-          <w:rFonts w:ascii="Georgia" w:hAnsi="Georgia"/>
-          <w:sz w:val="22"/>
-        </w:rPr>
-        <w:t>Es wacht darüber, dass die alten Regeln eingehalten werden. Wenn du für dich sorgst, meldet es sich. Wenn du Nein sagst, meldet es sich. Wenn du Raum einnimmst, meldet es sich. Nicht weil diese Dinge falsch sind — sondern weil das Nervensystem sie als Abweichung von dem registriert, was früher sicher war.</w:t>
+        <w:t>Das Problem: Diese Anpassung wird automatisch. Das Kind trägt sie ins Erwachsenenalter, ohne es zu merken. Und dann, mit dreissig, mit vierzig, mit fünfzig, sitzt da eine Frau, die reflexartig Nein zu sich selbst sagt, noch bevor sie bewusst darüber nachgedacht hat. Die sich entschuldigt, bevor sie weiss wofür. Die ihre Bedürfnisse so weit nach hinten schiebt, dass sie manchmal gar nicht mehr weiss, was sie eigentlich möchte.</w:t>
+      </w:r>
+    </w:p>
+    <w:p>
+      <w:pPr>
+        <w:spacing w:after="160" w:line="320" w:lineRule="exact"/>
+      </w:pPr>
+      <w:r>
+        <w:rPr>
+          <w:rFonts w:ascii="Georgia" w:hAnsi="Georgia"/>
+          <w:sz w:val="22"/>
+        </w:rPr>
+        <w:t>Das Gewissen übernimmt die Funktion des früheren Aussenrufers. Früher war es die Mutter, der Vater, die Lehrerin, die signalisiert haben: So nicht. Das Schuldgefühl. Der Rückzug. Die Enttäuschung im Blick. Jetzt ist dieses Signal verinnerlicht. Das Gewissen macht die Arbeit von innen. Es wacht darüber, dass die alten Regeln eingehalten werden.</w:t>
+      </w:r>
+    </w:p>
+    <w:p>
+      <w:pPr>
+        <w:spacing w:after="160" w:line="320" w:lineRule="exact"/>
+      </w:pPr>
+      <w:r>
+        <w:rPr>
+          <w:rFonts w:ascii="Georgia" w:hAnsi="Georgia"/>
+          <w:sz w:val="22"/>
+        </w:rPr>
+        <w:t>Wenn du für dich sorgst, meldet es sich. Wenn du Nein sagst, meldet es sich. Wenn du Raum einnimmst, meldet es sich. Nicht weil diese Dinge falsch sind — sondern weil das Nervensystem sie als Abweichung von dem registriert, was früher sicher war.</w:t>
       </w:r>
     </w:p>
     <w:p>
@@ -1165,7 +1213,43 @@
           <w:rFonts w:ascii="Georgia" w:hAnsi="Georgia"/>
           <w:sz w:val="22"/>
         </w:rPr>
-        <w:t>Ich sage das nicht um Eltern zu verurteilen. Die meisten Eltern haben das Beste gegeben, was sie konnten — oft mit Wunden, die sie selbst mit sich trugen, mit Vorstellungen von Erziehung, die damals galten, mit eigenem Druck und eigener Erschöpfung. Schuldzuweisungen führen nicht weiter. Was weiterführt, ist Verstehen.</w:t>
+        <w:t>Es gibt verschiedene Arten, wie dieses Muster in der Kindheit entsteht. Manche Frauen hatten Eltern, die emotional nicht verfügbar waren — nicht wegen böser Absicht, sondern wegen eigener unverarbeiteter Verletzungen, eigener Erschöpfung, eigener Prägungen. Andere hatten Eltern, die selbst sehr schuldbelastet waren und dieses Muster weitergegeben haben — unbewusst, wie man Sprache weitergibt, weil man keine andere kennt.</w:t>
+      </w:r>
+    </w:p>
+    <w:p>
+      <w:pPr>
+        <w:spacing w:after="160" w:line="320" w:lineRule="exact"/>
+      </w:pPr>
+      <w:r>
+        <w:rPr>
+          <w:rFonts w:ascii="Georgia" w:hAnsi="Georgia"/>
+          <w:sz w:val="22"/>
+        </w:rPr>
+        <w:t>Manche Frauen berichten von einer bestimmten Botschaft, die ihnen als Kinder immer wieder vermittelt wurde: „Denk nicht immer nur an dich." Oder: „Sei nicht so empfindlich." Oder: „Mit dir muss man es aber leicht haben." Diese Sätze klingen harmlos, wenn man sie einzeln betrachtet. Wenn man sie aber hundertmal gehört hat — in verschiedenen Variationen, bei verschiedenen Anlässen, von verschiedenen Menschen — dann formen sie eine innere Überzeugung: Meine Bedürfnisse sind zu viel. Meine Gefühle sind zu gross. Ich bin zu viel.</w:t>
+      </w:r>
+    </w:p>
+    <w:p>
+      <w:pPr>
+        <w:spacing w:after="160" w:line="320" w:lineRule="exact"/>
+      </w:pPr>
+      <w:r>
+        <w:rPr>
+          <w:rFonts w:ascii="Georgia" w:hAnsi="Georgia"/>
+          <w:sz w:val="22"/>
+        </w:rPr>
+        <w:t>Das Schuldgefühl ist dann die Konsequenz: Immer wenn ich etwas fühle oder will, kommt der innere Wächter und sagt: Zu viel. Nicht erlaubt. Denk an die anderen.</w:t>
+      </w:r>
+    </w:p>
+    <w:p>
+      <w:pPr>
+        <w:spacing w:after="160" w:line="320" w:lineRule="exact"/>
+      </w:pPr>
+      <w:r>
+        <w:rPr>
+          <w:rFonts w:ascii="Georgia" w:hAnsi="Georgia"/>
+          <w:sz w:val="22"/>
+        </w:rPr>
+        <w:t>Ich sage das nicht, um Eltern zu verurteilen. Die meisten Eltern haben das Beste gegeben, was sie konnten — oft mit Wunden, die sie selbst mit sich trugen, mit Vorstellungen von Erziehung, die damals galten, mit eigenem Druck und eigener Erschöpfung. Schuldzuweisungen führen nicht weiter, weder in Beratungsgesprächen noch in Büchern. Was weiterführt, ist Verstehen.</w:t>
       </w:r>
     </w:p>
     <w:p>
@@ -1189,31 +1273,31 @@
           <w:rFonts w:ascii="Georgia" w:hAnsi="Georgia"/>
           <w:sz w:val="22"/>
         </w:rPr>
-        <w:t>Und erlernte Reaktionen können verändert werden.</w:t>
-      </w:r>
-    </w:p>
-    <w:p>
-      <w:pPr>
-        <w:spacing w:after="160" w:line="320" w:lineRule="exact"/>
-      </w:pPr>
-      <w:r>
-        <w:rPr>
-          <w:rFonts w:ascii="Georgia" w:hAnsi="Georgia"/>
-          <w:sz w:val="22"/>
-        </w:rPr>
-        <w:t>Das ist nicht schnell. Das ist kein Schalter, den man umlegt. Aber es ist möglich.</w:t>
-      </w:r>
-    </w:p>
-    <w:p>
-      <w:pPr>
-        <w:spacing w:after="160" w:line="320" w:lineRule="exact"/>
-      </w:pPr>
-      <w:r>
-        <w:rPr>
-          <w:rFonts w:ascii="Georgia" w:hAnsi="Georgia"/>
-          <w:sz w:val="22"/>
-        </w:rPr>
-        <w:t>Ninety-nine Frauen von hundert, die ich kenne und die mit chronischem Schuldgefühl kämpfen, hatten nie die Gelegenheit zu verstehen: Das bin nicht ich. Das ist etwas, das mir gezeigt wurde. Und das Einzige, das zwischen dem Damals und dem Heute wirklich zählt, ist diese Erkenntnis.</w:t>
+        <w:t>Wie eine Schutzhülle aus Kindertagen, die du nie abgelegt hast, weil niemand dir gesagt hat, dass du sie nicht mehr brauchst.</w:t>
+      </w:r>
+    </w:p>
+    <w:p>
+      <w:pPr>
+        <w:spacing w:after="160" w:line="320" w:lineRule="exact"/>
+      </w:pPr>
+      <w:r>
+        <w:rPr>
+          <w:rFonts w:ascii="Georgia" w:hAnsi="Georgia"/>
+          <w:sz w:val="22"/>
+        </w:rPr>
+        <w:t>Nina hat mit vierzig zum ersten Mal über diesen Samstagnachmittag gesprochen. Nicht weil es das grösste Ereignis ihres Lebens war — sondern weil es so klein war. So unauffällig. Und weil sich so viel von dem, was sie dreissig Jahre später noch immer tat, in diesem einen kleinen Moment spiegelte: Ich bleibe. Auch wenn ich eigentlich gehen will. Auch wenn niemand mich wirklich fragt.</w:t>
+      </w:r>
+    </w:p>
+    <w:p>
+      <w:pPr>
+        <w:spacing w:after="160" w:line="320" w:lineRule="exact"/>
+      </w:pPr>
+      <w:r>
+        <w:rPr>
+          <w:rFonts w:ascii="Georgia" w:hAnsi="Georgia"/>
+          <w:sz w:val="22"/>
+        </w:rPr>
+        <w:t>Das zu benennen, hat etwas verändert. Nicht sofort. Nicht alles. Aber sie begann zu verstehen: Das bin nicht ich. Das ist etwas, das mir gezeigt wurde. Und das Einzige, das zwischen dem Damals und dem Heute wirklich zählt, ist diese Erkenntnis.</w:t>
       </w:r>
     </w:p>
     <w:p>
@@ -1278,7 +1362,7 @@
           <w:i/>
           <w:sz w:val="22"/>
         </w:rPr>
-        <w:t>Was hättest du als Kind gebraucht, das du nicht bekommen hast?</w:t>
+        <w:t>Was hättest du als Kind gebraucht, das du nicht bekommen hast — und trägst du dieses Bedürfnis noch immer mit dir?</w:t>
       </w:r>
     </w:p>
     <w:p>
@@ -1335,7 +1419,7 @@
           <w:rFonts w:ascii="Georgia" w:hAnsi="Georgia"/>
           <w:sz w:val="22"/>
         </w:rPr>
-        <w:t>Die Freundin antwortete nett. Kein Drama. Kein Vorwurf.</w:t>
+        <w:t>Die Freundin antwortete nett. Kein Drama. Kein Vorwurf. „Schon gut, werd gesund, wir sehen uns bald."</w:t>
       </w:r>
     </w:p>
     <w:p>
@@ -1359,7 +1443,7 @@
           <w:rFonts w:ascii="Georgia" w:hAnsi="Georgia"/>
           <w:sz w:val="22"/>
         </w:rPr>
-        <w:t>Sie stellte sich vor wie ihre Freundin enttäuscht war. Sie überlegte ob sie hätte trotzdem kommen können, irgendwie. Sie fragte sich ob sie sich zu schnell entschieden hatte. Ob die Freundin ihr heimlich böse war. Sie schrieb noch eine zweite Nachricht, noch ausführlicher. Dann fragte sie sich ob die zweite Nachricht zu viel war.</w:t>
+        <w:t>Sie stellte sich vor, wie ihre Freundin enttäuscht war. Sie überlegte, ob sie hätte trotzdem kommen können, irgendwie. Sie fragte sich, ob sie sich zu schnell entschieden hatte. Ob die Freundin ihr heimlich böse war. Sie schrieb noch eine zweite Nachricht, ausführlicher als die erste, mit mehr Erklärungen. Dann fragte sie sich, ob die zweite Nachricht zu viel war. Ob sie sich damit verdächtig gemacht hatte.</w:t>
       </w:r>
     </w:p>
     <w:p>
@@ -1395,43 +1479,43 @@
           <w:rFonts w:ascii="Georgia" w:hAnsi="Georgia"/>
           <w:sz w:val="22"/>
         </w:rPr>
-        <w:t>Das ist der Unterschied, über den wir in diesem Kapitel sprechen müssen. Weil er alles verändert.</w:t>
-      </w:r>
-    </w:p>
-    <w:p>
-      <w:pPr>
-        <w:spacing w:after="160" w:line="320" w:lineRule="exact"/>
-      </w:pPr>
-      <w:r>
-        <w:rPr>
-          <w:rFonts w:ascii="Georgia" w:hAnsi="Georgia"/>
-          <w:sz w:val="22"/>
-        </w:rPr>
-        <w:t>Echte Schuld zeigt auf etwas Konkretes. Du hast jemandem absichtlich geschadet. Du hast etwas versprochen und nicht gehalten. Du hast aus Gleichgültigkeit oder Bequemlichkeit jemanden im Stich gelassen, obwohl du hättest besser handeln können. Echte Schuld hat einen Anker in der Realität.</w:t>
-      </w:r>
-    </w:p>
-    <w:p>
-      <w:pPr>
-        <w:spacing w:after="160" w:line="320" w:lineRule="exact"/>
-      </w:pPr>
-      <w:r>
-        <w:rPr>
-          <w:rFonts w:ascii="Georgia" w:hAnsi="Georgia"/>
-          <w:sz w:val="22"/>
-        </w:rPr>
-        <w:t>Sie ist unbequem. Aber sie hat eine Funktion: Sie zeigt, dass etwas deinen eigenen Werten widerspricht. Sie motiviert zur Wiedergutmachung, zu einer aufrichtigen Entschuldigung, zu einem Gespräch, zu einer Korrektur. Und wenn das geschehen ist, löst sie sich auf. Echte Schuld hat ein Ende.</w:t>
-      </w:r>
-    </w:p>
-    <w:p>
-      <w:pPr>
-        <w:spacing w:after="160" w:line="320" w:lineRule="exact"/>
-      </w:pPr>
-      <w:r>
-        <w:rPr>
-          <w:rFonts w:ascii="Georgia" w:hAnsi="Georgia"/>
-          <w:sz w:val="22"/>
-        </w:rPr>
-        <w:t>Das falsche Gewissen funktioniert anders. Es meldet sich nicht auf Basis dessen, was du wirklich getan hast. Es meldet sich auf Basis einer Erwartung — oft einer, die nie ausgesprochen wurde, die vielleicht gar nicht existiert, die du dir selbst zugeschrieben hast.</w:t>
+        <w:t>Das ist der Unterschied, über den wir in diesem Kapitel sprechen müssen. Weil er alles verändert. Weil das, was dir hilft, davon abhängt, ob du es verstehst.</w:t>
+      </w:r>
+    </w:p>
+    <w:p>
+      <w:pPr>
+        <w:spacing w:after="160" w:line="320" w:lineRule="exact"/>
+      </w:pPr>
+      <w:r>
+        <w:rPr>
+          <w:rFonts w:ascii="Georgia" w:hAnsi="Georgia"/>
+          <w:sz w:val="22"/>
+        </w:rPr>
+        <w:t>Echte Schuld zeigt auf etwas Konkretes. Du hast jemandem absichtlich geschadet. Du hast etwas versprochen und nicht gehalten. Du hast aus Gleichgültigkeit oder Bequemlichkeit jemanden im Stich gelassen, obwohl du hättest besser handeln können. Echte Schuld hat einen Anker in der Realität. Sie ist unangenehm. Aber sie hat eine Funktion: Sie zeigt, dass etwas deinen eigenen Werten widerspricht. Sie motiviert zur Wiedergutmachung, zu einer aufrichtigen Entschuldigung, zu einem Gespräch, zu einer Korrektur.</w:t>
+      </w:r>
+    </w:p>
+    <w:p>
+      <w:pPr>
+        <w:spacing w:after="160" w:line="320" w:lineRule="exact"/>
+      </w:pPr>
+      <w:r>
+        <w:rPr>
+          <w:rFonts w:ascii="Georgia" w:hAnsi="Georgia"/>
+          <w:sz w:val="22"/>
+        </w:rPr>
+        <w:t>Und wenn das geschehen ist, löst sie sich auf. Echte Schuld hat ein Ende.</w:t>
+      </w:r>
+    </w:p>
+    <w:p>
+      <w:pPr>
+        <w:spacing w:after="160" w:line="320" w:lineRule="exact"/>
+      </w:pPr>
+      <w:r>
+        <w:rPr>
+          <w:rFonts w:ascii="Georgia" w:hAnsi="Georgia"/>
+          <w:sz w:val="22"/>
+        </w:rPr>
+        <w:t>Das falsche Gewissen funktioniert anders. Es meldet sich nicht auf Basis dessen, was du wirklich getan hast. Es meldet sich auf Basis einer Erwartung — oft einer, die nie ausgesprochen wurde, die vielleicht gar nicht existiert, die du dir selbst zugeschrieben hast. Einer alten Regel, die sagt: Ich muss immer da sein. Ich darf andere nicht enttäuschen. Mein Wohlbefinden darf nicht wichtiger sein als das anderer.</w:t>
       </w:r>
     </w:p>
     <w:p>
@@ -1455,19 +1539,7 @@
           <w:rFonts w:ascii="Georgia" w:hAnsi="Georgia"/>
           <w:sz w:val="22"/>
         </w:rPr>
-        <w:t>Diese Logik ist unabhängig von der Realität. Sie reagiert nicht auf Fakten. Man kann sie nicht mit Argumenten auflösen, weil sie keine rationale Konstruktion ist. Sie ist emotional. Sie sitzt tiefer als der Verstand.</w:t>
-      </w:r>
-    </w:p>
-    <w:p>
-      <w:pPr>
-        <w:spacing w:after="160" w:line="320" w:lineRule="exact"/>
-      </w:pPr>
-      <w:r>
-        <w:rPr>
-          <w:rFonts w:ascii="Georgia" w:hAnsi="Georgia"/>
-          <w:sz w:val="22"/>
-        </w:rPr>
-        <w:t>Und genau deshalb hilft Claudia auch nicht, wenn sie sich sagt: „Ich war krank, ich habe nichts falsch gemacht." Das stimmt zwar. Aber das Schuldgefühl glaubt ihr nicht.</w:t>
+        <w:t>Diese Logik ist unabhängig von der Realität. Sie reagiert nicht auf Fakten. Man kann sie nicht mit Argumenten auflösen, weil sie keine rationale Konstruktion ist. Sie ist emotional. Sie sitzt tiefer als der Verstand. Deshalb hilft auch die Einsicht „Ich habe nichts falsch gemacht" kurzfristig nicht — man weiss es, und trotzdem bleibt das Gefühl.</w:t>
       </w:r>
     </w:p>
     <w:p>
@@ -1503,19 +1575,19 @@
           <w:rFonts w:ascii="Georgia" w:hAnsi="Georgia"/>
           <w:sz w:val="22"/>
         </w:rPr>
-        <w:t>Ein zweiter Hinweis: Echte Schuld besteht, auch wenn niemand zuschaut. Das falsche Gewissen ist oft eng verknüpft mit der Frage: Was denkt die andere Person? Was fühlt sie? Wie reagiert sie auf mich?</w:t>
-      </w:r>
-    </w:p>
-    <w:p>
-      <w:pPr>
-        <w:spacing w:after="160" w:line="320" w:lineRule="exact"/>
-      </w:pPr>
-      <w:r>
-        <w:rPr>
-          <w:rFonts w:ascii="Georgia" w:hAnsi="Georgia"/>
-          <w:sz w:val="22"/>
-        </w:rPr>
-        <w:t>Ein dritter Hinweis: Echte Schuld kann sich auflösen, wenn man etwas tut. Das falsche Gewissen nicht — oder nur kurz, bevor es wiederkommt. Du entschuldigst dich, und eine Woche später meldet es sich wieder. Nicht wegen desselben Dings, sondern wegen etwas anderem. Das falsche Gewissen sucht sich immer einen neuen Anker.</w:t>
+        <w:t>Ein zweiter Hinweis: Echte Schuld besteht, auch wenn niemand zuschaut. Das falsche Gewissen ist oft eng verknüpft mit der Frage: Was denkt die andere Person? Was fühlt sie? Wie reagiert sie auf mich? Es orientiert sich nach aussen, nicht nach innen.</w:t>
+      </w:r>
+    </w:p>
+    <w:p>
+      <w:pPr>
+        <w:spacing w:after="160" w:line="320" w:lineRule="exact"/>
+      </w:pPr>
+      <w:r>
+        <w:rPr>
+          <w:rFonts w:ascii="Georgia" w:hAnsi="Georgia"/>
+          <w:sz w:val="22"/>
+        </w:rPr>
+        <w:t>Ein dritter Hinweis: Echte Schuld kann sich auflösen, wenn man etwas tut. Das falsche Gewissen nicht — oder nur kurz, bevor es wiederkommt. Du entschuldigst dich, und eine Woche später meldet es sich wieder. Nicht wegen desselben Dings, sondern wegen etwas anderem. Das falsche Gewissen sucht sich immer einen neuen Anker. Es ist kein Wegweiser, es ist ein Dauersignal.</w:t>
       </w:r>
     </w:p>
     <w:p>
@@ -1539,43 +1611,55 @@
           <w:rFonts w:ascii="Georgia" w:hAnsi="Georgia"/>
           <w:sz w:val="22"/>
         </w:rPr>
-        <w:t>Das bedeutet nicht, dass das falsche Gewissen keine echten Gefühle produziert. Die Scham ist real. Das Unbehagen ist real. Der Druck im Bauch ist real. Nur der Auslöser ist kein reales Vergehen.</w:t>
-      </w:r>
-    </w:p>
-    <w:p>
-      <w:pPr>
-        <w:spacing w:after="160" w:line="320" w:lineRule="exact"/>
-      </w:pPr>
-      <w:r>
-        <w:rPr>
-          <w:rFonts w:ascii="Georgia" w:hAnsi="Georgia"/>
-          <w:sz w:val="22"/>
-        </w:rPr>
-        <w:t>Und das verändert, was dagegen hilft.</w:t>
-      </w:r>
-    </w:p>
-    <w:p>
-      <w:pPr>
-        <w:spacing w:after="160" w:line="320" w:lineRule="exact"/>
-      </w:pPr>
-      <w:r>
-        <w:rPr>
-          <w:rFonts w:ascii="Georgia" w:hAnsi="Georgia"/>
-          <w:sz w:val="22"/>
-        </w:rPr>
-        <w:t>Claudia braucht keine weitere Entschuldigung. Sie braucht keine zweite Nachricht und keine vierte Erklärung. Was ihr helfen würde, ist das, worum es in diesem ganzen Buch geht: verstehen, dass das Schuldgefühl sich meldet, ohne dass sie etwas falsch gemacht hat. Und lernen, dem eigenen Urteil zu vertrauen.</w:t>
-      </w:r>
-    </w:p>
-    <w:p>
-      <w:pPr>
-        <w:spacing w:after="160" w:line="320" w:lineRule="exact"/>
-      </w:pPr>
-      <w:r>
-        <w:rPr>
-          <w:rFonts w:ascii="Georgia" w:hAnsi="Georgia"/>
-          <w:sz w:val="22"/>
-        </w:rPr>
-        <w:t>Das ist einfacher gesagt als getan. Aber es beginnt genau hier: mit dem Unterschied.</w:t>
+        <w:t>Das bedeutet nicht, dass das falsche Gewissen keine echten Gefühle produziert. Die Scham ist real. Das Unbehagen ist real. Der Druck im Bauch ist real. Nur der Auslöser ist kein reales Vergehen. Und das verändert, was dagegen hilft.</w:t>
+      </w:r>
+    </w:p>
+    <w:p>
+      <w:pPr>
+        <w:spacing w:after="160" w:line="320" w:lineRule="exact"/>
+      </w:pPr>
+      <w:r>
+        <w:rPr>
+          <w:rFonts w:ascii="Georgia" w:hAnsi="Georgia"/>
+          <w:sz w:val="22"/>
+        </w:rPr>
+        <w:t>Claudia braucht keine weitere Entschuldigung. Sie braucht keine zweite Nachricht und keine vierte Erklärung. Was ihr helfen würde, ist das, worum es in diesem ganzen Buch geht: verstehen, dass das Schuldgefühl sich meldet, ohne dass sie etwas falsch gemacht hat. Und lernen, dem eigenen Urteil zu vertrauen — auch dann, wenn das innere Radio etwas anderes sendet.</w:t>
+      </w:r>
+    </w:p>
+    <w:p>
+      <w:pPr>
+        <w:spacing w:after="160" w:line="320" w:lineRule="exact"/>
+      </w:pPr>
+      <w:r>
+        <w:rPr>
+          <w:rFonts w:ascii="Georgia" w:hAnsi="Georgia"/>
+          <w:sz w:val="22"/>
+        </w:rPr>
+        <w:t>Das ist ein Prozess, kein Schaltknopf. Aber er beginnt genau hier: mit dem Unterschied.</w:t>
+      </w:r>
+    </w:p>
+    <w:p>
+      <w:pPr>
+        <w:spacing w:after="160" w:line="320" w:lineRule="exact"/>
+      </w:pPr>
+      <w:r>
+        <w:rPr>
+          <w:rFonts w:ascii="Georgia" w:hAnsi="Georgia"/>
+          <w:sz w:val="22"/>
+        </w:rPr>
+        <w:t>Wenn du das nächste Mal ein schlechtes Gewissen spürst, probiere diese eine Frage aus: Kannst du das konkrete Vergehen benennen? Nicht die vage Vorstellung, jemandem nicht genug zu sein — sondern: Was genau habe ich getan oder nicht getan? Und gegen welchen meiner eigenen Werte verstösst das?</w:t>
+      </w:r>
+    </w:p>
+    <w:p>
+      <w:pPr>
+        <w:spacing w:after="160" w:line="320" w:lineRule="exact"/>
+      </w:pPr>
+      <w:r>
+        <w:rPr>
+          <w:rFonts w:ascii="Georgia" w:hAnsi="Georgia"/>
+          <w:sz w:val="22"/>
+        </w:rPr>
+        <w:t>Wenn du keine klare Antwort findest, ist das ein Hinweis: Das Schuldgefühl kommt nicht von einer realen Schuld. Es kommt von irgendwo anders. Und das ist der Ausgangspunkt.</w:t>
       </w:r>
     </w:p>
     <w:p>
@@ -1685,7 +1769,7 @@
           <w:rFonts w:ascii="Georgia" w:hAnsi="Georgia"/>
           <w:sz w:val="22"/>
         </w:rPr>
-        <w:t>Nicht gleich. Zuerst schaut sie ihn nur kurz an, nimmt die Stimmung wahr. Dann fragt sie vorsichtig ob alles gut ist. Er sagt „Ja." Aber das Ja klingt nicht wie Ja. Es klingt wie etwas, das er sagt damit sie aufhört zu fragen.</w:t>
+        <w:t>Nicht gleich. Zuerst schaut sie ihn nur kurz an, nimmt die Stimmung wahr. Dann fragt sie vorsichtig, ob alles gut ist. Er sagt „Ja." Aber das Ja klingt nicht wie Ja. Es klingt wie etwas, das er sagt, damit sie aufhört zu fragen.</w:t>
       </w:r>
     </w:p>
     <w:p>
@@ -1721,19 +1805,19 @@
           <w:rFonts w:ascii="Georgia" w:hAnsi="Georgia"/>
           <w:sz w:val="22"/>
         </w:rPr>
-        <w:t>Sie geht innerlich die letzten Stunden durch. Jeden Satz. Jede Reaktion. Jeden Moment wo etwas nicht ganz stimmte. Bis sie etwas findet. Irgendetwas findet sich immer.</w:t>
-      </w:r>
-    </w:p>
-    <w:p>
-      <w:pPr>
-        <w:spacing w:after="160" w:line="320" w:lineRule="exact"/>
-      </w:pPr>
-      <w:r>
-        <w:rPr>
-          <w:rFonts w:ascii="Georgia" w:hAnsi="Georgia"/>
-          <w:sz w:val="22"/>
-        </w:rPr>
-        <w:t>Monika glaubt, dass sie für die Stimmung ihres Mannes verantwortlich ist. Nicht bewusst — sie würde das nie so formulieren. Aber ihr Nervensystem handelt entsprechend. Wenn er gut gelaunt ist, ist sie entspannt. Wenn er still ist, ist sie in Alarmbereitschaft. Ihr innerer Zustand ist an seinen äusseren Ausdruck gekoppelt, Tag für Tag.</w:t>
+        <w:t>Sie geht innerlich die letzten Stunden durch. Jeden Satz. Jede Reaktion. Jeden Moment, wo etwas nicht ganz stimmte. Bis sie etwas findet. Irgendetwas findet sich immer.</w:t>
+      </w:r>
+    </w:p>
+    <w:p>
+      <w:pPr>
+        <w:spacing w:after="160" w:line="320" w:lineRule="exact"/>
+      </w:pPr>
+      <w:r>
+        <w:rPr>
+          <w:rFonts w:ascii="Georgia" w:hAnsi="Georgia"/>
+          <w:sz w:val="22"/>
+        </w:rPr>
+        <w:t>Monika glaubt, dass sie für die Stimmung ihres Mannes verantwortlich ist. Nicht bewusst — sie würde das nie so formulieren. Aber ihr Nervensystem handelt entsprechend. Wenn er gut gelaunt ist, ist sie entspannt. Wenn er still ist, ist sie in Alarmbereitschaft. Ihr innerer Zustand ist an seinen äusseren Ausdruck gekoppelt. Tag für Tag. Seit Jahren.</w:t>
       </w:r>
     </w:p>
     <w:p>
@@ -1757,67 +1841,55 @@
           <w:rFonts w:ascii="Georgia" w:hAnsi="Georgia"/>
           <w:sz w:val="22"/>
         </w:rPr>
-        <w:t>In einer Kindheit, in der die Stimmung anderer Menschen mit der eigenen Sicherheit verknüpft war, lernt das Kind: Ich muss die Stimmung der Erwachsenen lesen. Wenn Papa gute Laune hat, ist alles gut. Wenn Mama schweigt, könnte gleich etwas passieren. Das Kind entwickelt eine feine Antenne für Stimmungen, eine fast sensorische Empfindlichkeit für die Atmosphäre in einem Raum.</w:t>
-      </w:r>
-    </w:p>
-    <w:p>
-      <w:pPr>
-        <w:spacing w:after="160" w:line="320" w:lineRule="exact"/>
-      </w:pPr>
-      <w:r>
-        <w:rPr>
-          <w:rFonts w:ascii="Georgia" w:hAnsi="Georgia"/>
-          <w:sz w:val="22"/>
-        </w:rPr>
-        <w:t>Das war damals überlebenswichtig. Das Kind hat daraus gelernt, wann es besser ist unsichtbar zu sein, wann es gut ist zu helfen, wann es besser ist die Mutter abzulenken.</w:t>
-      </w:r>
-    </w:p>
-    <w:p>
-      <w:pPr>
-        <w:spacing w:after="160" w:line="320" w:lineRule="exact"/>
-      </w:pPr>
-      <w:r>
-        <w:rPr>
-          <w:rFonts w:ascii="Georgia" w:hAnsi="Georgia"/>
-          <w:sz w:val="22"/>
-        </w:rPr>
-        <w:t>Im Erwachsenenleben übersetzt sich das: Ich bin verantwortlich dafür, wie andere sich fühlen. Wenn jemand in meiner Nähe unglücklich ist, habe ich etwas falsch gemacht — oder ich muss etwas tun.</w:t>
-      </w:r>
-    </w:p>
-    <w:p>
-      <w:pPr>
-        <w:spacing w:after="160" w:line="320" w:lineRule="exact"/>
-      </w:pPr>
-      <w:r>
-        <w:rPr>
-          <w:rFonts w:ascii="Georgia" w:hAnsi="Georgia"/>
-          <w:sz w:val="22"/>
-        </w:rPr>
-        <w:t>Das ist der Mechanismus, durch den das schlechte Gewissen in Beziehungen so mächtig wird.</w:t>
-      </w:r>
-    </w:p>
-    <w:p>
-      <w:pPr>
-        <w:spacing w:after="160" w:line="320" w:lineRule="exact"/>
-      </w:pPr>
-      <w:r>
-        <w:rPr>
-          <w:rFonts w:ascii="Georgia" w:hAnsi="Georgia"/>
-          <w:sz w:val="22"/>
-        </w:rPr>
-        <w:t>Und er wird manchmal — nicht immer bewusst — von der anderen Person verstärkt.</w:t>
-      </w:r>
-    </w:p>
-    <w:p>
-      <w:pPr>
-        <w:spacing w:after="160" w:line="320" w:lineRule="exact"/>
-      </w:pPr>
-      <w:r>
-        <w:rPr>
-          <w:rFonts w:ascii="Georgia" w:hAnsi="Georgia"/>
-          <w:sz w:val="22"/>
-        </w:rPr>
-        <w:t>Das bedeutet nicht, dass Monikas Mann ein schlechter Mensch ist. Aber Schweigen, Enttäuschung, schlechte Stimmung als Reaktion auf das, was du tust oder nicht tust, wirkt auf jemanden wie Monika wie ein Vorwurf. Auch wenn keiner ausgesprochen wird. Es braucht keine Worte. Es braucht nur die Stimmung.</w:t>
+        <w:t>In einer Kindheit, in der die Stimmung anderer Menschen mit der eigenen Sicherheit verknüpft war, lernt das Kind: Ich muss die Stimmung der Erwachsenen lesen. Wenn Papa gute Laune hat, ist alles gut. Wenn Mama schweigt, könnte gleich etwas passieren. Das Kind entwickelt eine feine Antenne für Atmosphären, eine fast sensorische Empfindlichkeit für das emotionale Klima in einem Raum. Es weiss, wie jemand die Tür zumacht, ob der Abend schwierig werden wird. Es hört das Schweigen anders als andere.</w:t>
+      </w:r>
+    </w:p>
+    <w:p>
+      <w:pPr>
+        <w:spacing w:after="160" w:line="320" w:lineRule="exact"/>
+      </w:pPr>
+      <w:r>
+        <w:rPr>
+          <w:rFonts w:ascii="Georgia" w:hAnsi="Georgia"/>
+          <w:sz w:val="22"/>
+        </w:rPr>
+        <w:t>Das war damals überlebenswichtig. Das Kind hat gelernt, wann es besser ist, unsichtbar zu sein, wann es gut ist zu helfen, wann es besser ist die Mutter abzulenken, den Vater zu besänftigen.</w:t>
+      </w:r>
+    </w:p>
+    <w:p>
+      <w:pPr>
+        <w:spacing w:after="160" w:line="320" w:lineRule="exact"/>
+      </w:pPr>
+      <w:r>
+        <w:rPr>
+          <w:rFonts w:ascii="Georgia" w:hAnsi="Georgia"/>
+          <w:sz w:val="22"/>
+        </w:rPr>
+        <w:t>Im Erwachsenenleben übersetzt sich das: Ich bin verantwortlich dafür, wie andere sich fühlen. Wenn jemand in meiner Nähe unglücklich ist, habe ich etwas falsch gemacht — oder ich muss etwas tun. Jetzt.</w:t>
+      </w:r>
+    </w:p>
+    <w:p>
+      <w:pPr>
+        <w:spacing w:after="160" w:line="320" w:lineRule="exact"/>
+      </w:pPr>
+      <w:r>
+        <w:rPr>
+          <w:rFonts w:ascii="Georgia" w:hAnsi="Georgia"/>
+          <w:sz w:val="22"/>
+        </w:rPr>
+        <w:t>Das ist der Mechanismus, durch den das schlechte Gewissen in Beziehungen so mächtig wird. Und er wird manchmal — nicht immer bewusst — von der anderen Person verstärkt.</w:t>
+      </w:r>
+    </w:p>
+    <w:p>
+      <w:pPr>
+        <w:spacing w:after="160" w:line="320" w:lineRule="exact"/>
+      </w:pPr>
+      <w:r>
+        <w:rPr>
+          <w:rFonts w:ascii="Georgia" w:hAnsi="Georgia"/>
+          <w:sz w:val="22"/>
+        </w:rPr>
+        <w:t>Das bedeutet nicht, dass Monikas Mann ein schlechter Mensch ist. Aber Schweigen, Enttäuschung, schlechte Stimmung als Reaktion auf das, was du tust oder nicht tust, wirkt auf jemanden wie Monika wie ein stummer Vorwurf. Auch wenn keiner ausgesprochen wird. Es braucht keine Worte. Es braucht nur die Stimmung.</w:t>
       </w:r>
     </w:p>
     <w:p>
@@ -1841,31 +1913,19 @@
           <w:rFonts w:ascii="Georgia" w:hAnsi="Georgia"/>
           <w:sz w:val="22"/>
         </w:rPr>
-        <w:t>Es gibt Beziehungen, in denen dieses System sehr stabil funktioniert — für eine Seite. Eine Person übernimmt die emotionale Verantwortung für die andere, die andere muss sich nie um ihre eigene Regulierung kümmern, weil jemand anderes das erledigt. Das System hält sich selbst aufrecht, weil es für beide auf eine Art bequem ist. Nur dass die eine Person dabei sehr viel mehr zahlt als die andere.</w:t>
-      </w:r>
-    </w:p>
-    <w:p>
-      <w:pPr>
-        <w:spacing w:after="160" w:line="320" w:lineRule="exact"/>
-      </w:pPr>
-      <w:r>
-        <w:rPr>
-          <w:rFonts w:ascii="Georgia" w:hAnsi="Georgia"/>
-          <w:sz w:val="22"/>
-        </w:rPr>
-        <w:t>Was hilft Monika?</w:t>
-      </w:r>
-    </w:p>
-    <w:p>
-      <w:pPr>
-        <w:spacing w:after="160" w:line="320" w:lineRule="exact"/>
-      </w:pPr>
-      <w:r>
-        <w:rPr>
-          <w:rFonts w:ascii="Georgia" w:hAnsi="Georgia"/>
-          <w:sz w:val="22"/>
-        </w:rPr>
-        <w:t>Nicht mehr Geben. Nicht mehr Erklären. Nicht mehr Suchen.</w:t>
+        <w:t>Es gibt Beziehungen, in denen dieses System sehr stabil funktioniert — für eine Seite. Eine Person übernimmt die emotionale Verantwortung für die andere, die andere muss sich nie um ihre eigene Regulation kümmern, weil jemand anderes das erledigt. Das System hält sich selbst aufrecht, weil es für beide auf eine Art bequem ist. Nur dass die eine Person dabei sehr viel mehr zahlt als die andere. Und irgendwann ist das Konto leer.</w:t>
+      </w:r>
+    </w:p>
+    <w:p>
+      <w:pPr>
+        <w:spacing w:after="160" w:line="320" w:lineRule="exact"/>
+      </w:pPr>
+      <w:r>
+        <w:rPr>
+          <w:rFonts w:ascii="Georgia" w:hAnsi="Georgia"/>
+          <w:sz w:val="22"/>
+        </w:rPr>
+        <w:t>Was hilft Monika? Nicht mehr Geben. Nicht mehr Erklären. Nicht mehr Suchen.</w:t>
       </w:r>
     </w:p>
     <w:p>
@@ -1925,19 +1985,43 @@
           <w:rFonts w:ascii="Georgia" w:hAnsi="Georgia"/>
           <w:sz w:val="22"/>
         </w:rPr>
-        <w:t>Was weiss ich sicher? Dass er schweigt. Dass etwas in ihm gerade beschäftigt oder schwer ist. Das ist vielleicht alles.</w:t>
-      </w:r>
-    </w:p>
-    <w:p>
-      <w:pPr>
-        <w:spacing w:after="160" w:line="320" w:lineRule="exact"/>
-      </w:pPr>
-      <w:r>
-        <w:rPr>
-          <w:rFonts w:ascii="Georgia" w:hAnsi="Georgia"/>
-          <w:sz w:val="22"/>
-        </w:rPr>
-        <w:t>Die Stimmung des anderen als Information, nicht als Schuldzuweisung. Das ist der Unterschied, der einen riesigen Unterschied macht.</w:t>
+        <w:t>Was weiss ich sicher? Dass er schweigt. Dass etwas in ihm gerade beschäftigt oder schwer ist. Vielleicht Arbeit. Vielleicht Müdigkeit. Vielleicht etwas, das er selbst noch nicht in Worte fassen kann.</w:t>
+      </w:r>
+    </w:p>
+    <w:p>
+      <w:pPr>
+        <w:spacing w:after="160" w:line="320" w:lineRule="exact"/>
+      </w:pPr>
+      <w:r>
+        <w:rPr>
+          <w:rFonts w:ascii="Georgia" w:hAnsi="Georgia"/>
+          <w:sz w:val="22"/>
+        </w:rPr>
+        <w:t>Die Stimmung des anderen als Information, nicht als Schuldzuweisung. Das klingt einfach. Es ist es nicht. Für jemanden, der jahrelang die Stimmung anderer als Signal für die eigene Schuld gelesen hat, ist das eine grundlegende Neuprogrammierung.</w:t>
+      </w:r>
+    </w:p>
+    <w:p>
+      <w:pPr>
+        <w:spacing w:after="160" w:line="320" w:lineRule="exact"/>
+      </w:pPr>
+      <w:r>
+        <w:rPr>
+          <w:rFonts w:ascii="Georgia" w:hAnsi="Georgia"/>
+          <w:sz w:val="22"/>
+        </w:rPr>
+        <w:t>Aber es beginnt mit dieser einen Frage: Ist das meins?</w:t>
+      </w:r>
+    </w:p>
+    <w:p>
+      <w:pPr>
+        <w:spacing w:after="160" w:line="320" w:lineRule="exact"/>
+      </w:pPr>
+      <w:r>
+        <w:rPr>
+          <w:rFonts w:ascii="Georgia" w:hAnsi="Georgia"/>
+          <w:sz w:val="22"/>
+        </w:rPr>
+        <w:t>Oft ist es das nicht. Und wenn es das nicht ist, darf man es stehen lassen.</w:t>
       </w:r>
     </w:p>
     <w:p>
@@ -1976,7 +2060,7 @@
           <w:i/>
           <w:sz w:val="22"/>
         </w:rPr>
-        <w:t>Was passiert in dir, wenn jemand dem du nahe bist, schlechte Laune hat?</w:t>
+        <w:t>Was passiert in dir, wenn jemand, dem du nahe bist, schlechte Laune hat?</w:t>
       </w:r>
     </w:p>
     <w:p>
@@ -2047,43 +2131,43 @@
           <w:rFonts w:ascii="Georgia" w:hAnsi="Georgia"/>
           <w:sz w:val="22"/>
         </w:rPr>
-        <w:t>An den Tagen an denen sie arbeitet, denkt sie an ihre Kinder. Ob sie gut in der Kita angekommen sind. Ob die Kleine geweint hat. Ob ihr Grosser sich wünscht dass sie da wäre. An den Abenden an denen sie müde nach Hause kommt und nicht mehr spielen kann, denkt sie: Ich war nicht genug da.</w:t>
-      </w:r>
-    </w:p>
-    <w:p>
-      <w:pPr>
-        <w:spacing w:after="160" w:line="320" w:lineRule="exact"/>
-      </w:pPr>
-      <w:r>
-        <w:rPr>
-          <w:rFonts w:ascii="Georgia" w:hAnsi="Georgia"/>
-          <w:sz w:val="22"/>
-        </w:rPr>
-        <w:t>An den Tagen an denen sie zu Hause ist, fragt sie sich ob sie genug arbeitet. Ob sie ihrer Karriere schadet. Ob sie ein schlechtes Vorbild ist, weil sie nicht zeigt dass Frauen beides können. An Abenden wo das Essen nicht selbst gekocht ist, denkt sie: Ich hätte das heute Morgen vorbereiten können.</w:t>
-      </w:r>
-    </w:p>
-    <w:p>
-      <w:pPr>
-        <w:spacing w:after="160" w:line="320" w:lineRule="exact"/>
-      </w:pPr>
-      <w:r>
-        <w:rPr>
-          <w:rFonts w:ascii="Georgia" w:hAnsi="Georgia"/>
-          <w:sz w:val="22"/>
-        </w:rPr>
-        <w:t>Sie fühlt sich schuldig wenn sie arbeitet. Sie fühlt sich schuldig wenn sie zu Hause ist. Sie fühlt sich schuldig wenn sie abends erschöpft ist und nicht mehr lesen kann. Wenn sie kurz angebunden ist. Wenn die Kinder zu lange auf dem Tablet waren. Wenn der Kindergeburtstag nicht selbst gebastelt war.</w:t>
-      </w:r>
-    </w:p>
-    <w:p>
-      <w:pPr>
-        <w:spacing w:after="160" w:line="320" w:lineRule="exact"/>
-      </w:pPr>
-      <w:r>
-        <w:rPr>
-          <w:rFonts w:ascii="Georgia" w:hAnsi="Georgia"/>
-          <w:sz w:val="22"/>
-        </w:rPr>
-        <w:t>Lisa schläft im Durchschnitt sechs Stunden. Ihr Partner schläft sieben. Er macht sich, soweit sie es beurteilen kann, keine ernsthaften Gedanken darüber ob er ein guter Vater ist. Er ist einfach da, wenn er da ist, und das scheint zu reichen — für ihn und für die Kinder.</w:t>
+        <w:t>An den Tagen, an denen sie arbeitet, denkt sie an ihre Kinder. Ob sie gut in der Kita angekommen sind. Ob die Kleine geweint hat. Ob ihr Grosser sich wünscht, dass sie da wäre. An den Abenden, an denen sie müde nach Hause kommt und nicht mehr spielen kann, denkt sie: Ich war nicht genug da.</w:t>
+      </w:r>
+    </w:p>
+    <w:p>
+      <w:pPr>
+        <w:spacing w:after="160" w:line="320" w:lineRule="exact"/>
+      </w:pPr>
+      <w:r>
+        <w:rPr>
+          <w:rFonts w:ascii="Georgia" w:hAnsi="Georgia"/>
+          <w:sz w:val="22"/>
+        </w:rPr>
+        <w:t>An den Tagen, an denen sie zu Hause ist, fragt sie sich, ob sie genug arbeitet. Ob sie ihrer Karriere schadet. Ob sie ein schlechtes Vorbild ist, weil sie nicht zeigt, dass Frauen beides können. An Abenden, wo das Essen nicht selbst gekocht ist, denkt sie: Ich hätte das heute Morgen vorbereiten können.</w:t>
+      </w:r>
+    </w:p>
+    <w:p>
+      <w:pPr>
+        <w:spacing w:after="160" w:line="320" w:lineRule="exact"/>
+      </w:pPr>
+      <w:r>
+        <w:rPr>
+          <w:rFonts w:ascii="Georgia" w:hAnsi="Georgia"/>
+          <w:sz w:val="22"/>
+        </w:rPr>
+        <w:t>Sie fühlt sich schuldig, wenn sie arbeitet. Sie fühlt sich schuldig, wenn sie zu Hause ist. Sie fühlt sich schuldig, wenn sie abends erschöpft ist und nicht mehr lesen kann. Wenn sie kurz angebunden ist. Wenn die Kinder zu lange auf dem Tablet waren. Wenn der Kindergeburtstag nicht selbst gebastelt war. Wenn sie das falsche Müsli gekauft hat.</w:t>
+      </w:r>
+    </w:p>
+    <w:p>
+      <w:pPr>
+        <w:spacing w:after="160" w:line="320" w:lineRule="exact"/>
+      </w:pPr>
+      <w:r>
+        <w:rPr>
+          <w:rFonts w:ascii="Georgia" w:hAnsi="Georgia"/>
+          <w:sz w:val="22"/>
+        </w:rPr>
+        <w:t>Lisa schläft im Durchschnitt sechs Stunden. Ihr Partner schläft sieben. Er macht sich, soweit sie es beurteilen kann, keine ernsthaften Gedanken darüber, ob er ein guter Vater ist. Er ist einfach da, wenn er da ist, und das scheint zu reichen — für ihn und für die Kinder.</w:t>
       </w:r>
     </w:p>
     <w:p>
@@ -2107,19 +2191,19 @@
           <w:rFonts w:ascii="Georgia" w:hAnsi="Georgia"/>
           <w:sz w:val="22"/>
         </w:rPr>
-        <w:t>Das Mutter-Schuldgefühl ist nicht nur ein persönliches Problem. Es ist in einem erschreckenden Ausmass ein gesellschaftliches Konstrukt.</w:t>
-      </w:r>
-    </w:p>
-    <w:p>
-      <w:pPr>
-        <w:spacing w:after="160" w:line="320" w:lineRule="exact"/>
-      </w:pPr>
-      <w:r>
-        <w:rPr>
-          <w:rFonts w:ascii="Georgia" w:hAnsi="Georgia"/>
-          <w:sz w:val="22"/>
-        </w:rPr>
-        <w:t>Mütter werden mit einem Bild konfrontiert, das unmöglich zu erfüllen ist. Präsent, aber nicht erdrückend. Berufstätig, aber nicht abwesend. Grenzen setzend, aber nie hart. Nährend, aber nicht überbehütend. Geduldig, immer. Freudig, meistens. Mit sich selbst im Reinen, was auch immer das bedeutet.</w:t>
+        <w:t>Das Mutterschuldgefühl ist nicht nur ein persönliches Problem. Es ist in einem erschreckenden Ausmass ein gesellschaftliches Konstrukt.</w:t>
+      </w:r>
+    </w:p>
+    <w:p>
+      <w:pPr>
+        <w:spacing w:after="160" w:line="320" w:lineRule="exact"/>
+      </w:pPr>
+      <w:r>
+        <w:rPr>
+          <w:rFonts w:ascii="Georgia" w:hAnsi="Georgia"/>
+          <w:sz w:val="22"/>
+        </w:rPr>
+        <w:t>Mütter werden mit einem Bild konfrontiert, das unmöglich zu erfüllen ist. Präsent, aber nicht erdrückend. Berufstätig, aber nicht abwesend. Grenzen setzend, aber nie hart. Nährend, aber nicht überbehütend. Geduldig, immer. Freudig, meistens. Mit sich selbst im Reinen. Schlanke Handgelenke, voller Kühlschrank, aufgeräumtes Haus, zufriedene Kinder, ausgeglichene Ehe, erfüllender Job.</w:t>
       </w:r>
     </w:p>
     <w:p>
@@ -2155,43 +2239,55 @@
           <w:rFonts w:ascii="Georgia" w:hAnsi="Georgia"/>
           <w:sz w:val="22"/>
         </w:rPr>
-        <w:t>Nicht perfekte Mütter. Die Forschung ist da sehr klar. Kinder brauchen keine perfekte Mutter — sie brauchen eine ausreichend gute. Das Konzept des „good enough mother" kommt vom Kinderpsychiater Donald Winnicott und ist eines der befreiendsten, die ich je gelesen habe. Es besagt: Nicht Perfektion ist das Ziel. Ausreichende Feinfühligkeit, ausreichende Verlässlichkeit, ausreichende Verfügbarkeit. Ausreichend.</w:t>
-      </w:r>
-    </w:p>
-    <w:p>
-      <w:pPr>
-        <w:spacing w:after="160" w:line="320" w:lineRule="exact"/>
-      </w:pPr>
-      <w:r>
-        <w:rPr>
-          <w:rFonts w:ascii="Georgia" w:hAnsi="Georgia"/>
-          <w:sz w:val="22"/>
-        </w:rPr>
-        <w:t>Kinder brauchen Mütter die in der Lage sind, Fehler zu machen und sich zu entschuldigen. Die zeigen, dass man sich irren kann und weitermacht. Die vorleben, dass Erschöpfung kein Versagen ist. Die demonstrieren, dass eine Frau Bedürfnisse hat und dass diese Bedürfnisse legitim sind.</w:t>
-      </w:r>
-    </w:p>
-    <w:p>
-      <w:pPr>
-        <w:spacing w:after="160" w:line="320" w:lineRule="exact"/>
-      </w:pPr>
-      <w:r>
-        <w:rPr>
-          <w:rFonts w:ascii="Georgia" w:hAnsi="Georgia"/>
-          <w:sz w:val="22"/>
-        </w:rPr>
-        <w:t>Die beste Sache, die du deinen Kindern zeigen kannst, ist wie eine Frau mit sich selbst umgeht. Was sie sich erlaubt. Wo sie Grenzen setzt. Wie sie auf eigene Bedürfnisse reagiert.</w:t>
-      </w:r>
-    </w:p>
-    <w:p>
-      <w:pPr>
-        <w:spacing w:after="160" w:line="320" w:lineRule="exact"/>
-      </w:pPr>
-      <w:r>
-        <w:rPr>
-          <w:rFonts w:ascii="Georgia" w:hAnsi="Georgia"/>
-          <w:sz w:val="22"/>
-        </w:rPr>
-        <w:t>Wenn du dich pausenlos schuldig fühlst und dich immer weiter aufreibst, lernst du ihnen, dass Frauen sich so zu behandeln haben.</w:t>
+        <w:t>Nicht perfekte Mütter. Die Forschung ist da sehr klar. Kinder brauchen keine perfekte Mutter — sie brauchen eine ausreichend gute. Das Konzept des „good enough mother" kommt vom britischen Kinderpsychiater Donald Winnicott und ist eines der befreiendsten, die ich je gelesen habe. Es besagt: Nicht Perfektion ist das Ziel. Ausreichende Feinfühligkeit, ausreichende Verlässlichkeit, ausreichende Verfügbarkeit. Ausreichend. Nicht immer, nicht alles — ausreichend.</w:t>
+      </w:r>
+    </w:p>
+    <w:p>
+      <w:pPr>
+        <w:spacing w:after="160" w:line="320" w:lineRule="exact"/>
+      </w:pPr>
+      <w:r>
+        <w:rPr>
+          <w:rFonts w:ascii="Georgia" w:hAnsi="Georgia"/>
+          <w:sz w:val="22"/>
+        </w:rPr>
+        <w:t>Winnicott beschrieb auch das Konzept der „graduated failures" — der graduellen kleinen Misserfolge, die unvermeidlich sind und die Kindern sogar helfen, Enttäuschung zu verarbeiten und Resilienz zu entwickeln. Die Mutter, die nicht sofort auf jeden Ruf reagiert. Der Vater, der zu müde ist für das dritte Spiel hintereinander. Diese Momente sind keine Traumata. Sie sind Teil des Aufwachsens.</w:t>
+      </w:r>
+    </w:p>
+    <w:p>
+      <w:pPr>
+        <w:spacing w:after="160" w:line="320" w:lineRule="exact"/>
+      </w:pPr>
+      <w:r>
+        <w:rPr>
+          <w:rFonts w:ascii="Georgia" w:hAnsi="Georgia"/>
+          <w:sz w:val="22"/>
+        </w:rPr>
+        <w:t>Kinder brauchen Mütter, die in der Lage sind, Fehler zu machen und sich zu entschuldigen. Die zeigen, dass man sich irren kann und weitermacht. Die vorleben, dass Erschöpfung kein Versagen ist. Die demonstrieren, dass eine Frau Bedürfnisse hat und dass diese Bedürfnisse legitim sind.</w:t>
+      </w:r>
+    </w:p>
+    <w:p>
+      <w:pPr>
+        <w:spacing w:after="160" w:line="320" w:lineRule="exact"/>
+      </w:pPr>
+      <w:r>
+        <w:rPr>
+          <w:rFonts w:ascii="Georgia" w:hAnsi="Georgia"/>
+          <w:sz w:val="22"/>
+        </w:rPr>
+        <w:t>Das Beste, das du deinen Kindern zeigen kannst, ist, wie eine Frau mit sich selbst umgeht. Was sie sich erlaubt. Wo sie Grenzen setzt. Wie sie auf eigene Bedürfnisse reagiert. Ob sie Nein sagen kann, ohne sich drei Tage dafür zu bestrafen.</w:t>
+      </w:r>
+    </w:p>
+    <w:p>
+      <w:pPr>
+        <w:spacing w:after="160" w:line="320" w:lineRule="exact"/>
+      </w:pPr>
+      <w:r>
+        <w:rPr>
+          <w:rFonts w:ascii="Georgia" w:hAnsi="Georgia"/>
+          <w:sz w:val="22"/>
+        </w:rPr>
+        <w:t>Wenn du dich pausenlos schuldig fühlst und dich immer weiter aufreibst, zeigst du deinen Kindern — besonders den Mädchen — wie Frauen sich zu behandeln haben. Nicht mit Worten. Mit dem, was du täglich tust.</w:t>
       </w:r>
     </w:p>
     <w:p>
@@ -2215,7 +2311,7 @@
           <w:rFonts w:ascii="Georgia" w:hAnsi="Georgia"/>
           <w:sz w:val="22"/>
         </w:rPr>
-        <w:t>Lisa braucht keine perfekte Lösung. Sie braucht die Erlaubnis, dass gut genug gut genug ist. Dass die Kinder Chips zum Abendessen haben dürfen, ohne dass das eine Aussage über ihre Qualität als Mutter ist. Dass sie abends müde sein darf. Dass sie drei Tage die Woche arbeiten darf, weil das stimmt.</w:t>
+        <w:t>Lisa braucht keine perfekte Lösung. Sie braucht die Erlaubnis, dass gut genug gut genug ist. Dass die Kinder Chips zum Abendessen haben dürfen, ohne dass das eine Aussage über ihre Qualität als Mutter ist. Dass sie abends müde sein darf. Dass sie drei Tage die Woche arbeiten darf, weil das stimmt. Dass ein Kindergeburtstag aus dem Supermarkt genauso gefeiert werden kann wie ein selbst gebackener.</w:t>
       </w:r>
     </w:p>
     <w:p>
@@ -2292,7 +2388,7 @@
           <w:i/>
           <w:sz w:val="22"/>
         </w:rPr>
-        <w:t>Was lernen deine Kinder von dir, wenn sie sehen wie du mit dir selbst umgehst?</w:t>
+        <w:t>Was lernen deine Kinder von dir, wenn sie sehen, wie du mit dir selbst umgehst?</w:t>
       </w:r>
     </w:p>
     <w:p>
@@ -2337,7 +2433,7 @@
           <w:rFonts w:ascii="Georgia" w:hAnsi="Georgia"/>
           <w:sz w:val="22"/>
         </w:rPr>
-        <w:t>Nicht weil sie immer will. Manchmal will sie. Manchmal würde sie lieber schlafen oder lesen oder einfach nichts tun. Aber sie ruft an, weil sie weiss was kommt wenn sie nicht anruft. Kein Vorwurf. Keine Diskussion. Nur ein leises „Ich habe nichts von dir gehört" beim nächsten Gespräch, gefolgt von einer kurzen Pause. Die Pause sagt mehr als jedes Wort.</w:t>
+        <w:t>Nicht weil sie immer will. Manchmal will sie. Manchmal würde sie lieber schlafen oder lesen oder einfach nichts tun. Aber sie ruft an, weil sie weiss, was kommt, wenn sie nicht anruft. Kein Vorwurf. Keine Diskussion. Nur ein leises „Ich habe nichts von dir gehört" beim nächsten Gespräch, gefolgt von einer kurzen Pause. Die Pause sagt mehr als jedes Wort.</w:t>
       </w:r>
     </w:p>
     <w:p>
@@ -2373,151 +2469,139 @@
           <w:rFonts w:ascii="Georgia" w:hAnsi="Georgia"/>
           <w:sz w:val="22"/>
         </w:rPr>
-        <w:t>Vera hat den Urlaub nicht abgesagt. Aber sie ist mit einem Rucksack voller Schuldgefühle gefahren und mit demselben Rucksack zurückgekehrt. Sie hat die Mutter zweimal angerufen während sie weg war, obwohl das nie verabredet war. Sie hat Postkarten gekauft, die sie noch nie gekauft hätte. Sie hat sich im Nachhinein gefragt ob es richtig war zu fahren.</w:t>
-      </w:r>
-    </w:p>
-    <w:p>
-      <w:pPr>
-        <w:spacing w:after="160" w:line="320" w:lineRule="exact"/>
-      </w:pPr>
-      <w:r>
-        <w:rPr>
-          <w:rFonts w:ascii="Georgia" w:hAnsi="Georgia"/>
-          <w:sz w:val="22"/>
-        </w:rPr>
-        <w:t>Familiäre Schuldgefühle gehören zu den zähesten. Weil die Familie der erste Ort war, an dem wir Zugehörigkeit erlebt haben. Und weil die Regeln die dort gelten, nie explizit gemacht wurden — man hat sie einfach gelernt, indem man darin aufgewachsen ist.</w:t>
-      </w:r>
-    </w:p>
-    <w:p>
-      <w:pPr>
-        <w:spacing w:after="160" w:line="320" w:lineRule="exact"/>
-      </w:pPr>
-      <w:r>
-        <w:rPr>
-          <w:rFonts w:ascii="Georgia" w:hAnsi="Georgia"/>
-          <w:sz w:val="22"/>
-        </w:rPr>
-        <w:t>Manche Regeln sind ausgesprochen: „Wir halten zusammen." „Familie kommt zuerst." „Man verlässt die Familie nicht." Manche sind unausgesprochen, aber genauso mächtig: Wer eigene Wünsche hat, ist egoistisch. Wer weggeht, lässt uns im Stich. Wer Grenzen setzt, liebt nicht genug.</w:t>
-      </w:r>
-    </w:p>
-    <w:p>
-      <w:pPr>
-        <w:spacing w:after="160" w:line="320" w:lineRule="exact"/>
-      </w:pPr>
-      <w:r>
-        <w:rPr>
-          <w:rFonts w:ascii="Georgia" w:hAnsi="Georgia"/>
-          <w:sz w:val="22"/>
-        </w:rPr>
-        <w:t>Diese Regeln werden nicht hinterfragt, weil man sie nie von aussen betrachtet hat. Sie sind einfach da.</w:t>
-      </w:r>
-    </w:p>
-    <w:p>
-      <w:pPr>
-        <w:spacing w:after="160" w:line="320" w:lineRule="exact"/>
-      </w:pPr>
-      <w:r>
-        <w:rPr>
-          <w:rFonts w:ascii="Georgia" w:hAnsi="Georgia"/>
-          <w:sz w:val="22"/>
-        </w:rPr>
-        <w:t>Es gibt ein psychologisches Konzept, das ich hier hilfreich finde: das Familiensystem. Jede Familie hat ein System, bestehte aus ungeschriebenen Rollen, Regeln und Mustern. Wer rebelliert, verletzt das System. Das System setzt sich zur Wehr.</w:t>
-      </w:r>
-    </w:p>
-    <w:p>
-      <w:pPr>
-        <w:spacing w:after="160" w:line="320" w:lineRule="exact"/>
-      </w:pPr>
-      <w:r>
-        <w:rPr>
-          <w:rFonts w:ascii="Georgia" w:hAnsi="Georgia"/>
-          <w:sz w:val="22"/>
-        </w:rPr>
-        <w:t>Nicht unbedingt durch offene Konfrontation. Manchmal durch Schweigen. Manchmal durch einen bestimmten Satz. Manchmal durch eine kurze Pause, die alles sagt.</w:t>
-      </w:r>
-    </w:p>
-    <w:p>
-      <w:pPr>
-        <w:spacing w:after="160" w:line="320" w:lineRule="exact"/>
-      </w:pPr>
-      <w:r>
-        <w:rPr>
-          <w:rFonts w:ascii="Georgia" w:hAnsi="Georgia"/>
-          <w:sz w:val="22"/>
-        </w:rPr>
-        <w:t>Das Interessante: Diese Rückmeldung des Systems muss gar nicht manipulativ gemeint sein. Veras Mutter mag wirklich einsam sein. Sie mag wirklich wünschen, dass Vera mehr da ist. Das sind echte Gefühle.</w:t>
-      </w:r>
-    </w:p>
-    <w:p>
-      <w:pPr>
-        <w:spacing w:after="160" w:line="320" w:lineRule="exact"/>
-      </w:pPr>
-      <w:r>
-        <w:rPr>
-          <w:rFonts w:ascii="Georgia" w:hAnsi="Georgia"/>
-          <w:sz w:val="22"/>
-        </w:rPr>
-        <w:t>Aber das Ausdrücken dieser Gefühle so, dass Vera sich schuldig fühlt für Dinge die sie hat und die Mutter nicht hat, ist trotzdem problematisch. Nicht wegen der Absicht — sondern wegen der Wirkung.</w:t>
-      </w:r>
-    </w:p>
-    <w:p>
-      <w:pPr>
-        <w:spacing w:after="160" w:line="320" w:lineRule="exact"/>
-      </w:pPr>
-      <w:r>
-        <w:rPr>
-          <w:rFonts w:ascii="Georgia" w:hAnsi="Georgia"/>
-          <w:sz w:val="22"/>
-        </w:rPr>
-        <w:t>Vera muss nicht entscheiden ob ihre Mutter eine gute oder schlechte Person ist. Das ist nicht die Frage. Die Frage ist: Welche Regeln gelten in diesem System, und welche dieser Regeln möchte ich weiterhin befolgen?</w:t>
-      </w:r>
-    </w:p>
-    <w:p>
-      <w:pPr>
-        <w:spacing w:after="160" w:line="320" w:lineRule="exact"/>
-      </w:pPr>
-      <w:r>
-        <w:rPr>
-          <w:rFonts w:ascii="Georgia" w:hAnsi="Georgia"/>
-          <w:sz w:val="22"/>
-        </w:rPr>
-        <w:t>Manche familiären Erwartungen sind berechtigt. Aufmerksamkeit, Fürsorge, Verbundenheit — das sind legitime menschliche Bedürfnisse, auf beiden Seiten.</w:t>
-      </w:r>
-    </w:p>
-    <w:p>
-      <w:pPr>
-        <w:spacing w:after="160" w:line="320" w:lineRule="exact"/>
-      </w:pPr>
-      <w:r>
-        <w:rPr>
-          <w:rFonts w:ascii="Georgia" w:hAnsi="Georgia"/>
-          <w:sz w:val="22"/>
-        </w:rPr>
-        <w:t>Andere sind es nicht. Das Bedürfnis, dass Vera ihren Urlaub mit einem schlechten Gewissen verbringt, ist keine berechtigte Erwartung. Es ist ein Steuerungsmittel, ob bewusst eingesetzt oder nicht.</w:t>
-      </w:r>
-    </w:p>
-    <w:p>
-      <w:pPr>
-        <w:spacing w:after="160" w:line="320" w:lineRule="exact"/>
-      </w:pPr>
-      <w:r>
-        <w:rPr>
-          <w:rFonts w:ascii="Georgia" w:hAnsi="Georgia"/>
-          <w:sz w:val="22"/>
-        </w:rPr>
-        <w:t>Was Vera helfen könnte, ist zu verstehen: Sie darf Ja zur Mutter sagen und trotzdem Ja zu sich. Sie darf die Mutter lieben und trotzdem eigene Pläne haben. Beides gleichzeitig ist möglich.</w:t>
-      </w:r>
-    </w:p>
-    <w:p>
-      <w:pPr>
-        <w:spacing w:after="160" w:line="320" w:lineRule="exact"/>
-      </w:pPr>
-      <w:r>
-        <w:rPr>
-          <w:rFonts w:ascii="Georgia" w:hAnsi="Georgia"/>
-          <w:sz w:val="22"/>
-        </w:rPr>
-        <w:t>Und das Schuldgefühl, das sich meldet, wenn sie das tut, ist nicht das Signal dass sie falsch liegt. Es ist das Signal dass sie eine alte Regel bricht.</w:t>
+        <w:t>Vera hat den Urlaub nicht abgesagt. Aber sie ist mit einem Rucksack voller Schuldgefühle gefahren und mit demselben Rucksack zurückgekehrt. Sie hat die Mutter zweimal angerufen, während sie weg war, obwohl das nie verabredet war. Sie hat Postkarten gekauft, die sie noch nie gekauft hätte. Sie hat sich im Nachhinein gefragt, ob es richtig war zu fahren.</w:t>
+      </w:r>
+    </w:p>
+    <w:p>
+      <w:pPr>
+        <w:spacing w:after="160" w:line="320" w:lineRule="exact"/>
+      </w:pPr>
+      <w:r>
+        <w:rPr>
+          <w:rFonts w:ascii="Georgia" w:hAnsi="Georgia"/>
+          <w:sz w:val="22"/>
+        </w:rPr>
+        <w:t>Familiäre Schuldgefühle gehören zu den zähesten. Weil die Familie der erste Ort war, an dem wir Zugehörigkeit erlebt haben. Und weil die Regeln, die dort gelten, nie explizit gemacht wurden — man hat sie einfach gelernt, indem man darin aufgewachsen ist.</w:t>
+      </w:r>
+    </w:p>
+    <w:p>
+      <w:pPr>
+        <w:spacing w:after="160" w:line="320" w:lineRule="exact"/>
+      </w:pPr>
+      <w:r>
+        <w:rPr>
+          <w:rFonts w:ascii="Georgia" w:hAnsi="Georgia"/>
+          <w:sz w:val="22"/>
+        </w:rPr>
+        <w:t>Manche Regeln sind ausgesprochen: „Wir halten zusammen." „Familie kommt zuerst." Manche sind unausgesprochen, aber genauso mächtig: Wer eigene Wünsche hat, ist egoistisch. Wer weggeht, lässt uns im Stich. Wer Grenzen setzt, liebt nicht genug. Diese Regeln werden nicht hinterfragt, weil man sie nie von aussen betrachtet hat. Sie sind einfach da, wie die Möbel im Wohnzimmer.</w:t>
+      </w:r>
+    </w:p>
+    <w:p>
+      <w:pPr>
+        <w:spacing w:after="160" w:line="320" w:lineRule="exact"/>
+      </w:pPr>
+      <w:r>
+        <w:rPr>
+          <w:rFonts w:ascii="Georgia" w:hAnsi="Georgia"/>
+          <w:sz w:val="22"/>
+        </w:rPr>
+        <w:t>Es gibt ein psychologisches Konzept, das ich hier hilfreich finde: das Familiensystem. Jede Familie hat ein System, bestehend aus ungeschriebenen Rollen, Regeln und Mustern. Wer rebelliert, verletzt das System. Das System setzt sich zur Wehr. Nicht unbedingt durch offene Konfrontation. Manchmal durch Schweigen. Manchmal durch einen bestimmten Satz. Manchmal durch eine kurze Pause, die alles sagt.</w:t>
+      </w:r>
+    </w:p>
+    <w:p>
+      <w:pPr>
+        <w:spacing w:after="160" w:line="320" w:lineRule="exact"/>
+      </w:pPr>
+      <w:r>
+        <w:rPr>
+          <w:rFonts w:ascii="Georgia" w:hAnsi="Georgia"/>
+          <w:sz w:val="22"/>
+        </w:rPr>
+        <w:t>Das Interessante an diesem Konzept ist, dass es die Beteiligten entlastet: Es geht nicht um böse Absichten. Es geht um ein System, das sich selbst aufrechterhalten will. Die meisten familiären Muster sind nicht das Ergebnis von Bösartigkeit — sie sind das Ergebnis von Angst. Angst vor Verlust. Angst vor Verlassenwerden. Angst davor, dass sich etwas verändert, das sich vertraut anfühlt, auch wenn es nicht gut ist.</w:t>
+      </w:r>
+    </w:p>
+    <w:p>
+      <w:pPr>
+        <w:spacing w:after="160" w:line="320" w:lineRule="exact"/>
+      </w:pPr>
+      <w:r>
+        <w:rPr>
+          <w:rFonts w:ascii="Georgia" w:hAnsi="Georgia"/>
+          <w:sz w:val="22"/>
+        </w:rPr>
+        <w:t>Veras Mutter mag wirklich einsam sein. Sie mag wirklich wünschen, dass Vera mehr da ist. Das sind echte Gefühle.</w:t>
+      </w:r>
+    </w:p>
+    <w:p>
+      <w:pPr>
+        <w:spacing w:after="160" w:line="320" w:lineRule="exact"/>
+      </w:pPr>
+      <w:r>
+        <w:rPr>
+          <w:rFonts w:ascii="Georgia" w:hAnsi="Georgia"/>
+          <w:sz w:val="22"/>
+        </w:rPr>
+        <w:t>Aber das Ausdrücken dieser Gefühle so, dass Vera sich schuldig fühlt für Dinge, die sie hat und die Mutter nicht hat, ist trotzdem problematisch. Nicht wegen der Absicht — sondern wegen der Wirkung.</w:t>
+      </w:r>
+    </w:p>
+    <w:p>
+      <w:pPr>
+        <w:spacing w:after="160" w:line="320" w:lineRule="exact"/>
+      </w:pPr>
+      <w:r>
+        <w:rPr>
+          <w:rFonts w:ascii="Georgia" w:hAnsi="Georgia"/>
+          <w:sz w:val="22"/>
+        </w:rPr>
+        <w:t>Es gibt einen wichtigen Unterschied zwischen: „Ich vermisse dich, und das macht mir manchmal traurig" — und: „Ich bin ja allein hier, aber das macht nichts." Der erste Satz ist Verletzlichkeit. Er lädt zu Verbindung ein. Der zweite Satz ist eine Schuldzuweisung, verpackt als Verzicht.</w:t>
+      </w:r>
+    </w:p>
+    <w:p>
+      <w:pPr>
+        <w:spacing w:after="160" w:line="320" w:lineRule="exact"/>
+      </w:pPr>
+      <w:r>
+        <w:rPr>
+          <w:rFonts w:ascii="Georgia" w:hAnsi="Georgia"/>
+          <w:sz w:val="22"/>
+        </w:rPr>
+        <w:t>Vera muss nicht entscheiden, ob ihre Mutter eine gute oder schlechte Person ist. Das ist nicht die Frage. Die Frage ist: Welche Regeln gelten in diesem System, und welche dieser Regeln möchte ich weiterhin befolgen?</w:t>
+      </w:r>
+    </w:p>
+    <w:p>
+      <w:pPr>
+        <w:spacing w:after="160" w:line="320" w:lineRule="exact"/>
+      </w:pPr>
+      <w:r>
+        <w:rPr>
+          <w:rFonts w:ascii="Georgia" w:hAnsi="Georgia"/>
+          <w:sz w:val="22"/>
+        </w:rPr>
+        <w:t>Manche familiären Erwartungen sind berechtigt. Aufmerksamkeit, Fürsorge, Verbundenheit — das sind legitime menschliche Bedürfnisse, auf beiden Seiten. Andere sind es nicht. Das Bedürfnis, dass Vera ihren Urlaub mit einem schlechten Gewissen verbringt, ist keine berechtigte Erwartung. Es ist ein Steuerungsmittel, ob bewusst eingesetzt oder nicht.</w:t>
+      </w:r>
+    </w:p>
+    <w:p>
+      <w:pPr>
+        <w:spacing w:after="160" w:line="320" w:lineRule="exact"/>
+      </w:pPr>
+      <w:r>
+        <w:rPr>
+          <w:rFonts w:ascii="Georgia" w:hAnsi="Georgia"/>
+          <w:sz w:val="22"/>
+        </w:rPr>
+        <w:t>Was Vera helfen könnte, ist zu verstehen: Sie darf Ja zur Mutter sagen und trotzdem Ja zu sich. Sie darf die Mutter lieben und trotzdem eigene Pläne haben. Beides gleichzeitig ist möglich. Liebe schliesst Grenzen nicht aus — sie braucht sie.</w:t>
+      </w:r>
+    </w:p>
+    <w:p>
+      <w:pPr>
+        <w:spacing w:after="160" w:line="320" w:lineRule="exact"/>
+      </w:pPr>
+      <w:r>
+        <w:rPr>
+          <w:rFonts w:ascii="Georgia" w:hAnsi="Georgia"/>
+          <w:sz w:val="22"/>
+        </w:rPr>
+        <w:t>Und das Schuldgefühl, das sich meldet, wenn sie das tut, ist nicht das Signal, dass sie falsch liegt. Es ist das Signal, dass sie eine alte Regel bricht.</w:t>
       </w:r>
     </w:p>
     <w:p>
@@ -2639,19 +2723,19 @@
           <w:rFonts w:ascii="Georgia" w:hAnsi="Georgia"/>
           <w:sz w:val="22"/>
         </w:rPr>
-        <w:t>Ihre beste Freundin hatte sie gebeten, ihr beim Umzug zu helfen. Ein ganzes Wochenende. Karin hatte dieses Wochenende schon lange für sich reserviert. Sie war erschöpft, sie brauchte Ruhe, sie hatte nichts Besonderes geplant — nur Stille. Nur zwei Tage ohne Anforderungen.</w:t>
-      </w:r>
-    </w:p>
-    <w:p>
-      <w:pPr>
-        <w:spacing w:after="160" w:line="320" w:lineRule="exact"/>
-      </w:pPr>
-      <w:r>
-        <w:rPr>
-          <w:rFonts w:ascii="Georgia" w:hAnsi="Georgia"/>
-          <w:sz w:val="22"/>
-        </w:rPr>
-        <w:t>Sie sagte Nein. Sie schrieb es per Nachricht, mit einem kurzen ehrlichen Satz: „Ich kann dieses Wochenende nicht, ich brauche wirklich Erholung. Ich hoffe, du findest jemand anderen."</w:t>
+        <w:t>Ihre beste Freundin hatte sie gebeten, beim Umzug zu helfen. Ein ganzes Wochenende. Karin hatte dieses Wochenende schon lange für sich reserviert. Sie war erschöpft, sie brauchte Ruhe, sie hatte nichts Besonderes geplant — nur Stille. Nur zwei Tage ohne Anforderungen.</w:t>
+      </w:r>
+    </w:p>
+    <w:p>
+      <w:pPr>
+        <w:spacing w:after="160" w:line="320" w:lineRule="exact"/>
+      </w:pPr>
+      <w:r>
+        <w:rPr>
+          <w:rFonts w:ascii="Georgia" w:hAnsi="Georgia"/>
+          <w:sz w:val="22"/>
+        </w:rPr>
+        <w:t>Sie sagte Nein. Sie schrieb es per Nachricht, mit einem kurzen, ehrlichen Satz: „Ich kann dieses Wochenende nicht, ich brauche wirklich Erholung. Ich hoffe, du findest jemand anderen."</w:t>
       </w:r>
     </w:p>
     <w:p>
@@ -2711,7 +2795,7 @@
           <w:rFonts w:ascii="Georgia" w:hAnsi="Georgia"/>
           <w:sz w:val="22"/>
         </w:rPr>
-        <w:t>Sie überlegte ob sie nochmals schreiben sollte. Ob sie sich erklären sollte. Ob sie beim nächsten Mal besser helfen sollte, um das auszugleichen.</w:t>
+        <w:t>Sie überlegte, ob sie nochmals schreiben sollte. Ob sie sich erklären sollte. Ob sie beim nächsten Mal besser helfen sollte, um das auszugleichen.</w:t>
       </w:r>
     </w:p>
     <w:p>
@@ -2783,19 +2867,19 @@
           <w:rFonts w:ascii="Georgia" w:hAnsi="Georgia"/>
           <w:sz w:val="22"/>
         </w:rPr>
-        <w:t>Das Nervensystem hat über Jahre gespeichert: Wenn ich für andere da bin, bin ich sicher. Wenn ich Nein sage, riskiere ich Ablehnung, Enttäuschung, Liebesmangel. Das ist die Programmierung aus der Kindheit, die wir in Kapitel 2 besprochen haben.</w:t>
-      </w:r>
-    </w:p>
-    <w:p>
-      <w:pPr>
-        <w:spacing w:after="160" w:line="320" w:lineRule="exact"/>
-      </w:pPr>
-      <w:r>
-        <w:rPr>
-          <w:rFonts w:ascii="Georgia" w:hAnsi="Georgia"/>
-          <w:sz w:val="22"/>
-        </w:rPr>
-        <w:t>Wenn du Nein sagst, registriert das Nervensystem: Abweichung vom alten Muster. Alarm. Mögliche Gefahr. Und es sendet das Signal, das in solchen Situationen immer gesendet wurde: Schuldgefühl.</w:t>
+        <w:t>Das Nervensystem hat über Jahre gespeichert: Wenn ich für andere da bin, bin ich sicher. Wenn ich Nein sage, riskiere ich Ablehnung, Enttäuschung, den Verlust von Zugehörigkeit. Das ist die Programmierung aus der Kindheit, die wir in Kapitel 2 besprochen haben. Wenn du Nein sagst, registriert das Nervensystem: Abweichung vom alten Muster. Alarm. Mögliche Gefahr.</w:t>
+      </w:r>
+    </w:p>
+    <w:p>
+      <w:pPr>
+        <w:spacing w:after="160" w:line="320" w:lineRule="exact"/>
+      </w:pPr>
+      <w:r>
+        <w:rPr>
+          <w:rFonts w:ascii="Georgia" w:hAnsi="Georgia"/>
+          <w:sz w:val="22"/>
+        </w:rPr>
+        <w:t>Und es sendet das Signal, das in solchen Situationen immer gesendet wurde: Schuldgefühl.</w:t>
       </w:r>
     </w:p>
     <w:p>
@@ -2819,6 +2903,30 @@
           <w:rFonts w:ascii="Georgia" w:hAnsi="Georgia"/>
           <w:sz w:val="22"/>
         </w:rPr>
+        <w:t>Was wäre, wenn das Schuldgefühl nach dem Nein nicht bedeutet: „Du hast falsch gehandelt", sondern: „Du verlässt altes Terrain"?</w:t>
+      </w:r>
+    </w:p>
+    <w:p>
+      <w:pPr>
+        <w:spacing w:after="160" w:line="320" w:lineRule="exact"/>
+      </w:pPr>
+      <w:r>
+        <w:rPr>
+          <w:rFonts w:ascii="Georgia" w:hAnsi="Georgia"/>
+          <w:sz w:val="22"/>
+        </w:rPr>
+        <w:t>Was wäre, wenn es ein Zeichen von Wachstum wäre, kein Zeichen von Versagen?</w:t>
+      </w:r>
+    </w:p>
+    <w:p>
+      <w:pPr>
+        <w:spacing w:after="160" w:line="320" w:lineRule="exact"/>
+      </w:pPr>
+      <w:r>
+        <w:rPr>
+          <w:rFonts w:ascii="Georgia" w:hAnsi="Georgia"/>
+          <w:sz w:val="22"/>
+        </w:rPr>
         <w:t>Was hilft?</w:t>
       </w:r>
     </w:p>
@@ -2831,55 +2939,67 @@
           <w:rFonts w:ascii="Georgia" w:hAnsi="Georgia"/>
           <w:sz w:val="22"/>
         </w:rPr>
-        <w:t>Erstens: Verstehen, dass das Schuldgefühl kommen wird. Es ist kein Zeichen, dass das Nein falsch war. Es ist eine Vorhersage, die man machen kann: Ich werde Nein sagen, und danach werde ich mich schuldig fühlen. Das ist der Weg. Das gehört dazu.</w:t>
-      </w:r>
-    </w:p>
-    <w:p>
-      <w:pPr>
-        <w:spacing w:after="160" w:line="320" w:lineRule="exact"/>
-      </w:pPr>
-      <w:r>
-        <w:rPr>
-          <w:rFonts w:ascii="Georgia" w:hAnsi="Georgia"/>
-          <w:sz w:val="22"/>
-        </w:rPr>
-        <w:t>Zweitens: Beim Nein bleiben, auch wenn das Schuldgefühl sich meldet. Das ist das Einzige, was das Nervensystem langfristig überzeugt: Das Nein hat keine Katastrophe ausgelöst. Die Freundschaft besteht noch. Ich bin noch da.</w:t>
-      </w:r>
-    </w:p>
-    <w:p>
-      <w:pPr>
-        <w:spacing w:after="160" w:line="320" w:lineRule="exact"/>
-      </w:pPr>
-      <w:r>
-        <w:rPr>
-          <w:rFonts w:ascii="Georgia" w:hAnsi="Georgia"/>
-          <w:sz w:val="22"/>
-        </w:rPr>
-        <w:t>Drittens: Die Zeit geben, die es braucht. Karin hat drei Tage gebraucht. Beim nächsten Nein wird es vielleicht zwei Tage sein. Dann ein Tag. Das ist kein Versagen — das ist Lernen.</w:t>
-      </w:r>
-    </w:p>
-    <w:p>
-      <w:pPr>
-        <w:spacing w:after="160" w:line="320" w:lineRule="exact"/>
-      </w:pPr>
-      <w:r>
-        <w:rPr>
-          <w:rFonts w:ascii="Georgia" w:hAnsi="Georgia"/>
-          <w:sz w:val="22"/>
-        </w:rPr>
-        <w:t>Nein sagen und dabei ein schlechtes Gewissen haben ist nicht das Ziel. Das Ziel ist, beim Nein zu bleiben, auch mit dem schlechten Gewissen. Das Schuldgefühl darf da sein. Es muss nur nicht das Steuer übernehmen.</w:t>
-      </w:r>
-    </w:p>
-    <w:p>
-      <w:pPr>
-        <w:spacing w:after="160" w:line="320" w:lineRule="exact"/>
-      </w:pPr>
-      <w:r>
-        <w:rPr>
-          <w:rFonts w:ascii="Georgia" w:hAnsi="Georgia"/>
-          <w:sz w:val="22"/>
-        </w:rPr>
-        <w:t>Das ist der Unterschied.</w:t>
+        <w:t>Erstens: Verstehen, dass das Schuldgefühl kommen wird. Es ist kein Zeichen, dass das Nein falsch war. Es ist eine Vorhersage, die man machen kann: Ich werde Nein sagen, und danach werde ich mich schuldig fühlen. Das ist der Weg. Das gehört dazu. Es bedeutet, dass ich etwas Neues tue.</w:t>
+      </w:r>
+    </w:p>
+    <w:p>
+      <w:pPr>
+        <w:spacing w:after="160" w:line="320" w:lineRule="exact"/>
+      </w:pPr>
+      <w:r>
+        <w:rPr>
+          <w:rFonts w:ascii="Georgia" w:hAnsi="Georgia"/>
+          <w:sz w:val="22"/>
+        </w:rPr>
+        <w:t>Zweitens: Beim Nein bleiben, auch wenn das Schuldgefühl sich meldet. Das ist das Einzige, was das Nervensystem langfristig überzeugt: Das Nein hat keine Katastrophe ausgelöst. Die Freundschaft besteht noch. Ich bin noch da. Die Welt ist nicht untergegangen. Dieses neue Wissen schreibt sich langsam ins Nervensystem ein — aber nur, wenn man beim Nein bleibt.</w:t>
+      </w:r>
+    </w:p>
+    <w:p>
+      <w:pPr>
+        <w:spacing w:after="160" w:line="320" w:lineRule="exact"/>
+      </w:pPr>
+      <w:r>
+        <w:rPr>
+          <w:rFonts w:ascii="Georgia" w:hAnsi="Georgia"/>
+          <w:sz w:val="22"/>
+        </w:rPr>
+        <w:t>Drittens: Die Zeit geben, die es braucht. Karin hat drei Tage gebraucht. Beim nächsten Nein wird es vielleicht zwei Tage sein. Dann ein Tag. Dann ein Abend. Das ist kein Versagen — das ist Lernen. Das ist das Nervensystem, das neue Erfahrungen sammelt.</w:t>
+      </w:r>
+    </w:p>
+    <w:p>
+      <w:pPr>
+        <w:spacing w:after="160" w:line="320" w:lineRule="exact"/>
+      </w:pPr>
+      <w:r>
+        <w:rPr>
+          <w:rFonts w:ascii="Georgia" w:hAnsi="Georgia"/>
+          <w:sz w:val="22"/>
+        </w:rPr>
+        <w:t>Viertens — und das ist vielleicht das Wichtigste: Du musst das Schuldgefühl nicht loswerden, um richtig zu handeln. Nein sagen und dabei ein schlechtes Gewissen haben ist nicht das Ziel. Das Ziel ist, beim Nein zu bleiben, auch mit dem schlechten Gewissen. Das Schuldgefühl darf da sein. Es muss nur nicht das Steuer übernehmen.</w:t>
+      </w:r>
+    </w:p>
+    <w:p>
+      <w:pPr>
+        <w:spacing w:after="160" w:line="320" w:lineRule="exact"/>
+      </w:pPr>
+      <w:r>
+        <w:rPr>
+          <w:rFonts w:ascii="Georgia" w:hAnsi="Georgia"/>
+          <w:sz w:val="22"/>
+        </w:rPr>
+        <w:t>Das ist der Unterschied zwischen einem Leben, das vom Schuldgefühl verwaltet wird, und einem, das du selbst verwaltest.</w:t>
+      </w:r>
+    </w:p>
+    <w:p>
+      <w:pPr>
+        <w:spacing w:after="160" w:line="320" w:lineRule="exact"/>
+      </w:pPr>
+      <w:r>
+        <w:rPr>
+          <w:rFonts w:ascii="Georgia" w:hAnsi="Georgia"/>
+          <w:sz w:val="22"/>
+        </w:rPr>
+        <w:t>Karin hat beim Nein geblieben. Das Wochenende war gut. Die Freundschaft ist die gleiche. Und das nächste Nein, das weiss Karin, wird ein bisschen leichter sein.</w:t>
       </w:r>
     </w:p>
     <w:p>
@@ -3001,19 +3121,19 @@
           <w:rFonts w:ascii="Georgia" w:hAnsi="Georgia"/>
           <w:sz w:val="22"/>
         </w:rPr>
-        <w:t>Hanna weiss nicht wie das gehen soll.</w:t>
-      </w:r>
-    </w:p>
-    <w:p>
-      <w:pPr>
-        <w:spacing w:after="160" w:line="320" w:lineRule="exact"/>
-      </w:pPr>
-      <w:r>
-        <w:rPr>
-          <w:rFonts w:ascii="Georgia" w:hAnsi="Georgia"/>
-          <w:sz w:val="22"/>
-        </w:rPr>
-        <w:t>Sie schläft schlecht. Nicht weil sie nicht müde wäre — sie ist immer müde. Aber wenn sie liegt, kommt das Denken. Alles was heute war, alles was morgen kommt, alles was sie hätte anders machen sollen. Das Gespräch, das nicht gut gelaufen ist. Die E-Mail, die sie noch nicht beantwortet hat. Der Moment wo sie zu knapp reagiert hat.</w:t>
+        <w:t>Hanna weiss nicht, wie das gehen soll.</w:t>
+      </w:r>
+    </w:p>
+    <w:p>
+      <w:pPr>
+        <w:spacing w:after="160" w:line="320" w:lineRule="exact"/>
+      </w:pPr>
+      <w:r>
+        <w:rPr>
+          <w:rFonts w:ascii="Georgia" w:hAnsi="Georgia"/>
+          <w:sz w:val="22"/>
+        </w:rPr>
+        <w:t>Sie schläft schlecht. Nicht weil sie nicht müde wäre — sie ist immer müde. Aber wenn sie liegt, kommt das Denken. Alles, was heute war, alles, was morgen kommt, alles, was sie hätte anders machen sollen. Das Gespräch, das nicht gut gelaufen ist. Die E-Mail, die sie noch nicht beantwortet hat. Der Moment, wo sie zu knapp reagiert hat.</w:t>
       </w:r>
     </w:p>
     <w:p>
@@ -3061,43 +3181,43 @@
           <w:rFonts w:ascii="Georgia" w:hAnsi="Georgia"/>
           <w:sz w:val="22"/>
         </w:rPr>
-        <w:t>Chronisches Schuldgefühl ist kein rein emotionales Phänomen. Es ist ein körperlicher Zustand. Das Stresssystem wird aktiviert, Cortisol und Adrenalin werden ausgeschüttet, das sympathische Nervensystem bleibt aktiv. Der Körper ist in einem Zustand erhöhter Bereitschaft — nicht für Stunden, sondern dauerhaft.</w:t>
-      </w:r>
-    </w:p>
-    <w:p>
-      <w:pPr>
-        <w:spacing w:after="160" w:line="320" w:lineRule="exact"/>
-      </w:pPr>
-      <w:r>
-        <w:rPr>
-          <w:rFonts w:ascii="Georgia" w:hAnsi="Georgia"/>
-          <w:sz w:val="22"/>
-        </w:rPr>
-        <w:t>Das hat konkrete Konsequenzen: Schlafprobleme, weil das Nervensystem in der Nacht nicht abschalten kann. Verspannungen, weil die Muskulatur dauerhaft angespannt ist. Ein Gefühl von Erschöpfung, das durch Schlaf allein nicht behoben wird, weil die Erschöpfung nicht körperlicher, sondern systemischer Natur ist. Kopfschmerzen. Verdauungsprobleme. Ein Immunsystem, das anfälliger wird. Das Gefühl, nie wirklich ankommen zu können — selbst im Urlaub, selbst im Bett.</w:t>
-      </w:r>
-    </w:p>
-    <w:p>
-      <w:pPr>
-        <w:spacing w:after="160" w:line="320" w:lineRule="exact"/>
-      </w:pPr>
-      <w:r>
-        <w:rPr>
-          <w:rFonts w:ascii="Georgia" w:hAnsi="Georgia"/>
-          <w:sz w:val="22"/>
-        </w:rPr>
-        <w:t>Es gibt eine Forscherin, die mich in meiner Arbeit sehr geprägt hat: Bessel van der Kolk, der in seinem Buch über Trauma geschrieben hat, dass der Körper Buch führt. Dass alles, was wir erlebt haben und nicht vollständig verarbeitet haben, sich irgendwo im Körper einschreibt.</w:t>
-      </w:r>
-    </w:p>
-    <w:p>
-      <w:pPr>
-        <w:spacing w:after="160" w:line="320" w:lineRule="exact"/>
-      </w:pPr>
-      <w:r>
-        <w:rPr>
-          <w:rFonts w:ascii="Georgia" w:hAnsi="Georgia"/>
-          <w:sz w:val="22"/>
-        </w:rPr>
-        <w:t>Ich glaube, das gilt auch für das chronische Schuldgefühl. Nicht als Trauma im klinischen Sinne unbedingt — aber als etwas, das sich festsetzt. Als Muster, das der Körper kennt und das er aufrecht erhält, auch wenn der Kopf schon längst weitergegangen ist.</w:t>
+        <w:t>Chronisches Schuldgefühl ist kein rein emotionales Phänomen. Es ist ein körperlicher Zustand. Das Stresssystem wird aktiviert, Cortisol und Adrenalin werden ausgeschüttet, das sympathische Nervensystem bleibt aktiv. Der Körper ist in einem Zustand erhöhter Bereitschaft — nicht für Stunden, sondern dauerhaft. Er wartet auf eine Gefahr, die nie greifbar ist.</w:t>
+      </w:r>
+    </w:p>
+    <w:p>
+      <w:pPr>
+        <w:spacing w:after="160" w:line="320" w:lineRule="exact"/>
+      </w:pPr>
+      <w:r>
+        <w:rPr>
+          <w:rFonts w:ascii="Georgia" w:hAnsi="Georgia"/>
+          <w:sz w:val="22"/>
+        </w:rPr>
+        <w:t>Das hat konkrete Konsequenzen: Schlafprobleme, weil das Nervensystem in der Nacht nicht in den Ruhemodus wechselt. Verspannungen, weil die Muskulatur dauerhaft angespannt ist — besonders in Nacken, Schultern, Kiefer. Eine Erschöpfung, die durch Schlaf allein nicht behoben wird, weil die Erschöpfung nicht körperlicher, sondern systemischer Natur ist. Kopfschmerzen. Verdauungsprobleme, weil das Verdauungssystem bei Stressaktivierung zurückgefahren wird. Ein Immunsystem, das anfälliger wird. Das Gefühl, nie wirklich ankommen zu können — selbst im Urlaub, selbst im Bett.</w:t>
+      </w:r>
+    </w:p>
+    <w:p>
+      <w:pPr>
+        <w:spacing w:after="160" w:line="320" w:lineRule="exact"/>
+      </w:pPr>
+      <w:r>
+        <w:rPr>
+          <w:rFonts w:ascii="Georgia" w:hAnsi="Georgia"/>
+          <w:sz w:val="22"/>
+        </w:rPr>
+        <w:t>Der Psychiater und Traumaforscher Bessel van der Kolk hat in seinem einflussreichen Buch „The Body Keeps the Score" beschrieben, wie emotionale Erfahrungen sich im Körper einschreiben und dort bleiben, wenn sie nicht vollständig verarbeitet werden. Der Körper hält die Rechnung. Er vergisst nicht.</w:t>
+      </w:r>
+    </w:p>
+    <w:p>
+      <w:pPr>
+        <w:spacing w:after="160" w:line="320" w:lineRule="exact"/>
+      </w:pPr>
+      <w:r>
+        <w:rPr>
+          <w:rFonts w:ascii="Georgia" w:hAnsi="Georgia"/>
+          <w:sz w:val="22"/>
+        </w:rPr>
+        <w:t>Ich glaube, das gilt auch für das chronische Schuldgefühl. Nicht als Trauma im klinischen Sinne unbedingt — aber als ein Muster, das sich körperlich festsetzt. Als etwas, das der Körper kennt und das er aufrecht erhält, auch wenn der Kopf schon längst weitergegangen ist. Der Körper ist konservativer als der Verstand. Er braucht Zeit.</w:t>
       </w:r>
     </w:p>
     <w:p>
@@ -3133,19 +3253,43 @@
           <w:rFonts w:ascii="Georgia" w:hAnsi="Georgia"/>
           <w:sz w:val="22"/>
         </w:rPr>
-        <w:t>Körpersignale dürfen ernst genommen werden. Der Nacken der immer zieht. Der Bauch der sich zusammenzieht in bestimmten Situationen. Das Herz das schneller schlägt wenn eine bestimmte Nummer auf dem Telefon erscheint. Die Erschöpfung die kommt, noch bevor der Tag richtig begonnen hat.</w:t>
-      </w:r>
-    </w:p>
-    <w:p>
-      <w:pPr>
-        <w:spacing w:after="160" w:line="320" w:lineRule="exact"/>
-      </w:pPr>
-      <w:r>
-        <w:rPr>
-          <w:rFonts w:ascii="Georgia" w:hAnsi="Georgia"/>
-          <w:sz w:val="22"/>
-        </w:rPr>
-        <w:t>Das sind Informationen. Nicht nur über körperliche Zustände — auch über innere.</w:t>
+        <w:t>Körpersignale dürfen ernst genommen werden. Der Nacken, der immer zieht. Der Bauch, der sich zusammenzieht in bestimmten Situationen. Das Herz, das schneller schlägt, wenn eine bestimmte Nummer auf dem Telefon erscheint. Die Erschöpfung, die kommt, noch bevor der Tag richtig begonnen hat.</w:t>
+      </w:r>
+    </w:p>
+    <w:p>
+      <w:pPr>
+        <w:spacing w:after="160" w:line="320" w:lineRule="exact"/>
+      </w:pPr>
+      <w:r>
+        <w:rPr>
+          <w:rFonts w:ascii="Georgia" w:hAnsi="Georgia"/>
+          <w:sz w:val="22"/>
+        </w:rPr>
+        <w:t>Das sind keine Fehlfunktionen. Das sind Informationen. Nicht nur über körperliche Zustände — auch über innere. Der Körper zeigt oft, was der Verstand noch nicht benennen kann.</w:t>
+      </w:r>
+    </w:p>
+    <w:p>
+      <w:pPr>
+        <w:spacing w:after="160" w:line="320" w:lineRule="exact"/>
+      </w:pPr>
+      <w:r>
+        <w:rPr>
+          <w:rFonts w:ascii="Georgia" w:hAnsi="Georgia"/>
+          <w:sz w:val="22"/>
+        </w:rPr>
+        <w:t>Eine Frage, die ich Frauen manchmal stelle, wenn sie über körperliche Symptome sprechen: Was würde passieren, wenn du dem Schmerz erlaubst, eine Botschaft zu haben? Wenn du deinen Nacken fragst: Was trägst du?</w:t>
+      </w:r>
+    </w:p>
+    <w:p>
+      <w:pPr>
+        <w:spacing w:after="160" w:line="320" w:lineRule="exact"/>
+      </w:pPr>
+      <w:r>
+        <w:rPr>
+          <w:rFonts w:ascii="Georgia" w:hAnsi="Georgia"/>
+          <w:sz w:val="22"/>
+        </w:rPr>
+        <w:t>Das klingt vielleicht ungewohnt. Aber viele Frauen, die ich begleitet habe, haben über diese einfache Frage Zugang zu Dingen gefunden, die sie lange nicht in Worte fassen konnten.</w:t>
       </w:r>
     </w:p>
     <w:p>
@@ -3170,6 +3314,18 @@
           <w:sz w:val="22"/>
         </w:rPr>
         <w:t>Die Antwort war lang. Die Schmerzen wurden nicht sofort besser. Aber zum ersten Mal seit Jahren hatte Hanna das Gefühl, dass ihr Körper ihr etwas sagt, das einen Sinn ergibt. Nicht eine zufällige Fehlfunktion. Eine Botschaft.</w:t>
+      </w:r>
+    </w:p>
+    <w:p>
+      <w:pPr>
+        <w:spacing w:after="160" w:line="320" w:lineRule="exact"/>
+      </w:pPr>
+      <w:r>
+        <w:rPr>
+          <w:rFonts w:ascii="Georgia" w:hAnsi="Georgia"/>
+          <w:sz w:val="22"/>
+        </w:rPr>
+        <w:t>Das ist der Beginn einer anderen Art, mit sich selbst zu sein.</w:t>
       </w:r>
     </w:p>
     <w:p>
@@ -3339,19 +3495,19 @@
           <w:rFonts w:ascii="Georgia" w:hAnsi="Georgia"/>
           <w:sz w:val="22"/>
         </w:rPr>
-        <w:t>Julia hatte das noch nie so klar gedacht. In zwanzig Jahren des Familientreffens-Organisierens, des Alleine-Einkaufens, des Alleine-Aufbauens, des Alleine-Aufräumens — hatte sie das nie Wut genannt. Sie hatte es „so ist er halt" genannt. Und „ich mache das gerne". Und „man kann von niemandem verlangen".</w:t>
-      </w:r>
-    </w:p>
-    <w:p>
-      <w:pPr>
-        <w:spacing w:after="160" w:line="320" w:lineRule="exact"/>
-      </w:pPr>
-      <w:r>
-        <w:rPr>
-          <w:rFonts w:ascii="Georgia" w:hAnsi="Georgia"/>
-          <w:sz w:val="22"/>
-        </w:rPr>
-        <w:t>Wut war in ihrer Familie kein akzeptiertes Gefühl. Wut war schwierig. Wut bedeutete, dass man unreif war, egozentrisch, undankbar. Die ruhige, verständnisvolle Tochter — das war das Ideal. Das war, was Lob bekam.</w:t>
+        <w:t>Julia hatte das noch nie so klar gedacht. In zwanzig Jahren des Familientreffens-Organisierens, des Alleine-Einkaufens, des Alleine-Aufbauens, des Alleine-Aufräumens — hatte sie das nie Wut genannt. Sie hatte es „so ist er halt" genannt. Und „ich mache das gerne". Und „man kann von niemandem verlangen". Und dann hatte sie die nächste Einladung geschrieben.</w:t>
+      </w:r>
+    </w:p>
+    <w:p>
+      <w:pPr>
+        <w:spacing w:after="160" w:line="320" w:lineRule="exact"/>
+      </w:pPr>
+      <w:r>
+        <w:rPr>
+          <w:rFonts w:ascii="Georgia" w:hAnsi="Georgia"/>
+          <w:sz w:val="22"/>
+        </w:rPr>
+        <w:t>Wut war in ihrer Familie kein akzeptiertes Gefühl. Wut war schwierig. Wut bedeutete, dass man unreif war, egozentrisch, undankbar. Die ruhige, verständnisvolle Tochter — das war das Ideal. Das war, was Lob bekam. Das war, was sie sicher hielt.</w:t>
       </w:r>
     </w:p>
     <w:p>
@@ -3399,7 +3555,19 @@
           <w:rFonts w:ascii="Georgia" w:hAnsi="Georgia"/>
           <w:sz w:val="22"/>
         </w:rPr>
-        <w:t>Wenn die Wut nicht ausgedrückt werden darf — weil sie gefährlich ist, weil sie Liebe kostet, weil sie in der Familie nicht erlaubt war — dann sucht sie sich einen anderen Weg. Das Schuldgefühl ist ein sehr häufiger Weg, weil er sicherer ist. Sicherer, weil er die Wut nach innen richtet statt nach aussen.</w:t>
+        <w:t>Das ist eine wichtige Funktion. Wut ist nicht das Problem. Wut, die nie ausgedrückt werden darf, die sich kein Outlet findet und die sich nach innen wendet — das ist ein Problem.</w:t>
+      </w:r>
+    </w:p>
+    <w:p>
+      <w:pPr>
+        <w:spacing w:after="160" w:line="320" w:lineRule="exact"/>
+      </w:pPr>
+      <w:r>
+        <w:rPr>
+          <w:rFonts w:ascii="Georgia" w:hAnsi="Georgia"/>
+          <w:sz w:val="22"/>
+        </w:rPr>
+        <w:t>Wenn die Wut nicht ausgedrückt werden darf — weil sie gefährlich ist, weil sie Liebe kostet, weil sie in der Familie nicht erlaubt war — dann sucht sie sich einen anderen Weg. Das Schuldgefühl ist ein sehr häufiger Weg, weil er sicherer ist. Sicherer, weil er die Wut nach innen richtet statt nach aussen. Die Richtung der Emotion kehrt sich um.</w:t>
       </w:r>
     </w:p>
     <w:p>
@@ -3447,19 +3615,7 @@
           <w:rFonts w:ascii="Georgia" w:hAnsi="Georgia"/>
           <w:sz w:val="22"/>
         </w:rPr>
-        <w:t>Die Richtung der Emotion kehrt sich um. Statt nach aussen zu zeigen — „Du hast mir etwas angetan" — zeigt sie nach innen: „Ich habe etwas falsch gemacht."</w:t>
-      </w:r>
-    </w:p>
-    <w:p>
-      <w:pPr>
-        <w:spacing w:after="160" w:line="320" w:lineRule="exact"/>
-      </w:pPr>
-      <w:r>
-        <w:rPr>
-          <w:rFonts w:ascii="Georgia" w:hAnsi="Georgia"/>
-          <w:sz w:val="22"/>
-        </w:rPr>
-        <w:t>Das ist sicherer. Aber auf Dauer erschöpfend. Und es löst das eigentliche Problem nicht — es vergräbt es nur.</w:t>
+        <w:t>Die Richtung kehrt sich um. Statt nach aussen zu zeigen — „Du hast mir etwas angetan" — zeigt sie nach innen: „Ich habe etwas falsch gemacht." Das ist sicherer. Aber auf Dauer erschöpfend. Und es löst das eigentliche Problem nicht — es vergräbt es nur. Tiefer und tiefer, bis es irgendwann keine Sprache mehr hat.</w:t>
       </w:r>
     </w:p>
     <w:p>
@@ -3483,7 +3639,19 @@
           <w:rFonts w:ascii="Georgia" w:hAnsi="Georgia"/>
           <w:sz w:val="22"/>
         </w:rPr>
-        <w:t>Julia hat nicht angefangen, ihren Bruder anzuschreien. Das war nie der Punkt. Aber sie hat angefangen, die Wut wahrzunehmen — zu fühlen bevor sie sie übersetzt. Zu bemerken: Ich bin gerade wütend. Das zu benennen, wenn auch nur für sich selbst.</w:t>
+        <w:t>Das heisst nicht, dass Wut unkontrolliert nach aussen geschüttet werden muss. Wut ausdrücken und Wut mit jemandem ausschütten sind zwei sehr verschiedene Dinge. Wut wahrnehmen, benennen, zulassen — das ist der erste Schritt. Was man dann damit macht, ist eine andere Frage.</w:t>
+      </w:r>
+    </w:p>
+    <w:p>
+      <w:pPr>
+        <w:spacing w:after="160" w:line="320" w:lineRule="exact"/>
+      </w:pPr>
+      <w:r>
+        <w:rPr>
+          <w:rFonts w:ascii="Georgia" w:hAnsi="Georgia"/>
+          <w:sz w:val="22"/>
+        </w:rPr>
+        <w:t>Julia hat nicht angefangen, ihren Bruder anzuschreien. Das war nie der Punkt. Aber sie hat angefangen, die Wut wahrzunehmen — zu fühlen, bevor sie sie übersetzt. Zu bemerken: Ich bin gerade wütend. Das zu benennen, wenn auch nur für sich selbst. Zuerst im Gespräch mit der Therapeutin, dann irgendwann in einem Tagebuch, dann manchmal laut.</w:t>
       </w:r>
     </w:p>
     <w:p>
@@ -3560,7 +3728,7 @@
           <w:i/>
           <w:sz w:val="22"/>
         </w:rPr>
-        <w:t>Auf wen oder was bist du gerade wütend?</w:t>
+        <w:t>Auf wen oder was bist du gerade wütend — und hast du dir das schon einmal wirklich erlaubt zu fühlen?</w:t>
       </w:r>
     </w:p>
     <w:p>
@@ -3605,43 +3773,43 @@
           <w:rFonts w:ascii="Georgia" w:hAnsi="Georgia"/>
           <w:sz w:val="22"/>
         </w:rPr>
-        <w:t>Nicht weil sie das besonders wichtig findet. Sondern weil sie sich schuldig fühlt wenn es nicht so ist. Wenn Besuch kommt und ein Kleidungsstück auf dem Stuhl liegt, bemerkt sie es sofort und es kostet sie Energie, die Energie die es braucht, mit etwas umzugehen, das falsch ist.</w:t>
-      </w:r>
-    </w:p>
-    <w:p>
-      <w:pPr>
-        <w:spacing w:after="160" w:line="320" w:lineRule="exact"/>
-      </w:pPr>
-      <w:r>
-        <w:rPr>
-          <w:rFonts w:ascii="Georgia" w:hAnsi="Georgia"/>
-          <w:sz w:val="22"/>
-        </w:rPr>
-        <w:t>Ihr E-Mail-Postfach ist täglich auf null. Ihre Berichte bei der Arbeit haben keine Tippfehler, sie hat jeden dreimal gelesen. Sie ist immer pünktlich, meistens zu früh — nicht weil Pünktlichkeit ihr so wichtig ist, sondern weil die Vorstellung, zu spät zu kommen, ein Unbehagen auslöst, das sie nicht aushält. Sie sagt nie ohne Nachdenken zu, und wenn sie zusagt, hält sie immer.</w:t>
-      </w:r>
-    </w:p>
-    <w:p>
-      <w:pPr>
-        <w:spacing w:after="160" w:line="320" w:lineRule="exact"/>
-      </w:pPr>
-      <w:r>
-        <w:rPr>
-          <w:rFonts w:ascii="Georgia" w:hAnsi="Georgia"/>
-          <w:sz w:val="22"/>
-        </w:rPr>
-        <w:t>Sandra ist erschöpft. Dauerhaft. Und sie weiss nicht wie sie anders sein soll.</w:t>
-      </w:r>
-    </w:p>
-    <w:p>
-      <w:pPr>
-        <w:spacing w:after="160" w:line="320" w:lineRule="exact"/>
-      </w:pPr>
-      <w:r>
-        <w:rPr>
-          <w:rFonts w:ascii="Georgia" w:hAnsi="Georgia"/>
-          <w:sz w:val="22"/>
-        </w:rPr>
-        <w:t>Die Logik hinter dem Perfektionismus ist, wenn man ihn direkt betrachtet, erschreckend klar: Wenn ich alles richtig mache, gibt es nichts wofür ich mich schuldig fühlen müsste.</w:t>
+        <w:t>Nicht weil sie das besonders wichtig findet. Sondern weil sie sich schuldig fühlt, wenn es nicht so ist. Wenn Besuch kommt und ein Kleidungsstück auf dem Stuhl liegt, bemerkt sie es sofort, und es kostet sie Energie — die Energie, die es braucht, mit etwas umzugehen, das falsch ist.</w:t>
+      </w:r>
+    </w:p>
+    <w:p>
+      <w:pPr>
+        <w:spacing w:after="160" w:line="320" w:lineRule="exact"/>
+      </w:pPr>
+      <w:r>
+        <w:rPr>
+          <w:rFonts w:ascii="Georgia" w:hAnsi="Georgia"/>
+          <w:sz w:val="22"/>
+        </w:rPr>
+        <w:t>Ihr E-Mail-Postfach ist täglich auf null. Ihre Berichte bei der Arbeit haben keine Tippfehler, sie hat jeden dreimal gelesen. Sie ist immer pünktlich, meistens zu früh — nicht weil Pünktlichkeit ihr so wichtig ist, sondern weil die Vorstellung, zu spät zu kommen, ein Unbehagen auslöst, das sie nicht aushält. Sie sagt nie ohne Nachdenken zu, und wenn sie zusagt, hält sie immer. Immer. Ohne Ausnahme.</w:t>
+      </w:r>
+    </w:p>
+    <w:p>
+      <w:pPr>
+        <w:spacing w:after="160" w:line="320" w:lineRule="exact"/>
+      </w:pPr>
+      <w:r>
+        <w:rPr>
+          <w:rFonts w:ascii="Georgia" w:hAnsi="Georgia"/>
+          <w:sz w:val="22"/>
+        </w:rPr>
+        <w:t>Sandra ist erschöpft. Dauerhaft. Und sie weiss nicht, wie sie anders sein soll.</w:t>
+      </w:r>
+    </w:p>
+    <w:p>
+      <w:pPr>
+        <w:spacing w:after="160" w:line="320" w:lineRule="exact"/>
+      </w:pPr>
+      <w:r>
+        <w:rPr>
+          <w:rFonts w:ascii="Georgia" w:hAnsi="Georgia"/>
+          <w:sz w:val="22"/>
+        </w:rPr>
+        <w:t>Die Logik hinter dem Perfektionismus ist, wenn man ihn direkt betrachtet, erschreckend klar: Wenn ich alles richtig mache, gibt es nichts, wofür ich mich schuldig fühlen müsste.</w:t>
       </w:r>
     </w:p>
     <w:p>
@@ -3665,43 +3833,31 @@
           <w:rFonts w:ascii="Georgia" w:hAnsi="Georgia"/>
           <w:sz w:val="22"/>
         </w:rPr>
-        <w:t>Es gibt immer etwas, das man besser hätte machen können. Immer eine E-Mail, die vielleicht zu kurz war. Immer einen Moment, wo man hätte aufmerksamer sein können. Immer eine Situation, die ein bisschen anders hätte verlaufen können, wenn man nur etwas mehr, etwas besser, etwas früher.</w:t>
-      </w:r>
-    </w:p>
-    <w:p>
-      <w:pPr>
-        <w:spacing w:after="160" w:line="320" w:lineRule="exact"/>
-      </w:pPr>
-      <w:r>
-        <w:rPr>
-          <w:rFonts w:ascii="Georgia" w:hAnsi="Georgia"/>
-          <w:sz w:val="22"/>
-        </w:rPr>
-        <w:t>Das Schuldgefühl findet immer einen Weg. Perfektion schützt nicht davor — sie verschiebt es nur.</w:t>
-      </w:r>
-    </w:p>
-    <w:p>
-      <w:pPr>
-        <w:spacing w:after="160" w:line="320" w:lineRule="exact"/>
-      </w:pPr>
-      <w:r>
-        <w:rPr>
-          <w:rFonts w:ascii="Georgia" w:hAnsi="Georgia"/>
-          <w:sz w:val="22"/>
-        </w:rPr>
-        <w:t>Und sie kostet einen enormen Preis. Sandra verbringt Energie mit Dingen, die niemand ausser ihr bemerkt. Sie überprüft Berichte, die gut genug sind. Sie räumt auf, obwohl niemand kommt. Sie bereitet Gespräche vor, die spontan gut laufen würden.</w:t>
-      </w:r>
-    </w:p>
-    <w:p>
-      <w:pPr>
-        <w:spacing w:after="160" w:line="320" w:lineRule="exact"/>
-      </w:pPr>
-      <w:r>
-        <w:rPr>
-          <w:rFonts w:ascii="Georgia" w:hAnsi="Georgia"/>
-          <w:sz w:val="22"/>
-        </w:rPr>
-        <w:t>Diese Energie fehlt ihr woanders. Bei Dingen, die ihr wirklich wichtig wären, wenn sie jemals die Stille fänden, in der sie das hören könnte.</w:t>
+        <w:t>Es gibt immer etwas, das man besser hätte machen können. Immer eine E-Mail, die vielleicht zu kurz war. Immer einen Moment, wo man hätte aufmerksamer sein können. Immer eine Situation, die ein bisschen anders hätte verlaufen können, wenn man nur etwas mehr, etwas besser, etwas früher getan hätte. Das Schuldgefühl findet immer einen Weg. Perfektion schützt nicht davor — sie verschiebt es nur, immer einen Schritt weiter.</w:t>
+      </w:r>
+    </w:p>
+    <w:p>
+      <w:pPr>
+        <w:spacing w:after="160" w:line="320" w:lineRule="exact"/>
+      </w:pPr>
+      <w:r>
+        <w:rPr>
+          <w:rFonts w:ascii="Georgia" w:hAnsi="Georgia"/>
+          <w:sz w:val="22"/>
+        </w:rPr>
+        <w:t>Perfektionismus als Schutz vor Schuld ist wie eine Deichschutzwand, die immer höher gebaut wird. Das Wasser findet trotzdem einen Weg. Und die Kraft, die in den Bau der Wand geht, fehlt woanders.</w:t>
+      </w:r>
+    </w:p>
+    <w:p>
+      <w:pPr>
+        <w:spacing w:after="160" w:line="320" w:lineRule="exact"/>
+      </w:pPr>
+      <w:r>
+        <w:rPr>
+          <w:rFonts w:ascii="Georgia" w:hAnsi="Georgia"/>
+          <w:sz w:val="22"/>
+        </w:rPr>
+        <w:t>Sandra verbringt Energie mit Dingen, die niemand ausser ihr bemerkt. Sie überprüft Berichte, die gut genug sind. Sie räumt auf, obwohl niemand kommt. Sie bereitet Gespräche vor, die spontan gut laufen würden. Diese Energie fehlt ihr woanders — bei Dingen, die ihr wirklich wichtig wären, wenn sie jemals die Stille fänden, in der sie das hören könnte.</w:t>
       </w:r>
     </w:p>
     <w:p>
@@ -3725,19 +3881,19 @@
           <w:rFonts w:ascii="Georgia" w:hAnsi="Georgia"/>
           <w:sz w:val="22"/>
         </w:rPr>
-        <w:t>Fast immer die Überzeugung: Wenn ich Fehler mache, bin ich ein Fehler. Nicht: Ich habe etwas falsch gemacht. Sondern: Ich bin falsch.</w:t>
-      </w:r>
-    </w:p>
-    <w:p>
-      <w:pPr>
-        <w:spacing w:after="160" w:line="320" w:lineRule="exact"/>
-      </w:pPr>
-      <w:r>
-        <w:rPr>
-          <w:rFonts w:ascii="Georgia" w:hAnsi="Georgia"/>
-          <w:sz w:val="22"/>
-        </w:rPr>
-        <w:t>Diese Überzeugung setzt sich fest, wenn in der Kindheit Fehler nicht als Teil des Lernens betrachtet wurden, sondern als persönliches Versagen. Wenn Korrekturen sich wie Kritik an der Person anfühlten, nicht an der Handlung. Wenn Lob an das Ergebnis geknüpft war, nicht an den Versuch.</w:t>
+        <w:t>Fast immer eine Überzeugung, die sich so formulieren lässt: Wenn ich Fehler mache, bin ich ein Fehler. Nicht: Ich habe etwas falsch gemacht. Sondern: Ich bin falsch.</w:t>
+      </w:r>
+    </w:p>
+    <w:p>
+      <w:pPr>
+        <w:spacing w:after="160" w:line="320" w:lineRule="exact"/>
+      </w:pPr>
+      <w:r>
+        <w:rPr>
+          <w:rFonts w:ascii="Georgia" w:hAnsi="Georgia"/>
+          <w:sz w:val="22"/>
+        </w:rPr>
+        <w:t>Diese Überzeugung setzt sich fest, wenn in der Kindheit Fehler nicht als Teil des Lernens betrachtet wurden, sondern als persönliches Versagen. Wenn Korrekturen sich wie Kritik an der Person anfühlten, nicht an der Handlung. Wenn Lob an das Ergebnis geknüpft war, nicht an den Versuch. Wenn ein durchgelogener Schulaufsatz mehr Wert hatte als ein ehrliches Bemühen.</w:t>
       </w:r>
     </w:p>
     <w:p>
@@ -3773,7 +3929,19 @@
           <w:rFonts w:ascii="Georgia" w:hAnsi="Georgia"/>
           <w:sz w:val="22"/>
         </w:rPr>
-        <w:t>Fehler sind unvermeidlich. Sie sind menschlich. Sie sind der Weg, durch den man lernt, wächst, sich entwickelt. Eine Frau, die keine Fehler zulässt, hat keinen Raum zum Wachsen. Sie hat auch keinen Raum zum Ausruhen. Sie lebt in einer dauerhaften Prüfung, die sie sich selbst stellt.</w:t>
+        <w:t>Aber Fehler sind unvermeidlich. Sie sind menschlich. Sie sind der Weg, durch den man lernt, wächst, sich entwickelt. Eine Frau, die keine Fehler zulässt, hat keinen Raum zum Wachsen. Sie hat auch keinen Raum zum Ausruhen. Sie lebt in einer dauerhaften Prüfung, die sie sich selbst stellt und bei der sie immer die Prüferin und immer die Prüfling ist.</w:t>
+      </w:r>
+    </w:p>
+    <w:p>
+      <w:pPr>
+        <w:spacing w:after="160" w:line="320" w:lineRule="exact"/>
+      </w:pPr>
+      <w:r>
+        <w:rPr>
+          <w:rFonts w:ascii="Georgia" w:hAnsi="Georgia"/>
+          <w:sz w:val="22"/>
+        </w:rPr>
+        <w:t>Der erste Schritt aus dem Perfektionismus ist nicht, plötzlich nachlässig zu werden. Das ist keine realistische Erwartung und auch nicht das Ziel. Der erste Schritt ist, den Perfektionismus zu verstehen: als Versuch, das Schuldgefühl zu kontrollieren. Als Schutzreflex. Als etwas, das einmal Sinn gemacht hat und das jetzt einen zu hohen Preis kostet.</w:t>
       </w:r>
     </w:p>
     <w:p>
@@ -3797,19 +3965,19 @@
           <w:rFonts w:ascii="Georgia" w:hAnsi="Georgia"/>
           <w:sz w:val="22"/>
         </w:rPr>
-        <w:t>Das klingt lächerlich klein. Für Sandra war es ein riesiger Schritt. Der erste Mal schickte sie eine E-Mail nach zweimaligem Lesen ab und wartete auf die Katastrophe. Sie kam nicht.</w:t>
-      </w:r>
-    </w:p>
-    <w:p>
-      <w:pPr>
-        <w:spacing w:after="160" w:line="320" w:lineRule="exact"/>
-      </w:pPr>
-      <w:r>
-        <w:rPr>
-          <w:rFonts w:ascii="Georgia" w:hAnsi="Georgia"/>
-          <w:sz w:val="22"/>
-        </w:rPr>
-        <w:t>Das war der Anfang.</w:t>
+        <w:t>Das klingt lächerlich klein. Für Sandra war es ein riesiger Schritt. Das erste Mal, als sie eine E-Mail nach zweimaligem Lesen abschickte, wartete sie auf die Katastrophe. Sie kam nicht. Die E-Mail war gut genug. Die Empfängerin hat geantwortet. Nichts ist passiert.</w:t>
+      </w:r>
+    </w:p>
+    <w:p>
+      <w:pPr>
+        <w:spacing w:after="160" w:line="320" w:lineRule="exact"/>
+      </w:pPr>
+      <w:r>
+        <w:rPr>
+          <w:rFonts w:ascii="Georgia" w:hAnsi="Georgia"/>
+          <w:sz w:val="22"/>
+        </w:rPr>
+        <w:t>Das war der Anfang. Ein winziger Riss in der Wand, durch den ein anderes Licht fiel.</w:t>
       </w:r>
     </w:p>
     <w:p>
@@ -3848,7 +4016,7 @@
           <w:i/>
           <w:sz w:val="22"/>
         </w:rPr>
-        <w:t>Was befürchtest du würde passieren, wenn du einen Fehler machst?</w:t>
+        <w:t>Was befürchtest du, würde passieren, wenn du einen Fehler machst?</w:t>
       </w:r>
     </w:p>
     <w:p>
@@ -3874,7 +4042,7 @@
           <w:i/>
           <w:sz w:val="22"/>
         </w:rPr>
-        <w:t>Wo könntest du gut genug sein, statt perfekt?</w:t>
+        <w:t>Wo könntest du gut genug sein, statt perfekt — und was würde das freimachen?</w:t>
       </w:r>
     </w:p>
     <w:p>
@@ -3919,7 +4087,7 @@
           <w:rFonts w:ascii="Georgia" w:hAnsi="Georgia"/>
           <w:sz w:val="22"/>
         </w:rPr>
-        <w:t>Für die Stimmung beim Abendessen. Für die Hausaufgaben der Kinder, auch wenn die Kinder zwölf und fünfzehn sind und das selbst könnten. Für den Zusammenhalt in der Familie, was bedeutet dass sie bei Konflikten immer vermittelt, auch wenn sie selbst Teil des Konflikts ist. Für die gute Laune des Partners, für das Wohlbefinden der Mutter, für die Harmonie in der Freundinnengruppe.</w:t>
+        <w:t>Für die Stimmung beim Abendessen. Für die Hausaufgaben der Kinder, auch wenn die Kinder zwölf und fünfzehn sind und das selbst könnten. Für den Zusammenhalt in der Familie, was bedeutet, dass sie bei Konflikten immer vermittelt, auch wenn sie selbst Teil des Konflikts ist. Für die gute Laune des Partners, für das Wohlbefinden der Mutter, für die Harmonie in der Freundinnengruppe. Für den Frieden im Büro.</w:t>
       </w:r>
     </w:p>
     <w:p>
@@ -3991,43 +4159,43 @@
           <w:rFonts w:ascii="Georgia" w:hAnsi="Georgia"/>
           <w:sz w:val="22"/>
         </w:rPr>
-        <w:t>Verantwortung hat Ränder. Sie ist begrenzt. Das ist kein Defizit — das ist eine Tatsache.</w:t>
-      </w:r>
-    </w:p>
-    <w:p>
-      <w:pPr>
-        <w:spacing w:after="160" w:line="320" w:lineRule="exact"/>
-      </w:pPr>
-      <w:r>
-        <w:rPr>
-          <w:rFonts w:ascii="Georgia" w:hAnsi="Georgia"/>
-          <w:sz w:val="22"/>
-        </w:rPr>
-        <w:t>Schuld ist anders. Schuld ist diffus. Sie hat keine klaren Grenzen. Sie erstreckt sich auf alles: auf Dinge die du getan hast, Dinge die du nicht getan hast, Dinge die andere getan haben, Dinge die niemand getan hat.</w:t>
-      </w:r>
-    </w:p>
-    <w:p>
-      <w:pPr>
-        <w:spacing w:after="160" w:line="320" w:lineRule="exact"/>
-      </w:pPr>
-      <w:r>
-        <w:rPr>
-          <w:rFonts w:ascii="Georgia" w:hAnsi="Georgia"/>
-          <w:sz w:val="22"/>
-        </w:rPr>
-        <w:t>Anne fühlt sich schuldig für die schlechte Laune des Partners, die mit dem Arbeitsstress zusammenhängt. Für den Streit unter den Kindern, der damit zusammenhängt dass Geschwister sich streiten — das gehört dazu, das ist normal. Für die Einsamkeit der Mutter, die mit der Mutter zu tun hat, nicht mit Anne.</w:t>
-      </w:r>
-    </w:p>
-    <w:p>
-      <w:pPr>
-        <w:spacing w:after="160" w:line="320" w:lineRule="exact"/>
-      </w:pPr>
-      <w:r>
-        <w:rPr>
-          <w:rFonts w:ascii="Georgia" w:hAnsi="Georgia"/>
-          <w:sz w:val="22"/>
-        </w:rPr>
-        <w:t>Sie hat die Verantwortung für das ganze System übernommen. Und das ist kein System, das ein Mensch tragen kann. Nicht dauerhaft.</w:t>
+        <w:t>Verantwortung hat Ränder. Sie ist begrenzt. Das ist kein Defizit — das ist eine Tatsache der menschlichen Realität. Kein Mensch hat unbegrenzten Einfluss auf das, was um ihn herum passiert. Auch wenn es so aussieht. Auch wenn es sich so anfühlt.</w:t>
+      </w:r>
+    </w:p>
+    <w:p>
+      <w:pPr>
+        <w:spacing w:after="160" w:line="320" w:lineRule="exact"/>
+      </w:pPr>
+      <w:r>
+        <w:rPr>
+          <w:rFonts w:ascii="Georgia" w:hAnsi="Georgia"/>
+          <w:sz w:val="22"/>
+        </w:rPr>
+        <w:t>Schuld ist anders. Schuld, wie das chronische Schuldgefühl sie erlebt, ist diffus. Sie hat keine klaren Grenzen. Sie erstreckt sich auf alles: auf Dinge, die du getan hast, Dinge, die du nicht getan hast, Dinge, die andere getan haben, Dinge, die niemand getan hat, und Dinge, die in einer parallelen Realität vielleicht hätten passieren können.</w:t>
+      </w:r>
+    </w:p>
+    <w:p>
+      <w:pPr>
+        <w:spacing w:after="160" w:line="320" w:lineRule="exact"/>
+      </w:pPr>
+      <w:r>
+        <w:rPr>
+          <w:rFonts w:ascii="Georgia" w:hAnsi="Georgia"/>
+          <w:sz w:val="22"/>
+        </w:rPr>
+        <w:t>Anne fühlt sich schuldig für die schlechte Laune des Partners, die mit dem Arbeitsstress zusammenhängt. Für den Streit unter den Kindern, der damit zusammenhängt, dass Geschwister sich streiten — das gehört dazu, das ist normal. Für die Einsamkeit der Mutter, die mit der Mutter zu tun hat, nicht mit Anne.</w:t>
+      </w:r>
+    </w:p>
+    <w:p>
+      <w:pPr>
+        <w:spacing w:after="160" w:line="320" w:lineRule="exact"/>
+      </w:pPr>
+      <w:r>
+        <w:rPr>
+          <w:rFonts w:ascii="Georgia" w:hAnsi="Georgia"/>
+          <w:sz w:val="22"/>
+        </w:rPr>
+        <w:t>Sie hat die Verantwortung für das ganze System übernommen. Und das ist kein System, das ein Mensch tragen kann. Nicht dauerhaft. Das Ergebnis ist keine bessere Familie. Das Ergebnis ist eine erschöpfte Anne, die immer weniger von sich selbst hat — und am Ende auch weniger für die anderen.</w:t>
       </w:r>
     </w:p>
     <w:p>
@@ -4051,31 +4219,31 @@
           <w:rFonts w:ascii="Georgia" w:hAnsi="Georgia"/>
           <w:sz w:val="22"/>
         </w:rPr>
-        <w:t>Die Stimmung deines Partners liegt nicht vollständig in deinem Einflussbereich. Die Zufriedenheit deiner Mutter liegt nicht in deinem Einflussbereich. Die Art wie deine Kinder sich fühlen, liegt nur teilweise in deinem Einflussbereich.</w:t>
-      </w:r>
-    </w:p>
-    <w:p>
-      <w:pPr>
-        <w:spacing w:after="160" w:line="320" w:lineRule="exact"/>
-      </w:pPr>
-      <w:r>
-        <w:rPr>
-          <w:rFonts w:ascii="Georgia" w:hAnsi="Georgia"/>
-          <w:sz w:val="22"/>
-        </w:rPr>
-        <w:t>Dein Handeln liegt in deinem Einflussbereich. Deine Haltung. Deine Worte. Wie du mit Konflikten umgehst. Das kannst du beeinflussen. Das ist deine Verantwortung.</w:t>
-      </w:r>
-    </w:p>
-    <w:p>
-      <w:pPr>
-        <w:spacing w:after="160" w:line="320" w:lineRule="exact"/>
-      </w:pPr>
-      <w:r>
-        <w:rPr>
-          <w:rFonts w:ascii="Georgia" w:hAnsi="Georgia"/>
-          <w:sz w:val="22"/>
-        </w:rPr>
-        <w:t>Wenn Anne das unterscheiden lernt — was ich kann beeinflussen, was nicht — verändert sich etwas. Nicht sofort. Nicht vollständig. Aber sie kann anfangen, das Gewicht zu sortieren.</w:t>
+        <w:t>Die Stimmung deines Partners liegt nicht vollständig in deinem Einflussbereich. Die Zufriedenheit deiner Mutter liegt nicht in deinem Einflussbereich. Die Art, wie deine Kinder sich fühlen, liegt nur teilweise in deinem Einflussbereich. Du kannst Bedingungen schaffen, du kannst Zuwendung geben, du kannst da sein — aber du kannst nicht für jemand anderen fühlen.</w:t>
+      </w:r>
+    </w:p>
+    <w:p>
+      <w:pPr>
+        <w:spacing w:after="160" w:line="320" w:lineRule="exact"/>
+      </w:pPr>
+      <w:r>
+        <w:rPr>
+          <w:rFonts w:ascii="Georgia" w:hAnsi="Georgia"/>
+          <w:sz w:val="22"/>
+        </w:rPr>
+        <w:t>Dein Handeln liegt in deinem Einflussbereich. Deine Haltung. Deine Worte. Wie du mit Konflikten umgehst. Das kannst du beeinflussen. Das ist deine Verantwortung. Und das ist genug.</w:t>
+      </w:r>
+    </w:p>
+    <w:p>
+      <w:pPr>
+        <w:spacing w:after="160" w:line="320" w:lineRule="exact"/>
+      </w:pPr>
+      <w:r>
+        <w:rPr>
+          <w:rFonts w:ascii="Georgia" w:hAnsi="Georgia"/>
+          <w:sz w:val="22"/>
+        </w:rPr>
+        <w:t>Wenn Anne das unterscheiden lernt — was ich kann beeinflussen, was nicht — verändert sich etwas. Die Last wird nicht kleiner. Aber sie wird klarer. Und mit der Klarheit kommt die Möglichkeit, das Gewicht zu sortieren.</w:t>
       </w:r>
     </w:p>
     <w:p>
@@ -4099,7 +4267,7 @@
           <w:rFonts w:ascii="Georgia" w:hAnsi="Georgia"/>
           <w:sz w:val="22"/>
         </w:rPr>
-        <w:t>Das ist keine Gleichgültigkeit. Es ist eine Ehrlichkeit, die am Ende auch anderen nützt.</w:t>
+        <w:t>Das ist keine Gleichgültigkeit. Es ist eine Ehrlichkeit, die am Ende auch anderen nützt. Eine Frau, die weiss, was ihre Verantwortung ist und was nicht, kann das, was wirklich ihr gehört, viel besser tragen.</w:t>
       </w:r>
     </w:p>
     <w:p>
@@ -4209,19 +4377,19 @@
           <w:rFonts w:ascii="Georgia" w:hAnsi="Georgia"/>
           <w:sz w:val="22"/>
         </w:rPr>
-        <w:t>Nicht weil jemand nicht da gewesen wäre. Sondern weil sie sich bewusst dafür entschieden hat. Sie hat ihre erwachsenen Kinder nicht angerufen. Ihren Mann nicht gefragt ob er etwas braucht. Ihre Freundinnen nicht gefragt ob jemand Zeit hat.</w:t>
-      </w:r>
-    </w:p>
-    <w:p>
-      <w:pPr>
-        <w:spacing w:after="160" w:line="320" w:lineRule="exact"/>
-      </w:pPr>
-      <w:r>
-        <w:rPr>
-          <w:rFonts w:ascii="Georgia" w:hAnsi="Georgia"/>
-          <w:sz w:val="22"/>
-        </w:rPr>
-        <w:t>Sie hat sich hingesetzt, Tee gemacht, ein Buch gelesen. Zwei Stunden, ohne Handy, ohne Aufgaben, ohne den Gedanken wer jetzt gerade etwas brauchen könnte.</w:t>
+        <w:t>Nicht weil jemand nicht da gewesen wäre. Sondern weil sie sich bewusst dafür entschieden hat. Sie hat ihre erwachsenen Kinder nicht angerufen. Ihren Mann nicht gefragt, ob er etwas braucht. Ihre Freundinnen nicht gefragt, ob jemand Zeit hat.</w:t>
+      </w:r>
+    </w:p>
+    <w:p>
+      <w:pPr>
+        <w:spacing w:after="160" w:line="320" w:lineRule="exact"/>
+      </w:pPr>
+      <w:r>
+        <w:rPr>
+          <w:rFonts w:ascii="Georgia" w:hAnsi="Georgia"/>
+          <w:sz w:val="22"/>
+        </w:rPr>
+        <w:t>Sie hat sich hingesetzt, Tee gemacht, ein Buch gelesen. Zwei Stunden, ohne Handy, ohne Aufgaben, ohne den Gedanken, wer jetzt gerade etwas brauchen könnte.</w:t>
       </w:r>
     </w:p>
     <w:p>
@@ -4257,19 +4425,7 @@
           <w:rFonts w:ascii="Georgia" w:hAnsi="Georgia"/>
           <w:sz w:val="22"/>
         </w:rPr>
-        <w:t>Marie ist nicht das erste Mal in ihrem Leben allein gewesen. Aber es war das erste Mal seit sehr langer Zeit, dass Alleinsein sich nicht wie Versagen angefühlt hat. Wie Zeit, die hätte genutzt werden sollen. Wie ein Schuldgefühl, das gleich kommt.</w:t>
-      </w:r>
-    </w:p>
-    <w:p>
-      <w:pPr>
-        <w:spacing w:after="160" w:line="320" w:lineRule="exact"/>
-      </w:pPr>
-      <w:r>
-        <w:rPr>
-          <w:rFonts w:ascii="Georgia" w:hAnsi="Georgia"/>
-          <w:sz w:val="22"/>
-        </w:rPr>
-        <w:t>Es war einfach Zeit. Für sie.</w:t>
+        <w:t>Marie ist nicht das erste Mal in ihrem Leben allein gewesen. Aber es war das erste Mal seit sehr langer Zeit, dass Alleinsein sich nicht wie Versagen angefühlt hat. Wie Zeit, die hätte genutzt werden sollen. Wie ein Schuldgefühl, das gleich kommt. Es war einfach Zeit. Für sie.</w:t>
       </w:r>
     </w:p>
     <w:p>
@@ -4293,7 +4449,7 @@
           <w:rFonts w:ascii="Georgia" w:hAnsi="Georgia"/>
           <w:sz w:val="22"/>
         </w:rPr>
-        <w:t>Das klingt wie eine seltsame Frage. Die meisten Frauen die ich kenne, haben darüber noch nie nachgedacht. Sie wissen sehr genau, was sie anderen schulden. Was sie dem Partner schulden, den Kindern, den Eltern, dem Arbeitgeber. Die Liste ist lang. Gepflegt. Immer präsent.</w:t>
+        <w:t>Das klingt wie eine seltsame Frage. Die meisten Frauen, die ich kenne, haben darüber noch nie nachgedacht. Sie wissen sehr genau, was sie anderen schulden. Was sie dem Partner schulden, den Kindern, den Eltern, dem Arbeitgeber, der Freundinnengruppe, dem Verein, der Schule. Die Liste ist lang, gepflegt, immer präsent.</w:t>
       </w:r>
     </w:p>
     <w:p>
@@ -4317,7 +4473,19 @@
           <w:rFonts w:ascii="Georgia" w:hAnsi="Georgia"/>
           <w:sz w:val="22"/>
         </w:rPr>
-        <w:t>Selbstfürsorge wird in unserer Kultur oft als Luxus dargestellt. Als etwas, das man sich gönnt wenn alles andere erledigt ist. Als Belohnung für geleistete Arbeit. Als Selbstgefälligkeit, die man sich verdienen muss.</w:t>
+        <w:t>Das ist kein Zufall. Es ist das direkte Ergebnis des chronischen Schuldgefühls: Wer sich immer schuldig fühlt, glaubt, dass er zuerst alle anderen Schulden beglichen haben muss, bevor er sich selbst etwas zugestehen darf. Aber die Schulden werden nie alle beglichen sein. Also kommt das Eigene nie.</w:t>
+      </w:r>
+    </w:p>
+    <w:p>
+      <w:pPr>
+        <w:spacing w:after="160" w:line="320" w:lineRule="exact"/>
+      </w:pPr>
+      <w:r>
+        <w:rPr>
+          <w:rFonts w:ascii="Georgia" w:hAnsi="Georgia"/>
+          <w:sz w:val="22"/>
+        </w:rPr>
+        <w:t>Selbstfürsorge wird in unserer Kultur oft als Luxus dargestellt. Als etwas, das man sich gönnt, wenn alles andere erledigt ist. Als Belohnung für geleistete Arbeit. Als Selbstgefälligkeit, die man sich verdienen muss.</w:t>
       </w:r>
     </w:p>
     <w:p>
@@ -4341,19 +4509,7 @@
           <w:rFonts w:ascii="Georgia" w:hAnsi="Georgia"/>
           <w:sz w:val="22"/>
         </w:rPr>
-        <w:t>Selbstfürsorge ist keine Belohnung. Sie ist keine Selbstgefälligkeit. Sie ist das, was dir ermöglicht, überhaupt für andere da zu sein.</w:t>
-      </w:r>
-    </w:p>
-    <w:p>
-      <w:pPr>
-        <w:spacing w:after="160" w:line="320" w:lineRule="exact"/>
-      </w:pPr>
-      <w:r>
-        <w:rPr>
-          <w:rFonts w:ascii="Georgia" w:hAnsi="Georgia"/>
-          <w:sz w:val="22"/>
-        </w:rPr>
-        <w:t>Du kannst aus einem leeren Gefäss nicht geben. Du weisst das. Aber du lebst, als wäre das Gefäss unendlich gross.</w:t>
+        <w:t>Selbstfürsorge ist keine Belohnung. Sie ist keine Selbstgefälligkeit. Sie ist keine Schwäche und kein Egoismus. Sie ist das, was dir ermöglicht, überhaupt für andere da zu sein. Du kannst aus einem leeren Gefäss nicht geben. Du weisst das. Aber du lebst, als wäre das Gefäss unendlich gross und würde sich von selbst füllen.</w:t>
       </w:r>
     </w:p>
     <w:p>
@@ -4377,43 +4533,43 @@
           <w:rFonts w:ascii="Georgia" w:hAnsi="Georgia"/>
           <w:sz w:val="22"/>
         </w:rPr>
-        <w:t>Schlaf. Nicht als Luxus, sondern als biologische Notwendigkeit. Nicht sechs Stunden als Kompromiss — ausreichend Schlaf.</w:t>
-      </w:r>
-    </w:p>
-    <w:p>
-      <w:pPr>
-        <w:spacing w:after="160" w:line="320" w:lineRule="exact"/>
-      </w:pPr>
-      <w:r>
-        <w:rPr>
-          <w:rFonts w:ascii="Georgia" w:hAnsi="Georgia"/>
-          <w:sz w:val="22"/>
-        </w:rPr>
-        <w:t>Zeit, in der wir nichts leisten. Nicht Pausen zwischen Aufgaben, sondern echte Leere, echte Stille.</w:t>
-      </w:r>
-    </w:p>
-    <w:p>
-      <w:pPr>
-        <w:spacing w:after="160" w:line="320" w:lineRule="exact"/>
-      </w:pPr>
-      <w:r>
-        <w:rPr>
-          <w:rFonts w:ascii="Georgia" w:hAnsi="Georgia"/>
-          <w:sz w:val="22"/>
-        </w:rPr>
-        <w:t>Essen, das gut ist, nicht nur schnell. Bewegung, die wir mögen, nicht nur erledigen. Gespräche, die uns nähren, nicht nur verbrauchen.</w:t>
-      </w:r>
-    </w:p>
-    <w:p>
-      <w:pPr>
-        <w:spacing w:after="160" w:line="320" w:lineRule="exact"/>
-      </w:pPr>
-      <w:r>
-        <w:rPr>
-          <w:rFonts w:ascii="Georgia" w:hAnsi="Georgia"/>
-          <w:sz w:val="22"/>
-        </w:rPr>
-        <w:t>Und, vielleicht am wichtigsten: Das Recht, eigene Bedürfnisse zu haben. Auch wenn sie anderen unbequem sind. Auch wenn das Schuldgefühl sich meldet. Auch wenn niemand versteht warum du das gerade brauchst.</w:t>
+        <w:t>Schlaf. Nicht als Luxus, sondern als biologische Notwendigkeit. Nicht sechs Stunden als Kompromiss, den man zwischen Familie, Arbeit und dem Rest quetscht — ausreichend Schlaf.</w:t>
+      </w:r>
+    </w:p>
+    <w:p>
+      <w:pPr>
+        <w:spacing w:after="160" w:line="320" w:lineRule="exact"/>
+      </w:pPr>
+      <w:r>
+        <w:rPr>
+          <w:rFonts w:ascii="Georgia" w:hAnsi="Georgia"/>
+          <w:sz w:val="22"/>
+        </w:rPr>
+        <w:t>Zeit, in der wir nichts leisten. Nicht Pausen zwischen Aufgaben, sondern echte Stille. Echte Leere. Momente, in denen das Schuldgefühl vielleicht kommt und fragt: Was machst du hier? — und wir trotzdem bleiben.</w:t>
+      </w:r>
+    </w:p>
+    <w:p>
+      <w:pPr>
+        <w:spacing w:after="160" w:line="320" w:lineRule="exact"/>
+      </w:pPr>
+      <w:r>
+        <w:rPr>
+          <w:rFonts w:ascii="Georgia" w:hAnsi="Georgia"/>
+          <w:sz w:val="22"/>
+        </w:rPr>
+        <w:t>Essen, das gut ist, nicht nur schnell. Bewegung, die wir mögen, nicht nur erledigen. Gespräche, die uns nähren, nicht nur verbrauchen. Menschen, bei denen wir wir selbst sein können, ohne Performance.</w:t>
+      </w:r>
+    </w:p>
+    <w:p>
+      <w:pPr>
+        <w:spacing w:after="160" w:line="320" w:lineRule="exact"/>
+      </w:pPr>
+      <w:r>
+        <w:rPr>
+          <w:rFonts w:ascii="Georgia" w:hAnsi="Georgia"/>
+          <w:sz w:val="22"/>
+        </w:rPr>
+        <w:t>Und, vielleicht am wichtigsten: Das Recht, eigene Bedürfnisse zu haben. Auch wenn sie anderen unbequem sind. Auch wenn das Schuldgefühl sich meldet. Auch wenn niemand versteht, warum du das gerade brauchst.</w:t>
       </w:r>
     </w:p>
     <w:p>
@@ -4437,19 +4593,19 @@
           <w:rFonts w:ascii="Georgia" w:hAnsi="Georgia"/>
           <w:sz w:val="22"/>
         </w:rPr>
-        <w:t>Bedürfnisse brauchen keine Rechtfertigung. Sie sind einfach da. Das ist menschlich.</w:t>
-      </w:r>
-    </w:p>
-    <w:p>
-      <w:pPr>
-        <w:spacing w:after="160" w:line="320" w:lineRule="exact"/>
-      </w:pPr>
-      <w:r>
-        <w:rPr>
-          <w:rFonts w:ascii="Georgia" w:hAnsi="Georgia"/>
-          <w:sz w:val="22"/>
-        </w:rPr>
-        <w:t>Marie hat gelernt, dass der Nachmittag auf dem Sofa kein Verrat an ihrer Familie war. Er war eine Investition — in sie selbst, ja. Und damit auch in alles, was sie für andere ist. Eine ausgeruhte, bei sich seiende Frau kann anderen anders begegnen als eine, die auf Reserve läuft.</w:t>
+        <w:t>Bedürfnisse brauchen keine Rechtfertigung. Sie sind einfach da. Das ist menschlich. Das ist erlaubt.</w:t>
+      </w:r>
+    </w:p>
+    <w:p>
+      <w:pPr>
+        <w:spacing w:after="160" w:line="320" w:lineRule="exact"/>
+      </w:pPr>
+      <w:r>
+        <w:rPr>
+          <w:rFonts w:ascii="Georgia" w:hAnsi="Georgia"/>
+          <w:sz w:val="22"/>
+        </w:rPr>
+        <w:t>Marie hat gelernt, dass der Nachmittag auf dem Sofa kein Verrat an ihrer Familie war. Er war eine Investition — in sie selbst, ja. Und damit auch in alles, was sie für andere ist. Eine ausgeruhte, bei sich seiende Frau kann anderen anders begegnen als eine, die auf Reserve läuft und schon lange nicht mehr weiss, wer sie ausserhalb dieser Rollen eigentlich ist.</w:t>
       </w:r>
     </w:p>
     <w:p>
@@ -4526,7 +4682,7 @@
           <w:i/>
           <w:sz w:val="22"/>
         </w:rPr>
-        <w:t>Was hält dich konkret davon ab?</w:t>
+        <w:t>Was hält dich konkret davon ab — und ist dieses Hindernis wirklich unüberwindbar?</w:t>
       </w:r>
     </w:p>
     <w:p>
@@ -4571,7 +4727,7 @@
           <w:rFonts w:ascii="Georgia" w:hAnsi="Georgia"/>
           <w:sz w:val="22"/>
         </w:rPr>
-        <w:t>Sie hat damals ihre Ehe beendet. Ihre Kinder waren klein, sieben und neun Jahre alt. Es war kompliziert, es war schmerzhaft, der Auszug des Vaters hat die Kinder getroffen. Das sieht Renate heute noch gelegentlich, in bestimmten Mustern ihrer erwachsenen Kinder, in Gesprächen die eine bestimmte Richtung nehmen.</w:t>
+        <w:t>Sie hat damals ihre Ehe beendet. Ihre Kinder waren klein, sieben und neun Jahre alt. Es war kompliziert, es war schmerzhaft, der Auszug des Vaters hat die Kinder getroffen. Das sieht Renate heute noch gelegentlich — in bestimmten Mustern ihrer erwachsenen Kinder, in Gesprächen, die eine bestimmte Richtung nehmen.</w:t>
       </w:r>
     </w:p>
     <w:p>
@@ -4655,7 +4811,7 @@
           <w:rFonts w:ascii="Georgia" w:hAnsi="Georgia"/>
           <w:sz w:val="22"/>
         </w:rPr>
-        <w:t>Nicht weil die Dinge die man bereut, immer klein sind. Manchmal sind sie es nicht. Manchmal hat man wirklich etwas getan, das jemanden verletzt hat. Manchmal hätte man es besser machen können, und man hat es gewusst — oder hätte es wissen sollen.</w:t>
+        <w:t>Nicht weil die Dinge, die man bereut, immer klein sind. Manchmal sind sie es nicht. Manchmal hat man wirklich etwas getan, das jemanden verletzt hat. Manchmal hätte man es besser machen können, und man hat es gewusst — oder hätte es wissen sollen.</w:t>
       </w:r>
     </w:p>
     <w:p>
@@ -4679,19 +4835,19 @@
           <w:rFonts w:ascii="Georgia" w:hAnsi="Georgia"/>
           <w:sz w:val="22"/>
         </w:rPr>
-        <w:t>Selbstbestrafung ist keine Moral. Sie schützt niemanden. Sie heilt niemanden. Sie macht das, was geschehen ist, nicht ungeschehen. Sie dient, wenn man ehrlich hinschaut, vor allem dazu, das Gefühl aufrechtzuerhalten: Ich leide genug. Also bin ich noch nicht vollständig schuldig.</w:t>
-      </w:r>
-    </w:p>
-    <w:p>
-      <w:pPr>
-        <w:spacing w:after="160" w:line="320" w:lineRule="exact"/>
-      </w:pPr>
-      <w:r>
-        <w:rPr>
-          <w:rFonts w:ascii="Georgia" w:hAnsi="Georgia"/>
-          <w:sz w:val="22"/>
-        </w:rPr>
-        <w:t>Aber das ist eine Falle.</w:t>
+        <w:t>Selbstbestrafung ist keine Moral. Sie schützt niemanden. Sie heilt niemanden. Sie macht das, was geschehen ist, nicht ungeschehen. Sie dient, wenn man ehrlich hinschaut, vor allem dazu, das Gefühl aufrechtzuerhalten: Ich leide genug. Also bin ich kein schlechter Mensch.</w:t>
+      </w:r>
+    </w:p>
+    <w:p>
+      <w:pPr>
+        <w:spacing w:after="160" w:line="320" w:lineRule="exact"/>
+      </w:pPr>
+      <w:r>
+        <w:rPr>
+          <w:rFonts w:ascii="Georgia" w:hAnsi="Georgia"/>
+          <w:sz w:val="22"/>
+        </w:rPr>
+        <w:t>Aber das ist eine Falle. Leiden ist keine Wiedergutmachung. Es ist nur Leiden.</w:t>
       </w:r>
     </w:p>
     <w:p>
@@ -4715,43 +4871,31 @@
           <w:rFonts w:ascii="Georgia" w:hAnsi="Georgia"/>
           <w:sz w:val="22"/>
         </w:rPr>
-        <w:t>Reue schaut auf das, was war, und fragt: Was kann ich daraus verstehen? Was würde ich heute anders machen? Gibt es noch etwas, das ich tun kann?</w:t>
-      </w:r>
-    </w:p>
-    <w:p>
-      <w:pPr>
-        <w:spacing w:after="160" w:line="320" w:lineRule="exact"/>
-      </w:pPr>
-      <w:r>
-        <w:rPr>
-          <w:rFonts w:ascii="Georgia" w:hAnsi="Georgia"/>
-          <w:sz w:val="22"/>
-        </w:rPr>
-        <w:t>Reue ermöglicht Lernen. Sie ist produktiv, auch wenn sie schmerzhaft ist.</w:t>
-      </w:r>
-    </w:p>
-    <w:p>
-      <w:pPr>
-        <w:spacing w:after="160" w:line="320" w:lineRule="exact"/>
-      </w:pPr>
-      <w:r>
-        <w:rPr>
-          <w:rFonts w:ascii="Georgia" w:hAnsi="Georgia"/>
-          <w:sz w:val="22"/>
-        </w:rPr>
-        <w:t>Schuld, die lähmt, schaut auf das, was war, und sagt: Du hast kein Recht auf Frieden. Du hast kein Recht auf Freude. Das, was damals war, macht dich auf irgendeine Weise für immer zu einem schlechteren Menschen.</w:t>
-      </w:r>
-    </w:p>
-    <w:p>
-      <w:pPr>
-        <w:spacing w:after="160" w:line="320" w:lineRule="exact"/>
-      </w:pPr>
-      <w:r>
-        <w:rPr>
-          <w:rFonts w:ascii="Georgia" w:hAnsi="Georgia"/>
-          <w:sz w:val="22"/>
-        </w:rPr>
-        <w:t>Das ist kein Gewissen mehr. Das ist Selbstverstümmelung.</w:t>
+        <w:t>Reue schaut auf das, was war, und fragt: Was kann ich daraus verstehen? Was würde ich heute anders machen? Gibt es noch etwas, das ich tun kann, um den Schaden zu begrenzen?</w:t>
+      </w:r>
+    </w:p>
+    <w:p>
+      <w:pPr>
+        <w:spacing w:after="160" w:line="320" w:lineRule="exact"/>
+      </w:pPr>
+      <w:r>
+        <w:rPr>
+          <w:rFonts w:ascii="Georgia" w:hAnsi="Georgia"/>
+          <w:sz w:val="22"/>
+        </w:rPr>
+        <w:t>Reue ermöglicht Lernen. Sie ist produktiv, auch wenn sie schmerzhaft ist. Sie hat eine Richtung: vorwärts.</w:t>
+      </w:r>
+    </w:p>
+    <w:p>
+      <w:pPr>
+        <w:spacing w:after="160" w:line="320" w:lineRule="exact"/>
+      </w:pPr>
+      <w:r>
+        <w:rPr>
+          <w:rFonts w:ascii="Georgia" w:hAnsi="Georgia"/>
+          <w:sz w:val="22"/>
+        </w:rPr>
+        <w:t>Schuld, die lähmt, schaut auf das, was war, und sagt: Du hast kein Recht auf Frieden. Du hast kein Recht auf Freude. Das, was damals war, macht dich auf irgendeine Weise für immer zu einem schlechteren Menschen. Das ist kein Gewissen mehr. Das ist Selbstverstümmelung, die als Moral verkleidet ist.</w:t>
       </w:r>
     </w:p>
     <w:p>
@@ -4787,31 +4931,31 @@
           <w:rFonts w:ascii="Georgia" w:hAnsi="Georgia"/>
           <w:sz w:val="22"/>
         </w:rPr>
-        <w:t>Vielleicht hätte ich mehr wissen können. Vielleicht hätte ich stärker sein können. Vielleicht. Aber die Entscheidung von damals mit dem Wissen und der Reife von heute zu beurteilen, ist unfair. Das ist eine Verurteilung, die keine Grundlage hat.</w:t>
-      </w:r>
-    </w:p>
-    <w:p>
-      <w:pPr>
-        <w:spacing w:after="160" w:line="320" w:lineRule="exact"/>
-      </w:pPr>
-      <w:r>
-        <w:rPr>
-          <w:rFonts w:ascii="Georgia" w:hAnsi="Georgia"/>
-          <w:sz w:val="22"/>
-        </w:rPr>
-        <w:t>Renate kann ihr Gewissen nicht durch ewige Reue zurückzahlen. Es gibt nichts zurückzuzahlen. Die Vergangenheit ist, wie sie ist.</w:t>
-      </w:r>
-    </w:p>
-    <w:p>
-      <w:pPr>
-        <w:spacing w:after="160" w:line="320" w:lineRule="exact"/>
-      </w:pPr>
-      <w:r>
-        <w:rPr>
-          <w:rFonts w:ascii="Georgia" w:hAnsi="Georgia"/>
-          <w:sz w:val="22"/>
-        </w:rPr>
-        <w:t>Was sie kann: entscheiden, wie sie den Rest ihres Lebens lebt. Ob das Schuldgefühl von damals auch die nächsten zwanzig Jahre bestimmt — oder nicht.</w:t>
+        <w:t>Vielleicht hätte ich mehr wissen können. Vielleicht hätte ich stärker sein können. Vielleicht. Aber die Entscheidung von damals mit dem Wissen und der Reife von heute zu beurteilen, ist unfair. Es ist wie einen zwölfjährigen Fehler mit den Augen einer Fünfzigjährigen zu verurteilen. Das Kind von damals hatte nicht, was du heute hast.</w:t>
+      </w:r>
+    </w:p>
+    <w:p>
+      <w:pPr>
+        <w:spacing w:after="160" w:line="320" w:lineRule="exact"/>
+      </w:pPr>
+      <w:r>
+        <w:rPr>
+          <w:rFonts w:ascii="Georgia" w:hAnsi="Georgia"/>
+          <w:sz w:val="22"/>
+        </w:rPr>
+        <w:t>Renate kann ihr Gewissen nicht durch ewige Reue zurückzahlen. Es gibt nichts zurückzuzahlen. Die Vergangenheit ist, wie sie ist. Die Entscheidung, die sie getroffen hat, war das, was sie damals konnte. Mit mehr Wissen, mehr Reife, anderen Umständen hätte sie vielleicht anders entschieden. Aber sie war in den Umständen, die sie hatte.</w:t>
+      </w:r>
+    </w:p>
+    <w:p>
+      <w:pPr>
+        <w:spacing w:after="160" w:line="320" w:lineRule="exact"/>
+      </w:pPr>
+      <w:r>
+        <w:rPr>
+          <w:rFonts w:ascii="Georgia" w:hAnsi="Georgia"/>
+          <w:sz w:val="22"/>
+        </w:rPr>
+        <w:t>Was sie kann: entscheiden, wie sie den Rest ihres Lebens lebt. Ob das Schuldgefühl von damals auch die nächsten zwanzig Jahre bestimmt — oder nicht. Das ist keine Verräterei an dem, was damals war. Es ist die einzige Entscheidung, die noch möglich ist.</w:t>
       </w:r>
     </w:p>
     <w:p>
@@ -4888,7 +5032,7 @@
           <w:i/>
           <w:sz w:val="22"/>
         </w:rPr>
-        <w:t>Was würde „sich vergeben" für dich konkret bedeuten?</w:t>
+        <w:t>Was würde „sich vergeben" für dich konkret bedeuten — nicht als Konzept, sondern im Alltag?</w:t>
       </w:r>
     </w:p>
     <w:p>
@@ -4969,31 +5113,31 @@
           <w:rFonts w:ascii="Georgia" w:hAnsi="Georgia"/>
           <w:sz w:val="22"/>
         </w:rPr>
-        <w:t>Wir haben lange zusammengearbeitet.</w:t>
-      </w:r>
-    </w:p>
-    <w:p>
-      <w:pPr>
-        <w:spacing w:after="160" w:line="320" w:lineRule="exact"/>
-      </w:pPr>
-      <w:r>
-        <w:rPr>
-          <w:rFonts w:ascii="Georgia" w:hAnsi="Georgia"/>
-          <w:sz w:val="22"/>
-        </w:rPr>
-        <w:t>Kürzlich habe ich sie zufällig getroffen, auf einem Markt. Sie hatte ihr jüngstes Kind dabei, das etwa vier Jahre alt ist. Sie sah entspannt aus. Nicht perfekt — entspannt. Es gab einen Unterschied in ihrer Art zu stehen, zu schauen, zu lachen. Nicht dramatisch. Aber da.</w:t>
-      </w:r>
-    </w:p>
-    <w:p>
-      <w:pPr>
-        <w:spacing w:after="160" w:line="320" w:lineRule="exact"/>
-      </w:pPr>
-      <w:r>
-        <w:rPr>
-          <w:rFonts w:ascii="Georgia" w:hAnsi="Georgia"/>
-          <w:sz w:val="22"/>
-        </w:rPr>
-        <w:t>Ich fragte sie wie es ihr geht.</w:t>
+        <w:t>Wir haben lange zusammengearbeitet. Es war kein geradliniger Weg. Es gab Momente, in denen das Schuldgefühl lauter wurde, bevor es leiser wurde — das passiert fast immer, wenn man anfängt, Muster zu verändern. Das System, das sich stabilisiert hat, widersetzt sich der Veränderung. Das ist normal. Das ist kein Zeichen, dass etwas falsch läuft.</w:t>
+      </w:r>
+    </w:p>
+    <w:p>
+      <w:pPr>
+        <w:spacing w:after="160" w:line="320" w:lineRule="exact"/>
+      </w:pPr>
+      <w:r>
+        <w:rPr>
+          <w:rFonts w:ascii="Georgia" w:hAnsi="Georgia"/>
+          <w:sz w:val="22"/>
+        </w:rPr>
+        <w:t>Kürzlich habe ich Sophia zufällig getroffen, auf einem Markt. Sie hatte ihr jüngstes Kind dabei, das etwa vier Jahre alt ist. Sie sah entspannt aus. Nicht perfekt — entspannt. Es gab einen Unterschied in ihrer Art zu stehen, zu schauen, zu lachen. Nicht dramatisch. Aber da.</w:t>
+      </w:r>
+    </w:p>
+    <w:p>
+      <w:pPr>
+        <w:spacing w:after="160" w:line="320" w:lineRule="exact"/>
+      </w:pPr>
+      <w:r>
+        <w:rPr>
+          <w:rFonts w:ascii="Georgia" w:hAnsi="Georgia"/>
+          <w:sz w:val="22"/>
+        </w:rPr>
+        <w:t>Ich fragte sie, wie es ihr geht.</w:t>
       </w:r>
     </w:p>
     <w:p>
@@ -5029,7 +5173,7 @@
           <w:rFonts w:ascii="Georgia" w:hAnsi="Georgia"/>
           <w:sz w:val="22"/>
         </w:rPr>
-        <w:t>Das ist kein dramatischer Satz. Kein grosses Finale. Für jemanden der jahrelang diesen Dauergast mit sich getragen hat, ist es trotzdem enorm.</w:t>
+        <w:t>Das ist kein dramatischer Satz. Kein grosses Finale. Für jemanden, der jahrelang diesen Dauergast mit sich getragen hat, ist es trotzdem enorm.</w:t>
       </w:r>
     </w:p>
     <w:p>
@@ -5053,31 +5197,19 @@
           <w:rFonts w:ascii="Georgia" w:hAnsi="Georgia"/>
           <w:sz w:val="22"/>
         </w:rPr>
-        <w:t>Es bedeutet nicht, kein Gewissen mehr zu haben. Sophia hat noch immer Momente, wo sie merkt, dass sie etwas besser hätte machen können. Wo sie sich entschuldigt, wenn sie jemanden verletzt hat. Wo sie Verantwortung übernimmt für das, was sie getan hat.</w:t>
-      </w:r>
-    </w:p>
-    <w:p>
-      <w:pPr>
-        <w:spacing w:after="160" w:line="320" w:lineRule="exact"/>
-      </w:pPr>
-      <w:r>
-        <w:rPr>
-          <w:rFonts w:ascii="Georgia" w:hAnsi="Georgia"/>
-          <w:sz w:val="22"/>
-        </w:rPr>
-        <w:t>Das ist das gesunde Gewissen. Das kommt, zeigt auf etwas, und geht wieder. Es hat ein Ende.</w:t>
-      </w:r>
-    </w:p>
-    <w:p>
-      <w:pPr>
-        <w:spacing w:after="160" w:line="320" w:lineRule="exact"/>
-      </w:pPr>
-      <w:r>
-        <w:rPr>
-          <w:rFonts w:ascii="Georgia" w:hAnsi="Georgia"/>
-          <w:sz w:val="22"/>
-        </w:rPr>
-        <w:t>Was weg ist, ist der Dauerton. Das Hintergrundrauschen. Das Gewicht, das morgens schon da ist, bevor der Tag begonnen hat. Das Gefühl, immer irgendwie zu viel oder zu wenig zu sein.</w:t>
+        <w:t>Es bedeutet nicht, kein Gewissen mehr zu haben. Sophia hat noch immer Momente, wo sie merkt, dass sie etwas besser hätte machen können. Wo sie sich entschuldigt, wenn sie jemanden verletzt hat. Wo sie Verantwortung übernimmt für das, was sie getan hat. Das ist das gesunde Gewissen. Das kommt, zeigt auf etwas, und geht wieder. Es hat ein Ende.</w:t>
+      </w:r>
+    </w:p>
+    <w:p>
+      <w:pPr>
+        <w:spacing w:after="160" w:line="320" w:lineRule="exact"/>
+      </w:pPr>
+      <w:r>
+        <w:rPr>
+          <w:rFonts w:ascii="Georgia" w:hAnsi="Georgia"/>
+          <w:sz w:val="22"/>
+        </w:rPr>
+        <w:t>Was weg ist, ist der Dauerton. Das Hintergrundrauschen. Das Gewicht, das morgens schon da ist, bevor der Tag begonnen hat. Das Gefühl, immer irgendwie zu viel oder zu wenig zu sein. Der innere Wächter, der nie schläft.</w:t>
       </w:r>
     </w:p>
     <w:p>
@@ -5113,31 +5245,31 @@
           <w:rFonts w:ascii="Georgia" w:hAnsi="Georgia"/>
           <w:sz w:val="22"/>
         </w:rPr>
-        <w:t>Entscheidungen aus einer anderen Quelle. Nicht aus der Angst davor, jemanden zu enttäuschen. Sondern aus dem, was wirklich stimmt.</w:t>
-      </w:r>
-    </w:p>
-    <w:p>
-      <w:pPr>
-        <w:spacing w:after="160" w:line="320" w:lineRule="exact"/>
-      </w:pPr>
-      <w:r>
-        <w:rPr>
-          <w:rFonts w:ascii="Georgia" w:hAnsi="Georgia"/>
-          <w:sz w:val="22"/>
-        </w:rPr>
-        <w:t>Beziehungen, die echter sind. Weil man nicht mehr alles gibt, um das Schuldgefühl zum Schweigen zu bringen. Weil das Geben aus Wahl kommt, nicht aus Pflicht.</w:t>
-      </w:r>
-    </w:p>
-    <w:p>
-      <w:pPr>
-        <w:spacing w:after="160" w:line="320" w:lineRule="exact"/>
-      </w:pPr>
-      <w:r>
-        <w:rPr>
-          <w:rFonts w:ascii="Georgia" w:hAnsi="Georgia"/>
-          <w:sz w:val="22"/>
-        </w:rPr>
-        <w:t>Und diese merkwürdige, ruhige Möglichkeit, einfach da zu sein. In einem Moment. Ohne den nächsten schon zu verwalten.</w:t>
+        <w:t>Entscheidungen aus einer anderen Quelle. Nicht aus der Angst davor, jemanden zu enttäuschen. Sondern aus dem, was wirklich stimmt. Was du wirklich willst. Was wirklich zu dir passt.</w:t>
+      </w:r>
+    </w:p>
+    <w:p>
+      <w:pPr>
+        <w:spacing w:after="160" w:line="320" w:lineRule="exact"/>
+      </w:pPr>
+      <w:r>
+        <w:rPr>
+          <w:rFonts w:ascii="Georgia" w:hAnsi="Georgia"/>
+          <w:sz w:val="22"/>
+        </w:rPr>
+        <w:t>Beziehungen, die echter sind. Weil man nicht mehr alles gibt, um das Schuldgefühl zum Schweigen zu bringen. Weil das Geben aus Wahl kommt, nicht aus Pflicht. Weil das Nein möglich ist, wenn es das Richtige ist.</w:t>
+      </w:r>
+    </w:p>
+    <w:p>
+      <w:pPr>
+        <w:spacing w:after="160" w:line="320" w:lineRule="exact"/>
+      </w:pPr>
+      <w:r>
+        <w:rPr>
+          <w:rFonts w:ascii="Georgia" w:hAnsi="Georgia"/>
+          <w:sz w:val="22"/>
+        </w:rPr>
+        <w:t>Und diese merkwürdige, ruhige Möglichkeit, einfach da zu sein. In einem Moment. Ohne den nächsten schon zu verwalten. Ohne das Inventar zu machen, was man noch tun müsste, wem man noch was schuldet.</w:t>
       </w:r>
     </w:p>
     <w:p>
@@ -5271,6 +5403,54 @@
           <w:rFonts w:ascii="Georgia" w:hAnsi="Georgia"/>
           <w:sz w:val="22"/>
         </w:rPr>
+        <w:t>Es ist seltsam, jemandem zu schreiben, den man nicht kennt.</w:t>
+      </w:r>
+    </w:p>
+    <w:p>
+      <w:pPr>
+        <w:spacing w:after="160" w:line="320" w:lineRule="exact"/>
+      </w:pPr>
+      <w:r>
+        <w:rPr>
+          <w:rFonts w:ascii="Georgia" w:hAnsi="Georgia"/>
+          <w:sz w:val="22"/>
+        </w:rPr>
+        <w:t>Ich weiss nicht, wer du bist. Ich weiss nicht, wie dein Leben aussieht, was dich hierher geführt hat, ob du dieses Buch von vorne nach hinten gelesen hast oder dort eingestiegen bist, wo etwas in dir sich wiedererkannt hat. Ich weiss nicht, ob du allein bist oder mit jemandem. Ob das, was ich geschrieben habe, dich berührt hat oder eher skeptisch gelassen.</w:t>
+      </w:r>
+    </w:p>
+    <w:p>
+      <w:pPr>
+        <w:spacing w:after="160" w:line="320" w:lineRule="exact"/>
+      </w:pPr>
+      <w:r>
+        <w:rPr>
+          <w:rFonts w:ascii="Georgia" w:hAnsi="Georgia"/>
+          <w:sz w:val="22"/>
+        </w:rPr>
+        <w:t>Was ich weiss: Du hast dir die Zeit genommen. Das ist mehr, als du glaubst.</w:t>
+      </w:r>
+    </w:p>
+    <w:p>
+      <w:pPr>
+        <w:spacing w:after="160" w:line="320" w:lineRule="exact"/>
+      </w:pPr>
+      <w:r>
+        <w:rPr>
+          <w:rFonts w:ascii="Georgia" w:hAnsi="Georgia"/>
+          <w:sz w:val="22"/>
+        </w:rPr>
+        <w:t>Frauen, die chronisch mit dem Schuldgefühl leben, nehmen sich selten Zeit für sich selbst. Sie lesen zwar — aber meistens für andere. Sie informieren sich — aber meistens um besser zu funktionieren. Ein Buch, das von der eigenen inneren Welt handelt, von den eigenen Mustern, von dem, was einem selbst zusteht — das ist keine Kleinigkeit.</w:t>
+      </w:r>
+    </w:p>
+    <w:p>
+      <w:pPr>
+        <w:spacing w:after="160" w:line="320" w:lineRule="exact"/>
+      </w:pPr>
+      <w:r>
+        <w:rPr>
+          <w:rFonts w:ascii="Georgia" w:hAnsi="Georgia"/>
+          <w:sz w:val="22"/>
+        </w:rPr>
         <w:t>Ich habe dieses Buch geschrieben, weil ich glaube, dass du es verdienst, dein Leben ohne dieses Gewicht zu leben.</w:t>
       </w:r>
     </w:p>
@@ -5307,43 +5487,31 @@
           <w:rFonts w:ascii="Georgia" w:hAnsi="Georgia"/>
           <w:sz w:val="22"/>
         </w:rPr>
-        <w:t>Du bist eine Frau, die das Beste gegeben hat, was sie hatte. In manchen Momenten war das viel. In anderen war es das, was gerade möglich war.</w:t>
-      </w:r>
-    </w:p>
-    <w:p>
-      <w:pPr>
-        <w:spacing w:after="160" w:line="320" w:lineRule="exact"/>
-      </w:pPr>
-      <w:r>
-        <w:rPr>
-          <w:rFonts w:ascii="Georgia" w:hAnsi="Georgia"/>
-          <w:sz w:val="22"/>
-        </w:rPr>
-        <w:t>Beides ist menschlich.</w:t>
-      </w:r>
-    </w:p>
-    <w:p>
-      <w:pPr>
-        <w:spacing w:after="160" w:line="320" w:lineRule="exact"/>
-      </w:pPr>
-      <w:r>
-        <w:rPr>
-          <w:rFonts w:ascii="Georgia" w:hAnsi="Georgia"/>
-          <w:sz w:val="22"/>
-        </w:rPr>
-        <w:t>Was ich dir nicht versprechen kann: dass es einfach wird. Dass die Schuldgefühle einfach verschwinden, nachdem du dieses Buch gelesen hast. Dass das Nervensystem sofort anders reagiert.</w:t>
-      </w:r>
-    </w:p>
-    <w:p>
-      <w:pPr>
-        <w:spacing w:after="160" w:line="320" w:lineRule="exact"/>
-      </w:pPr>
-      <w:r>
-        <w:rPr>
-          <w:rFonts w:ascii="Georgia" w:hAnsi="Georgia"/>
-          <w:sz w:val="22"/>
-        </w:rPr>
-        <w:t>Was ich dir versprechen kann: dass Verstehen der Anfang ist. Dass jedes Mal, wenn du das Schuldgefühl bemerkst und weisst woher es kommt, sich etwas verändert. Langsam. Aber real.</w:t>
+        <w:t>Du bist eine Frau, die das Beste gegeben hat, was sie hatte. In manchen Momenten war das viel. In anderen war es das, was gerade möglich war. Beides ist menschlich.</w:t>
+      </w:r>
+    </w:p>
+    <w:p>
+      <w:pPr>
+        <w:spacing w:after="160" w:line="320" w:lineRule="exact"/>
+      </w:pPr>
+      <w:r>
+        <w:rPr>
+          <w:rFonts w:ascii="Georgia" w:hAnsi="Georgia"/>
+          <w:sz w:val="22"/>
+        </w:rPr>
+        <w:t>Was ich dir nicht versprechen kann: dass es einfach wird. Dass die Schuldgefühle einfach verschwinden, nachdem du dieses Buch gelesen hast. Dass das Nervensystem sofort anders reagiert. Veränderung passiert nicht durch Lesen — sie passiert durch das, was du danach tust. Durch die kleinen Entscheidungen, die du triffst. Durch das Bleiben beim Nein. Durch das Wahrnehmen des Körpers. Durch die Frage, die du dir selbst stellst, wenn das Schuldgefühl kommt: Ist das meins?</w:t>
+      </w:r>
+    </w:p>
+    <w:p>
+      <w:pPr>
+        <w:spacing w:after="160" w:line="320" w:lineRule="exact"/>
+      </w:pPr>
+      <w:r>
+        <w:rPr>
+          <w:rFonts w:ascii="Georgia" w:hAnsi="Georgia"/>
+          <w:sz w:val="22"/>
+        </w:rPr>
+        <w:t>Was ich dir versprechen kann: dass Verstehen der Anfang ist. Dass jedes Mal, wenn du das Schuldgefühl bemerkst und weisst, woher es kommt, sich etwas verändert. Langsam. Aber real. Jede Begegnung mit dir selbst, die nicht auf Schuldgefühl basiert, ist ein neues Muster, das sich eingraviert.</w:t>
       </w:r>
     </w:p>
     <w:p>
@@ -5367,7 +5535,7 @@
           <w:rFonts w:ascii="Georgia" w:hAnsi="Georgia"/>
           <w:sz w:val="22"/>
         </w:rPr>
-        <w:t>Was ich dir wünsche, ist das Ende des Dauerlärms. Dieses diffuse, nie ganz greifbare Rauschen, das dich begleitet und dich glauben lässt, du seist immer irgendwie nicht genug.</w:t>
+        <w:t>Was ich dir wünsche, ist das Ende des Dauerlärms. Dieses diffuse, nie ganz greifbare Rauschen, das dich begleitet und dich glauben lässt, du seist immer irgendwie nicht genug. Nicht gut genug als Mutter. Nicht präsent genug als Tochter. Nicht zuverlässig genug als Freundin. Nicht leistungsfähig genug als Kollegin. Nicht entspannt genug als Partnerin.</w:t>
       </w:r>
     </w:p>
     <w:p>
@@ -5391,7 +5559,7 @@
           <w:rFonts w:ascii="Georgia" w:hAnsi="Georgia"/>
           <w:sz w:val="22"/>
         </w:rPr>
-        <w:t>Nicht weil du alles richtig gemacht hast. Nicht weil du niemanden enttäuscht hast. Sondern weil Genug-Sein nicht an Bedingungen geknüpft ist.</w:t>
+        <w:t>Nicht weil du alles richtig gemacht hast. Nicht weil du niemanden enttäuscht hast. Sondern weil Genug-Sein nicht an Bedingungen geknüpft ist. Das ist das, was das Schuldgefühl dir nie sagen wird: dass du schon genug bist, bevor du irgendetwas geleistet hast.</w:t>
       </w:r>
     </w:p>
     <w:p>
@@ -5415,7 +5583,7 @@
           <w:rFonts w:ascii="Georgia" w:hAnsi="Georgia"/>
           <w:sz w:val="22"/>
         </w:rPr>
-        <w:t>Den Rest findest du selbst heraus. Schritt für Schritt, in deinem eigenen Tempo, auf deinem eigenen Weg.</w:t>
+        <w:t>Den Rest findest du selbst heraus. Schritt für Schritt, in deinem eigenen Tempo, auf deinem eigenen Weg. Mit Rückschlägen, mit Momenten, wo das Schuldgefühl wieder lauter ist. Mit Tagen, wo es leichter ist, und Wochen, wo es schwerer ist.</w:t>
       </w:r>
     </w:p>
     <w:p>
@@ -5472,7 +5640,7 @@
           <w:rFonts w:ascii="Georgia" w:hAnsi="Georgia"/>
           <w:sz w:val="22"/>
         </w:rPr>
-        <w:t>Dieses Buch ist entstanden aus Hunderten von Gesprächen mit Frauen, die mir ihr Vertrauen geschenkt haben. Ihnen gilt mein tiefster Dank.</w:t>
+        <w:t>Dieses Buch ist entstanden aus Hunderten von Gesprächen mit Frauen, die mir ihr Vertrauen geschenkt haben. In meiner Praxis, in Kursen, in zufälligen Momenten, in denen jemand etwas erzählt hat, das ich nie vergessen habe. Ihnen gilt mein tiefster Dank. Ohne diese Gespräche wäre dieses Buch nicht möglich gewesen.</w:t>
       </w:r>
     </w:p>
     <w:p>
@@ -5529,7 +5697,7 @@
           <w:rFonts w:ascii="Georgia" w:hAnsi="Georgia"/>
           <w:sz w:val="22"/>
         </w:rPr>
-        <w:t>Sie glaubt daran, dass Verstehen der Anfang von Veränderung ist. Und dass jede Frau das Recht hat, ihr Leben ohne chronisches Schuldgefühl zu leben.</w:t>
+        <w:t>Sie glaubt daran, dass Verstehen der Anfang von Veränderung ist. Und dass jede Frau das Recht hat, ihr Leben ohne chronisches Schuldgefühl zu leben — nicht weil sie es sich verdient hat, sondern weil sie es schlicht darf.</w:t>
       </w:r>
     </w:p>
     <w:p>
@@ -5598,7 +5766,7 @@
           <w:rFonts w:ascii="Georgia" w:hAnsi="Georgia"/>
           <w:sz w:val="22"/>
         </w:rPr>
-        <w:t>Wenn du das Gefühl hast, dass du Begleitung möchtest — für einen Schritt, der schwerer ist als er von aussen aussieht — melde dich gerne direkt.</w:t>
+        <w:t>Wenn du das Gefühl hast, dass du Begleitung möchtest — für einen Schritt, der schwerer ist als er von aussen aussieht, für ein Muster, das du nicht allein verändern kannst, für den Raum, in dem jemand wirklich zuhört — melde dich gerne direkt.</w:t>
       </w:r>
     </w:p>
     <w:p>
@@ -5706,18 +5874,6 @@
           <w:sz w:val="22"/>
         </w:rPr>
         <w:t>Alle im Buch beschriebenen Personen und Situationen sind Composite-Darstellungen. Sie basieren auf typischen Erfahrungsmustern aus der therapeutischen Praxis und sind so verfasst, dass keine reale Person erkennbar ist. Namen wurden frei gewählt. Ähnlichkeiten mit lebenden oder verstorbenen Personen sind zufällig und nicht beabsichtigt.</w:t>
-      </w:r>
-    </w:p>
-    <w:p>
-      <w:pPr>
-        <w:spacing w:after="160" w:line="320" w:lineRule="exact"/>
-      </w:pPr>
-      <w:r>
-        <w:rPr>
-          <w:rFonts w:ascii="Georgia" w:hAnsi="Georgia"/>
-          <w:sz w:val="22"/>
-        </w:rPr>
-        <w:t>Dieses Werk ist urheberrechtlich geschützt. Jede Verwertung ausserhalb der engen Grenzen des Urheberrechts ist ohne schriftliche Zustimmung der Autorin unzulässig und strafbar. Das gilt insbesondere für Vervielfältigungen, Übersetzungen, Mikroverfilmungen und die Einspeicherung und Verarbeitung in elektronischen Systemen.</w:t>
       </w:r>
     </w:p>
     <w:sectPr>

</xml_diff>

<commit_message>
Buch 4: Vollständiges Lektorat – KI-Muster entfernt, Franzi-Stil, Swiss-Spelling
</commit_message>
<xml_diff>
--- a/outputs/buch-schuldgefuehle/das-schlechte-gewissen-KDP.docx
+++ b/outputs/buch-schuldgefuehle/das-schlechte-gewissen-KDP.docx
@@ -422,19 +422,19 @@
           <w:rFonts w:ascii="Georgia" w:hAnsi="Georgia"/>
           <w:sz w:val="22"/>
         </w:rPr>
-        <w:t>Das war der Moment, in dem ich wusste: Dieses Buch muss geschrieben werden.</w:t>
-      </w:r>
-    </w:p>
-    <w:p>
-      <w:pPr>
-        <w:spacing w:after="160" w:line="320" w:lineRule="exact"/>
-      </w:pPr>
-      <w:r>
-        <w:rPr>
-          <w:rFonts w:ascii="Georgia" w:hAnsi="Georgia"/>
-          <w:sz w:val="22"/>
-        </w:rPr>
-        <w:t>Ich arbeite seit vielen Jahren als Therapeutin. Ich habe Hunderte von Frauen begleitet, an Punkten in ihrem Leben, wo etwas nicht mehr stimmte. Wo der Körper Nein sagte, auch wenn der Kopf noch versuchte, die Situation schönzureden. Wo die Erschöpfung so tief sass, dass Schlafen nicht mehr half — weil man im Schlaf noch immer grübelte, noch immer für jemanden da war, noch immer innerlich funktionierte. Wo die Freundlichkeit so weit nach aussen gerichtet war, dass vom eigenen Kern kaum noch etwas zu finden war.</w:t>
+        <w:t>Das war der Moment, in dem ich wusste, dass dieses Buch geschrieben werden muss.</w:t>
+      </w:r>
+    </w:p>
+    <w:p>
+      <w:pPr>
+        <w:spacing w:after="160" w:line="320" w:lineRule="exact"/>
+      </w:pPr>
+      <w:r>
+        <w:rPr>
+          <w:rFonts w:ascii="Georgia" w:hAnsi="Georgia"/>
+          <w:sz w:val="22"/>
+        </w:rPr>
+        <w:t>Ich arbeite seit vielen Jahren als Therapeutin. Ich habe Hunderte von Frauen begleitet, an Punkten in ihrem Leben, wo etwas nicht mehr stimmte. Wo der Körper Nein sagte, auch wenn der Kopf noch versuchte, die Situation schönzureden. Wo die Erschöpfung so tief sass, dass Schlafen nicht mehr half, weil man im Schlaf noch immer grübelte, noch immer für jemanden da war, noch immer innerlich funktionierte. Wo die Freundlichkeit so weit nach aussen gerichtet war, dass vom eigenen Kern kaum noch etwas zu finden war.</w:t>
       </w:r>
     </w:p>
     <w:p>
@@ -470,31 +470,31 @@
           <w:rFonts w:ascii="Georgia" w:hAnsi="Georgia"/>
           <w:sz w:val="22"/>
         </w:rPr>
-        <w:t>Frauen, die sich schuldig fühlten, wenn sie Nein sagten. Wenn sie Ja sagten. Wenn sie sich Ruhe gönnten. Wenn sie zu viel Raum einnahmen. Wenn sie nicht genug da waren. Wenn sie zu viel da waren. Wenn sie Abstand brauchten. Wenn sie Nähe suchten. Als wäre jede Regung, jede Entscheidung, jeder Atemzug potenziell schuldbehaftet.</w:t>
-      </w:r>
-    </w:p>
-    <w:p>
-      <w:pPr>
-        <w:spacing w:after="160" w:line="320" w:lineRule="exact"/>
-      </w:pPr>
-      <w:r>
-        <w:rPr>
-          <w:rFonts w:ascii="Georgia" w:hAnsi="Georgia"/>
-          <w:sz w:val="22"/>
-        </w:rPr>
-        <w:t>Das schlechte Gewissen sass bei diesen Frauen wie ein stiller Dauergast, der nie gefragt hatte, ob er willkommen ist, der aber trotzdem immer am Tisch sitzt, immer einen Platz belegt, immer etwas kostet — Energie, Entscheidungsfreiheit, Lebensfreude.</w:t>
-      </w:r>
-    </w:p>
-    <w:p>
-      <w:pPr>
-        <w:spacing w:after="160" w:line="320" w:lineRule="exact"/>
-      </w:pPr>
-      <w:r>
-        <w:rPr>
-          <w:rFonts w:ascii="Georgia" w:hAnsi="Georgia"/>
-          <w:sz w:val="22"/>
-        </w:rPr>
-        <w:t>Was mich über die Jahre immer wieder bewegt hat: Diese Frauen waren keine schwachen Menschen. Im Gegenteil. Sie waren stark, zuverlässig, belastbar. Sie organisierten, trugen, hielten zusammen. Sie waren die, bei denen man anrief. Die, die kamen wenn jemand sie brauchte. Die, denen Dinge anvertraut wurden, die anderen nicht anvertraut werden. Aussen war alles in Ordnung. Innen war ein Dauerlärm, den sie kaum noch wahrnahmen, weil er so selbstverständlich geworden war. Es ist wie das Rauschen des Kühlschranks. Man hört es erst, wenn er aufhört.</w:t>
+        <w:t>Frauen, die sich schuldig fühlten, wenn sie Nein sagten. Wenn sie Ja sagten. Wenn sie sich Ruhe gönnten. Wenn sie zu viel Raum einnahmen. Wenn sie nicht genug da waren. Wenn sie zu viel da waren. Als wäre jede Regung, jede Entscheidung, jeder Atemzug potenziell schuldbehaftet.</w:t>
+      </w:r>
+    </w:p>
+    <w:p>
+      <w:pPr>
+        <w:spacing w:after="160" w:line="320" w:lineRule="exact"/>
+      </w:pPr>
+      <w:r>
+        <w:rPr>
+          <w:rFonts w:ascii="Georgia" w:hAnsi="Georgia"/>
+          <w:sz w:val="22"/>
+        </w:rPr>
+        <w:t>Das schlechte Gewissen sass bei diesen Frauen wie ein stiller Dauergast, der nie gefragt hatte, ob er willkommen ist, der aber trotzdem immer am Tisch sitzt, immer einen Platz belegt, immer etwas kostet. Energie. Entscheidungsfreiheit. Lebensfreude.</w:t>
+      </w:r>
+    </w:p>
+    <w:p>
+      <w:pPr>
+        <w:spacing w:after="160" w:line="320" w:lineRule="exact"/>
+      </w:pPr>
+      <w:r>
+        <w:rPr>
+          <w:rFonts w:ascii="Georgia" w:hAnsi="Georgia"/>
+          <w:sz w:val="22"/>
+        </w:rPr>
+        <w:t>Was mich über die Jahre immer wieder bewegt hat: Diese Frauen waren keine schwachen Menschen. Im Gegenteil. Sie waren stark, zuverlässig, belastbar. Sie organisierten, trugen, hielten zusammen. Sie waren die, bei denen man anrief. Die, die kamen, wenn jemand sie brauchte. Aussen war alles in Ordnung. Innen war ein Dauerlärm, den sie kaum noch wahrnahmen, weil er so selbstverständlich geworden war. Wie das Rauschen des Kühlschranks. Man hört es erst, wenn er aufhört.</w:t>
       </w:r>
     </w:p>
     <w:p>
@@ -518,7 +518,7 @@
           <w:rFonts w:ascii="Georgia" w:hAnsi="Georgia"/>
           <w:sz w:val="22"/>
         </w:rPr>
-        <w:t>Nicht weil du etwas falsch machst. Sondern weil du wahrscheinlich schon lange zu viel trägst — und weil ein Teil von dir ahnt, dass es nicht so bleiben muss. Ein Teil von dir, der manchmal kaum hörbar ist, weil das Schuldgefühl immer lauter ist. Aber der da ist. Der weiss, dass etwas nicht stimmt.</w:t>
+        <w:t>Nicht weil du etwas falsch machst. Sondern weil du wahrscheinlich schon lange zu viel trägst. Und weil ein Teil von dir ahnt, dass es nicht so bleiben muss. Ein Teil von dir, der manchmal kaum hörbar ist, weil das Schuldgefühl immer lauter ist. Aber der da ist. Der weiss, dass etwas nicht stimmt.</w:t>
       </w:r>
     </w:p>
     <w:p>
@@ -542,19 +542,19 @@
           <w:rFonts w:ascii="Georgia" w:hAnsi="Georgia"/>
           <w:sz w:val="22"/>
         </w:rPr>
-        <w:t>Es gibt dabei keine Schnellösungen. Wer dir sagt, dass drei Atemübungen und eine neue Morgenroutine ein lebenslang gelerntes Muster verändern, lügt dich an. Was ich dir anbiete, ist Verstehen. Tiefes, ehrliches, manchmal unbequemes Verstehen. Und Verstehen ist der Anfang von allem. Nicht das Ende — aber das, ohne das nichts beginnt.</w:t>
-      </w:r>
-    </w:p>
-    <w:p>
-      <w:pPr>
-        <w:spacing w:after="160" w:line="320" w:lineRule="exact"/>
-      </w:pPr>
-      <w:r>
-        <w:rPr>
-          <w:rFonts w:ascii="Georgia" w:hAnsi="Georgia"/>
-          <w:sz w:val="22"/>
-        </w:rPr>
-        <w:t>Ich schreibe nicht aus einer Position der Überlegenheit. Ich kenne das Schuldgefühl aus eigener Erfahrung. Ich kenne den Moment, in dem man sich erklärt, bevor man überhaupt gefragt wurde. Den Reflex, die eigenen Bedürfnisse zu verkleinern, damit sie niemanden stören. Das leise Unbehagen, wenn man etwas für sich tut, als müsste man dafür irgendwo Rechenschaft ablegen. Ich kenne das Gefühl, zu viel zu sein. Ich kenne auch das Gefühl, nie genug zu sein. Beides gleichzeitig — das ist das Paradox des chronischen Schuldgefühls.</w:t>
+        <w:t>Es gibt dabei keine Schnellösungen. Wer dir sagt, dass drei Atemübungen und eine neue Morgenroutine ein lebenslang gelerntes Muster verändern, lügt dich an. Was ich dir anbiete, ist Verstehen. Tiefes, ehrliches, manchmal unbequemes Verstehen. Und Verstehen ist der Anfang von allem. Nicht das Ende, aber das, ohne das nichts beginnt.</w:t>
+      </w:r>
+    </w:p>
+    <w:p>
+      <w:pPr>
+        <w:spacing w:after="160" w:line="320" w:lineRule="exact"/>
+      </w:pPr>
+      <w:r>
+        <w:rPr>
+          <w:rFonts w:ascii="Georgia" w:hAnsi="Georgia"/>
+          <w:sz w:val="22"/>
+        </w:rPr>
+        <w:t>Ich schreibe nicht aus einer Position der Überlegenheit. Ich kenne das Schuldgefühl aus eigener Erfahrung. Ich kenne den Moment, in dem man sich erklärt, bevor man überhaupt gefragt wurde. Den Reflex, die eigenen Bedürfnisse zu verkleinern, damit sie niemanden stören. Das leise Unbehagen, wenn man etwas für sich tut, als müsste man dafür irgendwo Rechenschaft ablegen. Ich kenne das Gefühl, zu viel zu sein. Ich kenne auch das Gefühl, nie genug zu sein. Beides gleichzeitig. Das ist das Paradox des chronischen Schuldgefühls.</w:t>
       </w:r>
     </w:p>
     <w:p>
@@ -578,19 +578,19 @@
           <w:rFonts w:ascii="Georgia" w:hAnsi="Georgia"/>
           <w:sz w:val="22"/>
         </w:rPr>
-        <w:t>Du kannst dieses Buch von vorne nach hinten lesen. Du kannst auch dort einsteigen, wo dich etwas besonders anspricht — wo ein Satz dich trifft, bevor du weisst warum. Die Fragen am Ende jedes Kapitels sind keine Hausaufgaben. Du kannst sie überspringen, wenn du willst. Aber sie bringen oft das ans Licht, was im Kopf verschwommen bleibt. Schreib die Antworten irgendwo auf, wenn du kannst. Das Schreiben macht aus Gefühlen Worte, und aus Worten wird manchmal Klarheit.</w:t>
-      </w:r>
-    </w:p>
-    <w:p>
-      <w:pPr>
-        <w:spacing w:after="160" w:line="320" w:lineRule="exact"/>
-      </w:pPr>
-      <w:r>
-        <w:rPr>
-          <w:rFonts w:ascii="Georgia" w:hAnsi="Georgia"/>
-          <w:sz w:val="22"/>
-        </w:rPr>
-        <w:t>Und noch etwas, das mir wichtig ist: Wenn du beim Lesen merkst, dass du mehr Unterstützung brauchst als ein Buch geben kann — hol sie dir. Dieses Buch ist ein Anfang. Für manche ist es genug. Für andere ist es der erste Schritt zu etwas Grösserem. Beides ist richtig. Beides ist mutig.</w:t>
+        <w:t>Du kannst dieses Buch von vorne nach hinten lesen. Du kannst auch dort einsteigen, wo dich etwas besonders anspricht, wo ein Satz dich trifft, bevor du weisst warum. Die Fragen am Ende jedes Kapitels sind keine Hausaufgaben. Du kannst sie überspringen, wenn du willst. Aber sie bringen oft das ans Licht, was im Kopf verschwommen bleibt. Schreib die Antworten irgendwo auf, wenn du kannst. Das Schreiben macht aus Gefühlen Worte, und aus Worten wird manchmal Klarheit.</w:t>
+      </w:r>
+    </w:p>
+    <w:p>
+      <w:pPr>
+        <w:spacing w:after="160" w:line="320" w:lineRule="exact"/>
+      </w:pPr>
+      <w:r>
+        <w:rPr>
+          <w:rFonts w:ascii="Georgia" w:hAnsi="Georgia"/>
+          <w:sz w:val="22"/>
+        </w:rPr>
+        <w:t>Und noch etwas, das mir wichtig ist: Wenn du beim Lesen merkst, dass du mehr Unterstützung brauchst als ein Buch geben kann, hol sie dir. Dieses Buch ist ein Anfang. Für manche ist es genug. Für andere ist es der erste Schritt zu etwas Grösserem. Beides ist richtig. Beides ist mutig.</w:t>
       </w:r>
     </w:p>
     <w:p>
@@ -659,19 +659,19 @@
           <w:rFonts w:ascii="Georgia" w:hAnsi="Georgia"/>
           <w:sz w:val="22"/>
         </w:rPr>
-        <w:t>Noch bevor sie weiss, was heute ansteht. Noch bevor sie aufs Handy schaut. Noch bevor der erste Gedanke fertig gedacht ist. Da ist dieses Gefühl. Diffus. Schwer. Irgendwie vertraut — so vertraut, dass sie manchmal nicht mehr sicher ist, ob es immer da war oder ob sie sich ein Leben ohne es überhaupt vorstellen kann.</w:t>
-      </w:r>
-    </w:p>
-    <w:p>
-      <w:pPr>
-        <w:spacing w:after="160" w:line="320" w:lineRule="exact"/>
-      </w:pPr>
-      <w:r>
-        <w:rPr>
-          <w:rFonts w:ascii="Georgia" w:hAnsi="Georgia"/>
-          <w:sz w:val="22"/>
-        </w:rPr>
-        <w:t>Als hätte sie etwas vergessen. Oder etwas versäumt. Oder jemanden enttäuscht. Oder irgendetwas wäre nicht in Ordnung mit dem, was gestern war.</w:t>
+        <w:t>Noch bevor sie weiss, was heute ansteht. Noch bevor sie aufs Handy schaut. Noch bevor der erste Gedanke fertig gedacht ist. Da ist dieses Gefühl. Diffus. Schwer. Irgendwie vertraut, so vertraut, dass sie manchmal nicht mehr sicher ist, ob es immer da war oder ob sie sich ein Leben ohne es überhaupt vorstellen kann.</w:t>
+      </w:r>
+    </w:p>
+    <w:p>
+      <w:pPr>
+        <w:spacing w:after="160" w:line="320" w:lineRule="exact"/>
+      </w:pPr>
+      <w:r>
+        <w:rPr>
+          <w:rFonts w:ascii="Georgia" w:hAnsi="Georgia"/>
+          <w:sz w:val="22"/>
+        </w:rPr>
+        <w:t>Als hätte sie etwas vergessen. Oder etwas versäumt. Oder jemanden enttäuscht. Irgendetwas wäre nicht in Ordnung mit dem, was gestern war.</w:t>
       </w:r>
     </w:p>
     <w:p>
@@ -695,7 +695,7 @@
           <w:rFonts w:ascii="Georgia" w:hAnsi="Georgia"/>
           <w:sz w:val="22"/>
         </w:rPr>
-        <w:t>Sarah ist zweiundvierzig. Sie ist Lehrerin, Mutter von zwei Kindern, Tochter einer anspruchsvollen Mutter, Freundin für viele. Sie ist die, bei der man anruft, wenn etwas ist. Sie ist die, die organisiert, wenn niemand sonst es tut. Sie ist verlässlich, warmherzig, zugewandt — und sie fängt jeden Tag mit diesem Gewicht an. Sie hat aufgehört, sich daran zu stören. Das ist das Beunruhigendste.</w:t>
+        <w:t>Sarah ist zweiundvierzig. Sie ist Lehrerin, Mutter von zwei Kindern, Tochter einer anspruchsvollen Mutter, Freundin für viele. Sie ist die, bei der man anruft, wenn etwas ist. Die, die organisiert, wenn niemand sonst es tut. Sie ist verlässlich, warmherzig, zugewandt. Und sie fängt jeden Tag mit diesem Gewicht an. Sie hat aufgehört, sich daran zu stören. Das ist das Beunruhigendste.</w:t>
       </w:r>
     </w:p>
     <w:p>
@@ -719,43 +719,31 @@
           <w:rFonts w:ascii="Georgia" w:hAnsi="Georgia"/>
           <w:sz w:val="22"/>
         </w:rPr>
-        <w:t>Das ist wichtig zu verstehen, weil es den Unterschied macht zwischen einem Gefühl, das man konkret angehen kann, und einem, das man zunächst verstehen muss, bevor man überhaupt etwas damit anfangen kann.</w:t>
-      </w:r>
-    </w:p>
-    <w:p>
-      <w:pPr>
-        <w:spacing w:after="160" w:line="320" w:lineRule="exact"/>
-      </w:pPr>
-      <w:r>
-        <w:rPr>
-          <w:rFonts w:ascii="Georgia" w:hAnsi="Georgia"/>
-          <w:sz w:val="22"/>
-        </w:rPr>
-        <w:t>Ein gesundes Gewissen ist präzise. Es meldet sich, wenn du etwas getan oder unterlassen hast, das gegen deine eigenen Werte verstösst. Es zeigt auf etwas Konkretes. Du weisst, wofür du dich schämst oder bereust. Es motiviert zur Wiedergutmachung — zu einer aufrichtigen Entschuldigung, zu einem Gespräch, zu einer Korrektur des eigenen Verhaltens. Und wenn das geschehen ist, löst es sich auf. Das gesunde Gewissen hat ein Ende. Es kommt, tut seine Arbeit, und geht. Es ist ein Wegweiser, kein Bewohner.</w:t>
-      </w:r>
-    </w:p>
-    <w:p>
-      <w:pPr>
-        <w:spacing w:after="160" w:line="320" w:lineRule="exact"/>
-      </w:pPr>
-      <w:r>
-        <w:rPr>
-          <w:rFonts w:ascii="Georgia" w:hAnsi="Georgia"/>
-          <w:sz w:val="22"/>
-        </w:rPr>
-        <w:t>Das chronische Schuldgefühl funktioniert anders. Es ist unspezifisch. Es lässt sich nicht festmachen. Es reagiert nicht auf Entschuldigungen, weil es kein konkretes Vergehen gibt, für das man sich entschuldigen könnte. Es ist einfach da. Wie Hintergrundmusik, die du nicht ausschalten kannst. Wie ein Radio, das immer leise läuft, auch dann, wenn du schläfst, auch dann, wenn alles gut ist, auch dann, wenn alle zufrieden sind und niemand etwas braucht.</w:t>
-      </w:r>
-    </w:p>
-    <w:p>
-      <w:pPr>
-        <w:spacing w:after="160" w:line="320" w:lineRule="exact"/>
-      </w:pPr>
-      <w:r>
-        <w:rPr>
-          <w:rFonts w:ascii="Georgia" w:hAnsi="Georgia"/>
-          <w:sz w:val="22"/>
-        </w:rPr>
-        <w:t>Viele Frauen, die ich kenne, haben gelernt, damit zu leben. Sie schieben es beiseite, gehen ihrem Tag nach, funktionieren. Die meisten von ihnen würden nicht einmal sagen, dass sie ein ausgeprägtes Schuldgefühl haben — weil es so zum Alltag gehört, dass sie es kaum noch wahrnehmen. Wie das Rauschen des Kühlschranks. Man hört es erst, wenn er aufhört.</w:t>
+        <w:t>Ein gesundes Gewissen ist präzise. Es meldet sich, wenn du etwas getan oder unterlassen hast, das gegen deine eigenen Werte verstösst. Du weisst, wofür du dich schämst oder bereust. Es motiviert zur Wiedergutmachung, zu einem aufrichtigen Gespräch, zu einer Korrektur des eigenen Verhaltens. Und wenn das geschehen ist, löst es sich auf. Das gesunde Gewissen hat ein Ende. Es kommt, tut seine Arbeit, und geht. Es ist ein Wegweiser, kein Bewohner.</w:t>
+      </w:r>
+    </w:p>
+    <w:p>
+      <w:pPr>
+        <w:spacing w:after="160" w:line="320" w:lineRule="exact"/>
+      </w:pPr>
+      <w:r>
+        <w:rPr>
+          <w:rFonts w:ascii="Georgia" w:hAnsi="Georgia"/>
+          <w:sz w:val="22"/>
+        </w:rPr>
+        <w:t>Das chronische Schuldgefühl funktioniert anders. Es lässt sich nicht festmachen. Es reagiert nicht auf Entschuldigungen, weil es kein konkretes Vergehen gibt, für das man sich entschuldigen könnte. Es ist einfach da. Wie Hintergrundmusik, die du nicht ausschalten kannst. Wie ein Radio, das immer leise läuft, auch dann, wenn du schläfst, auch dann, wenn alle zufrieden sind und niemand etwas braucht.</w:t>
+      </w:r>
+    </w:p>
+    <w:p>
+      <w:pPr>
+        <w:spacing w:after="160" w:line="320" w:lineRule="exact"/>
+      </w:pPr>
+      <w:r>
+        <w:rPr>
+          <w:rFonts w:ascii="Georgia" w:hAnsi="Georgia"/>
+          <w:sz w:val="22"/>
+        </w:rPr>
+        <w:t>Viele Frauen, die ich kenne, haben gelernt, damit zu leben. Sie schieben es beiseite, gehen ihrem Tag nach, funktionieren. Die meisten von ihnen würden nicht einmal sagen, dass sie ein ausgeprägtes Schuldgefühl haben, weil es so zum Alltag gehört, dass sie es kaum noch wahrnehmen. Wie das Rauschen des Kühlschranks. Man hört es erst, wenn er aufhört.</w:t>
       </w:r>
     </w:p>
     <w:p>
@@ -779,91 +767,43 @@
           <w:rFonts w:ascii="Georgia" w:hAnsi="Georgia"/>
           <w:sz w:val="22"/>
         </w:rPr>
-        <w:t>Körperlich macht sich das chronische Schuldgefühl auf verschiedene Arten bemerkbar. Manchen Frauen sitzt es im Bauch — ein leichtes Zusammenziehen, ein Unbehagen, das bleibt und das sie mit Kaffee oder Beschäftigung übertönen. Anderen im Nacken oder in den Schultern, die Muskeln, die nie loslassen können, weil der innere Aufseher immer wachsam bleibt. Manche beschreiben es als eine Art innerer Unruhe, eine Nervosität ohne Anlass, ein Gefühl, nie ganz ankommen zu können. Als würde man in einem Zimmer stehen und nicht wissen, ob man bleiben darf. Als wäre man Gast im eigenen Leben.</w:t>
-      </w:r>
-    </w:p>
-    <w:p>
-      <w:pPr>
-        <w:spacing w:after="160" w:line="320" w:lineRule="exact"/>
-      </w:pPr>
-      <w:r>
-        <w:rPr>
-          <w:rFonts w:ascii="Georgia" w:hAnsi="Georgia"/>
-          <w:sz w:val="22"/>
-        </w:rPr>
-        <w:t>Das ist kein Zufall, und es ist keine Einbildung. Schuldgefühle aktivieren das Stresssystem. Das Nervensystem unterscheidet nicht zwischen einer konkreten äusseren Bedrohung und einem diffusen inneren Vorwurf. Es reagiert auf beides mit derselben physiologischen Antwort: Anspannung, Cortisol, Adrenalin. Der Sympathikus ist aktiv. Der Körper ist bereit, auf eine Gefahr zu reagieren, die er nicht greifen kann.</w:t>
-      </w:r>
-    </w:p>
-    <w:p>
-      <w:pPr>
-        <w:spacing w:after="160" w:line="320" w:lineRule="exact"/>
-      </w:pPr>
-      <w:r>
-        <w:rPr>
-          <w:rFonts w:ascii="Georgia" w:hAnsi="Georgia"/>
-          <w:sz w:val="22"/>
-        </w:rPr>
-        <w:t>Wenn diese Anspannung zum Dauerzustand wird, zahlt der Körper einen Preis. Schlafprobleme, weil das Nervensystem in der Nacht nicht in den Ruhezustand wechseln kann. Erschöpfung, die durch Schlaf allein nicht behoben wird, weil die Erschöpfung nicht aus körperlicher Arbeit stammt, sondern aus der dauerhaften Stressaktivierung. Verspannungen, Kopfschmerzen, Verdauungsprobleme, ein Immunsystem, das anfälliger wird. Dazu kommen wir in Kapitel 8 noch genauer.</w:t>
-      </w:r>
-    </w:p>
-    <w:p>
-      <w:pPr>
-        <w:spacing w:after="160" w:line="320" w:lineRule="exact"/>
-      </w:pPr>
-      <w:r>
-        <w:rPr>
-          <w:rFonts w:ascii="Georgia" w:hAnsi="Georgia"/>
-          <w:sz w:val="22"/>
-        </w:rPr>
-        <w:t>Etwas anderes, das ich immer wieder beobachte: Das chronische Schuldgefühl beeinflusst Entscheidungen auf eine Weise, die von aussen kaum sichtbar ist — auch für die betroffene Person selbst. Frauen, die in diesem Zustand leben, entscheiden häufig nicht danach, was sie wollen oder was richtig ist. Sie entscheiden danach, was das Schuldgefühl am wirksamsten zum Schweigen bringt. Das klingt vielleicht vernünftig, ist aber ein fundamentales Problem: Das Schuldgefühl wird dadurch zur heimlichen Chefin. Niemand merkt es. Auch sie selbst nicht — weil sie es längst Fürsorge, Pflicht, Liebe oder Verantwortungsbewusstsein nennt.</w:t>
-      </w:r>
-    </w:p>
-    <w:p>
-      <w:pPr>
-        <w:spacing w:after="160" w:line="320" w:lineRule="exact"/>
-      </w:pPr>
-      <w:r>
-        <w:rPr>
-          <w:rFonts w:ascii="Georgia" w:hAnsi="Georgia"/>
-          <w:sz w:val="22"/>
-        </w:rPr>
-        <w:t>Sie nimmt die Einladung an, obwohl sie erschöpft ist — weil das Schuldgefühl sonst lauter wird.</w:t>
-      </w:r>
-    </w:p>
-    <w:p>
-      <w:pPr>
-        <w:spacing w:after="160" w:line="320" w:lineRule="exact"/>
-      </w:pPr>
-      <w:r>
-        <w:rPr>
-          <w:rFonts w:ascii="Georgia" w:hAnsi="Georgia"/>
-          <w:sz w:val="22"/>
-        </w:rPr>
-        <w:t>Sie sagt Ja zum Projekt, obwohl sie keine Kapazität hat — weil Nein zu schmerzhaft wäre.</w:t>
-      </w:r>
-    </w:p>
-    <w:p>
-      <w:pPr>
-        <w:spacing w:after="160" w:line="320" w:lineRule="exact"/>
-      </w:pPr>
-      <w:r>
-        <w:rPr>
-          <w:rFonts w:ascii="Georgia" w:hAnsi="Georgia"/>
-          <w:sz w:val="22"/>
-        </w:rPr>
-        <w:t>Sie entschuldigt sich, obwohl sie nichts falsch gemacht hat — weil das Gewissen so fordert.</w:t>
-      </w:r>
-    </w:p>
-    <w:p>
-      <w:pPr>
-        <w:spacing w:after="160" w:line="320" w:lineRule="exact"/>
-      </w:pPr>
-      <w:r>
-        <w:rPr>
-          <w:rFonts w:ascii="Georgia" w:hAnsi="Georgia"/>
-          <w:sz w:val="22"/>
-        </w:rPr>
-        <w:t>Sie kauft das Geschenk, schreibt die Karte, organisiert das Essen, bringt die Kinder, holt die Mutter ab, schickt die Nachricht, erledigt, was niemand sonst erledigt — nicht aus Freude, nicht aus Überzeugung, sondern weil das der einzige Weg ist, den inneren Lärm kurzfristig leiser zu machen.</w:t>
+        <w:t>Körperlich sitzt es manchmal im Bauch, ein leichtes Zusammenziehen, ein Unbehagen, das bleibt und das sie mit Kaffee oder Beschäftigung übertönen. Anderen sitzt es im Nacken oder in den Schultern, Muskeln, die nie loslassen können, weil der innere Aufseher immer wachsam bleibt. Manche beschreiben es als innere Unruhe ohne Anlass, ein Gefühl, nie ganz ankommen zu können. Als würde man in einem Zimmer stehen und nicht wissen, ob man bleiben darf. Als wäre man Gast im eigenen Leben.</w:t>
+      </w:r>
+    </w:p>
+    <w:p>
+      <w:pPr>
+        <w:spacing w:after="160" w:line="320" w:lineRule="exact"/>
+      </w:pPr>
+      <w:r>
+        <w:rPr>
+          <w:rFonts w:ascii="Georgia" w:hAnsi="Georgia"/>
+          <w:sz w:val="22"/>
+        </w:rPr>
+        <w:t>Das Nervensystem unterscheidet nicht zwischen einer konkreten äusseren Bedrohung und einem diffusen inneren Vorwurf. Es reagiert auf beides mit Anspannung, mit Cortisol, mit einem Körper, der bereit ist, auf eine Gefahr zu reagieren, die er nicht greifen kann. Wenn dieser Zustand zum Dauerzustand wird, zahlt der Körper einen Preis. Schlafprobleme. Erschöpfung, die durch Schlaf allein nicht behoben wird, weil sie nicht aus körperlicher Arbeit stammt. Verspannungen, Kopfschmerzen, Verdauungsprobleme, ein Immunsystem, das anfälliger wird. Dazu kommen wir in Kapitel 8 noch genauer.</w:t>
+      </w:r>
+    </w:p>
+    <w:p>
+      <w:pPr>
+        <w:spacing w:after="160" w:line="320" w:lineRule="exact"/>
+      </w:pPr>
+      <w:r>
+        <w:rPr>
+          <w:rFonts w:ascii="Georgia" w:hAnsi="Georgia"/>
+          <w:sz w:val="22"/>
+        </w:rPr>
+        <w:t>Und dann ist da noch etwas, das vielleicht das Entscheidendste ist: Das chronische Schuldgefühl beeinflusst Entscheidungen auf eine Weise, die von aussen kaum sichtbar ist, auch für die betroffene Person selbst. Frauen, die in diesem Zustand leben, entscheiden häufig nicht danach, was sie wollen oder was richtig ist. Sie entscheiden danach, was das Schuldgefühl am wirksamsten zum Schweigen bringt. Das Schuldgefühl wird dadurch zur heimlichen Chefin. Niemand merkt es. Auch sie selbst nicht, weil sie es längst Fürsorge, Pflicht, Liebe oder Verantwortungsbewusstsein nennt.</w:t>
+      </w:r>
+    </w:p>
+    <w:p>
+      <w:pPr>
+        <w:spacing w:after="160" w:line="320" w:lineRule="exact"/>
+      </w:pPr>
+      <w:r>
+        <w:rPr>
+          <w:rFonts w:ascii="Georgia" w:hAnsi="Georgia"/>
+          <w:sz w:val="22"/>
+        </w:rPr>
+        <w:t>Sie nimmt die Einladung an, obwohl sie erschöpft ist, weil das Schuldgefühl sonst lauter wird. Sie sagt Ja zum Projekt, obwohl sie keine Kapazität hat, weil Nein zu schmerzhaft wäre. Sie entschuldigt sich, obwohl sie nichts falsch gemacht hat, weil das Gewissen so fordert. Sie kauft das Geschenk, schreibt die Karte, organisiert das Essen, bringt die Kinder, holt die Mutter ab, erledigt, was niemand sonst erledigt. Nicht aus Freude, nicht aus Überzeugung, sondern weil das der einzige Weg ist, den inneren Lärm kurzfristig leiser zu machen.</w:t>
       </w:r>
     </w:p>
     <w:p>
@@ -887,7 +827,7 @@
           <w:rFonts w:ascii="Georgia" w:hAnsi="Georgia"/>
           <w:sz w:val="22"/>
         </w:rPr>
-        <w:t>Die gute Nachricht — und ich sage das mit voller Überzeugung, nicht als Floskel: Dieser Aufseher ist nicht du. Er fühlt sich wie du an, weil er von innen spricht. Er klingt nach dir, weil er deine Stimme benutzt. Aber er ist nicht du. Er ist ein erlerntes Muster. Eine Reaktion, die irgendwann sinnvoll war, in einer Zeit und einem Kontext, in dem sie dir geholfen hat, dazuzugehören, geliebt zu werden, sicher zu sein.</w:t>
+        <w:t>Und jetzt das Wichtigste, das ich dir in diesem Buch sagen möchte: Dieser Aufseher ist nicht du. Er fühlt sich wie du an, weil er von innen spricht. Er klingt nach dir, weil er deine Stimme benutzt. Aber er ist nicht du. Er ist ein erlerntes Muster. Eine Reaktion, die irgendwann sinnvoll war, in einer Zeit und einem Kontext, in dem sie dir geholfen hat, dazuzugehören, geliebt zu werden, sicher zu sein.</w:t>
       </w:r>
     </w:p>
     <w:p>
@@ -911,19 +851,19 @@
           <w:rFonts w:ascii="Georgia" w:hAnsi="Georgia"/>
           <w:sz w:val="22"/>
         </w:rPr>
-        <w:t>Das ist nicht dasselbe wie sagen: Es wird einfach. Es wird nicht einfach sein. Muster, die tief eingeschrieben sind und die das Nervensystem seit Jahrzehnten kennt, verändern sich nicht durch einen Entschluss. Sie verändern sich durch wiederholte neue Erfahrungen, durch Verständnis, durch das allmähliche Erkennen, dass die alte Reaktion nicht mehr notwendig ist.</w:t>
-      </w:r>
-    </w:p>
-    <w:p>
-      <w:pPr>
-        <w:spacing w:after="160" w:line="320" w:lineRule="exact"/>
-      </w:pPr>
-      <w:r>
-        <w:rPr>
-          <w:rFonts w:ascii="Georgia" w:hAnsi="Georgia"/>
-          <w:sz w:val="22"/>
-        </w:rPr>
-        <w:t>Sarah hat angefangen, das schlechte Gewissen zu verstehen — woher es kommt, was es will, was es wirklich aussagt über sie und über die Welt. Das hat nicht sofort alles verändert. Der Morgen beginnt manchmal noch immer mit diesem Grau. Aber es hat sich etwas Fundamentales verändert: Sie hat aufgehört, dem Schuldgefühl zu glauben, dass es die Wahrheit sagt. Das ist ein kleiner Schritt, der sich wie ein grosser anfühlt.</w:t>
+        <w:t>Nicht durch einen Entschluss. Muster, die tief eingeschrieben sind und die das Nervensystem seit Jahrzehnten kennt, verändern sich durch wiederholte neue Erfahrungen, durch Verständnis, durch das allmähliche Erkennen, dass die alte Reaktion nicht mehr notwendig ist. Das ist kein gerader Weg. Aber er existiert.</w:t>
+      </w:r>
+    </w:p>
+    <w:p>
+      <w:pPr>
+        <w:spacing w:after="160" w:line="320" w:lineRule="exact"/>
+      </w:pPr>
+      <w:r>
+        <w:rPr>
+          <w:rFonts w:ascii="Georgia" w:hAnsi="Georgia"/>
+          <w:sz w:val="22"/>
+        </w:rPr>
+        <w:t>Sarah hat angefangen, das schlechte Gewissen zu verstehen. Das hat nicht sofort alles verändert. Der Morgen beginnt manchmal noch immer mit diesem Grau. Aber es hat sich etwas Fundamentales verändert: Sie hat aufgehört, dem Schuldgefühl zu glauben, dass es die Wahrheit sagt. Das ist ein kleiner Schritt, der sich wie ein grosser anfühlt.</w:t>
       </w:r>
     </w:p>
     <w:p>
@@ -948,7 +888,7 @@
           <w:i/>
           <w:sz w:val="22"/>
         </w:rPr>
-        <w:t>Fragen zum Nachdenken:</w:t>
+        <w:t>Wann spürst du das schlechte Gewissen am stärksten, zu welchen Tageszeiten, in welchen Situationen, bei welchen Menschen?</w:t>
       </w:r>
     </w:p>
     <w:p>
@@ -961,7 +901,7 @@
           <w:i/>
           <w:sz w:val="22"/>
         </w:rPr>
-        <w:t>Wann spürst du das schlechte Gewissen am stärksten — zu welchen Tageszeiten, in welchen Situationen, bei welchen Menschen?</w:t>
+        <w:t>Gibt es ein konkretes Vergehen, auf das es zeigt, oder ist es eher ein diffuses Gefühl ohne klaren Auslöser?</w:t>
       </w:r>
     </w:p>
     <w:p>
@@ -974,20 +914,7 @@
           <w:i/>
           <w:sz w:val="22"/>
         </w:rPr>
-        <w:t>Gibt es ein konkretes Vergehen, auf das es zeigt — oder ist es eher ein diffuses Gefühl ohne klaren Auslöser?</w:t>
-      </w:r>
-    </w:p>
-    <w:p>
-      <w:pPr>
-        <w:spacing w:after="160" w:line="320" w:lineRule="exact"/>
-      </w:pPr>
-      <w:r>
-        <w:rPr>
-          <w:rFonts w:ascii="Georgia" w:hAnsi="Georgia"/>
-          <w:i/>
-          <w:sz w:val="22"/>
-        </w:rPr>
-        <w:t>Wo spürst du es im Körper — und seit wann begleitet dich dieses Gefühl?</w:t>
+        <w:t>Wo spürst du es im Körper, und seit wann begleitet dich dieses Gefühl?</w:t>
       </w:r>
     </w:p>
     <w:p>
@@ -1045,7 +972,7 @@
           <w:rFonts w:ascii="Georgia" w:hAnsi="Georgia"/>
           <w:sz w:val="22"/>
         </w:rPr>
-        <w:t>Sie war zwölf Jahre alt. Es war ein Samstagnachmittag, und sie wollte zu einer Freundin. Ihre Mutter stand in der Küche, und als Nina fragte, ob sie gehen dürfe, sagte ihre Mutter — nicht laut, nicht dramatisch, ganz ruhig, fast nebenbei: „Natürlich. Ich bin ja sowieso immer allein hier."</w:t>
+        <w:t>Sie war zwölf Jahre alt. Es war ein Samstagnachmittag, und sie wollte zu einer Freundin. Ihre Mutter stand in der Küche, und als Nina fragte, ob sie gehen dürfe, sagte ihre Mutter, nicht laut, nicht dramatisch, ganz ruhig, fast nebenbei: „Natürlich. Ich bin ja sowieso immer allein hier."</w:t>
       </w:r>
     </w:p>
     <w:p>
@@ -1117,31 +1044,31 @@
           <w:rFonts w:ascii="Georgia" w:hAnsi="Georgia"/>
           <w:sz w:val="22"/>
         </w:rPr>
-        <w:t>Nicht unbedingt in einer dramatischen Geschichte. Nicht unbedingt in offensichtlicher Vernachlässigung oder Misshandlung — Dingen, die man als Kind benennen könnte. Oft in kleinen, wiederholten Momenten, die allein betrachtet harmlos erscheinen, die allein betrachtet nichts erklären, die aber zusammengenommen eine Botschaft formen, die sich ins Nervensystem einschreibt. Lautlos, kontinuierlich, tief.</w:t>
-      </w:r>
-    </w:p>
-    <w:p>
-      <w:pPr>
-        <w:spacing w:after="160" w:line="320" w:lineRule="exact"/>
-      </w:pPr>
-      <w:r>
-        <w:rPr>
-          <w:rFonts w:ascii="Georgia" w:hAnsi="Georgia"/>
-          <w:sz w:val="22"/>
-        </w:rPr>
-        <w:t>Kinder brauchen Liebe und Zugehörigkeit wie Essen und Schlaf. Das ist keine Metapher — das ist Biologie. Ein kleines Kind, das ohne emotionale Verbindung und Zugehörigkeit aufwächst, überlebt buchstäblich nicht. Das Nervensystem des Kindes ist evolutionär darauf ausgerichtet, die Signale der Bezugspersonen zu lesen: Bin ich sicher? Werde ich geliebt? Gehöre ich dazu? Diese Fragen werden nicht rational gestellt — sie werden vom Nervensystem permanent und automatisch verarbeitet, laufend, wie ein System, das nie in den Standby-Modus wechselt.</w:t>
-      </w:r>
-    </w:p>
-    <w:p>
-      <w:pPr>
-        <w:spacing w:after="160" w:line="320" w:lineRule="exact"/>
-      </w:pPr>
-      <w:r>
-        <w:rPr>
-          <w:rFonts w:ascii="Georgia" w:hAnsi="Georgia"/>
-          <w:sz w:val="22"/>
-        </w:rPr>
-        <w:t>Die Bindungsforschung — begründet von John Bowlby in den fünfziger Jahren und seither durch Jahrzehnte empirischer Forschung vertieft — hat gezeigt, wie fundamental dieses Grundbedürfnis ist. Kinder passen ihr Verhalten an die verfügbaren Bezugspersonen an. Sie lernen, was sie tun müssen, um Nähe zu bekommen. Was sie vermeiden müssen, um keine Kälte oder Ablehnung zu riskieren. Wie sie die Stimmung der Erwachsenen lesen können, um Gefahren vorherzusagen.</w:t>
+        <w:t>Nicht unbedingt in einer dramatischen Geschichte. Nicht unbedingt in offensichtlicher Vernachlässigung oder Misshandlung. Oft in kleinen, wiederholten Momenten, die allein betrachtet harmlos erscheinen, die allein betrachtet nichts erklären, die aber zusammengenommen eine Botschaft formen, die sich ins Nervensystem einschreibt. Lautlos, kontinuierlich, tief.</w:t>
+      </w:r>
+    </w:p>
+    <w:p>
+      <w:pPr>
+        <w:spacing w:after="160" w:line="320" w:lineRule="exact"/>
+      </w:pPr>
+      <w:r>
+        <w:rPr>
+          <w:rFonts w:ascii="Georgia" w:hAnsi="Georgia"/>
+          <w:sz w:val="22"/>
+        </w:rPr>
+        <w:t>Kinder brauchen Liebe und Zugehörigkeit wie Essen und Schlaf. Das ist keine Metapher, das ist Biologie. Ein kleines Kind, das ohne emotionale Verbindung und Zugehörigkeit aufwächst, überlebt buchstäblich nicht. Das Nervensystem des Kindes ist evolutionär darauf ausgerichtet, die Signale der Bezugspersonen zu lesen: Bin ich sicher? Werde ich geliebt? Gehöre ich dazu? Diese Fragen werden nicht rational gestellt. Sie werden vom Nervensystem permanent und automatisch verarbeitet, laufend, wie ein System, das nie in den Standby-Modus wechselt.</w:t>
+      </w:r>
+    </w:p>
+    <w:p>
+      <w:pPr>
+        <w:spacing w:after="160" w:line="320" w:lineRule="exact"/>
+      </w:pPr>
+      <w:r>
+        <w:rPr>
+          <w:rFonts w:ascii="Georgia" w:hAnsi="Georgia"/>
+          <w:sz w:val="22"/>
+        </w:rPr>
+        <w:t>Die Bindungsforschung, begründet von John Bowlby in den fünfziger Jahren und seither durch Jahrzehnte empirischer Forschung vertieft, hat gezeigt, wie fundamental dieses Grundbedürfnis ist. Kinder passen ihr Verhalten an die verfügbaren Bezugspersonen an. Sie lernen, was sie tun müssen, um Nähe zu bekommen. Was sie vermeiden müssen, um keine Kälte oder Ablehnung zu riskieren. Wie sie die Stimmung der Erwachsenen lesen können, um Gefahren vorherzusagen.</w:t>
       </w:r>
     </w:p>
     <w:p>
@@ -1165,43 +1092,43 @@
           <w:rFonts w:ascii="Georgia" w:hAnsi="Georgia"/>
           <w:sz w:val="22"/>
         </w:rPr>
-        <w:t>Das Problem entsteht nicht im Kind. Das Problem entsteht, wenn dieses Kind erwachsen wird und die Anpassung bleibt, auch wenn die Umgebung eine andere geworden ist.</w:t>
-      </w:r>
-    </w:p>
-    <w:p>
-      <w:pPr>
-        <w:spacing w:after="160" w:line="320" w:lineRule="exact"/>
-      </w:pPr>
-      <w:r>
-        <w:rPr>
-          <w:rFonts w:ascii="Georgia" w:hAnsi="Georgia"/>
-          <w:sz w:val="22"/>
-        </w:rPr>
-        <w:t>Wenn Liebe an Wohlverhalten geknüpft ist — wenn das Kind gelobt wird, wenn es brav ist, ignoriert wird, wenn es Bedürfnisse hat, und bestraft wird, wenn es Grenzen testet — dann lernt das Kind sehr schnell: Ich bekomme Liebe, wenn ich funktioniere. Nicht wenn ich ich bin. Wenn ich funktioniere. Wenn ich die Erwartungen erfülle. Wenn ich nicht zu viel brauche.</w:t>
-      </w:r>
-    </w:p>
-    <w:p>
-      <w:pPr>
-        <w:spacing w:after="160" w:line="320" w:lineRule="exact"/>
-      </w:pPr>
-      <w:r>
-        <w:rPr>
-          <w:rFonts w:ascii="Georgia" w:hAnsi="Georgia"/>
-          <w:sz w:val="22"/>
-        </w:rPr>
-        <w:t>Das Kind schlussfolgert — nicht bewusst, nicht in Worten, sondern in einem tiefen körperlichen Wissen: Meine Bedürfnisse sind eine Gefahr für die Verbindung. Also mache ich sie klein.</w:t>
-      </w:r>
-    </w:p>
-    <w:p>
-      <w:pPr>
-        <w:spacing w:after="160" w:line="320" w:lineRule="exact"/>
-      </w:pPr>
-      <w:r>
-        <w:rPr>
-          <w:rFonts w:ascii="Georgia" w:hAnsi="Georgia"/>
-          <w:sz w:val="22"/>
-        </w:rPr>
-        <w:t>Im Erwachsenenleben übersetzt sich das: Ich bin verantwortlich dafür, wie andere sich fühlen. Wenn jemand unglücklich ist, habe ich etwas falsch gemacht. Wenn ich Grenzen setze, riskiere ich Ablehnung. Wenn ich Nein sage, verliere ich Liebe.</w:t>
+        <w:t>Das Problem entsteht nicht im Kind. Es entsteht, wenn dieses Kind erwachsen wird und die Anpassung bleibt, auch wenn die Umgebung eine andere geworden ist.</w:t>
+      </w:r>
+    </w:p>
+    <w:p>
+      <w:pPr>
+        <w:spacing w:after="160" w:line="320" w:lineRule="exact"/>
+      </w:pPr>
+      <w:r>
+        <w:rPr>
+          <w:rFonts w:ascii="Georgia" w:hAnsi="Georgia"/>
+          <w:sz w:val="22"/>
+        </w:rPr>
+        <w:t>Wenn Liebe an Wohlverhalten geknüpft ist, wenn das Kind gelobt wird, wenn es brav ist, ignoriert wird, wenn es Bedürfnisse hat, und bestraft wird, wenn es Grenzen testet, dann lernt das Kind sehr schnell: Ich bekomme Liebe, wenn ich funktioniere. Nicht wenn ich ich bin. Wenn ich funktioniere. Wenn ich die Erwartungen erfülle. Wenn ich nicht zu viel brauche.</w:t>
+      </w:r>
+    </w:p>
+    <w:p>
+      <w:pPr>
+        <w:spacing w:after="160" w:line="320" w:lineRule="exact"/>
+      </w:pPr>
+      <w:r>
+        <w:rPr>
+          <w:rFonts w:ascii="Georgia" w:hAnsi="Georgia"/>
+          <w:sz w:val="22"/>
+        </w:rPr>
+        <w:t>Das Kind schlussfolgert, nicht bewusst, nicht in Worten, sondern in einem tiefen körperlichen Wissen: Meine Bedürfnisse sind eine Gefahr für die Verbindung. Also mache ich sie klein.</w:t>
+      </w:r>
+    </w:p>
+    <w:p>
+      <w:pPr>
+        <w:spacing w:after="160" w:line="320" w:lineRule="exact"/>
+      </w:pPr>
+      <w:r>
+        <w:rPr>
+          <w:rFonts w:ascii="Georgia" w:hAnsi="Georgia"/>
+          <w:sz w:val="22"/>
+        </w:rPr>
+        <w:t>Im Erwachsenenleben übersetzt sich das so: Ich bin verantwortlich dafür, wie andere sich fühlen. Wenn jemand unglücklich ist, habe ich etwas falsch gemacht. Wenn ich Grenzen setze, riskiere ich Ablehnung. Wenn ich Nein sage, verliere ich Liebe.</w:t>
       </w:r>
     </w:p>
     <w:p>
@@ -1225,79 +1152,31 @@
           <w:rFonts w:ascii="Georgia" w:hAnsi="Georgia"/>
           <w:sz w:val="22"/>
         </w:rPr>
-        <w:t>Es gibt verschiedene Konstellationen, in denen dieses Muster entsteht.</w:t>
-      </w:r>
-    </w:p>
-    <w:p>
-      <w:pPr>
-        <w:spacing w:after="160" w:line="320" w:lineRule="exact"/>
-      </w:pPr>
-      <w:r>
-        <w:rPr>
-          <w:rFonts w:ascii="Georgia" w:hAnsi="Georgia"/>
-          <w:sz w:val="22"/>
-        </w:rPr>
-        <w:t>Manche Frauen hatten Eltern, die emotional wenig verfügbar waren — nicht aus Bosheit, sondern aus eigener Überlastung, aus eigenen unverarbeiteten Verletzungen, aus einer Generation, in der Gefühle nicht thematisiert wurden. Das Kind lernt: Meine Gefühle stören. Ich reguliere sie allein.</w:t>
-      </w:r>
-    </w:p>
-    <w:p>
-      <w:pPr>
-        <w:spacing w:after="160" w:line="320" w:lineRule="exact"/>
-      </w:pPr>
-      <w:r>
-        <w:rPr>
-          <w:rFonts w:ascii="Georgia" w:hAnsi="Georgia"/>
-          <w:sz w:val="22"/>
-        </w:rPr>
-        <w:t>Manche hatten Eltern, die ihre eigenen Bedürfnisse über die des Kindes stellten — manchmal unbewusst, manchmal durch schwierige Lebensumstände begründet. Das Kind lernt: Ich bin dafür zuständig, dass Erwachsene sich gut fühlen. Meine Aufgabe ist Fürsorge, nicht Empfang von Fürsorge.</w:t>
-      </w:r>
-    </w:p>
-    <w:p>
-      <w:pPr>
-        <w:spacing w:after="160" w:line="320" w:lineRule="exact"/>
-      </w:pPr>
-      <w:r>
-        <w:rPr>
-          <w:rFonts w:ascii="Georgia" w:hAnsi="Georgia"/>
-          <w:sz w:val="22"/>
-        </w:rPr>
-        <w:t>Manche hatten Eltern, die Schuldgefühle als Steuerungsmittel eingesetzt haben — wie Ninas Mutter, die nie sagte „Du darfst nicht gehen", sondern „Ich bin ja sowieso allein." Das Kind lernt: Schuld ist das Signal dafür, dass ich falsch liege. Schuld heisst: Tu etwas.</w:t>
-      </w:r>
-    </w:p>
-    <w:p>
-      <w:pPr>
-        <w:spacing w:after="160" w:line="320" w:lineRule="exact"/>
-      </w:pPr>
-      <w:r>
-        <w:rPr>
-          <w:rFonts w:ascii="Georgia" w:hAnsi="Georgia"/>
-          <w:sz w:val="22"/>
-        </w:rPr>
-        <w:t>Und manche hatten Eltern, die es schlicht gut meinten, aber eine Botschaft vermittelt haben, die sich festgesetzt hat: „Denk nicht immer nur an dich." „Sei nicht so empfindlich." „Du hast es so gut, sei doch froh." Sätze, die allein betrachtet harmlos klingen, aber wiederholt und in empfänglichem Alter gehört, eine Überzeugung formen: Meine Innenwelt ist nicht wichtig. Was zählt, ist die Innenwelt der anderen.</w:t>
-      </w:r>
-    </w:p>
-    <w:p>
-      <w:pPr>
-        <w:spacing w:after="160" w:line="320" w:lineRule="exact"/>
-      </w:pPr>
-      <w:r>
-        <w:rPr>
-          <w:rFonts w:ascii="Georgia" w:hAnsi="Georgia"/>
-          <w:sz w:val="22"/>
-        </w:rPr>
-        <w:t>Ich sage das nicht, um Eltern zu verurteilen. Die meisten Eltern haben das Beste gegeben, was sie konnten — mit dem Wissen, das sie hatten, mit den Ressourcen, die ihnen zur Verfügung standen, mit ihren eigenen Wunden und Grenzen und blinden Flecken. Eltern-Bashing hilft niemandem und führt nirgendwo hin. Was weiterführt, ist Verstehen.</w:t>
-      </w:r>
-    </w:p>
-    <w:p>
-      <w:pPr>
-        <w:spacing w:after="160" w:line="320" w:lineRule="exact"/>
-      </w:pPr>
-      <w:r>
-        <w:rPr>
-          <w:rFonts w:ascii="Georgia" w:hAnsi="Georgia"/>
-          <w:sz w:val="22"/>
-        </w:rPr>
-        <w:t>Denn wenn du verstehst, woher das Schuldgefühl kommt, verändert sich seine Bedeutung. Es hört auf, sich wie eine unabänderliche Wahrheit über dich anzufühlen. Es hört auf, eine moralische Aussage darüber zu sein, wer du bist. Es wird das, was es wirklich ist: eine erlernte Reaktion, die einmal funktioniert hat und die sich festgesetzt hat. Wie eine Schutzhülle aus Kindertagen, die du nie abgelegt hast — weil niemand dir sagte, dass du sie nicht mehr brauchst. Weil niemand sagte: Du bist gross genug. Die Gefahr von damals ist vorbei.</w:t>
+        <w:t>Die Herkunft dieses Musters sieht dabei bei jeder Frau etwas anders aus. Manche wuchsen bei Eltern auf, die emotional wenig verfügbar waren, nicht aus Bosheit, sondern aus eigener Überlastung, aus eigenen unverarbeiteten Verletzungen, aus einer Generation, in der Gefühle nicht thematisiert wurden. Das Kind lernt: Meine Gefühle stören. Ich reguliere sie allein. Andere hatten Eltern, die Schuldgefühle als Steuerungsmittel einsetzten, wie Ninas Mutter, die nie sagte „Du darfst nicht gehen", sondern „Ich bin ja sowieso allein." Das Kind lernt: Schuld ist das Signal dafür, dass ich falsch liege. Schuld heisst: Tu etwas. Und wieder andere hatten Eltern, die es schlicht gut meinten, aber Sätze vermittelten, die sich festgesetzt haben. „Denk nicht immer nur an dich." „Sei nicht so empfindlich." „Du hast es so gut, sei doch froh." Sätze, die allein betrachtet harmlos klingen, aber wiederholt und in empfänglichem Alter gehört, eine Überzeugung formen: Meine Innenwelt ist nicht wichtig. Was zählt, ist die Innenwelt der anderen.</w:t>
+      </w:r>
+    </w:p>
+    <w:p>
+      <w:pPr>
+        <w:spacing w:after="160" w:line="320" w:lineRule="exact"/>
+      </w:pPr>
+      <w:r>
+        <w:rPr>
+          <w:rFonts w:ascii="Georgia" w:hAnsi="Georgia"/>
+          <w:sz w:val="22"/>
+        </w:rPr>
+        <w:t>Das sage ich nicht, um Eltern zu verurteilen. Die meisten Eltern haben das Beste gegeben, was sie konnten, mit dem Wissen, das sie hatten, mit den Ressourcen, die ihnen zur Verfügung standen, mit ihren eigenen Wunden und Grenzen. Was weiterführt, ist nicht Anklage. Es ist Verstehen.</w:t>
+      </w:r>
+    </w:p>
+    <w:p>
+      <w:pPr>
+        <w:spacing w:after="160" w:line="320" w:lineRule="exact"/>
+      </w:pPr>
+      <w:r>
+        <w:rPr>
+          <w:rFonts w:ascii="Georgia" w:hAnsi="Georgia"/>
+          <w:sz w:val="22"/>
+        </w:rPr>
+        <w:t>Denn wenn du verstehst, woher das Schuldgefühl kommt, verändert sich seine Bedeutung. Es hört auf, sich wie eine unabänderliche Wahrheit über dich anzufühlen. Es wird das, was es wirklich ist: eine erlernte Reaktion, die einmal funktioniert hat und die sich festgesetzt hat. Wie eine Schutzhülle aus Kindertagen, die du nie abgelegt hast, weil niemand dir sagte, dass du sie nicht mehr brauchst. Weil niemand sagte: Du bist gross genug. Die Gefahr von damals ist vorbei.</w:t>
       </w:r>
     </w:p>
     <w:p>
@@ -1346,7 +1225,7 @@
           <w:i/>
           <w:sz w:val="22"/>
         </w:rPr>
-        <w:t>Fragen zum Nachdenken:</w:t>
+        <w:t>Welche Botschaften hast du als Kind über deine Bedürfnisse bekommen, direkt oder indirekt?</w:t>
       </w:r>
     </w:p>
     <w:p>
@@ -1359,7 +1238,7 @@
           <w:i/>
           <w:sz w:val="22"/>
         </w:rPr>
-        <w:t>Welche Botschaften hast du als Kind über deine Bedürfnisse bekommen — direkt oder indirekt?</w:t>
+        <w:t>Gab es Sätze oder Momente, die sich eingeprägt haben, ähnlich wie bei Nina?</w:t>
       </w:r>
     </w:p>
     <w:p>
@@ -1372,7 +1251,7 @@
           <w:i/>
           <w:sz w:val="22"/>
         </w:rPr>
-        <w:t>Gab es Sätze oder Momente, die sich eingeprägt haben, ähnlich wie bei Nina?</w:t>
+        <w:t>Welche Regel glaubst du, unbewusst zu befolgen, wenn das Schuldgefühl sich meldet?</w:t>
       </w:r>
     </w:p>
     <w:p>
@@ -1385,20 +1264,7 @@
           <w:i/>
           <w:sz w:val="22"/>
         </w:rPr>
-        <w:t>Welche Regel glaubst du, unbewusst zu befolgen, wenn das Schuldgefühl sich meldet?</w:t>
-      </w:r>
-    </w:p>
-    <w:p>
-      <w:pPr>
-        <w:spacing w:after="160" w:line="320" w:lineRule="exact"/>
-      </w:pPr>
-      <w:r>
-        <w:rPr>
-          <w:rFonts w:ascii="Georgia" w:hAnsi="Georgia"/>
-          <w:i/>
-          <w:sz w:val="22"/>
-        </w:rPr>
-        <w:t>Was hättest du als Kind gebraucht, das du nicht bekommen hast — und trägst du dieses Bedürfnis noch immer mit dir?</w:t>
+        <w:t>Was hättest du als Kind gebraucht, das du nicht bekommen hast, und trägst du dieses Bedürfnis noch immer mit dir?</w:t>
       </w:r>
     </w:p>
     <w:p>
@@ -1479,7 +1345,7 @@
           <w:rFonts w:ascii="Georgia" w:hAnsi="Georgia"/>
           <w:sz w:val="22"/>
         </w:rPr>
-        <w:t>Sie stellte sich vor, wie ihre Freundin enttäuscht war. Sie überlegte, ob sie hätte trotzdem kommen können, irgendwie — vielleicht nur kurz, vielleicht mit Maske. Sie fragte sich, ob sie sich zu schnell entschieden hatte. Ob die Freundin ihr heimlich böse war, obwohl sie nichts davon schrieb. Sie schrieb noch eine zweite Nachricht, ausführlicher als die erste, mit mehr Erklärungen, mit einem weiteren Entschuldigungsanteil. Dann fragte sie sich, ob die zweite Nachricht zu viel war. Ob sie sich damit verdächtig gemacht hatte. Ob sie jetzt wirkte, als hätte sie etwas zu verbergen.</w:t>
+        <w:t>Sie stellte sich vor, wie ihre Freundin enttäuscht war. Sie überlegte, ob sie hätte trotzdem kommen können, irgendwie, vielleicht nur kurz, vielleicht mit Maske. Sie fragte sich, ob sie sich zu schnell entschieden hatte. Ob die Freundin ihr heimlich böse war, obwohl sie nichts davon schrieb. Sie schrieb noch eine zweite Nachricht, ausführlicher als die erste, mit mehr Erklärungen. Dann fragte sie sich, ob die zweite Nachricht zu viel war. Ob sie sich damit verdächtig gemacht hatte.</w:t>
       </w:r>
     </w:p>
     <w:p>
@@ -1515,163 +1381,139 @@
           <w:rFonts w:ascii="Georgia" w:hAnsi="Georgia"/>
           <w:sz w:val="22"/>
         </w:rPr>
-        <w:t>Das ist der Unterschied, über den wir in diesem Kapitel sprechen müssen. Weil er alles verändert. Weil das, was dir hilft, vollständig davon abhängt, ob du diesen Unterschied verstehst.</w:t>
-      </w:r>
-    </w:p>
-    <w:p>
-      <w:pPr>
-        <w:spacing w:after="160" w:line="320" w:lineRule="exact"/>
-      </w:pPr>
-      <w:r>
-        <w:rPr>
-          <w:rFonts w:ascii="Georgia" w:hAnsi="Georgia"/>
-          <w:sz w:val="22"/>
-        </w:rPr>
-        <w:t>Echte Schuld zeigt auf etwas Konkretes. Du hast jemandem absichtlich geschadet. Du hast etwas versprochen und nicht gehalten. Du hast aus Gleichgültigkeit oder Bequemlichkeit jemanden im Stich gelassen, obwohl du hättest besser handeln können und es gewusst hast. Echte Schuld hat einen Anker in der Realität. Sie ist unangenehm. Aber sie hat eine Funktion: Sie zeigt, dass etwas, das du getan oder unterlassen hast, gegen deine eigenen Werte verstösst. Sie motiviert zur Wiedergutmachung — zu einer aufrichtigen Entschuldigung, zu einem Gespräch, zu einer konkreten Änderung.</w:t>
-      </w:r>
-    </w:p>
-    <w:p>
-      <w:pPr>
-        <w:spacing w:after="160" w:line="320" w:lineRule="exact"/>
-      </w:pPr>
-      <w:r>
-        <w:rPr>
-          <w:rFonts w:ascii="Georgia" w:hAnsi="Georgia"/>
-          <w:sz w:val="22"/>
-        </w:rPr>
-        <w:t>Und wenn das geschehen ist — wenn du dich aufrichtig entschuldigt hast, wenn du Verantwortung übernommen hast, wenn du verstanden hast, was du beim nächsten Mal anders machen willst — dann löst sich echte Schuld auf. Sie hat ein Ende. Das ist ihr Wesen: Sie kommt, zeigt auf etwas, ermöglicht Korrektur, und geht.</w:t>
-      </w:r>
-    </w:p>
-    <w:p>
-      <w:pPr>
-        <w:spacing w:after="160" w:line="320" w:lineRule="exact"/>
-      </w:pPr>
-      <w:r>
-        <w:rPr>
-          <w:rFonts w:ascii="Georgia" w:hAnsi="Georgia"/>
-          <w:sz w:val="22"/>
-        </w:rPr>
-        <w:t>Das falsche Gewissen funktioniert anders. Es meldet sich nicht auf Basis dessen, was du wirklich getan hast. Es meldet sich auf Basis einer Erwartung — oft einer, die nie ausgesprochen wurde. Einer Regel, die du so tief verinnerlicht hast, dass sie sich wie ein natürliches Gesetz anfühlt: Ich muss immer da sein. Ich darf andere nicht enttäuschen. Meine Bedürfnisse dürfen nicht wichtiger sein als die anderer. Wenn jemand traurig ist und ich in der Nähe bin, ist es meine Schuld.</w:t>
-      </w:r>
-    </w:p>
-    <w:p>
-      <w:pPr>
-        <w:spacing w:after="160" w:line="320" w:lineRule="exact"/>
-      </w:pPr>
-      <w:r>
-        <w:rPr>
-          <w:rFonts w:ascii="Georgia" w:hAnsi="Georgia"/>
-          <w:sz w:val="22"/>
-        </w:rPr>
-        <w:t>Claudia hatte niemanden enttäuscht. Sie war krank. Aber ihr Gewissen operierte nach einer Logik, die von der Realität unabhängig ist: Ich muss da sein. Wenn ich nicht da bin, enttäusche ich. Wenn ich enttäusche, bin ich schuldig. Diese Logik reagiert nicht auf Fakten. Man kann sie nicht mit Argumenten auflösen — weil sie keine rationale Konstruktion ist, sondern eine emotionale Programmierung, die tiefer sitzt als der Verstand.</w:t>
-      </w:r>
-    </w:p>
-    <w:p>
-      <w:pPr>
-        <w:spacing w:after="160" w:line="320" w:lineRule="exact"/>
-      </w:pPr>
-      <w:r>
-        <w:rPr>
-          <w:rFonts w:ascii="Georgia" w:hAnsi="Georgia"/>
-          <w:sz w:val="22"/>
-        </w:rPr>
-        <w:t>Deshalb hilft Claudia auch nicht, wenn sie sich sagt: „Ich war krank, ich habe nichts falsch gemacht." Sie weiss es. Und trotzdem bleibt das Gefühl. Wissen und Fühlen sprechen hier verschiedene Sprachen.</w:t>
-      </w:r>
-    </w:p>
-    <w:p>
-      <w:pPr>
-        <w:spacing w:after="160" w:line="320" w:lineRule="exact"/>
-      </w:pPr>
-      <w:r>
-        <w:rPr>
-          <w:rFonts w:ascii="Georgia" w:hAnsi="Georgia"/>
-          <w:sz w:val="22"/>
-        </w:rPr>
-        <w:t>Wie erkennt man die zwei?</w:t>
-      </w:r>
-    </w:p>
-    <w:p>
-      <w:pPr>
-        <w:spacing w:after="160" w:line="320" w:lineRule="exact"/>
-      </w:pPr>
-      <w:r>
-        <w:rPr>
-          <w:rFonts w:ascii="Georgia" w:hAnsi="Georgia"/>
-          <w:sz w:val="22"/>
-        </w:rPr>
-        <w:t>Ein erster Hinweis: Echte Schuld ist präzise. Du kannst benennen, was du getan oder unterlassen hast, und warum das falsch war nach deinen eigenen Massstäben. Das falsche Gewissen ist diffus. Wenn du versuchst, es festzumachen, löst es sich auf — oder es wandert weiter. Es zeigt auf Momente, die bei näherer Betrachtung keine Vergehen waren. Oder es findet immer ein neues Vergehen, sobald das alte nicht trägt.</w:t>
-      </w:r>
-    </w:p>
-    <w:p>
-      <w:pPr>
-        <w:spacing w:after="160" w:line="320" w:lineRule="exact"/>
-      </w:pPr>
-      <w:r>
-        <w:rPr>
-          <w:rFonts w:ascii="Georgia" w:hAnsi="Georgia"/>
-          <w:sz w:val="22"/>
-        </w:rPr>
-        <w:t>Ein zweiter Hinweis: Echte Schuld besteht unabhängig davon, ob jemand zuschaut oder es weiss. Du weisst, was du getan hast, auch wenn niemand sonst es wissen wird. Das falsche Gewissen ist fast immer verknüpft mit einer anderen Person — mit ihrer vermuteten Reaktion, ihrer Enttäuschung, ihrem Blick, ihrer Stimmung. Es lebt in der Vorstellung, wie jemand anderes über dich denkt oder fühlt.</w:t>
-      </w:r>
-    </w:p>
-    <w:p>
-      <w:pPr>
-        <w:spacing w:after="160" w:line="320" w:lineRule="exact"/>
-      </w:pPr>
-      <w:r>
-        <w:rPr>
-          <w:rFonts w:ascii="Georgia" w:hAnsi="Georgia"/>
-          <w:sz w:val="22"/>
-        </w:rPr>
-        <w:t>Ein dritter Hinweis: Echte Schuld kann sich auflösen, wenn man handelt. Eine echte Entschuldigung, eine Wiedergutmachung, ein ehrliches Gespräch — das kann echte Schuld beenden. Das falsche Gewissen nicht. Du entschuldigst dich, und es kommt zurück. Nicht für dasselbe, sondern für etwas anderes. Es findet immer einen Anker. Weil der Anker nicht das konkrete Vergehen ist, sondern das Muster.</w:t>
-      </w:r>
-    </w:p>
-    <w:p>
-      <w:pPr>
-        <w:spacing w:after="160" w:line="320" w:lineRule="exact"/>
-      </w:pPr>
-      <w:r>
-        <w:rPr>
-          <w:rFonts w:ascii="Georgia" w:hAnsi="Georgia"/>
-          <w:sz w:val="22"/>
-        </w:rPr>
-        <w:t>Ein vierter Hinweis, der vielleicht der wichtigste ist: Echte Schuld richtet sich nach deinen eigenen Werten. Das falsche Gewissen richtet sich nach den vermuteten Erwartungen anderer. Nicht nach dem, was du denkst — nach dem, was du denkst, dass sie denken.</w:t>
-      </w:r>
-    </w:p>
-    <w:p>
-      <w:pPr>
-        <w:spacing w:after="160" w:line="320" w:lineRule="exact"/>
-      </w:pPr>
-      <w:r>
-        <w:rPr>
-          <w:rFonts w:ascii="Georgia" w:hAnsi="Georgia"/>
-          <w:sz w:val="22"/>
-        </w:rPr>
-        <w:t>Das bedeutet nicht, dass das falsche Gewissen keine echten Gefühle produziert. Die Scham ist real. Das Unbehagen ist real. Der Druck im Bauch ist real. Nur der Auslöser ist kein reales Vergehen.</w:t>
-      </w:r>
-    </w:p>
-    <w:p>
-      <w:pPr>
-        <w:spacing w:after="160" w:line="320" w:lineRule="exact"/>
-      </w:pPr>
-      <w:r>
-        <w:rPr>
-          <w:rFonts w:ascii="Georgia" w:hAnsi="Georgia"/>
-          <w:sz w:val="22"/>
-        </w:rPr>
-        <w:t>Und das verändert fundamental, was helfen kann.</w:t>
-      </w:r>
-    </w:p>
-    <w:p>
-      <w:pPr>
-        <w:spacing w:after="160" w:line="320" w:lineRule="exact"/>
-      </w:pPr>
-      <w:r>
-        <w:rPr>
-          <w:rFonts w:ascii="Georgia" w:hAnsi="Georgia"/>
-          <w:sz w:val="22"/>
-        </w:rPr>
-        <w:t>Claudia braucht keine weitere Entschuldigung. Sie braucht keine zweite Nachricht und keine vierte Erklärung. Was ihr helfen kann, ist das, worum es in diesem ganzen Buch geht: verstehen, dass das Schuldgefühl sich meldet, ohne dass sie etwas falsch gemacht hat. Dass das Schuldgefühl kein verlässlicher Kompass ist, sondern ein altes Muster. Und dass das eigene Urteil — auch wenn das Gewissen etwas anderes sagt — vertrauenswürdiger ist, als es sich anfühlt.</w:t>
+        <w:t>Dieser Unterschied ist der Kern von allem, worüber wir in diesem Buch sprechen. Nicht weil er schwer zu erklären wäre, sondern weil er so schwer zu fühlen ist.</w:t>
+      </w:r>
+    </w:p>
+    <w:p>
+      <w:pPr>
+        <w:spacing w:after="160" w:line="320" w:lineRule="exact"/>
+      </w:pPr>
+      <w:r>
+        <w:rPr>
+          <w:rFonts w:ascii="Georgia" w:hAnsi="Georgia"/>
+          <w:sz w:val="22"/>
+        </w:rPr>
+        <w:t>Echte Schuld zeigt auf etwas Konkretes. Du hast jemandem absichtlich geschadet. Du hast etwas versprochen und nicht gehalten. Du hast aus Gleichgültigkeit jemanden im Stich gelassen, obwohl du hättest besser handeln können und es gewusst hast. Echte Schuld hat einen Anker in der Realität. Sie ist unangenehm, aber sie hat eine Funktion: Sie zeigt, dass etwas, das du getan oder unterlassen hast, gegen deine eigenen Werte verstösst. Sie motiviert zur Wiedergutmachung, zu einem ehrlichen Gespräch, zu einer konkreten Änderung. Und wenn das geschehen ist, löst sie sich auf. Das ist ihr Wesen. Sie kommt, zeigt auf etwas, ermöglicht Korrektur, und geht.</w:t>
+      </w:r>
+    </w:p>
+    <w:p>
+      <w:pPr>
+        <w:spacing w:after="160" w:line="320" w:lineRule="exact"/>
+      </w:pPr>
+      <w:r>
+        <w:rPr>
+          <w:rFonts w:ascii="Georgia" w:hAnsi="Georgia"/>
+          <w:sz w:val="22"/>
+        </w:rPr>
+        <w:t>Das falsche Gewissen funktioniert anders. Es meldet sich nicht auf Basis dessen, was du wirklich getan hast. Es meldet sich auf Basis einer Erwartung, oft einer, die nie ausgesprochen wurde. Einer Regel, die du so tief verinnerlicht hast, dass sie sich wie ein natürliches Gesetz anfühlt: Ich muss immer da sein. Ich darf andere nicht enttäuschen. Meine Bedürfnisse dürfen nicht wichtiger sein als die anderer. Wenn jemand traurig ist und ich in der Nähe bin, ist es meine Schuld.</w:t>
+      </w:r>
+    </w:p>
+    <w:p>
+      <w:pPr>
+        <w:spacing w:after="160" w:line="320" w:lineRule="exact"/>
+      </w:pPr>
+      <w:r>
+        <w:rPr>
+          <w:rFonts w:ascii="Georgia" w:hAnsi="Georgia"/>
+          <w:sz w:val="22"/>
+        </w:rPr>
+        <w:t>Claudia hatte niemanden enttäuscht. Sie war krank. Aber ihr Gewissen operierte nach einer Logik, die von der Realität unabhängig ist: Ich muss da sein. Wenn ich nicht da bin, enttäusche ich. Wenn ich enttäusche, bin ich schuldig. Diese Logik reagiert nicht auf Fakten. Man kann sie nicht mit Argumenten auflösen, weil sie keine rationale Konstruktion ist, sondern eine emotionale Programmierung, die tiefer sitzt als der Verstand.</w:t>
+      </w:r>
+    </w:p>
+    <w:p>
+      <w:pPr>
+        <w:spacing w:after="160" w:line="320" w:lineRule="exact"/>
+      </w:pPr>
+      <w:r>
+        <w:rPr>
+          <w:rFonts w:ascii="Georgia" w:hAnsi="Georgia"/>
+          <w:sz w:val="22"/>
+        </w:rPr>
+        <w:t>Deshalb hilft es Claudia auch nicht, wenn sie sich sagt: „Ich war krank, ich habe nichts falsch gemacht." Sie weiss es. Und trotzdem bleibt das Gefühl. Wissen und Fühlen sprechen hier verschiedene Sprachen.</w:t>
+      </w:r>
+    </w:p>
+    <w:p>
+      <w:pPr>
+        <w:spacing w:after="160" w:line="320" w:lineRule="exact"/>
+      </w:pPr>
+      <w:r>
+        <w:rPr>
+          <w:rFonts w:ascii="Georgia" w:hAnsi="Georgia"/>
+          <w:sz w:val="22"/>
+        </w:rPr>
+        <w:t>Wie erkennst du, mit welchem der beiden du es gerade zu tun hast?</w:t>
+      </w:r>
+    </w:p>
+    <w:p>
+      <w:pPr>
+        <w:spacing w:after="160" w:line="320" w:lineRule="exact"/>
+      </w:pPr>
+      <w:r>
+        <w:rPr>
+          <w:rFonts w:ascii="Georgia" w:hAnsi="Georgia"/>
+          <w:sz w:val="22"/>
+        </w:rPr>
+        <w:t>Echte Schuld ist präzise. Du kannst benennen, was du getan oder unterlassen hast, und warum das falsch war nach deinen eigenen Massstäben. Das falsche Gewissen ist diffus. Wenn du versuchst, es festzumachen, löst es sich auf oder es wandert weiter. Es zeigt auf Momente, die bei näherer Betrachtung keine Vergehen waren. Oder es findet immer ein neues Vergehen, sobald das alte nicht trägt.</w:t>
+      </w:r>
+    </w:p>
+    <w:p>
+      <w:pPr>
+        <w:spacing w:after="160" w:line="320" w:lineRule="exact"/>
+      </w:pPr>
+      <w:r>
+        <w:rPr>
+          <w:rFonts w:ascii="Georgia" w:hAnsi="Georgia"/>
+          <w:sz w:val="22"/>
+        </w:rPr>
+        <w:t>Ausserdem besteht echte Schuld unabhängig davon, ob jemand zuschaut oder es weiss. Du weisst, was du getan hast, auch wenn niemand sonst es wissen wird. Das falsche Gewissen ist fast immer verknüpft mit einer anderen Person, mit ihrer vermuteten Reaktion, ihrer Enttäuschung, ihrem Blick. Es lebt in der Vorstellung, wie jemand anderes über dich denkt oder fühlt.</w:t>
+      </w:r>
+    </w:p>
+    <w:p>
+      <w:pPr>
+        <w:spacing w:after="160" w:line="320" w:lineRule="exact"/>
+      </w:pPr>
+      <w:r>
+        <w:rPr>
+          <w:rFonts w:ascii="Georgia" w:hAnsi="Georgia"/>
+          <w:sz w:val="22"/>
+        </w:rPr>
+        <w:t>Und der vielleicht wichtigste Unterschied: Echte Schuld kann sich auflösen, wenn man handelt. Eine ehrliche Entschuldigung, eine Wiedergutmachung, das kann echte Schuld beenden. Das falsche Gewissen nicht. Du entschuldigst dich, und es kommt zurück. Nicht für dasselbe, sondern für etwas anderes. Es findet immer einen Anker, weil der Anker nicht das konkrete Vergehen ist, sondern das Muster.</w:t>
+      </w:r>
+    </w:p>
+    <w:p>
+      <w:pPr>
+        <w:spacing w:after="160" w:line="320" w:lineRule="exact"/>
+      </w:pPr>
+      <w:r>
+        <w:rPr>
+          <w:rFonts w:ascii="Georgia" w:hAnsi="Georgia"/>
+          <w:sz w:val="22"/>
+        </w:rPr>
+        <w:t>Echte Schuld richtet sich nach deinen eigenen Werten. Das falsche Gewissen richtet sich nach den vermuteten Erwartungen anderer. Nicht nach dem, was du denkst, sondern nach dem, was du denkst, dass sie denken.</w:t>
+      </w:r>
+    </w:p>
+    <w:p>
+      <w:pPr>
+        <w:spacing w:after="160" w:line="320" w:lineRule="exact"/>
+      </w:pPr>
+      <w:r>
+        <w:rPr>
+          <w:rFonts w:ascii="Georgia" w:hAnsi="Georgia"/>
+          <w:sz w:val="22"/>
+        </w:rPr>
+        <w:t>Die Scham ist real. Das Unbehagen ist real. Der Druck im Bauch ist real. Nur der Auslöser ist kein reales Vergehen.</w:t>
+      </w:r>
+    </w:p>
+    <w:p>
+      <w:pPr>
+        <w:spacing w:after="160" w:line="320" w:lineRule="exact"/>
+      </w:pPr>
+      <w:r>
+        <w:rPr>
+          <w:rFonts w:ascii="Georgia" w:hAnsi="Georgia"/>
+          <w:sz w:val="22"/>
+        </w:rPr>
+        <w:t>Claudia braucht keine weitere Entschuldigung. Sie braucht keine zweite Nachricht und keine vierte Erklärung. Was ihr helfen kann, ist das, worum es in diesem ganzen Buch geht: verstehen, dass das Schuldgefühl sich meldet, ohne dass sie etwas falsch gemacht hat. Dass das Schuldgefühl kein verlässlicher Kompass ist, sondern ein altes Muster. Und dass das eigene Urteil, auch wenn das Gewissen etwas anderes sagt, vertrauenswürdiger ist, als es sich anfühlt.</w:t>
       </w:r>
     </w:p>
     <w:p>
@@ -1708,7 +1550,7 @@
           <w:i/>
           <w:sz w:val="22"/>
         </w:rPr>
-        <w:t>Fragen zum Nachdenken:</w:t>
+        <w:t>Gibt es Situationen in deinem Leben, in denen du dich schuldig fühlst, obwohl du weisst, dass du nichts falsch gemacht hast?</w:t>
       </w:r>
     </w:p>
     <w:p>
@@ -1721,7 +1563,7 @@
           <w:i/>
           <w:sz w:val="22"/>
         </w:rPr>
-        <w:t>Gibt es Situationen in deinem Leben, in denen du dich schuldig fühlst, obwohl du rational weisst, dass du nichts falsch gemacht hast?</w:t>
+        <w:t>Wenn du versuchst, das Schuldgefühl festzumachen, auf welches konkrete Vergehen zeigt es?</w:t>
       </w:r>
     </w:p>
     <w:p>
@@ -1734,7 +1576,7 @@
           <w:i/>
           <w:sz w:val="22"/>
         </w:rPr>
-        <w:t>Wenn du versuchst, das Schuldgefühl festzumachen — auf welches konkrete Vergehen zeigt es?</w:t>
+        <w:t>Wie unterscheidet sich das für dich körperlich: das Gefühl bei echter Schuld verglichen mit diesem diffusen Dauergewissen?</w:t>
       </w:r>
     </w:p>
     <w:p>
@@ -1747,20 +1589,7 @@
           <w:i/>
           <w:sz w:val="22"/>
         </w:rPr>
-        <w:t>Wie unterscheidet sich das für dich körperlich: das Gefühl bei echter Schuld verglichen mit diesem diffusen Dauergewissen?</w:t>
-      </w:r>
-    </w:p>
-    <w:p>
-      <w:pPr>
-        <w:spacing w:after="160" w:line="320" w:lineRule="exact"/>
-      </w:pPr>
-      <w:r>
-        <w:rPr>
-          <w:rFonts w:ascii="Georgia" w:hAnsi="Georgia"/>
-          <w:i/>
-          <w:sz w:val="22"/>
-        </w:rPr>
-        <w:t>Wessen Urteil machst du abhängig, wenn du dich schuldig fühlst — deins, oder das einer bestimmten Person?</w:t>
+        <w:t>Wessen Urteil machst du abhängig, wenn du dich schuldig fühlst, deins, oder das einer bestimmten Person?</w:t>
       </w:r>
     </w:p>
     <w:p>
@@ -1805,7 +1634,7 @@
           <w:rFonts w:ascii="Georgia" w:hAnsi="Georgia"/>
           <w:sz w:val="22"/>
         </w:rPr>
-        <w:t>Nicht gleich. Zuerst schaut sie ihn nur kurz an, nimmt die Stimmung wahr. Dann fragt sie vorsichtig, ob alles gut ist. Er sagt „Ja." Aber das Ja klingt nicht wie Ja. Es klingt wie etwas, das er sagt, damit sie aufhört zu fragen. Es klingt angespannt, kurz, abgeschlossen.</w:t>
+        <w:t>Nicht gleich. Zuerst schaut sie ihn nur kurz an, nimmt die Stimmung wahr. Dann fragt sie vorsichtig, ob alles gut ist. Er sagt „Ja." Aber das Ja klingt nicht wie Ja. Es klingt wie etwas, das er sagt, damit sie aufhört zu fragen. Angespannt, kurz, abgeschlossen.</w:t>
       </w:r>
     </w:p>
     <w:p>
@@ -1841,79 +1670,79 @@
           <w:rFonts w:ascii="Georgia" w:hAnsi="Georgia"/>
           <w:sz w:val="22"/>
         </w:rPr>
-        <w:t>Monika glaubt — nicht bewusst, nicht als formulierten Glaubenssatz, sondern als körperliche Wahrheit, die ihr Handeln lenkt — dass sie für die Stimmung ihres Mannes verantwortlich ist. Wenn er gut gelaunt ist, ist sie entspannt. Wenn er still ist, ist sie in Alarmbereitschaft. Ihr innerer Zustand ist an seinen äusseren Ausdruck gekoppelt, ohne dass sie das je entschieden hätte. Es ist einfach so.</w:t>
-      </w:r>
-    </w:p>
-    <w:p>
-      <w:pPr>
-        <w:spacing w:after="160" w:line="320" w:lineRule="exact"/>
-      </w:pPr>
-      <w:r>
-        <w:rPr>
-          <w:rFonts w:ascii="Georgia" w:hAnsi="Georgia"/>
-          <w:sz w:val="22"/>
-        </w:rPr>
-        <w:t>Ich kenne dieses Muster sehr gut. Es gehört zu den häufigsten Dingen, die ich in meiner Praxis sehe — und es hat fast immer dieselbe Wurzel.</w:t>
-      </w:r>
-    </w:p>
-    <w:p>
-      <w:pPr>
-        <w:spacing w:after="160" w:line="320" w:lineRule="exact"/>
-      </w:pPr>
-      <w:r>
-        <w:rPr>
-          <w:rFonts w:ascii="Georgia" w:hAnsi="Georgia"/>
-          <w:sz w:val="22"/>
-        </w:rPr>
-        <w:t>In einer Kindheit, in der die Stimmung anderer Menschen mit der eigenen Sicherheit verknüpft war, lernt das Kind: Ich muss die Stimmung der Erwachsenen lesen. Wenn Papa gute Laune hat, ist alles gut. Wenn Mama schweigt, könnte gleich etwas passieren. Das Kind entwickelt eine feine Antenne — eine fast sensorische Empfindlichkeit für das emotionale Klima in einem Raum. Es weiss, wie jemand die Tür zumacht, ob der Abend schwierig werden wird. Es hört in einer Stimme, ob Gefahr droht, noch bevor ein Wort gesprochen wurde.</w:t>
-      </w:r>
-    </w:p>
-    <w:p>
-      <w:pPr>
-        <w:spacing w:after="160" w:line="320" w:lineRule="exact"/>
-      </w:pPr>
-      <w:r>
-        <w:rPr>
-          <w:rFonts w:ascii="Georgia" w:hAnsi="Georgia"/>
-          <w:sz w:val="22"/>
-        </w:rPr>
-        <w:t>Das war damals überlebenswichtig. Das Kind hat gelernt, wie es Gefahren vorhersehen kann, wie es Eskalationen abwenden kann, wie es durch eigenes Verhalten die Atmosphäre beeinflusst. Es hat gelernt, unsichtbar zu sein, wenn das sicherer war. Es hat gelernt, abzulenken oder zu helfen oder zu besänftigen, wenn das Klima kippte.</w:t>
-      </w:r>
-    </w:p>
-    <w:p>
-      <w:pPr>
-        <w:spacing w:after="160" w:line="320" w:lineRule="exact"/>
-      </w:pPr>
-      <w:r>
-        <w:rPr>
-          <w:rFonts w:ascii="Georgia" w:hAnsi="Georgia"/>
-          <w:sz w:val="22"/>
-        </w:rPr>
-        <w:t>Im Erwachsenenleben übersetzt sich das: Ich bin verantwortlich dafür, wie andere sich fühlen. Wenn jemand in meiner Nähe unglücklich ist, habe ich etwas falsch gemacht — oder ich muss jetzt sofort etwas tun. Diese Überzeugung ist nicht rational erreichbar. Sie ist nicht etwas, das man mit Argumenten auflösen kann. Sie sitzt im Nervensystem, nicht im Kopf.</w:t>
-      </w:r>
-    </w:p>
-    <w:p>
-      <w:pPr>
-        <w:spacing w:after="160" w:line="320" w:lineRule="exact"/>
-      </w:pPr>
-      <w:r>
-        <w:rPr>
-          <w:rFonts w:ascii="Georgia" w:hAnsi="Georgia"/>
-          <w:sz w:val="22"/>
-        </w:rPr>
-        <w:t>Und sie wird manchmal — nicht immer bewusst — von der anderen Person verstärkt.</w:t>
-      </w:r>
-    </w:p>
-    <w:p>
-      <w:pPr>
-        <w:spacing w:after="160" w:line="320" w:lineRule="exact"/>
-      </w:pPr>
-      <w:r>
-        <w:rPr>
-          <w:rFonts w:ascii="Georgia" w:hAnsi="Georgia"/>
-          <w:sz w:val="22"/>
-        </w:rPr>
-        <w:t>Das bedeutet nicht, dass Monikas Mann ein schlechter Mensch ist. Es bedeutet nicht, dass er manipuliert. Es bedeutet, dass Schweigen, Rückzug und schlechte Stimmung, wenn sie als Reaktion auf das auftreten, was du tust oder nicht tust, auf jemanden wie Monika wie ein stummer Vorwurf wirken. Auch wenn keiner ausgesprochen wird. Auch wenn keiner beabsichtigt ist. Es braucht keine Worte. Es braucht nur die Stimmung.</w:t>
+        <w:t>Monika glaubt, nicht bewusst, nicht als formulierten Glaubenssatz, sondern als körperliche Wahrheit, die ihr Handeln lenkt: Sie ist verantwortlich für die Stimmung ihres Mannes. Wenn er gut gelaunt ist, ist sie entspannt. Wenn er still ist, ist sie in Alarmbereitschaft. Ihr innerer Zustand ist an seinen äusseren Ausdruck gekoppelt, ohne dass sie das je entschieden hätte. Es ist einfach so.</w:t>
+      </w:r>
+    </w:p>
+    <w:p>
+      <w:pPr>
+        <w:spacing w:after="160" w:line="320" w:lineRule="exact"/>
+      </w:pPr>
+      <w:r>
+        <w:rPr>
+          <w:rFonts w:ascii="Georgia" w:hAnsi="Georgia"/>
+          <w:sz w:val="22"/>
+        </w:rPr>
+        <w:t>Ich kenne dieses Muster sehr gut. Es gehört zu den häufigsten Dingen, die ich in meiner Praxis sehe. Und es hat fast immer dieselbe Wurzel.</w:t>
+      </w:r>
+    </w:p>
+    <w:p>
+      <w:pPr>
+        <w:spacing w:after="160" w:line="320" w:lineRule="exact"/>
+      </w:pPr>
+      <w:r>
+        <w:rPr>
+          <w:rFonts w:ascii="Georgia" w:hAnsi="Georgia"/>
+          <w:sz w:val="22"/>
+        </w:rPr>
+        <w:t>In einer Kindheit, in der die Stimmung anderer Menschen mit der eigenen Sicherheit verknüpft war, lernt das Kind: Ich muss die Stimmung der Erwachsenen lesen. Wenn Papa gute Laune hat, ist alles gut. Wenn Mama schweigt, könnte gleich etwas passieren. Das Kind entwickelt eine feine Antenne, eine fast sensorische Empfindlichkeit für das emotionale Klima in einem Raum. Es weiss, wie jemand die Tür zumacht, ob der Abend schwierig werden wird. Es hört in einer Stimme, ob Gefahr droht, noch bevor ein Wort gesprochen wurde.</w:t>
+      </w:r>
+    </w:p>
+    <w:p>
+      <w:pPr>
+        <w:spacing w:after="160" w:line="320" w:lineRule="exact"/>
+      </w:pPr>
+      <w:r>
+        <w:rPr>
+          <w:rFonts w:ascii="Georgia" w:hAnsi="Georgia"/>
+          <w:sz w:val="22"/>
+        </w:rPr>
+        <w:t>Das war damals überlebenswichtig. Das Kind hat gelernt, Eskalationen abzuwenden, Atmosphären zu beeinflussen, durch eigenes Verhalten zu regulieren. Es hat gelernt, unsichtbar zu sein, wenn das sicherer war.</w:t>
+      </w:r>
+    </w:p>
+    <w:p>
+      <w:pPr>
+        <w:spacing w:after="160" w:line="320" w:lineRule="exact"/>
+      </w:pPr>
+      <w:r>
+        <w:rPr>
+          <w:rFonts w:ascii="Georgia" w:hAnsi="Georgia"/>
+          <w:sz w:val="22"/>
+        </w:rPr>
+        <w:t>Im Erwachsenenleben übersetzt sich das so: Ich bin verantwortlich dafür, wie andere sich fühlen. Wenn jemand in meiner Nähe unglücklich ist, habe ich etwas falsch gemacht, oder ich muss jetzt sofort etwas tun. Diese Überzeugung ist nicht rational erreichbar. Sie sitzt im Nervensystem, nicht im Kopf.</w:t>
+      </w:r>
+    </w:p>
+    <w:p>
+      <w:pPr>
+        <w:spacing w:after="160" w:line="320" w:lineRule="exact"/>
+      </w:pPr>
+      <w:r>
+        <w:rPr>
+          <w:rFonts w:ascii="Georgia" w:hAnsi="Georgia"/>
+          <w:sz w:val="22"/>
+        </w:rPr>
+        <w:t>Und sie wird manchmal, nicht immer bewusst, von der anderen Person verstärkt.</w:t>
+      </w:r>
+    </w:p>
+    <w:p>
+      <w:pPr>
+        <w:spacing w:after="160" w:line="320" w:lineRule="exact"/>
+      </w:pPr>
+      <w:r>
+        <w:rPr>
+          <w:rFonts w:ascii="Georgia" w:hAnsi="Georgia"/>
+          <w:sz w:val="22"/>
+        </w:rPr>
+        <w:t>Das bedeutet nicht, dass Monikas Mann ein schlechter Mensch ist. Es bedeutet nicht, dass er manipuliert. Schweigen, Rückzug und schlechte Stimmung wirken auf jemanden wie Monika wie ein stummer Vorwurf, auch wenn keiner ausgesprochen wird, auch wenn keiner beabsichtigt ist. Es braucht keine Worte. Es braucht nur die Stimmung.</w:t>
       </w:r>
     </w:p>
     <w:p>
@@ -1937,43 +1766,19 @@
           <w:rFonts w:ascii="Georgia" w:hAnsi="Georgia"/>
           <w:sz w:val="22"/>
         </w:rPr>
-        <w:t>Es gibt Beziehungen, in denen dieses System sehr stabil funktioniert — für eine Seite. Eine Person übernimmt die emotionale Verantwortung für die andere, die andere muss sich nie um ihre eigene emotionale Regulation kümmern, weil jemand anderes das erledigt. Das System hält sich selbst aufrecht. Für beide kann es auf eine bestimmte Art bequem sein: Monika weiss, was sie tun muss. Ihr Mann muss nicht kommunizieren, was er braucht. Die Rollen sind klar.</w:t>
-      </w:r>
-    </w:p>
-    <w:p>
-      <w:pPr>
-        <w:spacing w:after="160" w:line="320" w:lineRule="exact"/>
-      </w:pPr>
-      <w:r>
-        <w:rPr>
-          <w:rFonts w:ascii="Georgia" w:hAnsi="Georgia"/>
-          <w:sz w:val="22"/>
-        </w:rPr>
-        <w:t>Nur dass die eine Person dabei sehr viel mehr zahlt als die andere. Und irgendwann ist das Konto leer.</w:t>
-      </w:r>
-    </w:p>
-    <w:p>
-      <w:pPr>
-        <w:spacing w:after="160" w:line="320" w:lineRule="exact"/>
-      </w:pPr>
-      <w:r>
-        <w:rPr>
-          <w:rFonts w:ascii="Georgia" w:hAnsi="Georgia"/>
-          <w:sz w:val="22"/>
-        </w:rPr>
-        <w:t>Was hilft Monika? Nicht mehr Geben. Nicht mehr Erklären. Nicht mehr Suchen nach dem, was sie falsch gemacht haben könnte.</w:t>
-      </w:r>
-    </w:p>
-    <w:p>
-      <w:pPr>
-        <w:spacing w:after="160" w:line="320" w:lineRule="exact"/>
-      </w:pPr>
-      <w:r>
-        <w:rPr>
-          <w:rFonts w:ascii="Georgia" w:hAnsi="Georgia"/>
-          <w:sz w:val="22"/>
-        </w:rPr>
-        <w:t>Was helfen könnte, ist etwas, das sich zunächst kontraintuitiv anfühlt: innezuhalten, wenn der Reflex kommt, und sich zu fragen: Hat er mir gesagt, dass er mit mir unzufrieden ist? Hat er das ausgesprochen?</w:t>
+        <w:t>Es gibt Beziehungen, in denen dieses System sehr stabil funktioniert, für eine Seite. Eine Person übernimmt die emotionale Verantwortung für die andere, die andere muss sich nie um ihre eigene emotionale Regulation kümmern, weil jemand anderes das erledigt. Das System hält sich selbst aufrecht. Nur dass die eine Person dabei sehr viel mehr zahlt als die andere. Und irgendwann ist das Konto leer.</w:t>
+      </w:r>
+    </w:p>
+    <w:p>
+      <w:pPr>
+        <w:spacing w:after="160" w:line="320" w:lineRule="exact"/>
+      </w:pPr>
+      <w:r>
+        <w:rPr>
+          <w:rFonts w:ascii="Georgia" w:hAnsi="Georgia"/>
+          <w:sz w:val="22"/>
+        </w:rPr>
+        <w:t>Was hilft, ist nicht mehr Geben, nicht mehr Erklären, nicht mehr Suchen nach dem, was sie falsch gemacht haben könnte. Was helfen könnte, ist etwas, das sich zunächst kontraintuitiv anfühlt: innezuhalten, wenn der Reflex kommt, und sich zu fragen: Hat er mir gesagt, dass er mit mir unzufrieden ist? Hat er das ausgesprochen?</w:t>
       </w:r>
     </w:p>
     <w:p>
@@ -2021,31 +1826,31 @@
           <w:rFonts w:ascii="Georgia" w:hAnsi="Georgia"/>
           <w:sz w:val="22"/>
         </w:rPr>
-        <w:t>Was weiss ich sicher? Dass er schweigt. Dass etwas in ihm gerade beschäftigt oder schwer ist. Vielleicht ist es Arbeit. Vielleicht Müdigkeit. Vielleicht etwas, das er selbst noch nicht in Worte fassen kann und das gar nichts mit Monika zu tun hat. Das ist alles, was sie weiss.</w:t>
-      </w:r>
-    </w:p>
-    <w:p>
-      <w:pPr>
-        <w:spacing w:after="160" w:line="320" w:lineRule="exact"/>
-      </w:pPr>
-      <w:r>
-        <w:rPr>
-          <w:rFonts w:ascii="Georgia" w:hAnsi="Georgia"/>
-          <w:sz w:val="22"/>
-        </w:rPr>
-        <w:t>Die Stimmung des anderen als Information, nicht als Schuldzuweisung. Das klingt einfach — und es ist für jemanden wie Monika einer der schwierigsten Schritte überhaupt. Weil ihr Nervensystem jahrzehntelang genau das Gegenteil geübt hat.</w:t>
-      </w:r>
-    </w:p>
-    <w:p>
-      <w:pPr>
-        <w:spacing w:after="160" w:line="320" w:lineRule="exact"/>
-      </w:pPr>
-      <w:r>
-        <w:rPr>
-          <w:rFonts w:ascii="Georgia" w:hAnsi="Georgia"/>
-          <w:sz w:val="22"/>
-        </w:rPr>
-        <w:t>Aber es beginnt mit dieser einen Frage: Hat jemand mir tatsächlich gesagt, dass ich schuldig bin — oder lese ich das in etwas, das ich sehe?</w:t>
+        <w:t>Was weiss ich sicher? Dass er schweigt. Dass etwas in ihm gerade beschäftigt oder schwer ist. Vielleicht ist es Arbeit. Vielleicht Müdigkeit. Vielleicht etwas, das er selbst noch nicht in Worte fassen kann und das gar nichts mit Monika zu tun hat.</w:t>
+      </w:r>
+    </w:p>
+    <w:p>
+      <w:pPr>
+        <w:spacing w:after="160" w:line="320" w:lineRule="exact"/>
+      </w:pPr>
+      <w:r>
+        <w:rPr>
+          <w:rFonts w:ascii="Georgia" w:hAnsi="Georgia"/>
+          <w:sz w:val="22"/>
+        </w:rPr>
+        <w:t>Die Stimmung des anderen als Information, nicht als Schuldzuweisung. Das klingt einfach, und es ist für jemanden wie Monika einer der schwierigsten Schritte überhaupt. Weil ihr Nervensystem jahrzehntelang genau das Gegenteil geübt hat.</w:t>
+      </w:r>
+    </w:p>
+    <w:p>
+      <w:pPr>
+        <w:spacing w:after="160" w:line="320" w:lineRule="exact"/>
+      </w:pPr>
+      <w:r>
+        <w:rPr>
+          <w:rFonts w:ascii="Georgia" w:hAnsi="Georgia"/>
+          <w:sz w:val="22"/>
+        </w:rPr>
+        <w:t>Aber es beginnt mit dieser einen Frage: Hat jemand mir tatsächlich gesagt, dass ich schuldig bin, oder lese ich das in etwas, das ich sehe?</w:t>
       </w:r>
     </w:p>
     <w:p>
@@ -2070,20 +1875,7 @@
           <w:i/>
           <w:sz w:val="22"/>
         </w:rPr>
-        <w:t>Fragen zum Nachdenken:</w:t>
-      </w:r>
-    </w:p>
-    <w:p>
-      <w:pPr>
-        <w:spacing w:after="160" w:line="320" w:lineRule="exact"/>
-      </w:pPr>
-      <w:r>
-        <w:rPr>
-          <w:rFonts w:ascii="Georgia" w:hAnsi="Georgia"/>
-          <w:i/>
-          <w:sz w:val="22"/>
-        </w:rPr>
-        <w:t>Wessen Stimmung in deinem Leben hat deinen eigenen inneren Zustand am stärksten beeinflusst — früher und heute?</w:t>
+        <w:t>Wessen Stimmung in deinem Leben hat deinen eigenen inneren Zustand am stärksten beeinflusst, früher und heute?</w:t>
       </w:r>
     </w:p>
     <w:p>
@@ -2191,19 +1983,19 @@
           <w:rFonts w:ascii="Georgia" w:hAnsi="Georgia"/>
           <w:sz w:val="22"/>
         </w:rPr>
-        <w:t>Sie fühlt sich schuldig, wenn sie arbeitet. Sie fühlt sich schuldig, wenn sie zu Hause ist. Sie fühlt sich schuldig, wenn sie abends erschöpft ist. Wenn sie kurz angebunden ist. Wenn die Kinder zu lange auf dem Tablet waren. Wenn der Kindergeburtstag nicht selbst gebastelt war. Wenn das Müsli aus dem falschen Bio-Laden kommt.</w:t>
-      </w:r>
-    </w:p>
-    <w:p>
-      <w:pPr>
-        <w:spacing w:after="160" w:line="320" w:lineRule="exact"/>
-      </w:pPr>
-      <w:r>
-        <w:rPr>
-          <w:rFonts w:ascii="Georgia" w:hAnsi="Georgia"/>
-          <w:sz w:val="22"/>
-        </w:rPr>
-        <w:t>Lisa schläft im Durchschnitt sechs Stunden. Ihr Partner schläft sieben. Er macht sich, soweit sie es beurteilen kann, keine ernsthaften Gedanken darüber, ob er ein guter Vater ist. Er ist einfach da, wenn er da ist, und das scheint zu reichen — für ihn und für die Kinder.</w:t>
+        <w:t>Sie fühlt sich schuldig, wenn sie arbeitet. Sie fühlt sich schuldig, wenn sie zu Hause ist. Sie fühlt sich schuldig, wenn sie abends erschöpft ist. Wenn sie kurz angebunden ist. Wenn die Kinder zu lange auf dem Tablet waren. Wenn der Kindergeburtstag nicht selbst gebastelt war.</w:t>
+      </w:r>
+    </w:p>
+    <w:p>
+      <w:pPr>
+        <w:spacing w:after="160" w:line="320" w:lineRule="exact"/>
+      </w:pPr>
+      <w:r>
+        <w:rPr>
+          <w:rFonts w:ascii="Georgia" w:hAnsi="Georgia"/>
+          <w:sz w:val="22"/>
+        </w:rPr>
+        <w:t>Lisa schläft im Durchschnitt sechs Stunden. Ihr Partner schläft sieben. Er macht sich, soweit sie es beurteilen kann, keine ernsthaften Gedanken darüber, ob er ein guter Vater ist. Er ist einfach da, wenn er da ist, und das scheint zu reichen.</w:t>
       </w:r>
     </w:p>
     <w:p>
@@ -2227,31 +2019,19 @@
           <w:rFonts w:ascii="Georgia" w:hAnsi="Georgia"/>
           <w:sz w:val="22"/>
         </w:rPr>
-        <w:t>Das Mutterschuldgefühl ist kein persönliches Problem. Es ist in einem erschreckenden Ausmass ein gesellschaftliches Konstrukt, das Frauen von Geburt ihres ersten Kindes an begleitet — manchmal schon früher. Die Schwangerschaft als Test. Die Entbindung als erste Prüfung. Das Stillen als moralische Frage. Die Kita als Beweisstück für mangelnde Liebe oder als Beweis für gesunden Pragmatismus, je nachdem wen man fragt.</w:t>
-      </w:r>
-    </w:p>
-    <w:p>
-      <w:pPr>
-        <w:spacing w:after="160" w:line="320" w:lineRule="exact"/>
-      </w:pPr>
-      <w:r>
-        <w:rPr>
-          <w:rFonts w:ascii="Georgia" w:hAnsi="Georgia"/>
-          <w:sz w:val="22"/>
-        </w:rPr>
-        <w:t>Mütter werden mit einem Bild konfrontiert, das unmöglich zu erfüllen ist. Präsent, aber nicht erdrückend. Berufstätig, aber nicht abwesend. Grenzen setzend, aber nie hart. Nährend, aber nicht überbehütend. Geduldig — immer. Selbst in Momenten, in denen Geduld das Letzte ist, was noch vorhanden ist.</w:t>
-      </w:r>
-    </w:p>
-    <w:p>
-      <w:pPr>
-        <w:spacing w:after="160" w:line="320" w:lineRule="exact"/>
-      </w:pPr>
-      <w:r>
-        <w:rPr>
-          <w:rFonts w:ascii="Georgia" w:hAnsi="Georgia"/>
-          <w:sz w:val="22"/>
-        </w:rPr>
-        <w:t>Und dieses Bild ist nicht gender-neutral. Väter werden nicht annähernd so gemessen. Ein Vater, der zu einem Schulkonzert kommt, wird gelobt. Eine Mutter, die es verpasst, wird befragt.</w:t>
+        <w:t>Das Mutterschuldgefühl ist kein persönliches Problem. Es ist in einem erschreckenden Ausmass ein gesellschaftliches Konstrukt, das Frauen von Geburt ihres ersten Kindes an begleitet, manchmal schon früher. Die Schwangerschaft als Test. Die Entbindung als erste Prüfung. Das Stillen als moralische Frage. Die Kita als Beweisstück für mangelnde Liebe oder als Beweis für gesunden Pragmatismus, je nachdem wen man fragt.</w:t>
+      </w:r>
+    </w:p>
+    <w:p>
+      <w:pPr>
+        <w:spacing w:after="160" w:line="320" w:lineRule="exact"/>
+      </w:pPr>
+      <w:r>
+        <w:rPr>
+          <w:rFonts w:ascii="Georgia" w:hAnsi="Georgia"/>
+          <w:sz w:val="22"/>
+        </w:rPr>
+        <w:t>Mütter werden mit einem Bild konfrontiert, das unmöglich zu erfüllen ist. Präsent, aber nicht erdrückend. Berufstätig, aber nicht abwesend. Grenzen setzend, aber nie hart. Nährend, aber nicht überbehütend. Geduldig, immer. Selbst in Momenten, in denen Geduld das Letzte ist, was noch vorhanden ist. Und dieses Bild ist nicht gender-neutral. Väter werden nicht annähernd so gemessen. Ein Vater, der zu einem Schulkonzert kommt, wird gelobt. Eine Mutter, die es verpasst, wird befragt.</w:t>
       </w:r>
     </w:p>
     <w:p>
@@ -2275,31 +2055,31 @@
           <w:rFonts w:ascii="Georgia" w:hAnsi="Georgia"/>
           <w:sz w:val="22"/>
         </w:rPr>
-        <w:t>Nicht perfekte Mütter. Die Forschung ist da sehr klar. Kinder brauchen keine perfekte Mutter — sie brauchen eine ausreichend gute. Der britische Kinderpsychiater Donald Winnicott prägte dafür den Begriff „good enough mother" — die ausreichend gute Mutter. Es ist eines der befreiendsten Konzepte, die ich in meiner Arbeit kenne.</w:t>
-      </w:r>
-    </w:p>
-    <w:p>
-      <w:pPr>
-        <w:spacing w:after="160" w:line="320" w:lineRule="exact"/>
-      </w:pPr>
-      <w:r>
-        <w:rPr>
-          <w:rFonts w:ascii="Georgia" w:hAnsi="Georgia"/>
-          <w:sz w:val="22"/>
-        </w:rPr>
-        <w:t>Ausreichend gute Fürsorge bedeutet: nicht immer, nicht alles, nicht perfekt. Es bedeutet ausreichende emotionale Verfügbarkeit. Ausreichende Verlässlichkeit. Ausreichende Feinfühligkeit. Und — das ist der Teil, der Müttern selten gesagt wird — ausreichend viele kleine Misserfolge. Winnicott beschrieb, wie die kleinen unvermeidlichen Enttäuschungen des Alltags Kindern helfen, Frustrationstoleranz aufzubauen. Die Mutter, die nicht sofort auf jeden Ruf reagiert. Der Vater, der zu müde ist für das dritte Spiel hintereinander. Diese Momente sind keine Traumata. Sie sind Teil eines gesunden Aufwachsens.</w:t>
-      </w:r>
-    </w:p>
-    <w:p>
-      <w:pPr>
-        <w:spacing w:after="160" w:line="320" w:lineRule="exact"/>
-      </w:pPr>
-      <w:r>
-        <w:rPr>
-          <w:rFonts w:ascii="Georgia" w:hAnsi="Georgia"/>
-          <w:sz w:val="22"/>
-        </w:rPr>
-        <w:t>Kinder brauchen Mütter, die Fehler machen und sich entschuldigen — und dann weitermachen. Die zeigen, dass man sich irren kann und dass das Leben weitergeht. Die vorleben, dass Erschöpfung kein Versagen ist, sondern eine menschliche Reaktion auf Anforderungen. Die demonstrieren, dass eine Frau eigene Bedürfnisse hat und dass diese Bedürfnisse legitim sind.</w:t>
+        <w:t>Nicht perfekte Mütter. Die Forschung ist da sehr klar. Kinder brauchen keine perfekte Mutter. Sie brauchen eine ausreichend gute. Der britische Kinderpsychiater Donald Winnicott prägte dafür den Begriff „good enough mother", die ausreichend gute Mutter. Es ist eines der befreiendsten Konzepte, die ich in meiner Arbeit kenne.</w:t>
+      </w:r>
+    </w:p>
+    <w:p>
+      <w:pPr>
+        <w:spacing w:after="160" w:line="320" w:lineRule="exact"/>
+      </w:pPr>
+      <w:r>
+        <w:rPr>
+          <w:rFonts w:ascii="Georgia" w:hAnsi="Georgia"/>
+          <w:sz w:val="22"/>
+        </w:rPr>
+        <w:t>Ausreichend gute Fürsorge bedeutet: nicht immer, nicht alles, nicht perfekt. Es bedeutet ausreichende emotionale Verfügbarkeit. Ausreichende Verlässlichkeit. Und, das ist der Teil, der Müttern selten gesagt wird, ausreichend viele kleine Misserfolge. Winnicott beschrieb, wie die kleinen unvermeidlichen Enttäuschungen des Alltags Kindern helfen, Frustrationstoleranz aufzubauen. Die Mutter, die nicht sofort auf jeden Ruf reagiert. Der Vater, der zu müde ist für das dritte Spiel hintereinander. Diese Momente sind keine Traumata. Sie sind Teil eines gesunden Aufwachsens.</w:t>
+      </w:r>
+    </w:p>
+    <w:p>
+      <w:pPr>
+        <w:spacing w:after="160" w:line="320" w:lineRule="exact"/>
+      </w:pPr>
+      <w:r>
+        <w:rPr>
+          <w:rFonts w:ascii="Georgia" w:hAnsi="Georgia"/>
+          <w:sz w:val="22"/>
+        </w:rPr>
+        <w:t>Kinder brauchen Mütter, die Fehler machen und sich entschuldigen, und dann weitermachen. Die zeigen, dass man sich irren kann und dass das Leben weitergeht. Die vorleben, dass Erschöpfung kein Versagen ist, sondern eine menschliche Reaktion auf Anforderungen. Die demonstrieren, dass eine Frau eigene Bedürfnisse hat und dass diese Bedürfnisse legitim sind.</w:t>
       </w:r>
     </w:p>
     <w:p>
@@ -2335,19 +2115,19 @@
           <w:rFonts w:ascii="Georgia" w:hAnsi="Georgia"/>
           <w:sz w:val="22"/>
         </w:rPr>
-        <w:t>Wenn du dich pausenlos schuldig fühlst und dich immer weiter aufreibst, zeigst du deinen Kindern — und besonders deinen Töchtern — wie Frauen sich zu behandeln haben. Das geschieht nicht durch Worte. Es geschieht durch das, was sie jeden Tag sehen.</w:t>
-      </w:r>
-    </w:p>
-    <w:p>
-      <w:pPr>
-        <w:spacing w:after="160" w:line="320" w:lineRule="exact"/>
-      </w:pPr>
-      <w:r>
-        <w:rPr>
-          <w:rFonts w:ascii="Georgia" w:hAnsi="Georgia"/>
-          <w:sz w:val="22"/>
-        </w:rPr>
-        <w:t>Das ist keine Anklage. Es ist eine Einladung, anders hinzuschauen. Nicht: Ich muss das sofort verändern, damit ich kein schlechtes Vorbild bin. Sondern: Was wäre, wenn Selbstfürsorge auch für sie gut wäre?</w:t>
+        <w:t>Wenn du dich pausenlos schuldig fühlst und dich immer weiter aufreibst, zeigst du deinen Kindern, und besonders deinen Töchtern, wie Frauen sich zu behandeln haben. Das geschieht nicht durch Worte. Es geschieht durch das, was sie jeden Tag sehen.</w:t>
+      </w:r>
+    </w:p>
+    <w:p>
+      <w:pPr>
+        <w:spacing w:after="160" w:line="320" w:lineRule="exact"/>
+      </w:pPr>
+      <w:r>
+        <w:rPr>
+          <w:rFonts w:ascii="Georgia" w:hAnsi="Georgia"/>
+          <w:sz w:val="22"/>
+        </w:rPr>
+        <w:t>Das ist keine Anklage. Es ist eine Einladung, anders hinzuschauen. Was wäre, wenn Selbstfürsorge auch für sie gut wäre?</w:t>
       </w:r>
     </w:p>
     <w:p>
@@ -2372,7 +2152,7 @@
           <w:i/>
           <w:sz w:val="22"/>
         </w:rPr>
-        <w:t>Fragen zum Nachdenken:</w:t>
+        <w:t>Wofür genau fühlst du dich als Mutter schuldig, kannst du es konkret benennen?</w:t>
       </w:r>
     </w:p>
     <w:p>
@@ -2385,20 +2165,7 @@
           <w:i/>
           <w:sz w:val="22"/>
         </w:rPr>
-        <w:t>Wofür genau fühlst du dich als Mutter schuldig — kannst du es konkret benennen?</w:t>
-      </w:r>
-    </w:p>
-    <w:p>
-      <w:pPr>
-        <w:spacing w:after="160" w:line="320" w:lineRule="exact"/>
-      </w:pPr>
-      <w:r>
-        <w:rPr>
-          <w:rFonts w:ascii="Georgia" w:hAnsi="Georgia"/>
-          <w:i/>
-          <w:sz w:val="22"/>
-        </w:rPr>
-        <w:t>Welches Bild von Mutterschaft hast du verinnerlicht — und woher kommt es wirklich?</w:t>
+        <w:t>Welches Bild von Mutterschaft hast du verinnerlicht, und woher kommt es wirklich?</w:t>
       </w:r>
     </w:p>
     <w:p>
@@ -2505,43 +2272,43 @@
           <w:rFonts w:ascii="Georgia" w:hAnsi="Georgia"/>
           <w:sz w:val="22"/>
         </w:rPr>
-        <w:t>Vera hat den Urlaub nicht abgesagt. Aber sie ist mit einem Rucksack voller Schuldgefühle gefahren und mit demselben Rucksack zurückgekehrt. Sie hat die Mutter zweimal angerufen, obwohl das nie verabredet war. Sie hat Postkarten gekauft, die sie noch nie gekauft hätte. Sie hat sich im Nachhinein gefragt, ob es richtig war zu fahren.</w:t>
-      </w:r>
-    </w:p>
-    <w:p>
-      <w:pPr>
-        <w:spacing w:after="160" w:line="320" w:lineRule="exact"/>
-      </w:pPr>
-      <w:r>
-        <w:rPr>
-          <w:rFonts w:ascii="Georgia" w:hAnsi="Georgia"/>
-          <w:sz w:val="22"/>
-        </w:rPr>
-        <w:t>Familiäre Schuldgefühle gehören zu den zähesten. Weil die Familie der erste Ort war, an dem wir Zugehörigkeit erlebt haben. Weil die Regeln, die dort gelten, nie explizit gemacht wurden — man hat sie gelernt, indem man darin aufgewachsen ist, wie man Atemholen lernt. Sie fühlen sich nicht wie Regeln an. Sie fühlen sich wie die Wirklichkeit an.</w:t>
-      </w:r>
-    </w:p>
-    <w:p>
-      <w:pPr>
-        <w:spacing w:after="160" w:line="320" w:lineRule="exact"/>
-      </w:pPr>
-      <w:r>
-        <w:rPr>
-          <w:rFonts w:ascii="Georgia" w:hAnsi="Georgia"/>
-          <w:sz w:val="22"/>
-        </w:rPr>
-        <w:t>In der Familientherapie gibt es das Konzept des Familiensystems. Jede Familie ist ein System — mit ungeschriebenen Rollen, mit stabilen Mustern, mit Regeln, die eingehalten werden müssen, damit das System im Gleichgewicht bleibt. Wer diese Regeln verletzt, verletzt das System. Und das System antwortet darauf. Nicht notwendigerweise mit Worten. Oft mit Stimmungen, mit Schweigen, mit Sätzen, die so eingebaut sind, dass sie kaum auffallen.</w:t>
-      </w:r>
-    </w:p>
-    <w:p>
-      <w:pPr>
-        <w:spacing w:after="160" w:line="320" w:lineRule="exact"/>
-      </w:pPr>
-      <w:r>
-        <w:rPr>
-          <w:rFonts w:ascii="Georgia" w:hAnsi="Georgia"/>
-          <w:sz w:val="22"/>
-        </w:rPr>
-        <w:t>„Ich bin ja allein hier, aber das macht nichts." Das ist kein unschuldiger Satz. Er enthält eine Aussage über die Mutter (Einsamkeit, Aufopferung), eine implizite Erwartung (du solltest da sein) und eine Schuldzuweisung ohne Anklage (du verlässt mich). Alles gleichzeitig, in zwölf Wörtern, ohne dass ein einziger Vorwurf ausgesprochen wurde.</w:t>
+        <w:t>Vera hat den Urlaub nicht abgesagt. Aber sie ist mit einem Rucksack voller Schuldgefühle gefahren und mit demselben Rucksack zurückgekehrt. Sie hat die Mutter zweimal angerufen, obwohl das nie verabredet war. Sie hat sich im Nachhinein gefragt, ob es richtig war zu fahren.</w:t>
+      </w:r>
+    </w:p>
+    <w:p>
+      <w:pPr>
+        <w:spacing w:after="160" w:line="320" w:lineRule="exact"/>
+      </w:pPr>
+      <w:r>
+        <w:rPr>
+          <w:rFonts w:ascii="Georgia" w:hAnsi="Georgia"/>
+          <w:sz w:val="22"/>
+        </w:rPr>
+        <w:t>Familiäre Schuldgefühle gehören zu den zähesten. Weil die Familie der erste Ort war, an dem wir Zugehörigkeit erlebt haben. Weil die Regeln, die dort gelten, nie explizit gemacht wurden. Man hat sie gelernt, indem man darin aufgewachsen ist. Sie fühlen sich nicht wie Regeln an. Sie fühlen sich wie die Wirklichkeit an.</w:t>
+      </w:r>
+    </w:p>
+    <w:p>
+      <w:pPr>
+        <w:spacing w:after="160" w:line="320" w:lineRule="exact"/>
+      </w:pPr>
+      <w:r>
+        <w:rPr>
+          <w:rFonts w:ascii="Georgia" w:hAnsi="Georgia"/>
+          <w:sz w:val="22"/>
+        </w:rPr>
+        <w:t>Jede Familie ist ein System mit ungeschriebenen Rollen, mit stabilen Mustern, mit Regeln, die eingehalten werden müssen, damit das System im Gleichgewicht bleibt. Wer diese Regeln verletzt, verletzt das System. Und das System antwortet. Nicht notwendigerweise mit Worten. Oft mit Stimmungen, mit Schweigen, mit Sätzen, die so eingebaut sind, dass sie kaum auffallen.</w:t>
+      </w:r>
+    </w:p>
+    <w:p>
+      <w:pPr>
+        <w:spacing w:after="160" w:line="320" w:lineRule="exact"/>
+      </w:pPr>
+      <w:r>
+        <w:rPr>
+          <w:rFonts w:ascii="Georgia" w:hAnsi="Georgia"/>
+          <w:sz w:val="22"/>
+        </w:rPr>
+        <w:t>„Ich bin ja allein hier, aber das macht nichts." Das ist kein unschuldiger Satz. Er enthält eine Aussage über die Mutter, eine implizite Erwartung, und eine Schuldzuweisung ohne Anklage. Alles gleichzeitig, in zwölf Wörtern, ohne dass ein einziger Vorwurf ausgesprochen wurde.</w:t>
       </w:r>
     </w:p>
     <w:p>
@@ -2565,79 +2332,67 @@
           <w:rFonts w:ascii="Georgia" w:hAnsi="Georgia"/>
           <w:sz w:val="22"/>
         </w:rPr>
-        <w:t>Aber das Ausdrücken von echten Gefühlen auf eine Weise, die die andere Person schuldig macht, ist trotzdem problematisch — nicht wegen der Absicht, sondern wegen der Wirkung. Und die Wirkung ist: Vera zahlt für etwas, das nicht ihrer Schuld entspringt.</w:t>
-      </w:r>
-    </w:p>
-    <w:p>
-      <w:pPr>
-        <w:spacing w:after="160" w:line="320" w:lineRule="exact"/>
-      </w:pPr>
-      <w:r>
-        <w:rPr>
-          <w:rFonts w:ascii="Georgia" w:hAnsi="Georgia"/>
-          <w:sz w:val="22"/>
-        </w:rPr>
-        <w:t>Es gibt einen Unterschied zwischen: „Ich vermisse dich, und das macht mir manchmal traurig" — und: „Ich bin ja allein hier, aber das macht nichts." Der erste Satz ist ehrliche Verletzlichkeit. Er lädt zur Verbindung ein. Er gibt Vera die Möglichkeit, zu antworten. Der zweite Satz ist eine Schuldzuweisung in Demut verkleidet. Er gibt Vera keine Möglichkeit zu antworten, ohne sich zu verteidigen.</w:t>
-      </w:r>
-    </w:p>
-    <w:p>
-      <w:pPr>
-        <w:spacing w:after="160" w:line="320" w:lineRule="exact"/>
-      </w:pPr>
-      <w:r>
-        <w:rPr>
-          <w:rFonts w:ascii="Georgia" w:hAnsi="Georgia"/>
-          <w:sz w:val="22"/>
-        </w:rPr>
-        <w:t>Vera muss nicht entscheiden, ob ihre Mutter eine gute oder schlechte Person ist. Das ist nicht die Frage. Die Frage ist: Welche Regeln gelten in diesem System — und welche davon möchte ich weiterhin einhalten?</w:t>
-      </w:r>
-    </w:p>
-    <w:p>
-      <w:pPr>
-        <w:spacing w:after="160" w:line="320" w:lineRule="exact"/>
-      </w:pPr>
-      <w:r>
-        <w:rPr>
-          <w:rFonts w:ascii="Georgia" w:hAnsi="Georgia"/>
-          <w:sz w:val="22"/>
-        </w:rPr>
-        <w:t>Manche familiären Erwartungen sind berechtigt und bedeutsam. Aufmerksamkeit, emotionale Verbundenheit, Fürsorge im Alter, gemeinsame Zeit — das sind legitime menschliche Bedürfnisse, die aus echten Beziehungen entstehen. Diese zu erfüllen ist sinnvoll und oft auch gewollt.</w:t>
-      </w:r>
-    </w:p>
-    <w:p>
-      <w:pPr>
-        <w:spacing w:after="160" w:line="320" w:lineRule="exact"/>
-      </w:pPr>
-      <w:r>
-        <w:rPr>
-          <w:rFonts w:ascii="Georgia" w:hAnsi="Georgia"/>
-          <w:sz w:val="22"/>
-        </w:rPr>
-        <w:t>Andere Erwartungen sind es nicht. Das Bedürfnis, dass Vera ihren Urlaub mit einem schlechten Gewissen verbringt, ist keine berechtigte Erwartung. Es ist ein Steuerungsmittel — ob bewusst eingesetzt oder nicht.</w:t>
-      </w:r>
-    </w:p>
-    <w:p>
-      <w:pPr>
-        <w:spacing w:after="160" w:line="320" w:lineRule="exact"/>
-      </w:pPr>
-      <w:r>
-        <w:rPr>
-          <w:rFonts w:ascii="Georgia" w:hAnsi="Georgia"/>
-          <w:sz w:val="22"/>
-        </w:rPr>
-        <w:t>Was Vera lernen kann: Sie darf Ja zur Mutter sagen und trotzdem Ja zu sich. Sie darf die Mutter lieben und trotzdem eigene Pläne haben. Sie darf Verantwortung tragen — für das, was wirklich ihre Verantwortung ist — und trotzdem Grenzen setzen.</w:t>
-      </w:r>
-    </w:p>
-    <w:p>
-      <w:pPr>
-        <w:spacing w:after="160" w:line="320" w:lineRule="exact"/>
-      </w:pPr>
-      <w:r>
-        <w:rPr>
-          <w:rFonts w:ascii="Georgia" w:hAnsi="Georgia"/>
-          <w:sz w:val="22"/>
-        </w:rPr>
-        <w:t>Liebe schliesst Grenzen nicht aus. Liebe braucht Grenzen. Ohne Grenzen entsteht keine echte Verbindung — nur eine Dynamik, in der eine Person zahlt und die andere verwaltet.</w:t>
+        <w:t>Aber das Ausdrücken von echten Gefühlen auf eine Weise, die die andere Person schuldig macht, ist trotzdem problematisch, nicht wegen der Absicht, sondern wegen der Wirkung. Und die Wirkung ist: Vera zahlt für etwas, das nicht ihrer Schuld entspringt.</w:t>
+      </w:r>
+    </w:p>
+    <w:p>
+      <w:pPr>
+        <w:spacing w:after="160" w:line="320" w:lineRule="exact"/>
+      </w:pPr>
+      <w:r>
+        <w:rPr>
+          <w:rFonts w:ascii="Georgia" w:hAnsi="Georgia"/>
+          <w:sz w:val="22"/>
+        </w:rPr>
+        <w:t>Es gibt einen Unterschied zwischen: „Ich vermisse dich, und das macht mir manchmal traurig", und: „Ich bin ja allein hier, aber das macht nichts." Der erste Satz ist ehrliche Verletzlichkeit. Er lädt zur Verbindung ein. Er gibt Vera die Möglichkeit, zu antworten. Der zweite Satz ist eine Schuldzuweisung in Demut verkleidet. Er gibt Vera keine Möglichkeit zu antworten, ohne sich zu verteidigen.</w:t>
+      </w:r>
+    </w:p>
+    <w:p>
+      <w:pPr>
+        <w:spacing w:after="160" w:line="320" w:lineRule="exact"/>
+      </w:pPr>
+      <w:r>
+        <w:rPr>
+          <w:rFonts w:ascii="Georgia" w:hAnsi="Georgia"/>
+          <w:sz w:val="22"/>
+        </w:rPr>
+        <w:t>Vera muss nicht entscheiden, ob ihre Mutter eine gute oder schlechte Person ist. Die Frage ist eine andere: Welche Regeln gelten in diesem System, und welche davon möchte ich weiterhin einhalten?</w:t>
+      </w:r>
+    </w:p>
+    <w:p>
+      <w:pPr>
+        <w:spacing w:after="160" w:line="320" w:lineRule="exact"/>
+      </w:pPr>
+      <w:r>
+        <w:rPr>
+          <w:rFonts w:ascii="Georgia" w:hAnsi="Georgia"/>
+          <w:sz w:val="22"/>
+        </w:rPr>
+        <w:t>Manche familiären Erwartungen sind berechtigt und bedeutsam. Aufmerksamkeit, emotionale Verbundenheit, Fürsorge im Alter, gemeinsame Zeit. Das sind legitime menschliche Bedürfnisse, die aus echten Beziehungen entstehen. Diese zu erfüllen ist sinnvoll und oft auch gewollt.</w:t>
+      </w:r>
+    </w:p>
+    <w:p>
+      <w:pPr>
+        <w:spacing w:after="160" w:line="320" w:lineRule="exact"/>
+      </w:pPr>
+      <w:r>
+        <w:rPr>
+          <w:rFonts w:ascii="Georgia" w:hAnsi="Georgia"/>
+          <w:sz w:val="22"/>
+        </w:rPr>
+        <w:t>Aber das Bedürfnis, dass Vera ihren Urlaub mit einem schlechten Gewissen verbringt, ist keine berechtigte Erwartung. Es ist ein Steuerungsmittel, ob bewusst eingesetzt oder nicht.</w:t>
+      </w:r>
+    </w:p>
+    <w:p>
+      <w:pPr>
+        <w:spacing w:after="160" w:line="320" w:lineRule="exact"/>
+      </w:pPr>
+      <w:r>
+        <w:rPr>
+          <w:rFonts w:ascii="Georgia" w:hAnsi="Georgia"/>
+          <w:sz w:val="22"/>
+        </w:rPr>
+        <w:t>Vera darf Ja zur Mutter sagen und trotzdem Ja zu sich. Sie darf die Mutter lieben und trotzdem eigene Pläne haben. Liebe schliesst Grenzen nicht aus. Liebe braucht Grenzen. Ohne Grenzen entsteht keine echte Verbindung, nur eine Dynamik, in der eine Person zahlt und die andere verwaltet.</w:t>
       </w:r>
     </w:p>
     <w:p>
@@ -2662,7 +2417,7 @@
           <w:i/>
           <w:sz w:val="22"/>
         </w:rPr>
-        <w:t>Fragen zum Nachdenken:</w:t>
+        <w:t>Welche unausgesprochenen Regeln galten in deiner Familie?</w:t>
       </w:r>
     </w:p>
     <w:p>
@@ -2675,7 +2430,7 @@
           <w:i/>
           <w:sz w:val="22"/>
         </w:rPr>
-        <w:t>Welche unausgesprochenen Regeln galten in deiner Familie?</w:t>
+        <w:t>Wer in deiner Familie hat das Schuldgefühl am stärksten aktiviert, und wie?</w:t>
       </w:r>
     </w:p>
     <w:p>
@@ -2688,7 +2443,7 @@
           <w:i/>
           <w:sz w:val="22"/>
         </w:rPr>
-        <w:t>Wer in deiner Familie hat das Schuldgefühl am stärksten aktiviert — und wie?</w:t>
+        <w:t>Was passiert, wenn du in deiner Familie eigene Bedürfnisse äusserst?</w:t>
       </w:r>
     </w:p>
     <w:p>
@@ -2701,20 +2456,7 @@
           <w:i/>
           <w:sz w:val="22"/>
         </w:rPr>
-        <w:t>Was passiert, wenn du in deiner Familie eigene Bedürfnisse äusserst?</w:t>
-      </w:r>
-    </w:p>
-    <w:p>
-      <w:pPr>
-        <w:spacing w:after="160" w:line="320" w:lineRule="exact"/>
-      </w:pPr>
-      <w:r>
-        <w:rPr>
-          <w:rFonts w:ascii="Georgia" w:hAnsi="Georgia"/>
-          <w:i/>
-          <w:sz w:val="22"/>
-        </w:rPr>
-        <w:t>Welche familiären Erwartungen möchtest du weiterhin erfüllen — und welche nicht?</w:t>
+        <w:t>Welche familiären Erwartungen möchtest du weiterhin erfüllen, und welche nicht?</w:t>
       </w:r>
     </w:p>
     <w:p>
@@ -2759,7 +2501,7 @@
           <w:rFonts w:ascii="Georgia" w:hAnsi="Georgia"/>
           <w:sz w:val="22"/>
         </w:rPr>
-        <w:t>Ihre beste Freundin hatte sie gebeten, beim Umzug zu helfen. Ein ganzes Wochenende. Karin hatte dieses Wochenende schon lange für sich reserviert. Sie war erschöpft, sie brauchte Ruhe, sie hatte nichts Besonderes geplant — nur Stille. Nur zwei Tage ohne Anforderungen, ohne Plan, ohne müssen.</w:t>
+        <w:t>Ihre beste Freundin hatte sie gebeten, beim Umzug zu helfen. Ein ganzes Wochenende. Karin hatte dieses Wochenende schon lange für sich reserviert. Sie war erschöpft, sie brauchte Ruhe, sie hatte nichts Besonderes geplant, nur Stille. Nur zwei Tage ohne Anforderungen, ohne Plan, ohne müssen.</w:t>
       </w:r>
     </w:p>
     <w:p>
@@ -2819,19 +2561,19 @@
           <w:rFonts w:ascii="Georgia" w:hAnsi="Georgia"/>
           <w:sz w:val="22"/>
         </w:rPr>
-        <w:t>War es zu kurz? Hätte sie mehr erklären müssen? War die Formulierung vielleicht zu distanziert? Hätte sie nicht doch helfen können, zumindest am Samstag, nur ein paar Stunden? Die Freundin klang ein bisschen kürzer als sonst in der Nachricht — oder war das Einbildung? Ist die Freundschaft jetzt anders?</w:t>
-      </w:r>
-    </w:p>
-    <w:p>
-      <w:pPr>
-        <w:spacing w:after="160" w:line="320" w:lineRule="exact"/>
-      </w:pPr>
-      <w:r>
-        <w:rPr>
-          <w:rFonts w:ascii="Georgia" w:hAnsi="Georgia"/>
-          <w:sz w:val="22"/>
-        </w:rPr>
-        <w:t>Sie überlegte, ob sie nochmals schreiben sollte. Ob sie sich erklären sollte. Ob sie beim nächsten Mal besser helfen sollte, um das auszugleichen. Um sicherzustellen, dass die Freundschaft noch die gleiche ist.</w:t>
+        <w:t>War es zu kurz? Hätte sie mehr erklären müssen? War die Formulierung vielleicht zu distanziert? Hätte sie nicht doch helfen können, zumindest am Samstag, nur ein paar Stunden? Die Freundin klang ein bisschen kürzer als sonst in der Nachricht. Oder war das Einbildung? Ist die Freundschaft jetzt anders?</w:t>
+      </w:r>
+    </w:p>
+    <w:p>
+      <w:pPr>
+        <w:spacing w:after="160" w:line="320" w:lineRule="exact"/>
+      </w:pPr>
+      <w:r>
+        <w:rPr>
+          <w:rFonts w:ascii="Georgia" w:hAnsi="Georgia"/>
+          <w:sz w:val="22"/>
+        </w:rPr>
+        <w:t>Sie überlegte, ob sie nochmals schreiben sollte. Ob sie sich erklären sollte. Ob sie beim nächsten Mal besser helfen sollte, um das auszugleichen.</w:t>
       </w:r>
     </w:p>
     <w:p>
@@ -2855,19 +2597,7 @@
           <w:rFonts w:ascii="Georgia" w:hAnsi="Georgia"/>
           <w:sz w:val="22"/>
         </w:rPr>
-        <w:t>Das passiert fast immer. Und ich sage bewusst: fast immer, weil ich es so oft gesehen habe.</w:t>
-      </w:r>
-    </w:p>
-    <w:p>
-      <w:pPr>
-        <w:spacing w:after="160" w:line="320" w:lineRule="exact"/>
-      </w:pPr>
-      <w:r>
-        <w:rPr>
-          <w:rFonts w:ascii="Georgia" w:hAnsi="Georgia"/>
-          <w:sz w:val="22"/>
-        </w:rPr>
-        <w:t>Das Schuldgefühl meldet sich nicht vor dem Nein. Es meldet sich danach. Und viele Frauen interpretieren dieses nachträgliche Schuldgefühl als Beweis, dass das Nein falsch war. Als hätte das Gewissen eine Art Urteilsfunktion, die man ernst nehmen sollte: Wenn ich mich schuldig fühle, muss ich etwas falsch gemacht haben.</w:t>
+        <w:t>Das passiert fast immer. Das Schuldgefühl meldet sich nicht vor dem Nein. Es meldet sich danach. Und viele Frauen interpretieren dieses nachträgliche Schuldgefühl als Beweis, dass das Nein falsch war. Als hätte das Gewissen eine Art Urteilsfunktion: Wenn ich mich schuldig fühle, muss ich etwas falsch gemacht haben.</w:t>
       </w:r>
     </w:p>
     <w:p>
@@ -2903,7 +2633,7 @@
           <w:rFonts w:ascii="Georgia" w:hAnsi="Georgia"/>
           <w:sz w:val="22"/>
         </w:rPr>
-        <w:t>Das Nervensystem hat über Jahre — über Jahrzehnte — gespeichert: Wenn ich für andere da bin, bin ich sicher. Wenn ich gebe, bekomme ich Zugehörigkeit. Wenn ich Nein sage, riskiere ich Ablehnung, Kälte, den Verlust von Verbindung. Das ist die Programmierung aus der Kindheit, die wir in Kapitel 2 besprochen haben. Sie sitzt nicht im Verstand. Sie sitzt im Körper.</w:t>
+        <w:t>Das Nervensystem hat über Jahre, über Jahrzehnte, gespeichert: Wenn ich für andere da bin, bin ich sicher. Wenn ich gebe, bekomme ich Zugehörigkeit. Wenn ich Nein sage, riskiere ich Ablehnung, Kälte, den Verlust von Verbindung. Das ist die Programmierung aus der Kindheit, die wir in Kapitel 2 besprochen haben. Sie sitzt nicht im Verstand. Sie sitzt im Körper.</w:t>
       </w:r>
     </w:p>
     <w:p>
@@ -2927,7 +2657,7 @@
           <w:rFonts w:ascii="Georgia" w:hAnsi="Georgia"/>
           <w:sz w:val="22"/>
         </w:rPr>
-        <w:t>Das Schuldgefühl ist in diesem Moment kein moralisches Urteil. Es ist ein Alarm. Nicht mehr und nicht weniger. Und ein Alarm sagt dir nicht, ob die Sache richtig oder falsch ist — er sagt dir, dass etwas Ungewohntes passiert ist.</w:t>
+        <w:t>Das Schuldgefühl ist in diesem Moment kein moralisches Urteil. Es ist ein Alarm. Nicht mehr und nicht weniger. Und ein Alarm sagt dir nicht, ob die Sache richtig oder falsch ist. Er sagt dir, dass etwas Ungewohntes passiert ist.</w:t>
       </w:r>
     </w:p>
     <w:p>
@@ -2951,55 +2681,55 @@
           <w:rFonts w:ascii="Georgia" w:hAnsi="Georgia"/>
           <w:sz w:val="22"/>
         </w:rPr>
-        <w:t>Was hilft?</w:t>
-      </w:r>
-    </w:p>
-    <w:p>
-      <w:pPr>
-        <w:spacing w:after="160" w:line="320" w:lineRule="exact"/>
-      </w:pPr>
-      <w:r>
-        <w:rPr>
-          <w:rFonts w:ascii="Georgia" w:hAnsi="Georgia"/>
-          <w:sz w:val="22"/>
-        </w:rPr>
-        <w:t>Erstens: Wissen, dass es kommt. Das Schuldgefühl nach dem Nein ist vorhersagbar. Man kann sich darauf vorbereiten: Ich werde Nein sagen. Danach werde ich mich schuldig fühlen. Das ist keine Katastrophe — das ist der Weg. Das gehört dazu.</w:t>
-      </w:r>
-    </w:p>
-    <w:p>
-      <w:pPr>
-        <w:spacing w:after="160" w:line="320" w:lineRule="exact"/>
-      </w:pPr>
-      <w:r>
-        <w:rPr>
-          <w:rFonts w:ascii="Georgia" w:hAnsi="Georgia"/>
-          <w:sz w:val="22"/>
-        </w:rPr>
-        <w:t>Zweitens: Beim Nein bleiben, auch wenn das Schuldgefühl sich meldet. Das Nein zurücknehmen oder sich übermässig erklären oder kompensieren — das gibt kurzfristige Erleichterung. Aber es bestätigt die alte Programmierung: Das Schuldgefühl war berechtigt. Das Nein war falsch. Beim Nein bleiben, auch mit dem Schuldgefühl, ist das Einzige, was das Nervensystem langfristig überzeugt.</w:t>
-      </w:r>
-    </w:p>
-    <w:p>
-      <w:pPr>
-        <w:spacing w:after="160" w:line="320" w:lineRule="exact"/>
-      </w:pPr>
-      <w:r>
-        <w:rPr>
-          <w:rFonts w:ascii="Georgia" w:hAnsi="Georgia"/>
-          <w:sz w:val="22"/>
-        </w:rPr>
-        <w:t>Drittens: Warten und beobachten. Was passiert wirklich, wenn du Nein sagst? Ist die Freundschaft tatsächlich anders? Wurde die Freundin tatsächlich wütend? Hat die Mutter aufgehört, dich zu lieben? Sehr oft ist die Antwort: Nein. Die befürchtete Katastrophe ist ausgeblieben. Und jede Erfahrung, in der das Nein keine Katastrophe ausgelöst hat, schreibt sich ins Nervensystem ein — langsam, aber real.</w:t>
-      </w:r>
-    </w:p>
-    <w:p>
-      <w:pPr>
-        <w:spacing w:after="160" w:line="320" w:lineRule="exact"/>
-      </w:pPr>
-      <w:r>
-        <w:rPr>
-          <w:rFonts w:ascii="Georgia" w:hAnsi="Georgia"/>
-          <w:sz w:val="22"/>
-        </w:rPr>
-        <w:t>Karin hat beim Nein geblieben. Das Wochenende war gut. Die Freundschaft ist die gleiche. Und sie weiss: Das nächste Nein wird ein bisschen leichter sein. Nicht einfach — aber leichter.</w:t>
+        <w:t>Was hilft dir konkret?</w:t>
+      </w:r>
+    </w:p>
+    <w:p>
+      <w:pPr>
+        <w:spacing w:after="160" w:line="320" w:lineRule="exact"/>
+      </w:pPr>
+      <w:r>
+        <w:rPr>
+          <w:rFonts w:ascii="Georgia" w:hAnsi="Georgia"/>
+          <w:sz w:val="22"/>
+        </w:rPr>
+        <w:t>Wissen, dass es kommt. Das Schuldgefühl nach dem Nein ist vorhersagbar. Man kann sich darauf vorbereiten: Ich werde Nein sagen. Danach werde ich mich schuldig fühlen. Das ist keine Katastrophe, das ist der Weg. Das gehört dazu.</w:t>
+      </w:r>
+    </w:p>
+    <w:p>
+      <w:pPr>
+        <w:spacing w:after="160" w:line="320" w:lineRule="exact"/>
+      </w:pPr>
+      <w:r>
+        <w:rPr>
+          <w:rFonts w:ascii="Georgia" w:hAnsi="Georgia"/>
+          <w:sz w:val="22"/>
+        </w:rPr>
+        <w:t>Und beim Nein bleiben, auch wenn das Schuldgefühl sich meldet. Das Nein zurücknehmen oder sich übermässig erklären oder kompensieren, das gibt kurzfristige Erleichterung. Aber es bestätigt die alte Programmierung: Das Schuldgefühl war berechtigt. Das Nein war falsch. Beim Nein bleiben, auch mit dem Schuldgefühl, ist das Einzige, was das Nervensystem langfristig überzeugt.</w:t>
+      </w:r>
+    </w:p>
+    <w:p>
+      <w:pPr>
+        <w:spacing w:after="160" w:line="320" w:lineRule="exact"/>
+      </w:pPr>
+      <w:r>
+        <w:rPr>
+          <w:rFonts w:ascii="Georgia" w:hAnsi="Georgia"/>
+          <w:sz w:val="22"/>
+        </w:rPr>
+        <w:t>Und dann warten und beobachten. Was passiert wirklich, wenn du Nein sagst? Ist die Freundschaft tatsächlich anders? Wurde die Freundin tatsächlich wütend? Hat die Mutter aufgehört, dich zu lieben? Sehr oft ist die Antwort: Nein. Die befürchtete Katastrophe ist ausgeblieben. Und jede Erfahrung, in der das Nein keine Katastrophe ausgelöst hat, schreibt sich ins Nervensystem ein. Langsam, aber real.</w:t>
+      </w:r>
+    </w:p>
+    <w:p>
+      <w:pPr>
+        <w:spacing w:after="160" w:line="320" w:lineRule="exact"/>
+      </w:pPr>
+      <w:r>
+        <w:rPr>
+          <w:rFonts w:ascii="Georgia" w:hAnsi="Georgia"/>
+          <w:sz w:val="22"/>
+        </w:rPr>
+        <w:t>Karin hat beim Nein geblieben. Das Wochenende war gut. Die Freundschaft ist die gleiche. Und sie weiss: Das nächste Nein wird ein bisschen leichter sein. Nicht einfach, aber leichter.</w:t>
       </w:r>
     </w:p>
     <w:p>
@@ -3024,20 +2754,7 @@
           <w:i/>
           <w:sz w:val="22"/>
         </w:rPr>
-        <w:t>Fragen zum Nachdenken:</w:t>
-      </w:r>
-    </w:p>
-    <w:p>
-      <w:pPr>
-        <w:spacing w:after="160" w:line="320" w:lineRule="exact"/>
-      </w:pPr>
-      <w:r>
-        <w:rPr>
-          <w:rFonts w:ascii="Georgia" w:hAnsi="Georgia"/>
-          <w:i/>
-          <w:sz w:val="22"/>
-        </w:rPr>
-        <w:t>Wann hast du zuletzt Nein gesagt — und was ist danach passiert?</w:t>
+        <w:t>Wann hast du zuletzt Nein gesagt, und was ist danach passiert?</w:t>
       </w:r>
     </w:p>
     <w:p>
@@ -3121,7 +2838,7 @@
           <w:rFonts w:ascii="Georgia" w:hAnsi="Georgia"/>
           <w:sz w:val="22"/>
         </w:rPr>
-        <w:t>Sie war bei zwei Orthopäden, einem Physiotherapeuten, hat Massagen ausprobiert, neue Kopfkissen, eine andere Matratze, Wärmepflaster, Dehnübungen die sie eine Woche durchgehalten hat. Der Arzt hat Röntgenbilder gemacht. Nichts Besonderes. „Verspannungen", sagt er. „Stress." Er hat ihr empfohlen, sich zu entspannen.</w:t>
+        <w:t>Sie war bei zwei Orthopäden, einem Physiotherapeuten, hat Massagen ausprobiert, neue Kopfkissen, eine andere Matratze, Wärmepflaster, Dehnübungen, die sie eine Woche durchgehalten hat. Der Arzt hat Röntgenbilder gemacht. Nichts Besonderes. „Verspannungen", sagt er. „Stress." Er hat ihr empfohlen, sich zu entspannen.</w:t>
       </w:r>
     </w:p>
     <w:p>
@@ -3145,31 +2862,31 @@
           <w:rFonts w:ascii="Georgia" w:hAnsi="Georgia"/>
           <w:sz w:val="22"/>
         </w:rPr>
-        <w:t>Sie schläft schlecht. Nicht weil sie nicht müde wäre — sie ist immer müde, konstant, tief. Aber wenn sie liegt, kommt das Denken. Alles, was heute war. Alles, was morgen kommt. Alles, was sie hätte anders machen sollen. Das Gespräch, das nicht gut gelaufen ist. Die E-Mail, die sie noch nicht beantwortet hat. Der Moment, wo sie zu knapp reagiert hat, gegenüber dem Kind, gegenüber der Kollegin, gegenüber sich selbst.</w:t>
-      </w:r>
-    </w:p>
-    <w:p>
-      <w:pPr>
-        <w:spacing w:after="160" w:line="320" w:lineRule="exact"/>
-      </w:pPr>
-      <w:r>
-        <w:rPr>
-          <w:rFonts w:ascii="Georgia" w:hAnsi="Georgia"/>
-          <w:sz w:val="22"/>
-        </w:rPr>
-        <w:t>Sie kann nie ganz ankommen. Nicht in der Nacht, nicht am Wochenende, nicht im Urlaub. Letzten Sommer war sie eine Woche weg. Die ersten vier Tage war das Schuldgefühl dabei. Sie hätte nicht fahren sollen. Zu viel offen. Die Kinder. Der Haushalt. Die Kollegin, die jetzt alles allein macht. Erst am fünften Tag war sie wirklich da — und da war es schon fast vorbei.</w:t>
-      </w:r>
-    </w:p>
-    <w:p>
-      <w:pPr>
-        <w:spacing w:after="160" w:line="320" w:lineRule="exact"/>
-      </w:pPr>
-      <w:r>
-        <w:rPr>
-          <w:rFonts w:ascii="Georgia" w:hAnsi="Georgia"/>
-          <w:sz w:val="22"/>
-        </w:rPr>
-        <w:t>Was Hanna beschreibt, ist kein Zufall. Und es ist keine Schwäche. Es ist eine Konsequenz.</w:t>
+        <w:t>Sie schläft schlecht. Nicht weil sie nicht müde wäre, sie ist immer müde, konstant, tief. Aber wenn sie liegt, kommt das Denken. Alles, was heute war. Alles, was morgen kommt. Alles, was sie hätte anders machen sollen. Das Gespräch, das nicht gut gelaufen ist. Die E-Mail, die sie noch nicht beantwortet hat. Der Moment, wo sie zu knapp reagiert hat, gegenüber dem Kind, gegenüber der Kollegin, gegenüber sich selbst.</w:t>
+      </w:r>
+    </w:p>
+    <w:p>
+      <w:pPr>
+        <w:spacing w:after="160" w:line="320" w:lineRule="exact"/>
+      </w:pPr>
+      <w:r>
+        <w:rPr>
+          <w:rFonts w:ascii="Georgia" w:hAnsi="Georgia"/>
+          <w:sz w:val="22"/>
+        </w:rPr>
+        <w:t>Sie kann nie ganz ankommen. Nicht in der Nacht, nicht am Wochenende, nicht im Urlaub. Letzten Sommer war sie eine Woche weg. Die ersten vier Tage war das Schuldgefühl dabei. Sie hätte nicht fahren sollen. Zu viel offen. Die Kinder. Der Haushalt. Die Kollegin, die jetzt alles allein macht. Erst am fünften Tag war sie wirklich da, und da war es schon fast vorbei.</w:t>
+      </w:r>
+    </w:p>
+    <w:p>
+      <w:pPr>
+        <w:spacing w:after="160" w:line="320" w:lineRule="exact"/>
+      </w:pPr>
+      <w:r>
+        <w:rPr>
+          <w:rFonts w:ascii="Georgia" w:hAnsi="Georgia"/>
+          <w:sz w:val="22"/>
+        </w:rPr>
+        <w:t>Was Hanna beschreibt, ist kein persönlicher Charakter. Es ist eine Konsequenz.</w:t>
       </w:r>
     </w:p>
     <w:p>
@@ -3193,7 +2910,7 @@
           <w:rFonts w:ascii="Georgia" w:hAnsi="Georgia"/>
           <w:sz w:val="22"/>
         </w:rPr>
-        <w:t>Chronisches Schuldgefühl ist kein rein emotionales Phänomen. Es ist ein körperlicher Zustand, der sich physiologisch messen lässt. Das Stresssystem wird aktiviert: Cortisol und Adrenalin werden ausgeschüttet. Der Sympathikus — das System, das für die Aktivierung bei Bedrohung zuständig ist — bleibt aktiv. Der Parasympathikus — das System der Ruhe, der Erholung, der Verdauung, des tiefen Schlafs — kommt nicht ausreichend zum Zug.</w:t>
+        <w:t>Chronisches Schuldgefühl ist kein rein emotionales Phänomen. Es ist ein körperlicher Zustand. Das Stresssystem wird aktiviert: Cortisol und Adrenalin werden ausgeschüttet. Das System, das für die Aktivierung bei Bedrohung zuständig ist, bleibt aktiv. Das System der Ruhe, der Erholung, des tiefen Schlafs kommt nicht ausreichend zum Zug.</w:t>
       </w:r>
     </w:p>
     <w:p>
@@ -3217,19 +2934,19 @@
           <w:rFonts w:ascii="Georgia" w:hAnsi="Georgia"/>
           <w:sz w:val="22"/>
         </w:rPr>
-        <w:t>Das hat Konsequenzen, die sich manchmal erst nach Jahren zeigen. Schlafprobleme, weil das Nervensystem nachts nicht in den Ruhemodus wechseln kann — es wacht weiter, denkt weiter, bewertet weiter. Chronische Verspannungen, weil die Muskulatur dauerhaft angespannt ist und nie in die Entspannung findet. Eine Erschöpfung, die durch Schlaf allein nicht behoben wird, weil sie nicht aus körperlicher Arbeit stammt, sondern aus der permanenten Stressaktivierung. Kopfschmerzen. Verdauungsprobleme, weil das Verdauungssystem bei Stressaktivierung zurückgefahren wird. Ein Immunsystem, das anfälliger wird, weil die dauerhaft erhöhten Cortisol-Spiegel immunsuppressiv wirken.</w:t>
-      </w:r>
-    </w:p>
-    <w:p>
-      <w:pPr>
-        <w:spacing w:after="160" w:line="320" w:lineRule="exact"/>
-      </w:pPr>
-      <w:r>
-        <w:rPr>
-          <w:rFonts w:ascii="Georgia" w:hAnsi="Georgia"/>
-          <w:sz w:val="22"/>
-        </w:rPr>
-        <w:t>Der Psychiater und Traumaforscher Bessel van der Kolk beschrieb in seinem vielgelesenen Buch „The Body Keeps the Score", wie emotionale Erfahrungen sich im Körper einschreiben — wie das Nervensystem Muster speichert, die weit über das bewusste Gedächtnis hinausgehen. Der Körper erinnert sich, auch wenn der Verstand es längst „abgehakt" hat. Das gilt für Traumata im klinischen Sinne. Und es gilt, in einer abgeschwächten, aber real spürbaren Form, auch für chronische Belastungsmuster wie das Dauerschuldgefühl.</w:t>
+        <w:t>Das hat Konsequenzen, die sich manchmal erst nach Jahren zeigen. Schlafprobleme, weil das Nervensystem nachts nicht in den Ruhemodus wechseln kann. Es wacht weiter, denkt weiter, bewertet weiter. Chronische Verspannungen, weil die Muskulatur dauerhaft angespannt ist. Eine Erschöpfung, die durch Schlaf allein nicht behoben wird, weil sie nicht aus körperlicher Arbeit stammt, sondern aus der permanenten Stressaktivierung. Kopfschmerzen. Verdauungsprobleme. Ein Immunsystem, das anfälliger wird.</w:t>
+      </w:r>
+    </w:p>
+    <w:p>
+      <w:pPr>
+        <w:spacing w:after="160" w:line="320" w:lineRule="exact"/>
+      </w:pPr>
+      <w:r>
+        <w:rPr>
+          <w:rFonts w:ascii="Georgia" w:hAnsi="Georgia"/>
+          <w:sz w:val="22"/>
+        </w:rPr>
+        <w:t>Der Psychiater und Traumaforscher Bessel van der Kolk beschrieb in seinem vielgelesenen Buch „The Body Keeps the Score", wie emotionale Erfahrungen sich im Körper einschreiben, wie das Nervensystem Muster speichert, die weit über das bewusste Gedächtnis hinausgehen. Der Körper erinnert sich, auch wenn der Verstand es längst „abgehakt" hat. Das gilt für Traumata im klinischen Sinne. Und es gilt, in einer abgeschwächten, aber real spürbaren Form, auch für chronische Belastungsmuster wie das Dauerschuldgefühl.</w:t>
       </w:r>
     </w:p>
     <w:p>
@@ -3253,18 +2970,6 @@
           <w:rFonts w:ascii="Georgia" w:hAnsi="Georgia"/>
           <w:sz w:val="22"/>
         </w:rPr>
-        <w:t>Was bedeutet das praktisch?</w:t>
-      </w:r>
-    </w:p>
-    <w:p>
-      <w:pPr>
-        <w:spacing w:after="160" w:line="320" w:lineRule="exact"/>
-      </w:pPr>
-      <w:r>
-        <w:rPr>
-          <w:rFonts w:ascii="Georgia" w:hAnsi="Georgia"/>
-          <w:sz w:val="22"/>
-        </w:rPr>
         <w:t>Körpersignale dürfen als Informationsquelle ernst genommen werden. Der Nacken, der immer zieht. Der Bauch, der sich zusammenzieht, wenn eine bestimmte Nummer auf dem Telefon erscheint. Das Herz, das schneller schlägt, wenn eine bestimmte Person den Raum betritt. Die Erschöpfung, die kommt, noch bevor der Tag richtig begonnen hat. Die Enge in der Brust, wenn man Nein sagen sollte.</w:t>
       </w:r>
     </w:p>
@@ -3277,19 +2982,19 @@
           <w:rFonts w:ascii="Georgia" w:hAnsi="Georgia"/>
           <w:sz w:val="22"/>
         </w:rPr>
-        <w:t>Diese Signale sind keine Pathologien, die behandelt werden müssen. Sie sind Informationen — über den inneren Zustand, über Grenzen, über Dinge, die vielleicht nicht stimmen. Sie verdienen aufgehört zu werden.</w:t>
-      </w:r>
-    </w:p>
-    <w:p>
-      <w:pPr>
-        <w:spacing w:after="160" w:line="320" w:lineRule="exact"/>
-      </w:pPr>
-      <w:r>
-        <w:rPr>
-          <w:rFonts w:ascii="Georgia" w:hAnsi="Georgia"/>
-          <w:sz w:val="22"/>
-        </w:rPr>
-        <w:t>Eine Frage, die ich Frauen manchmal stelle: Wenn dein Körper eine Botschaft hätte — was würde er sagen?</w:t>
+        <w:t>Diese Signale sind keine Pathologien, die behandelt werden müssen. Sie sind Informationen über den inneren Zustand, über Grenzen, über Dinge, die vielleicht nicht stimmen. Sie verdienen gehört zu werden.</w:t>
+      </w:r>
+    </w:p>
+    <w:p>
+      <w:pPr>
+        <w:spacing w:after="160" w:line="320" w:lineRule="exact"/>
+      </w:pPr>
+      <w:r>
+        <w:rPr>
+          <w:rFonts w:ascii="Georgia" w:hAnsi="Georgia"/>
+          <w:sz w:val="22"/>
+        </w:rPr>
+        <w:t>Eine Frage, die ich Frauen manchmal stelle: Wenn dein Körper eine Botschaft hätte, was würde er sagen?</w:t>
       </w:r>
     </w:p>
     <w:p>
@@ -3350,7 +3055,7 @@
           <w:i/>
           <w:sz w:val="22"/>
         </w:rPr>
-        <w:t>Fragen zum Nachdenken:</w:t>
+        <w:t>Wo in deinem Körper spürst du Anspannung, und seit wann?</w:t>
       </w:r>
     </w:p>
     <w:p>
@@ -3363,7 +3068,7 @@
           <w:i/>
           <w:sz w:val="22"/>
         </w:rPr>
-        <w:t>Wo in deinem Körper spürst du Anspannung — und seit wann?</w:t>
+        <w:t>Gibt es körperliche Symptome, die sich in bestimmten Situationen oder Beziehungen verstärken?</w:t>
       </w:r>
     </w:p>
     <w:p>
@@ -3376,7 +3081,7 @@
           <w:i/>
           <w:sz w:val="22"/>
         </w:rPr>
-        <w:t>Gibt es körperliche Symptome, die sich in bestimmten Situationen oder Beziehungen verstärken?</w:t>
+        <w:t>Was würde dein Körper sagen, wenn er sprechen könnte?</w:t>
       </w:r>
     </w:p>
     <w:p>
@@ -3389,20 +3094,7 @@
           <w:i/>
           <w:sz w:val="22"/>
         </w:rPr>
-        <w:t>Was würde dein Körper sagen, wenn er sprechen könnte?</w:t>
-      </w:r>
-    </w:p>
-    <w:p>
-      <w:pPr>
-        <w:spacing w:after="160" w:line="320" w:lineRule="exact"/>
-      </w:pPr>
-      <w:r>
-        <w:rPr>
-          <w:rFonts w:ascii="Georgia" w:hAnsi="Georgia"/>
-          <w:i/>
-          <w:sz w:val="22"/>
-        </w:rPr>
-        <w:t>Wann hast du zuletzt das Gefühl gehabt, wirklich anzukommen — im Körper, nicht nur im Kopf?</w:t>
+        <w:t>Wann hast du zuletzt das Gefühl gehabt, wirklich anzukommen, im Körper, nicht nur im Kopf?</w:t>
       </w:r>
     </w:p>
     <w:p>
@@ -3483,7 +3175,7 @@
           <w:rFonts w:ascii="Georgia" w:hAnsi="Georgia"/>
           <w:sz w:val="22"/>
         </w:rPr>
-        <w:t>Die Therapeutin schwieg kurz. Dann fragte sie — ruhig, ohne Druck: „Das war keine Frage nach seinem Terminkalender. Was fühlst du?"</w:t>
+        <w:t>Die Therapeutin schwieg kurz. Dann fragte sie ruhig, ohne Druck: „Das war keine Frage nach seinem Terminkalender. Was fühlst du?"</w:t>
       </w:r>
     </w:p>
     <w:p>
@@ -3507,19 +3199,19 @@
           <w:rFonts w:ascii="Georgia" w:hAnsi="Georgia"/>
           <w:sz w:val="22"/>
         </w:rPr>
-        <w:t>Julia hatte das noch nie so klar gedacht. In zwanzig Jahren des Familientreffens-Organisierens, des Alleine-Einkaufens, des Alleine-Aufbauens, des Alleine-Aufräumens — hatte sie das nie Wut genannt. Sie hatte es „so ist er halt" genannt. Und „ich mache das gerne". Und „man kann von niemandem verlangen". Und dann hatte sie die nächste Einladung geschrieben.</w:t>
-      </w:r>
-    </w:p>
-    <w:p>
-      <w:pPr>
-        <w:spacing w:after="160" w:line="320" w:lineRule="exact"/>
-      </w:pPr>
-      <w:r>
-        <w:rPr>
-          <w:rFonts w:ascii="Georgia" w:hAnsi="Georgia"/>
-          <w:sz w:val="22"/>
-        </w:rPr>
-        <w:t>Wut war in ihrer Familie kein akzeptiertes Gefühl. Wut war schwierig. Wut bedeutete, dass man unreif war, egozentrisch, undankbar. Die ruhige, verständnisvolle Tochter — das war das Ideal. Das war, was Lob bekam. Das war, was bedeutete: Ich bin okay. Ich bin genug. Ich bin sicher.</w:t>
+        <w:t>Julia hatte das noch nie so klar gedacht. In zwanzig Jahren des Familientreffens-Organisierens, des Alleine-Einkaufens, des Alleine-Aufbauens, des Alleine-Aufräumens hatte sie das nie Wut genannt. Sie hatte es „so ist er halt" genannt. Und „ich mache das gerne". Und „man kann von niemandem verlangen". Und dann hatte sie die nächste Einladung geschrieben.</w:t>
+      </w:r>
+    </w:p>
+    <w:p>
+      <w:pPr>
+        <w:spacing w:after="160" w:line="320" w:lineRule="exact"/>
+      </w:pPr>
+      <w:r>
+        <w:rPr>
+          <w:rFonts w:ascii="Georgia" w:hAnsi="Georgia"/>
+          <w:sz w:val="22"/>
+        </w:rPr>
+        <w:t>Wut war in ihrer Familie kein akzeptiertes Gefühl. Wut war schwierig. Wut bedeutete, dass man unreif war, egozentrisch, undankbar. Die ruhige, verständnisvolle Tochter, das war das Ideal. Das war, was Lob bekam. Das war, was bedeutete: Ich bin okay. Ich bin genug. Ich bin sicher.</w:t>
       </w:r>
     </w:p>
     <w:p>
@@ -3567,19 +3259,19 @@
           <w:rFonts w:ascii="Georgia" w:hAnsi="Georgia"/>
           <w:sz w:val="22"/>
         </w:rPr>
-        <w:t>Das ist eine wichtige, notwendige Funktion. Wut ist nicht das Problem. Unterdrückte Wut, Wut die sich keinen Weg findet, Wut die sich nach innen wendet — das ist ein Problem.</w:t>
-      </w:r>
-    </w:p>
-    <w:p>
-      <w:pPr>
-        <w:spacing w:after="160" w:line="320" w:lineRule="exact"/>
-      </w:pPr>
-      <w:r>
-        <w:rPr>
-          <w:rFonts w:ascii="Georgia" w:hAnsi="Georgia"/>
-          <w:sz w:val="22"/>
-        </w:rPr>
-        <w:t>Wenn Wut nicht ausgedrückt werden darf — weil sie in der Kindheit Ablehnung produziert hat, weil sie als Charakterfehler galt, weil sie gefährlich war — dann sucht sie sich einen anderen Weg. Das Schuldgefühl ist ein sehr häufiger Weg. Sicherer, weil er die Wut nach innen richtet statt nach aussen. Akzeptierter, weil er das eigene Versagen betont statt das Versagen der anderen. Weniger riskant für Beziehungen, weil man damit niemanden anklagt.</w:t>
+        <w:t>Das ist eine wichtige, notwendige Funktion. Wut ist nicht das Problem. Unterdrückte Wut, Wut, die sich keinen Weg findet, Wut, die sich nach innen wendet, das ist ein Problem.</w:t>
+      </w:r>
+    </w:p>
+    <w:p>
+      <w:pPr>
+        <w:spacing w:after="160" w:line="320" w:lineRule="exact"/>
+      </w:pPr>
+      <w:r>
+        <w:rPr>
+          <w:rFonts w:ascii="Georgia" w:hAnsi="Georgia"/>
+          <w:sz w:val="22"/>
+        </w:rPr>
+        <w:t>Wenn Wut nicht ausgedrückt werden darf, weil sie in der Kindheit Ablehnung produziert hat, weil sie als Charakterfehler galt, weil sie gefährlich war, dann sucht sie sich einen anderen Weg. Das Schuldgefühl ist ein sehr häufiger Weg. Sicherer, weil er die Wut nach innen richtet statt nach aussen. Akzeptierter, weil er das eigene Versagen betont statt das Versagen der anderen. Weniger riskant für Beziehungen, weil man damit niemanden anklagt.</w:t>
       </w:r>
     </w:p>
     <w:p>
@@ -3627,19 +3319,19 @@
           <w:rFonts w:ascii="Georgia" w:hAnsi="Georgia"/>
           <w:sz w:val="22"/>
         </w:rPr>
-        <w:t>Die Richtung der Emotion kehrt sich um. Statt nach aussen zu zeigen, zeigt sie nach innen. Das ist sicherer. Aber auf Dauer erschöpfend. Und es löst das eigentliche Problem nicht — es vergräbt es nur tiefer.</w:t>
-      </w:r>
-    </w:p>
-    <w:p>
-      <w:pPr>
-        <w:spacing w:after="160" w:line="320" w:lineRule="exact"/>
-      </w:pPr>
-      <w:r>
-        <w:rPr>
-          <w:rFonts w:ascii="Georgia" w:hAnsi="Georgia"/>
-          <w:sz w:val="22"/>
-        </w:rPr>
-        <w:t>Wut darf sein. Sie ist kein Zeichen von schlechtem Charakter. Sie ist kein Zeichen von Undankbarkeit oder Unreife. Sie ist Information — darüber, was dir wichtig ist, wo eine Grenze verletzt wurde, was du brauchst und nicht bekommst.</w:t>
+        <w:t>Die Richtung der Emotion kehrt sich um. Statt nach aussen zu zeigen, zeigt sie nach innen. Das ist sicherer. Aber auf Dauer erschöpfend. Und es löst das eigentliche Problem nicht. Es vergräbt es nur tiefer.</w:t>
+      </w:r>
+    </w:p>
+    <w:p>
+      <w:pPr>
+        <w:spacing w:after="160" w:line="320" w:lineRule="exact"/>
+      </w:pPr>
+      <w:r>
+        <w:rPr>
+          <w:rFonts w:ascii="Georgia" w:hAnsi="Georgia"/>
+          <w:sz w:val="22"/>
+        </w:rPr>
+        <w:t>Wut darf sein. Sie ist kein Zeichen von schlechtem Charakter. Sie ist kein Zeichen von Undankbarkeit oder Unreife. Sie ist Information darüber, was dir wichtig ist, wo eine Grenze verletzt wurde, was du brauchst und nicht bekommst.</w:t>
       </w:r>
     </w:p>
     <w:p>
@@ -3663,19 +3355,19 @@
           <w:rFonts w:ascii="Georgia" w:hAnsi="Georgia"/>
           <w:sz w:val="22"/>
         </w:rPr>
-        <w:t>Julia hat nicht angefangen, ihren Bruder anzuschreien. Das war nie der Punkt. Aber sie hat angefangen, die Wut wahrzunehmen — zu fühlen, bevor sie sie übersetzt. Zu bemerken, dass sie wütend ist. Das zu benennen, zunächst nur für sich selbst.</w:t>
-      </w:r>
-    </w:p>
-    <w:p>
-      <w:pPr>
-        <w:spacing w:after="160" w:line="320" w:lineRule="exact"/>
-      </w:pPr>
-      <w:r>
-        <w:rPr>
-          <w:rFonts w:ascii="Georgia" w:hAnsi="Georgia"/>
-          <w:sz w:val="22"/>
-        </w:rPr>
-        <w:t>Das verändert etwas. Es macht die Information zugänglich, die die Wut trägt. Und es macht das Schuldgefühl ein bisschen leiser — weil es nicht mehr so viel Arbeit erledigen muss.</w:t>
+        <w:t>Julia hat nicht angefangen, ihren Bruder anzuschreien. Das war nie der Punkt. Aber sie hat angefangen, die Wut wahrzunehmen. Zu fühlen, bevor sie sie übersetzt. Zu bemerken, dass sie wütend ist. Das zu benennen, zunächst nur für sich selbst.</w:t>
+      </w:r>
+    </w:p>
+    <w:p>
+      <w:pPr>
+        <w:spacing w:after="160" w:line="320" w:lineRule="exact"/>
+      </w:pPr>
+      <w:r>
+        <w:rPr>
+          <w:rFonts w:ascii="Georgia" w:hAnsi="Georgia"/>
+          <w:sz w:val="22"/>
+        </w:rPr>
+        <w:t>Das verändert etwas. Es macht die Information zugänglich, die die Wut trägt. Und es macht das Schuldgefühl ein bisschen leiser, weil es nicht mehr so viel Arbeit erledigen muss.</w:t>
       </w:r>
     </w:p>
     <w:p>
@@ -3688,7 +3380,7 @@
           <w:i/>
           <w:sz w:val="22"/>
         </w:rPr>
-        <w:t>Fragen zum Nachdenken:</w:t>
+        <w:t>War Wut in deiner Kindheit ein erlaubtes Gefühl, und was passierte, wenn du wütend warst?</w:t>
       </w:r>
     </w:p>
     <w:p>
@@ -3701,7 +3393,7 @@
           <w:i/>
           <w:sz w:val="22"/>
         </w:rPr>
-        <w:t>War Wut in deiner Kindheit ein erlaubtes Gefühl — und was passierte, wenn du wütend warst?</w:t>
+        <w:t>Gibt es Situationen, in denen du nachträglich merkst, dass du wütend warst, es aber nicht so benannt hast?</w:t>
       </w:r>
     </w:p>
     <w:p>
@@ -3714,7 +3406,7 @@
           <w:i/>
           <w:sz w:val="22"/>
         </w:rPr>
-        <w:t>Gibt es Situationen, in denen du nachträglich merkst, dass du wütend warst, es aber nicht so benannt hast?</w:t>
+        <w:t>In was verwandelst du deine Wut, wenn du sie nicht ausdrücken kannst?</w:t>
       </w:r>
     </w:p>
     <w:p>
@@ -3727,20 +3419,7 @@
           <w:i/>
           <w:sz w:val="22"/>
         </w:rPr>
-        <w:t>In was verwandelst du deine Wut, wenn du sie nicht ausdrücken kannst?</w:t>
-      </w:r>
-    </w:p>
-    <w:p>
-      <w:pPr>
-        <w:spacing w:after="160" w:line="320" w:lineRule="exact"/>
-      </w:pPr>
-      <w:r>
-        <w:rPr>
-          <w:rFonts w:ascii="Georgia" w:hAnsi="Georgia"/>
-          <w:i/>
-          <w:sz w:val="22"/>
-        </w:rPr>
-        <w:t>Auf wen oder was bist du gerade wütend — und hast du dir das schon einmal wirklich erlaubt zu fühlen?</w:t>
+        <w:t>Auf wen oder was bist du gerade wütend, und hast du dir das schon einmal wirklich erlaubt zu fühlen?</w:t>
       </w:r>
     </w:p>
     <w:p>
@@ -3785,55 +3464,43 @@
           <w:rFonts w:ascii="Georgia" w:hAnsi="Georgia"/>
           <w:sz w:val="22"/>
         </w:rPr>
-        <w:t>Nicht weil sie das als besonders wichtig einschätzt. Sondern weil sie sich schuldig fühlt, wenn es nicht so ist. Wenn Besuch kommt und ein Kleidungsstück auf dem Stuhl liegt, bemerkt sie es sofort. Es zieht ihre Aufmerksamkeit an wie ein Magnet. Es kostet sie Energie — die innere Energie, mit etwas umzugehen, das nicht stimmt, das korrigiert werden müsste, das ein Urteil über sie sein könnte.</w:t>
-      </w:r>
-    </w:p>
-    <w:p>
-      <w:pPr>
-        <w:spacing w:after="160" w:line="320" w:lineRule="exact"/>
-      </w:pPr>
-      <w:r>
-        <w:rPr>
-          <w:rFonts w:ascii="Georgia" w:hAnsi="Georgia"/>
-          <w:sz w:val="22"/>
-        </w:rPr>
-        <w:t>Ihr E-Mail-Postfach ist täglich auf null. Ihre Berichte bei der Arbeit haben keine Tippfehler — sie hat jeden dreimal gelesen, manchmal viermal, manchmal laut. Sie ist immer pünktlich, meistens zu früh, nicht weil Pünktlichkeit ihr so wichtig ist, sondern weil die Vorstellung, zu spät zu kommen, ein Unbehagen auslöst, das sie nicht aushält. Sie sagt nie spontan zu, und wenn sie zusagt, hält sie immer. Immer. Ohne Ausnahme. Auch wenn es sie fast umbringt.</w:t>
-      </w:r>
-    </w:p>
-    <w:p>
-      <w:pPr>
-        <w:spacing w:after="160" w:line="320" w:lineRule="exact"/>
-      </w:pPr>
-      <w:r>
-        <w:rPr>
-          <w:rFonts w:ascii="Georgia" w:hAnsi="Georgia"/>
-          <w:sz w:val="22"/>
-        </w:rPr>
-        <w:t>Sandra ist erschöpft. Dauerhaft. Und sie weiss nicht, wie sie anders sein soll — weil sie nicht versteht, dass das Perfektionismus nicht ihr Charakter ist, sondern ihr Schutz.</w:t>
-      </w:r>
-    </w:p>
-    <w:p>
-      <w:pPr>
-        <w:spacing w:after="160" w:line="320" w:lineRule="exact"/>
-      </w:pPr>
-      <w:r>
-        <w:rPr>
-          <w:rFonts w:ascii="Georgia" w:hAnsi="Georgia"/>
-          <w:sz w:val="22"/>
-        </w:rPr>
-        <w:t>Die Logik hinter dem Perfektionismus ist, wenn man ihn direkt betrachtet, erschreckend klar: Wenn ich alles richtig mache, gibt es nichts, wofür ich mich schuldig fühlen müsste.</w:t>
-      </w:r>
-    </w:p>
-    <w:p>
-      <w:pPr>
-        <w:spacing w:after="160" w:line="320" w:lineRule="exact"/>
-      </w:pPr>
-      <w:r>
-        <w:rPr>
-          <w:rFonts w:ascii="Georgia" w:hAnsi="Georgia"/>
-          <w:sz w:val="22"/>
-        </w:rPr>
-        <w:t>Es ist ein Versuch, das Schuldgefühl präventiv auszuschalten. Wenn ich keine Fehler mache, kann niemand etwas gegen mich haben. Wenn ich pünktlich bin, bin ich nicht schuldig. Wenn mein Haus ordentlich ist, bin ich nicht schuldig. Wenn ich die E-Mail nach dreimaligem Lesen abschicke, bin ich nicht schuldig.</w:t>
+        <w:t>Nicht weil sie das als besonders wichtig einschätzt. Sondern weil sie sich schuldig fühlt, wenn es nicht so ist. Wenn Besuch kommt und ein Kleidungsstück auf dem Stuhl liegt, bemerkt sie es sofort. Es zieht ihre Aufmerksamkeit an wie ein Magnet. Es kostet sie Energie, die innere Energie, mit etwas umzugehen, das nicht stimmt, das korrigiert werden müsste, das ein Urteil über sie sein könnte.</w:t>
+      </w:r>
+    </w:p>
+    <w:p>
+      <w:pPr>
+        <w:spacing w:after="160" w:line="320" w:lineRule="exact"/>
+      </w:pPr>
+      <w:r>
+        <w:rPr>
+          <w:rFonts w:ascii="Georgia" w:hAnsi="Georgia"/>
+          <w:sz w:val="22"/>
+        </w:rPr>
+        <w:t>Ihr E-Mail-Postfach ist täglich auf null. Ihre Berichte bei der Arbeit haben keine Tippfehler, sie hat jeden dreimal gelesen, manchmal viermal, manchmal laut. Sie ist immer pünktlich, meistens zu früh, nicht weil Pünktlichkeit ihr so wichtig ist, sondern weil die Vorstellung, zu spät zu kommen, ein Unbehagen auslöst, das sie nicht aushält. Und wenn sie zusagt, hält sie immer. Immer. Ohne Ausnahme. Auch wenn es sie fast umbringt.</w:t>
+      </w:r>
+    </w:p>
+    <w:p>
+      <w:pPr>
+        <w:spacing w:after="160" w:line="320" w:lineRule="exact"/>
+      </w:pPr>
+      <w:r>
+        <w:rPr>
+          <w:rFonts w:ascii="Georgia" w:hAnsi="Georgia"/>
+          <w:sz w:val="22"/>
+        </w:rPr>
+        <w:t>Sandra ist erschöpft. Dauerhaft. Und sie versteht nicht, warum, weil sie nicht erkennt, dass das Perfektionismus nicht ihr Charakter ist, sondern ihr Schutz.</w:t>
+      </w:r>
+    </w:p>
+    <w:p>
+      <w:pPr>
+        <w:spacing w:after="160" w:line="320" w:lineRule="exact"/>
+      </w:pPr>
+      <w:r>
+        <w:rPr>
+          <w:rFonts w:ascii="Georgia" w:hAnsi="Georgia"/>
+          <w:sz w:val="22"/>
+        </w:rPr>
+        <w:t>Die Logik hinter dem Perfektionismus ist, wenn man ihn direkt betrachtet, erschreckend klar: Wenn ich alles richtig mache, gibt es nichts, wofür ich mich schuldig fühlen müsste. Es ist ein Versuch, das Schuldgefühl präventiv auszuschalten. Wenn ich keine Fehler mache, kann niemand etwas gegen mich haben. Wenn ich pünktlich bin, bin ich nicht schuldig. Wenn mein Haus ordentlich ist, bin ich nicht schuldig. Wenn ich die E-Mail nach dreimaligem Lesen abschicke, bin ich nicht schuldig.</w:t>
       </w:r>
     </w:p>
     <w:p>
@@ -3857,7 +3524,7 @@
           <w:rFonts w:ascii="Georgia" w:hAnsi="Georgia"/>
           <w:sz w:val="22"/>
         </w:rPr>
-        <w:t>Es gibt immer etwas, das man besser hätte machen können. Immer eine E-Mail, die vielleicht zu kurz war. Immer einen Moment, wo man hätte aufmerksamer sein können. Immer eine Situation, die ein bisschen anders hätte verlaufen können. Das Schuldgefühl findet immer einen Weg — weil es nicht von dem abhängt, was du tatsächlich getan hast, sondern von dem Muster, das tiefer liegt.</w:t>
+        <w:t>Es gibt immer etwas, das man besser hätte machen können. Immer eine E-Mail, die vielleicht zu kurz war. Immer einen Moment, wo man hätte aufmerksamer sein können. Das Schuldgefühl findet immer einen Weg, weil es nicht von dem abhängt, was du tatsächlich getan hast, sondern von dem Muster, das tiefer liegt.</w:t>
       </w:r>
     </w:p>
     <w:p>
@@ -3881,31 +3548,19 @@
           <w:rFonts w:ascii="Georgia" w:hAnsi="Georgia"/>
           <w:sz w:val="22"/>
         </w:rPr>
-        <w:t>Sandra verbringt Energie mit Dingen, die niemand ausser ihr bemerkt. Sie überprüft Berichte, die gut genug sind. Sie räumt auf, obwohl niemand kommt. Sie bereitet Gespräche vor, die spontan gut laufen würden. Sie liest E-Mails dreimal, die beim zweiten Mal bereits fertig waren.</w:t>
-      </w:r>
-    </w:p>
-    <w:p>
-      <w:pPr>
-        <w:spacing w:after="160" w:line="320" w:lineRule="exact"/>
-      </w:pPr>
-      <w:r>
-        <w:rPr>
-          <w:rFonts w:ascii="Georgia" w:hAnsi="Georgia"/>
-          <w:sz w:val="22"/>
-        </w:rPr>
-        <w:t>Diese Energie fehlt ihr woanders. Bei Dingen, die ihr wirklich wichtig wären. Bei Momenten, die nicht erledigt werden müssen, sondern erlebt. Bei einer Stille, in der sie sich selbst hören könnte.</w:t>
-      </w:r>
-    </w:p>
-    <w:p>
-      <w:pPr>
-        <w:spacing w:after="160" w:line="320" w:lineRule="exact"/>
-      </w:pPr>
-      <w:r>
-        <w:rPr>
-          <w:rFonts w:ascii="Georgia" w:hAnsi="Georgia"/>
-          <w:sz w:val="22"/>
-        </w:rPr>
-        <w:t>Was steckt hinter dem Perfektionismus?</w:t>
+        <w:t>Sandra verbringt Energie mit Dingen, die niemand ausser ihr bemerkt. Sie überprüft Berichte, die gut genug sind. Sie räumt auf, obwohl niemand kommt. Sie bereitet Gespräche vor, die spontan gut laufen würden. Diese Energie fehlt ihr woanders. Bei Dingen, die ihr wirklich wichtig wären. Bei Momenten, die nicht erledigt werden müssen, sondern erlebt. Bei einer Stille, in der sie sich selbst hören könnte.</w:t>
+      </w:r>
+    </w:p>
+    <w:p>
+      <w:pPr>
+        <w:spacing w:after="160" w:line="320" w:lineRule="exact"/>
+      </w:pPr>
+      <w:r>
+        <w:rPr>
+          <w:rFonts w:ascii="Georgia" w:hAnsi="Georgia"/>
+          <w:sz w:val="22"/>
+        </w:rPr>
+        <w:t>Was steckt dahinter?</w:t>
       </w:r>
     </w:p>
     <w:p>
@@ -3929,43 +3584,31 @@
           <w:rFonts w:ascii="Georgia" w:hAnsi="Georgia"/>
           <w:sz w:val="22"/>
         </w:rPr>
-        <w:t>Das ist ein fundamentaler Unterschied. „Ich habe einen Fehler gemacht" ist eine Aussage über eine Handlung, die korrigiert werden kann. „Ich bin ein Fehler" ist eine Aussage über das Selbst. Es gibt nichts zu korrigieren — nur zu verbergen.</w:t>
-      </w:r>
-    </w:p>
-    <w:p>
-      <w:pPr>
-        <w:spacing w:after="160" w:line="320" w:lineRule="exact"/>
-      </w:pPr>
-      <w:r>
-        <w:rPr>
-          <w:rFonts w:ascii="Georgia" w:hAnsi="Georgia"/>
-          <w:sz w:val="22"/>
-        </w:rPr>
-        <w:t>Diese Überzeugung entsteht, wenn in der Kindheit Fehler mit der Person verknüpft wurden, nicht mit der Handlung. Wenn Korrekturen sich anfühlten wie Kritik am Wesen, nicht am Verhalten. Wenn Lob ausschliesslich an Ergebnisse geknüpft war, nie an den Versuch, nie an die Anstrengung, nie an das Bemühen. Wenn ein Kind das Gefühl bekam: Mein Wert hängt davon ab, was ich leiste.</w:t>
-      </w:r>
-    </w:p>
-    <w:p>
-      <w:pPr>
-        <w:spacing w:after="160" w:line="320" w:lineRule="exact"/>
-      </w:pPr>
-      <w:r>
-        <w:rPr>
-          <w:rFonts w:ascii="Georgia" w:hAnsi="Georgia"/>
-          <w:sz w:val="22"/>
-        </w:rPr>
-        <w:t>Das Kind schlussfolgert: Um geliebt zu werden, muss ich fehlerfrei sein.</w:t>
-      </w:r>
-    </w:p>
-    <w:p>
-      <w:pPr>
-        <w:spacing w:after="160" w:line="320" w:lineRule="exact"/>
-      </w:pPr>
-      <w:r>
-        <w:rPr>
-          <w:rFonts w:ascii="Georgia" w:hAnsi="Georgia"/>
-          <w:sz w:val="22"/>
-        </w:rPr>
-        <w:t>Der Erwachsene schlussfolgert: Um okay zu sein, darf ich keine Fehler machen.</w:t>
+        <w:t>Das ist ein fundamentaler Unterschied. „Ich habe einen Fehler gemacht" ist eine Aussage über eine Handlung, die korrigiert werden kann. „Ich bin ein Fehler" ist eine Aussage über das Selbst. Es gibt nichts zu korrigieren, nur zu verbergen.</w:t>
+      </w:r>
+    </w:p>
+    <w:p>
+      <w:pPr>
+        <w:spacing w:after="160" w:line="320" w:lineRule="exact"/>
+      </w:pPr>
+      <w:r>
+        <w:rPr>
+          <w:rFonts w:ascii="Georgia" w:hAnsi="Georgia"/>
+          <w:sz w:val="22"/>
+        </w:rPr>
+        <w:t>Diese Überzeugung entsteht, wenn in der Kindheit Fehler mit der Person verknüpft wurden, nicht mit der Handlung. Wenn Korrekturen sich anfühlten wie Kritik am Wesen, nicht am Verhalten. Wenn Lob ausschliesslich an Ergebnisse geknüpft war, nie an den Versuch, nie an die Anstrengung. Wenn ein Kind das Gefühl bekam: Mein Wert hängt davon ab, was ich leiste.</w:t>
+      </w:r>
+    </w:p>
+    <w:p>
+      <w:pPr>
+        <w:spacing w:after="160" w:line="320" w:lineRule="exact"/>
+      </w:pPr>
+      <w:r>
+        <w:rPr>
+          <w:rFonts w:ascii="Georgia" w:hAnsi="Georgia"/>
+          <w:sz w:val="22"/>
+        </w:rPr>
+        <w:t>Das Kind schlussfolgert: Um geliebt zu werden, muss ich fehlerfrei sein. Der Erwachsene schlussfolgert: Um okay zu sein, darf ich keine Fehler machen.</w:t>
       </w:r>
     </w:p>
     <w:p>
@@ -4026,7 +3669,7 @@
           <w:i/>
           <w:sz w:val="22"/>
         </w:rPr>
-        <w:t>Fragen zum Nachdenken:</w:t>
+        <w:t>In welchen Bereichen deines Lebens bist du perfektionistisch, und warum genau dort?</w:t>
       </w:r>
     </w:p>
     <w:p>
@@ -4039,7 +3682,7 @@
           <w:i/>
           <w:sz w:val="22"/>
         </w:rPr>
-        <w:t>In welchen Bereichen deines Lebens bist du perfektionistisch — und warum genau dort?</w:t>
+        <w:t>Was befürchtest du, würde passieren, wenn du einen Fehler machst?</w:t>
       </w:r>
     </w:p>
     <w:p>
@@ -4052,7 +3695,7 @@
           <w:i/>
           <w:sz w:val="22"/>
         </w:rPr>
-        <w:t>Was befürchtest du, würde passieren, wenn du einen Fehler machst?</w:t>
+        <w:t>Was ist der Unterschied zwischen „Ich habe einen Fehler gemacht" und „Ich bin ein Fehler"?</w:t>
       </w:r>
     </w:p>
     <w:p>
@@ -4065,20 +3708,7 @@
           <w:i/>
           <w:sz w:val="22"/>
         </w:rPr>
-        <w:t>Was ist der Unterschied zwischen „Ich habe einen Fehler gemacht" und „Ich bin ein Fehler"?</w:t>
-      </w:r>
-    </w:p>
-    <w:p>
-      <w:pPr>
-        <w:spacing w:after="160" w:line="320" w:lineRule="exact"/>
-      </w:pPr>
-      <w:r>
-        <w:rPr>
-          <w:rFonts w:ascii="Georgia" w:hAnsi="Georgia"/>
-          <w:i/>
-          <w:sz w:val="22"/>
-        </w:rPr>
-        <w:t>Wo könntest du gut genug sein, statt perfekt — und was würde das freimachen?</w:t>
+        <w:t>Wo könntest du gut genug sein, statt perfekt, und was würde das freimachen?</w:t>
       </w:r>
     </w:p>
     <w:p>
@@ -4099,7 +3729,7 @@
           <w:rFonts w:ascii="Georgia" w:hAnsi="Georgia"/>
           <w:sz w:val="36"/>
         </w:rPr>
-        <w:t>Kapitel 11: Verantwortung ja — Schuld nein</w:t>
+        <w:t>Kapitel 11: Verantwortung ja, Schuld nein</w:t>
       </w:r>
     </w:p>
     <w:p>
@@ -4123,19 +3753,19 @@
           <w:rFonts w:ascii="Georgia" w:hAnsi="Georgia"/>
           <w:sz w:val="22"/>
         </w:rPr>
-        <w:t>Für die Stimmung beim Abendessen. Für die Hausaufgaben der Kinder, auch wenn die Kinder zwölf und fünfzehn sind und das selbst könnten. Für den Zusammenhalt in der Familie, was bedeutet, dass sie bei Konflikten immer vermittelt — auch wenn sie selbst Teil des Konflikts ist und eigentlich das Recht hätte, Position zu beziehen. Für die gute Laune des Partners, für das Wohlbefinden der Mutter, für die Harmonie in der Freundinnengruppe, für das Klima im Büro.</w:t>
-      </w:r>
-    </w:p>
-    <w:p>
-      <w:pPr>
-        <w:spacing w:after="160" w:line="320" w:lineRule="exact"/>
-      </w:pPr>
-      <w:r>
-        <w:rPr>
-          <w:rFonts w:ascii="Georgia" w:hAnsi="Georgia"/>
-          <w:sz w:val="22"/>
-        </w:rPr>
-        <w:t>Sie weiss nicht genau, wann sie all das übernommen hat. Es hat sich einfach so ergeben. Und es hat sich so ergeben, weil sie es gut konnte — weil sie die Signale liest, die andere nicht lesen, weil sie Spannungen spürt, bevor sie ausgesprochen werden, weil sie weiss, wie man die Atmosphäre in einem Raum verändert.</w:t>
+        <w:t>Für die Stimmung beim Abendessen. Für die Hausaufgaben der Kinder, auch wenn die Kinder zwölf und fünfzehn sind und das selbst könnten. Für den Zusammenhalt in der Familie, was bedeutet, dass sie bei Konflikten immer vermittelt, auch wenn sie selbst Teil des Konflikts ist und eigentlich das Recht hätte, Position zu beziehen. Für die gute Laune des Partners, für das Wohlbefinden der Mutter, für die Harmonie in der Freundinnengruppe, für das Klima im Büro.</w:t>
+      </w:r>
+    </w:p>
+    <w:p>
+      <w:pPr>
+        <w:spacing w:after="160" w:line="320" w:lineRule="exact"/>
+      </w:pPr>
+      <w:r>
+        <w:rPr>
+          <w:rFonts w:ascii="Georgia" w:hAnsi="Georgia"/>
+          <w:sz w:val="22"/>
+        </w:rPr>
+        <w:t>Sie weiss nicht genau, wann sie all das übernommen hat. Es hat sich einfach so ergeben. Und es hat sich so ergeben, weil sie es gut konnte, weil sie die Signale liest, die andere nicht lesen, weil sie Spannungen spürt, bevor sie ausgesprochen werden, weil sie weiss, wie man die Atmosphäre in einem Raum verändert.</w:t>
       </w:r>
     </w:p>
     <w:p>
@@ -4159,19 +3789,19 @@
           <w:rFonts w:ascii="Georgia" w:hAnsi="Georgia"/>
           <w:sz w:val="22"/>
         </w:rPr>
-        <w:t>Wenn beim Abendessen jemand schlecht gelaunt ist, ist Anne sofort im Modus: Was kann ich tun? Was hätte ich anders machen sollen? Vielleicht hätte sie früher fertig kochen sollen, oder einen anderen Zeitpunkt für das heikle Thema wählen sollen, oder die Kinder früher ins Bett bringen sollen, damit es ruhiger ist, oder gar nicht angefangen haben, über dieses Thema zu sprechen, das doch immer eskaliert.</w:t>
-      </w:r>
-    </w:p>
-    <w:p>
-      <w:pPr>
-        <w:spacing w:after="160" w:line="320" w:lineRule="exact"/>
-      </w:pPr>
-      <w:r>
-        <w:rPr>
-          <w:rFonts w:ascii="Georgia" w:hAnsi="Georgia"/>
-          <w:sz w:val="22"/>
-        </w:rPr>
-        <w:t>Anne verwechselt Verantwortung und Schuld. Das ist ein sehr häufiger Fehler — und er macht einen gewaltigen Unterschied.</w:t>
+        <w:t>Wenn beim Abendessen jemand schlecht gelaunt ist, ist Anne sofort im Modus: Was kann ich tun? Was hätte ich anders machen sollen? Vielleicht hätte sie früher fertig kochen sollen, oder einen anderen Zeitpunkt für das heikle Thema wählen sollen, oder die Kinder früher ins Bett bringen sollen, oder gar nicht angefangen haben, über dieses Thema zu sprechen.</w:t>
+      </w:r>
+    </w:p>
+    <w:p>
+      <w:pPr>
+        <w:spacing w:after="160" w:line="320" w:lineRule="exact"/>
+      </w:pPr>
+      <w:r>
+        <w:rPr>
+          <w:rFonts w:ascii="Georgia" w:hAnsi="Georgia"/>
+          <w:sz w:val="22"/>
+        </w:rPr>
+        <w:t>Anne verwechselt Verantwortung und Schuld. Das ist ein sehr häufiger Fehler. Und er macht einen gewaltigen Unterschied.</w:t>
       </w:r>
     </w:p>
     <w:p>
@@ -4195,55 +3825,43 @@
           <w:rFonts w:ascii="Georgia" w:hAnsi="Georgia"/>
           <w:sz w:val="22"/>
         </w:rPr>
-        <w:t>Du bist verantwortlich für dein Handeln — nicht für das Handeln anderer. Du bist verantwortlich für deine Worte — nicht dafür, wie sie jemand anderes hört. Du bist verantwortlich dafür, wie du mit deinen Kindern umgehst — nicht dafür, was deine Kinder fühlen. Du bist verantwortlich für deinen Beitrag zu einem Gespräch — nicht für das Ergebnis des Gesprächs.</w:t>
-      </w:r>
-    </w:p>
-    <w:p>
-      <w:pPr>
-        <w:spacing w:after="160" w:line="320" w:lineRule="exact"/>
-      </w:pPr>
-      <w:r>
-        <w:rPr>
-          <w:rFonts w:ascii="Georgia" w:hAnsi="Georgia"/>
-          <w:sz w:val="22"/>
-        </w:rPr>
-        <w:t>Verantwortung hat Ränder. Klare Ränder. Das ist kein Defizit — das ist die Realität der menschlichen Autonomie. Kein Mensch hat unbegrenzten Einfluss auf das, was um ihn herum passiert. Kein Mensch kann die Gefühle anderer kontrollieren. Das ist nicht möglich — und der Versuch kostet alles.</w:t>
-      </w:r>
-    </w:p>
-    <w:p>
-      <w:pPr>
-        <w:spacing w:after="160" w:line="320" w:lineRule="exact"/>
-      </w:pPr>
-      <w:r>
-        <w:rPr>
-          <w:rFonts w:ascii="Georgia" w:hAnsi="Georgia"/>
-          <w:sz w:val="22"/>
-        </w:rPr>
-        <w:t>Schuld, wie das chronische Schuldgefühl sie erlebt, ist diffus und grenzenlos. Sie erstreckt sich auf Dinge, die du getan hast, Dinge, die du nicht getan hast, Dinge, die andere getan haben, Dinge, die niemand getan hat, und Dinge, die in einer anderen Version des gestrigen Abends vielleicht hätten anders laufen können.</w:t>
-      </w:r>
-    </w:p>
-    <w:p>
-      <w:pPr>
-        <w:spacing w:after="160" w:line="320" w:lineRule="exact"/>
-      </w:pPr>
-      <w:r>
-        <w:rPr>
-          <w:rFonts w:ascii="Georgia" w:hAnsi="Georgia"/>
-          <w:sz w:val="22"/>
-        </w:rPr>
-        <w:t>Anne fühlt sich schuldig für die schlechte Laune des Partners, die mit seinem Arbeitsstress zusammenhängt — etwas, das sie nicht erzeugt hat und nicht lösen kann. Für den Streit unter den Kindern — Geschwister streiten sich, das gehört dazu, das ist kein Versagen der Mutter. Für die Einsamkeit der Mutter — die mit der eigenen Geschichte der Mutter zusammenhängt, nicht mit Anne.</w:t>
-      </w:r>
-    </w:p>
-    <w:p>
-      <w:pPr>
-        <w:spacing w:after="160" w:line="320" w:lineRule="exact"/>
-      </w:pPr>
-      <w:r>
-        <w:rPr>
-          <w:rFonts w:ascii="Georgia" w:hAnsi="Georgia"/>
-          <w:sz w:val="22"/>
-        </w:rPr>
-        <w:t>Sie hat die Verantwortung für das ganze System übernommen. Und das ist kein System, das ein Mensch tragen kann. Das Ergebnis ist keine besser funktionierende Familie. Das Ergebnis ist eine erschöpfte Anne, die immer weniger Ressourcen hat — und am Ende auch weniger für die anderen.</w:t>
+        <w:t>Du bist verantwortlich für dein Handeln, nicht für das Handeln anderer. Du bist verantwortlich für deine Worte, nicht dafür, wie sie jemand anderes hört. Du bist verantwortlich dafür, wie du mit deinen Kindern umgehst, nicht dafür, was deine Kinder fühlen. Verantwortung hat Ränder. Klare Ränder. Kein Mensch hat unbegrenzten Einfluss auf das, was um ihn herum passiert. Kein Mensch kann die Gefühle anderer kontrollieren. Das ist nicht möglich. Und der Versuch kostet alles.</w:t>
+      </w:r>
+    </w:p>
+    <w:p>
+      <w:pPr>
+        <w:spacing w:after="160" w:line="320" w:lineRule="exact"/>
+      </w:pPr>
+      <w:r>
+        <w:rPr>
+          <w:rFonts w:ascii="Georgia" w:hAnsi="Georgia"/>
+          <w:sz w:val="22"/>
+        </w:rPr>
+        <w:t>Das chronische Schuldgefühl kennt keine Ränder. Es erstreckt sich auf Dinge, die du getan hast, Dinge, die du nicht getan hast, Dinge, die andere getan haben, Dinge, die niemand getan hat, und Dinge, die in einer anderen Version des gestrigen Abends vielleicht hätten anders laufen können.</w:t>
+      </w:r>
+    </w:p>
+    <w:p>
+      <w:pPr>
+        <w:spacing w:after="160" w:line="320" w:lineRule="exact"/>
+      </w:pPr>
+      <w:r>
+        <w:rPr>
+          <w:rFonts w:ascii="Georgia" w:hAnsi="Georgia"/>
+          <w:sz w:val="22"/>
+        </w:rPr>
+        <w:t>Anne fühlt sich schuldig für die schlechte Laune des Partners, die mit seinem Arbeitsstress zusammenhängt, etwas, das sie nicht erzeugt hat und nicht lösen kann. Für den Streit unter den Kindern, Geschwister streiten sich, das gehört dazu, das ist kein Versagen der Mutter. Für die Einsamkeit der Mutter, die mit der eigenen Geschichte der Mutter zusammenhängt, nicht mit Anne.</w:t>
+      </w:r>
+    </w:p>
+    <w:p>
+      <w:pPr>
+        <w:spacing w:after="160" w:line="320" w:lineRule="exact"/>
+      </w:pPr>
+      <w:r>
+        <w:rPr>
+          <w:rFonts w:ascii="Georgia" w:hAnsi="Georgia"/>
+          <w:sz w:val="22"/>
+        </w:rPr>
+        <w:t>Sie hat die Verantwortung für das ganze System übernommen. Und das ist kein System, das ein Mensch tragen kann. Das Ergebnis ist keine besser funktionierende Familie. Das Ergebnis ist eine erschöpfte Anne, die immer weniger Ressourcen hat.</w:t>
       </w:r>
     </w:p>
     <w:p>
@@ -4279,7 +3897,7 @@
           <w:rFonts w:ascii="Georgia" w:hAnsi="Georgia"/>
           <w:sz w:val="22"/>
         </w:rPr>
-        <w:t>Wenn Anne das konsequent fragt, beginnt sich das Gewicht zu sortieren. Nicht alles auf einmal, nicht für immer — aber Stück für Stück. Dieses hier ist meins. Dieses dort ist nicht meins. Und das, das ich bisher getragen habe, als wäre es meins, gehört eigentlich jemandem anders.</w:t>
+        <w:t>Wenn Anne das konsequent fragt, beginnt sich das Gewicht zu sortieren. Nicht alles auf einmal, nicht für immer, aber Stück für Stück. Dieses hier ist meins. Dieses dort ist nicht meins. Und das, das ich bisher getragen habe, als wäre es meins, gehört eigentlich jemandem anders.</w:t>
       </w:r>
     </w:p>
     <w:p>
@@ -4303,20 +3921,7 @@
           <w:rFonts w:ascii="Georgia" w:hAnsi="Georgia"/>
           <w:sz w:val="22"/>
         </w:rPr>
-        <w:t>Das ist keine Gleichgültigkeit. Es ist Ehrlichkeit. Und diese Ehrlichkeit nützt am Ende auch den anderen — weil eine Frau, die weiss, was ihre Verantwortung ist und was nicht, das, was wirklich ihres ist, viel besser tragen kann.</w:t>
-      </w:r>
-    </w:p>
-    <w:p>
-      <w:pPr>
-        <w:spacing w:after="160" w:line="320" w:lineRule="exact"/>
-      </w:pPr>
-      <w:r>
-        <w:rPr>
-          <w:rFonts w:ascii="Georgia" w:hAnsi="Georgia"/>
-          <w:i/>
-          <w:sz w:val="22"/>
-        </w:rPr>
-        <w:t>Fragen zum Nachdenken:</w:t>
+        <w:t>Das ist keine Gleichgültigkeit. Es ist Ehrlichkeit. Und diese Ehrlichkeit nützt am Ende auch den anderen, weil eine Frau, die weiss, was ihre Verantwortung ist und was nicht, das, was wirklich ihres ist, viel besser tragen kann.</w:t>
       </w:r>
     </w:p>
     <w:p>
@@ -4437,7 +4042,7 @@
           <w:rFonts w:ascii="Georgia" w:hAnsi="Georgia"/>
           <w:sz w:val="22"/>
         </w:rPr>
-        <w:t>Danach hat sie geweint. Nicht aus Traurigkeit. Aus Erleichterung. Aus etwas, das sie nicht sofort benennen konnte — aus der Erfahrung, dass das geht. Dass sie das darf. Dass nichts zusammenbricht, wenn sie zwei Stunden lang einfach ist.</w:t>
+        <w:t>Danach hat sie geweint. Nicht aus Traurigkeit. Aus Erleichterung. Aus der Erfahrung, dass das geht. Dass sie das darf. Dass nichts zusammenbricht, wenn sie zwei Stunden lang einfach ist.</w:t>
       </w:r>
     </w:p>
     <w:p>
@@ -4473,43 +4078,31 @@
           <w:rFonts w:ascii="Georgia" w:hAnsi="Georgia"/>
           <w:sz w:val="22"/>
         </w:rPr>
-        <w:t>Das klingt wie eine seltsame Frage. Die meisten Frauen, die ich kenne, haben darüber noch nie nachgedacht. Sie wissen sehr genau, was sie anderen schulden. Die Liste ist lang, gepflegt, immer präsent, immer abrufbar. Was sie dem Partner schulden, den Kindern, den Eltern, dem Arbeitgeber, der Freundinnengruppe, dem Verein, der Schule, der Nachbarschaft.</w:t>
-      </w:r>
-    </w:p>
-    <w:p>
-      <w:pPr>
-        <w:spacing w:after="160" w:line="320" w:lineRule="exact"/>
-      </w:pPr>
-      <w:r>
-        <w:rPr>
-          <w:rFonts w:ascii="Georgia" w:hAnsi="Georgia"/>
-          <w:sz w:val="22"/>
-        </w:rPr>
-        <w:t>Was sie sich selbst schulden — da ist die Liste kurz. Oder leer. Oder gar nicht vorhanden, weil die Frage noch nie gestellt wurde.</w:t>
-      </w:r>
-    </w:p>
-    <w:p>
-      <w:pPr>
-        <w:spacing w:after="160" w:line="320" w:lineRule="exact"/>
-      </w:pPr>
-      <w:r>
-        <w:rPr>
-          <w:rFonts w:ascii="Georgia" w:hAnsi="Georgia"/>
-          <w:sz w:val="22"/>
-        </w:rPr>
-        <w:t>Das ist kein Zufall. Es ist das direkte Ergebnis des chronischen Schuldgefühls: Wer sich immer schuldig fühlt, glaubt, dass er zuerst alle anderen Schulden beglichen haben muss, bevor er sich selbst etwas zugestehen darf. Aber die anderen Schulden werden nie alle beglichen sein. Die Liste wächst schneller, als man sie abarbeiten kann. Also kommt das Eigene nie.</w:t>
-      </w:r>
-    </w:p>
-    <w:p>
-      <w:pPr>
-        <w:spacing w:after="160" w:line="320" w:lineRule="exact"/>
-      </w:pPr>
-      <w:r>
-        <w:rPr>
-          <w:rFonts w:ascii="Georgia" w:hAnsi="Georgia"/>
-          <w:sz w:val="22"/>
-        </w:rPr>
-        <w:t>Selbstfürsorge wird in unserer Kultur — und besonders im Kontext von Frauen, Müttern, Töchtern, Partnerinnen — oft als Luxus dargestellt. Als etwas, das man sich gönnt, wenn alles andere erledigt ist. Als Belohnung. Als etwas, das man sich verdienen muss durch genug geleistete Arbeit, genug Fürsorge, genug Funktionieren.</w:t>
+        <w:t>Das klingt wie eine seltsame Frage. Die meisten Frauen, die ich kenne, haben darüber noch nie nachgedacht. Sie wissen sehr genau, was sie anderen schulden. Die Liste ist lang, gepflegt, immer präsent, immer abrufbar. Was sie sich selbst schulden, da ist die Liste kurz. Oder leer. Oder gar nicht vorhanden, weil die Frage noch nie gestellt wurde.</w:t>
+      </w:r>
+    </w:p>
+    <w:p>
+      <w:pPr>
+        <w:spacing w:after="160" w:line="320" w:lineRule="exact"/>
+      </w:pPr>
+      <w:r>
+        <w:rPr>
+          <w:rFonts w:ascii="Georgia" w:hAnsi="Georgia"/>
+          <w:sz w:val="22"/>
+        </w:rPr>
+        <w:t>Das ist das direkte Ergebnis des chronischen Schuldgefühls: Wer sich immer schuldig fühlt, glaubt, dass er zuerst alle anderen Schulden beglichen haben muss, bevor er sich selbst etwas zugestehen darf. Aber die anderen Schulden werden nie alle beglichen sein. Die Liste wächst schneller, als man sie abarbeiten kann. Also kommt das Eigene nie.</w:t>
+      </w:r>
+    </w:p>
+    <w:p>
+      <w:pPr>
+        <w:spacing w:after="160" w:line="320" w:lineRule="exact"/>
+      </w:pPr>
+      <w:r>
+        <w:rPr>
+          <w:rFonts w:ascii="Georgia" w:hAnsi="Georgia"/>
+          <w:sz w:val="22"/>
+        </w:rPr>
+        <w:t>Selbstfürsorge wird in unserer Kultur, und besonders im Kontext von Frauen, Müttern, Töchtern, Partnerinnen, oft als Luxus dargestellt. Als etwas, das man sich gönnt, wenn alles andere erledigt ist. Als Belohnung. Als etwas, das man sich verdienen muss durch genug geleistete Arbeit, genug Fürsorge, genug Funktionieren.</w:t>
       </w:r>
     </w:p>
     <w:p>
@@ -4533,31 +4126,19 @@
           <w:rFonts w:ascii="Georgia" w:hAnsi="Georgia"/>
           <w:sz w:val="22"/>
         </w:rPr>
-        <w:t>Selbstfürsorge ist keine Belohnung. Sie ist keine Selbstgefälligkeit. Sie ist keine Schwäche und kein Egoismus. Sie ist das Fundament. Das Einzige, das dir ermöglicht, dauerhaft für andere da zu sein, ohne dabei dich selbst zu verlieren oder auszubrennen.</w:t>
-      </w:r>
-    </w:p>
-    <w:p>
-      <w:pPr>
-        <w:spacing w:after="160" w:line="320" w:lineRule="exact"/>
-      </w:pPr>
-      <w:r>
-        <w:rPr>
-          <w:rFonts w:ascii="Georgia" w:hAnsi="Georgia"/>
-          <w:sz w:val="22"/>
-        </w:rPr>
-        <w:t>Aus einem leeren Gefäss kann man nicht geben. Das weisst du. Und trotzdem lebst du, als wäre das Gefäss unendlich gross und würde sich von selbst wieder füllen — durch Schlaf, vielleicht, oder durch Urlaub, vielleicht, oder durch einen Kaffee am Morgen, bevor das Chaos beginnt.</w:t>
-      </w:r>
-    </w:p>
-    <w:p>
-      <w:pPr>
-        <w:spacing w:after="160" w:line="320" w:lineRule="exact"/>
-      </w:pPr>
-      <w:r>
-        <w:rPr>
-          <w:rFonts w:ascii="Georgia" w:hAnsi="Georgia"/>
-          <w:sz w:val="22"/>
-        </w:rPr>
-        <w:t>Aber das Gefäss füllt sich nur, wenn man es füllt. Mit Bewusstsein. Mit Entscheidung. Mit Handlungen, die ausschliesslich dir gehören.</w:t>
+        <w:t>Selbstfürsorge ist keine Belohnung. Sie ist keine Selbstgefälligkeit. Sie ist keine Schwäche und kein Egoismus. Sie ist das Fundament. Das Einzige, das dir ermöglicht, dauerhaft für andere da zu sein, ohne dabei dich selbst zu verlieren.</w:t>
+      </w:r>
+    </w:p>
+    <w:p>
+      <w:pPr>
+        <w:spacing w:after="160" w:line="320" w:lineRule="exact"/>
+      </w:pPr>
+      <w:r>
+        <w:rPr>
+          <w:rFonts w:ascii="Georgia" w:hAnsi="Georgia"/>
+          <w:sz w:val="22"/>
+        </w:rPr>
+        <w:t>Aus einem leeren Gefäss kann man nicht geben. Das weisst du. Und trotzdem lebst du manchmal, als wäre das Gefäss unendlich gross und würde sich von selbst wieder füllen. Aber das Gefäss füllt sich nur, wenn man es füllt. Mit Bewusstsein. Mit Entscheidung. Mit Handlungen, die ausschliesslich dir gehören.</w:t>
       </w:r>
     </w:p>
     <w:p>
@@ -4581,43 +4162,19 @@
           <w:rFonts w:ascii="Georgia" w:hAnsi="Georgia"/>
           <w:sz w:val="22"/>
         </w:rPr>
-        <w:t>Schlaf. Nicht als Luxus, sondern als biologische Notwendigkeit. Nicht sechs Stunden als Kompromiss, den man zwischen allem anderen quetscht — ausreichend Schlaf, der echte Erholung ermöglicht.</w:t>
-      </w:r>
-    </w:p>
-    <w:p>
-      <w:pPr>
-        <w:spacing w:after="160" w:line="320" w:lineRule="exact"/>
-      </w:pPr>
-      <w:r>
-        <w:rPr>
-          <w:rFonts w:ascii="Georgia" w:hAnsi="Georgia"/>
-          <w:sz w:val="22"/>
-        </w:rPr>
-        <w:t>Zeit, in der wir nichts leisten. Nicht Pausen zwischen Aufgaben, sondern echte Stille. Momente, in denen das Schuldgefühl vielleicht kommt und fragt: Was machst du hier? Und wir trotzdem bleiben.</w:t>
-      </w:r>
-    </w:p>
-    <w:p>
-      <w:pPr>
-        <w:spacing w:after="160" w:line="320" w:lineRule="exact"/>
-      </w:pPr>
-      <w:r>
-        <w:rPr>
-          <w:rFonts w:ascii="Georgia" w:hAnsi="Georgia"/>
-          <w:sz w:val="22"/>
-        </w:rPr>
-        <w:t>Essen, das gut ist, nicht nur schnell. Bewegung, die wir mögen, nicht nur erledigen. Gespräche, die uns nähren, nicht nur verbrauchen. Beziehungen, in denen wir empfangen dürfen, nicht nur geben.</w:t>
-      </w:r>
-    </w:p>
-    <w:p>
-      <w:pPr>
-        <w:spacing w:after="160" w:line="320" w:lineRule="exact"/>
-      </w:pPr>
-      <w:r>
-        <w:rPr>
-          <w:rFonts w:ascii="Georgia" w:hAnsi="Georgia"/>
-          <w:sz w:val="22"/>
-        </w:rPr>
-        <w:t>Und, vielleicht am wichtigsten: Das Recht, eigene Bedürfnisse zu haben. Ohne Rechtfertigung. Ohne Erklärung. Ohne dass jemand sie als berechtigt bestätigt. Bedürfnisse brauchen keine Erlaubnis. Sie sind einfach da. Das ist menschlich.</w:t>
+        <w:t>Schlaf. Nicht als Luxus, sondern als biologische Notwendigkeit. Zeit, in der wir nichts leisten. Nicht Pausen zwischen Aufgaben, sondern echte Stille. Momente, in denen das Schuldgefühl vielleicht kommt und fragt: Was machst du hier? Und wir trotzdem bleiben. Essen, das gut ist, nicht nur schnell. Bewegung, die wir mögen, nicht nur erledigen. Gespräche, die uns nähren, nicht nur verbrauchen. Beziehungen, in denen wir empfangen dürfen, nicht nur geben.</w:t>
+      </w:r>
+    </w:p>
+    <w:p>
+      <w:pPr>
+        <w:spacing w:after="160" w:line="320" w:lineRule="exact"/>
+      </w:pPr>
+      <w:r>
+        <w:rPr>
+          <w:rFonts w:ascii="Georgia" w:hAnsi="Georgia"/>
+          <w:sz w:val="22"/>
+        </w:rPr>
+        <w:t>Und vielleicht am wichtigsten: das Recht, eigene Bedürfnisse zu haben. Ohne Rechtfertigung. Ohne Erklärung. Ohne dass jemand sie als berechtigt bestätigt. Bedürfnisse brauchen keine Erlaubnis. Sie sind einfach da. Das ist menschlich.</w:t>
       </w:r>
     </w:p>
     <w:p>
@@ -4654,7 +4211,7 @@
           <w:i/>
           <w:sz w:val="22"/>
         </w:rPr>
-        <w:t>Fragen zum Nachdenken:</w:t>
+        <w:t>Was ist das Letzte, das du nur für dich getan hast, ohne Rechtfertigung, ohne Zweck, nur weil du es wolltest?</w:t>
       </w:r>
     </w:p>
     <w:p>
@@ -4667,7 +4224,7 @@
           <w:i/>
           <w:sz w:val="22"/>
         </w:rPr>
-        <w:t>Was ist das Letzte, das du nur für dich getan hast — ohne Rechtfertigung, ohne Zweck, nur weil du es wolltest?</w:t>
+        <w:t>Was brauchst du, das du dir regelmässig nicht gibst?</w:t>
       </w:r>
     </w:p>
     <w:p>
@@ -4680,7 +4237,7 @@
           <w:i/>
           <w:sz w:val="22"/>
         </w:rPr>
-        <w:t>Was brauchst du, das du dir regelmässig nicht gibst?</w:t>
+        <w:t>Was würde sich ändern, wenn du deine eigenen Bedürfnisse als genauso wichtig behandelst wie die anderer?</w:t>
       </w:r>
     </w:p>
     <w:p>
@@ -4693,20 +4250,7 @@
           <w:i/>
           <w:sz w:val="22"/>
         </w:rPr>
-        <w:t>Was würde sich ändern, wenn du deine eigenen Bedürfnisse als genauso wichtig behandelst wie die anderer?</w:t>
-      </w:r>
-    </w:p>
-    <w:p>
-      <w:pPr>
-        <w:spacing w:after="160" w:line="320" w:lineRule="exact"/>
-      </w:pPr>
-      <w:r>
-        <w:rPr>
-          <w:rFonts w:ascii="Georgia" w:hAnsi="Georgia"/>
-          <w:i/>
-          <w:sz w:val="22"/>
-        </w:rPr>
-        <w:t>Was hält dich konkret davon ab — und ist dieses Hindernis wirklich unüberwindbar?</w:t>
+        <w:t>Was hält dich konkret davon ab, und ist dieses Hindernis wirklich unüberwindbar?</w:t>
       </w:r>
     </w:p>
     <w:p>
@@ -4751,7 +4295,7 @@
           <w:rFonts w:ascii="Georgia" w:hAnsi="Georgia"/>
           <w:sz w:val="22"/>
         </w:rPr>
-        <w:t>Sie hat damals ihre Ehe beendet. Ihre Kinder waren klein, sieben und neun Jahre alt. Es war kompliziert, es war schmerzhaft, der Auszug des Vaters hat die Kinder getroffen. Das sieht Renate heute noch gelegentlich — in bestimmten Mustern ihrer erwachsenen Kinder, in Gesprächen, die eine bestimmte Richtung nehmen, in Momenten, wo sie sich fragt: Ist das meinetwegen so?</w:t>
+        <w:t>Sie hat damals ihre Ehe beendet. Ihre Kinder waren klein, sieben und neun Jahre alt. Es war kompliziert, es war schmerzhaft, der Auszug des Vaters hat die Kinder getroffen. Das sieht Renate heute noch gelegentlich, in bestimmten Mustern ihrer erwachsenen Kinder, in Gesprächen, die eine bestimmte Richtung nehmen.</w:t>
       </w:r>
     </w:p>
     <w:p>
@@ -4775,7 +4319,7 @@
           <w:rFonts w:ascii="Georgia" w:hAnsi="Georgia"/>
           <w:sz w:val="22"/>
         </w:rPr>
-        <w:t>Sie hat sich entschuldigt. Viele Male, auf viele Arten. Sie hat kompensiert — war immer da, hat vieles allein getragen, hat sich keine eigene Beziehung mehr zugetraut, weil die Schuldgefühle der Kinder gegenüber zu gross waren. Sie hat versucht, den Schaden wiedergutzumachen — mit Präsenz, mit Verfügbarkeit, mit der Bereitschaft, alle Bedürfnisse der Kinder über die eigenen zu stellen, für zwanzig Jahre.</w:t>
+        <w:t>Sie hat sich entschuldigt. Viele Male, auf viele Arten. Sie hat kompensiert, war immer da, hat vieles allein getragen, hat sich keine eigene Beziehung mehr zugetraut, weil die Schuldgefühle den Kindern gegenüber zu gross waren. Sie hat versucht, den Schaden wiedergutzumachen, mit Präsenz, mit Verfügbarkeit, mit der Bereitschaft, alle Bedürfnisse der Kinder über die eigenen zu stellen, für zwanzig Jahre.</w:t>
       </w:r>
     </w:p>
     <w:p>
@@ -4799,43 +4343,43 @@
           <w:rFonts w:ascii="Georgia" w:hAnsi="Georgia"/>
           <w:sz w:val="22"/>
         </w:rPr>
-        <w:t>Das schlechte Gewissen sitzt noch immer. Nicht jeden Tag. Aber es ist da. Wenn ihre Tochter in einer schwierigen Beziehung steckt, denkt Renate: Das kommt von damals. Wenn ihr Sohn Mühe hat mit Nähe, denkt Renate: Das habe ich verursacht. Wenn Weihnachten kompliziert ist, wenn Feiertage Arbeit bedeuten, wenn ihre Kinder Dinge sagen, die wehtun — Renate rechnet es sich an.</w:t>
-      </w:r>
-    </w:p>
-    <w:p>
-      <w:pPr>
-        <w:spacing w:after="160" w:line="320" w:lineRule="exact"/>
-      </w:pPr>
-      <w:r>
-        <w:rPr>
-          <w:rFonts w:ascii="Georgia" w:hAnsi="Georgia"/>
-          <w:sz w:val="22"/>
-        </w:rPr>
-        <w:t>Vielleicht stimmt ein Teil davon. Vielleicht stimmt es gar nicht. Renate weiss es nicht sicher — weil das, was in Kindheiten wirkt, zu komplex ist, um es auf einen einzigen Faktor zurückzuführen. Was sie weiss: Sie bezahlt seit zwanzig Jahren. Täglich. Manchmal stündlich.</w:t>
-      </w:r>
-    </w:p>
-    <w:p>
-      <w:pPr>
-        <w:spacing w:after="160" w:line="320" w:lineRule="exact"/>
-      </w:pPr>
-      <w:r>
-        <w:rPr>
-          <w:rFonts w:ascii="Georgia" w:hAnsi="Georgia"/>
-          <w:sz w:val="22"/>
-        </w:rPr>
-        <w:t>Sich selbst vergeben ist vielleicht das Schwerste, worüber wir in diesem Buch sprechen.</w:t>
-      </w:r>
-    </w:p>
-    <w:p>
-      <w:pPr>
-        <w:spacing w:after="160" w:line="320" w:lineRule="exact"/>
-      </w:pPr>
-      <w:r>
-        <w:rPr>
-          <w:rFonts w:ascii="Georgia" w:hAnsi="Georgia"/>
-          <w:sz w:val="22"/>
-        </w:rPr>
-        <w:t>Nicht weil die Dinge, die man bereut, immer klein sind. Manchmal sind sie es nicht. Manchmal hat man wirklich etwas getan, das jemanden verletzt hat. Manchmal hätte man es besser machen können, und man weiss das — mit dem Wissen, das man heute hat.</w:t>
+        <w:t>Das schlechte Gewissen sitzt noch immer. Nicht jeden Tag. Aber es ist da. Wenn ihre Tochter in einer schwierigen Beziehung steckt, denkt Renate: Das kommt von damals. Wenn ihr Sohn Mühe hat mit Nähe, denkt Renate: Das habe ich verursacht. Sie rechnet es sich an.</w:t>
+      </w:r>
+    </w:p>
+    <w:p>
+      <w:pPr>
+        <w:spacing w:after="160" w:line="320" w:lineRule="exact"/>
+      </w:pPr>
+      <w:r>
+        <w:rPr>
+          <w:rFonts w:ascii="Georgia" w:hAnsi="Georgia"/>
+          <w:sz w:val="22"/>
+        </w:rPr>
+        <w:t>Vielleicht stimmt ein Teil davon. Vielleicht stimmt es gar nicht. Was sie weiss: Sie bezahlt seit zwanzig Jahren. Täglich. Manchmal stündlich.</w:t>
+      </w:r>
+    </w:p>
+    <w:p>
+      <w:pPr>
+        <w:spacing w:after="160" w:line="320" w:lineRule="exact"/>
+      </w:pPr>
+      <w:r>
+        <w:rPr>
+          <w:rFonts w:ascii="Georgia" w:hAnsi="Georgia"/>
+          <w:sz w:val="22"/>
+        </w:rPr>
+        <w:t>Sich selbst vergeben ist vielleicht das Schwerste in diesem Buch.</w:t>
+      </w:r>
+    </w:p>
+    <w:p>
+      <w:pPr>
+        <w:spacing w:after="160" w:line="320" w:lineRule="exact"/>
+      </w:pPr>
+      <w:r>
+        <w:rPr>
+          <w:rFonts w:ascii="Georgia" w:hAnsi="Georgia"/>
+          <w:sz w:val="22"/>
+        </w:rPr>
+        <w:t>Nicht weil die Dinge, die man bereut, immer klein sind. Manchmal sind sie es nicht. Manchmal hat man wirklich etwas getan, das jemanden verletzt hat. Manchmal hätte man es besser machen können.</w:t>
       </w:r>
     </w:p>
     <w:p>
@@ -4859,19 +4403,7 @@
           <w:rFonts w:ascii="Georgia" w:hAnsi="Georgia"/>
           <w:sz w:val="22"/>
         </w:rPr>
-        <w:t>Renate hat vor zwanzig Jahren eine Entscheidung getroffen, mit dem Wissen von vor zwanzig Jahren. Mit der Reife von vor zwanzig Jahren. Mit den Ressourcen, den Möglichkeiten, dem Verständnis, das ihr damals zur Verfügung stand. Mit einer Situation, die sie damals so wahrgenommen hat, wie sie sie wahrgenommen hat.</w:t>
-      </w:r>
-    </w:p>
-    <w:p>
-      <w:pPr>
-        <w:spacing w:after="160" w:line="320" w:lineRule="exact"/>
-      </w:pPr>
-      <w:r>
-        <w:rPr>
-          <w:rFonts w:ascii="Georgia" w:hAnsi="Georgia"/>
-          <w:sz w:val="22"/>
-        </w:rPr>
-        <w:t>Die Entscheidung von damals mit den Augen von heute zu beurteilen, ist unfair. Es ist, als würde man ein Kind von sieben Jahren dafür bestrafen, dass es nicht so gedacht hat wie ein Erwachsener von achtundfünfzig.</w:t>
+        <w:t>Renate hat vor zwanzig Jahren eine Entscheidung getroffen, mit dem Wissen von vor zwanzig Jahren. Mit der Reife von vor zwanzig Jahren. Mit den Ressourcen, den Möglichkeiten, dem Verständnis, das ihr damals zur Verfügung stand. Die Entscheidung von damals mit den Augen von heute zu beurteilen, ist unfair. Es ist, als würde man ein Kind von sieben Jahren dafür bestrafen, dass es nicht so gedacht hat wie ein Erwachsener von achtundfünfzig.</w:t>
       </w:r>
     </w:p>
     <w:p>
@@ -4895,31 +4427,19 @@
           <w:rFonts w:ascii="Georgia" w:hAnsi="Georgia"/>
           <w:sz w:val="22"/>
         </w:rPr>
-        <w:t>Reue schaut auf das, was war, und fragt: Was kann ich daraus verstehen? Was würde ich heute anders machen? Gibt es noch etwas, das ich tun kann, jetzt, in der Gegenwart?</w:t>
-      </w:r>
-    </w:p>
-    <w:p>
-      <w:pPr>
-        <w:spacing w:after="160" w:line="320" w:lineRule="exact"/>
-      </w:pPr>
-      <w:r>
-        <w:rPr>
-          <w:rFonts w:ascii="Georgia" w:hAnsi="Georgia"/>
-          <w:sz w:val="22"/>
-        </w:rPr>
-        <w:t>Reue hat eine Richtung. Sie zeigt nach vorne. Sie ermöglicht Lernen und manchmal Wiedergutmachung. Sie ist schmerzhaft — aber sie ist produktiv.</w:t>
-      </w:r>
-    </w:p>
-    <w:p>
-      <w:pPr>
-        <w:spacing w:after="160" w:line="320" w:lineRule="exact"/>
-      </w:pPr>
-      <w:r>
-        <w:rPr>
-          <w:rFonts w:ascii="Georgia" w:hAnsi="Georgia"/>
-          <w:sz w:val="22"/>
-        </w:rPr>
-        <w:t>Lähmende Schuld schaut auf das, was war, und sagt: Du hast kein Recht auf Frieden. Du hast kein Recht auf Freude. Du hast kein Recht auf eine neue Beziehung, auf einen Urlaub, auf einen Abend, der nur dir gehört. Was damals war, macht dich für immer schlechter. Du musst das abbüssen, solange du lebst.</w:t>
+        <w:t>Reue schaut auf das, was war, und fragt: Was kann ich daraus verstehen? Was würde ich heute anders machen? Gibt es noch etwas, das ich tun kann, jetzt, in der Gegenwart? Reue hat eine Richtung. Sie zeigt nach vorne. Sie ermöglicht Lernen und manchmal Wiedergutmachung. Sie ist schmerzhaft, aber sie ist produktiv.</w:t>
+      </w:r>
+    </w:p>
+    <w:p>
+      <w:pPr>
+        <w:spacing w:after="160" w:line="320" w:lineRule="exact"/>
+      </w:pPr>
+      <w:r>
+        <w:rPr>
+          <w:rFonts w:ascii="Georgia" w:hAnsi="Georgia"/>
+          <w:sz w:val="22"/>
+        </w:rPr>
+        <w:t>Lähmende Schuld schaut auf das, was war, und sagt: Du hast kein Recht auf Frieden. Du hast kein Recht auf Freude. Was damals war, macht dich für immer schlechter. Du musst das abbüssen, solange du lebst.</w:t>
       </w:r>
     </w:p>
     <w:p>
@@ -4979,7 +4499,7 @@
           <w:rFonts w:ascii="Georgia" w:hAnsi="Georgia"/>
           <w:sz w:val="22"/>
         </w:rPr>
-        <w:t>Renate kann nicht durch ewige Reue etwas zurückzahlen. Es gibt nichts zurückzuzahlen. Die Vergangenheit ist, wie sie ist. Was sie kann: entscheiden, wie sie die nächsten zwanzig Jahre lebt. Ob das Schuldgefühl von damals auch diese Zeit bestimmt — oder nicht.</w:t>
+        <w:t>Renate kann nicht durch ewige Reue etwas zurückzahlen. Es gibt nichts zurückzuzahlen. Die Vergangenheit ist, wie sie ist. Was sie kann: entscheiden, wie sie die nächsten zwanzig Jahre lebt. Ob das Schuldgefühl von damals auch diese Zeit bestimmt.</w:t>
       </w:r>
     </w:p>
     <w:p>
@@ -5004,7 +4524,7 @@
           <w:i/>
           <w:sz w:val="22"/>
         </w:rPr>
-        <w:t>Fragen zum Nachdenken:</w:t>
+        <w:t>Gibt es etwas, für das du dich nie vergeben hast?</w:t>
       </w:r>
     </w:p>
     <w:p>
@@ -5017,7 +4537,7 @@
           <w:i/>
           <w:sz w:val="22"/>
         </w:rPr>
-        <w:t>Gibt es etwas, für das du dich nie vergeben hast?</w:t>
+        <w:t>Was wäre der Unterschied zwischen Reue, die lehrt, und Schuld, die lähmt?</w:t>
       </w:r>
     </w:p>
     <w:p>
@@ -5030,7 +4550,7 @@
           <w:i/>
           <w:sz w:val="22"/>
         </w:rPr>
-        <w:t>Was wäre der Unterschied zwischen Reue, die lehrt, und Schuld, die lähmt?</w:t>
+        <w:t>Was wäre möglich für dich, wenn du dieses Gewicht ablegst?</w:t>
       </w:r>
     </w:p>
     <w:p>
@@ -5043,20 +4563,7 @@
           <w:i/>
           <w:sz w:val="22"/>
         </w:rPr>
-        <w:t>Was wäre möglich für dich, wenn du dieses Gewicht ablegst?</w:t>
-      </w:r>
-    </w:p>
-    <w:p>
-      <w:pPr>
-        <w:spacing w:after="160" w:line="320" w:lineRule="exact"/>
-      </w:pPr>
-      <w:r>
-        <w:rPr>
-          <w:rFonts w:ascii="Georgia" w:hAnsi="Georgia"/>
-          <w:i/>
-          <w:sz w:val="22"/>
-        </w:rPr>
-        <w:t>Was würde „sich vergeben" für dich konkret bedeuten — nicht als Konzept, sondern als Handlung im Alltag?</w:t>
+        <w:t>Was würde „sich vergeben" für dich konkret bedeuten, nicht als Konzept, sondern als Handlung im Alltag?</w:t>
       </w:r>
     </w:p>
     <w:p>
@@ -5113,43 +4620,43 @@
           <w:rFonts w:ascii="Georgia" w:hAnsi="Georgia"/>
           <w:sz w:val="22"/>
         </w:rPr>
-        <w:t>Sophia war damals Anfang vierzig, energisch, klug, für viele der Anker in ihrem Umfeld. Sie hatte einen guten Beruf, eine Ehe, Kinder, Freundschaften. Von aussen sah ihr Leben vollständig aus, durchorganisiert, funktionierend. Sie kam nicht wegen des Schuldgefühls — das wusste sie damals noch nicht. Sie kam wegen Schlafproblemen und einer Erschöpfung, die sich auch nach Urlaub nicht löste. „Ich weiss nicht, was mit mir ist", sagte sie beim ersten Gespräch. „Es müsste mir gut gehen. Aber es geht mir nicht gut."</w:t>
-      </w:r>
-    </w:p>
-    <w:p>
-      <w:pPr>
-        <w:spacing w:after="160" w:line="320" w:lineRule="exact"/>
-      </w:pPr>
-      <w:r>
-        <w:rPr>
-          <w:rFonts w:ascii="Georgia" w:hAnsi="Georgia"/>
-          <w:sz w:val="22"/>
-        </w:rPr>
-        <w:t>In unseren ersten Gesprächen sprach sie viel über das, was nicht stimmte: Sie war immer müde. Sie konnte nie wirklich abschalten. Sie hatte das Gefühl, nie genug zu sein, nie genug zu tun, nie am richtigen Ort zu sein. Sie beschrieb es als Dauerton, der immer irgendwo läuft — kaum hörbar, aber nie weg.</w:t>
-      </w:r>
-    </w:p>
-    <w:p>
-      <w:pPr>
-        <w:spacing w:after="160" w:line="320" w:lineRule="exact"/>
-      </w:pPr>
-      <w:r>
-        <w:rPr>
-          <w:rFonts w:ascii="Georgia" w:hAnsi="Georgia"/>
-          <w:sz w:val="22"/>
-        </w:rPr>
-        <w:t>Wir haben lange zusammengearbeitet. Es war kein geradliniger Weg. Es gab Phasen, in denen das Schuldgefühl lauter wurde, bevor es leiser wurde — das passiert fast immer, wenn man anfängt, Muster zu verändern. Das System, das sich stabilisiert hat, widersetzt sich der Veränderung. Es kennt das Alte. Das Neue ist unsicher, auch wenn es besser ist.</w:t>
-      </w:r>
-    </w:p>
-    <w:p>
-      <w:pPr>
-        <w:spacing w:after="160" w:line="320" w:lineRule="exact"/>
-      </w:pPr>
-      <w:r>
-        <w:rPr>
-          <w:rFonts w:ascii="Georgia" w:hAnsi="Georgia"/>
-          <w:sz w:val="22"/>
-        </w:rPr>
-        <w:t>Sophia musste lernen, Nein zu sagen — und das Schuldgefühl danach auszuhalten, ohne zurückzurudern. Sie musste lernen, ihre eigenen Bedürfnisse als legitim anzuerkennen, obwohl das zunächst wie Egoismus anfühlte. Sie musste lernen, die Stimmungen anderer nicht automatisch als Schuldzuweisung zu lesen. Sie musste die Wut kennenlernen, die unter dem Schuldgefühl lag, und herausfinden, was diese Wut zu sagen hatte.</w:t>
+        <w:t>Sophia war damals Anfang vierzig, energisch, klug, für viele der Anker in ihrem Umfeld. Sie hatte einen guten Beruf, eine Ehe, Kinder, Freundschaften. Von aussen sah ihr Leben vollständig aus, durchorganisiert, funktionierend. Sie kam nicht wegen des Schuldgefühls, das wusste sie damals noch nicht. Sie kam wegen Schlafproblemen und einer Erschöpfung, die sich auch nach Urlaub nicht löste. „Ich weiss nicht, was mit mir ist", sagte sie beim ersten Gespräch. „Es müsste mir gut gehen. Aber es geht mir nicht gut."</w:t>
+      </w:r>
+    </w:p>
+    <w:p>
+      <w:pPr>
+        <w:spacing w:after="160" w:line="320" w:lineRule="exact"/>
+      </w:pPr>
+      <w:r>
+        <w:rPr>
+          <w:rFonts w:ascii="Georgia" w:hAnsi="Georgia"/>
+          <w:sz w:val="22"/>
+        </w:rPr>
+        <w:t>In unseren ersten Gesprächen sprach sie viel über das, was nicht stimmte. Sie war immer müde. Sie konnte nie wirklich abschalten. Sie hatte das Gefühl, nie genug zu sein, nie genug zu tun, nie am richtigen Ort zu sein. Sie beschrieb es als Dauerton, der immer irgendwo läuft, kaum hörbar, aber nie weg.</w:t>
+      </w:r>
+    </w:p>
+    <w:p>
+      <w:pPr>
+        <w:spacing w:after="160" w:line="320" w:lineRule="exact"/>
+      </w:pPr>
+      <w:r>
+        <w:rPr>
+          <w:rFonts w:ascii="Georgia" w:hAnsi="Georgia"/>
+          <w:sz w:val="22"/>
+        </w:rPr>
+        <w:t>Wir haben lange zusammengearbeitet. Es war kein geradliniger Weg. Es gab Phasen, in denen das Schuldgefühl lauter wurde, bevor es leiser wurde. Das passiert fast immer, wenn man anfängt, Muster zu verändern. Das System, das sich stabilisiert hat, widersetzt sich der Veränderung. Es kennt das Alte. Das Neue ist unsicher, auch wenn es besser ist.</w:t>
+      </w:r>
+    </w:p>
+    <w:p>
+      <w:pPr>
+        <w:spacing w:after="160" w:line="320" w:lineRule="exact"/>
+      </w:pPr>
+      <w:r>
+        <w:rPr>
+          <w:rFonts w:ascii="Georgia" w:hAnsi="Georgia"/>
+          <w:sz w:val="22"/>
+        </w:rPr>
+        <w:t>Sophia musste lernen, Nein zu sagen und das Schuldgefühl danach auszuhalten, ohne zurückzurudern. Sie musste lernen, ihre eigenen Bedürfnisse als legitim anzuerkennen, obwohl das zunächst wie Egoismus anfühlte. Sie musste lernen, die Stimmungen anderer nicht automatisch als Schuldzuweisung zu lesen. Sie musste die Wut kennenlernen, die unter dem Schuldgefühl lag, und herausfinden, was diese Wut zu sagen hatte.</w:t>
       </w:r>
     </w:p>
     <w:p>
@@ -5209,7 +4716,7 @@
           <w:rFonts w:ascii="Georgia" w:hAnsi="Georgia"/>
           <w:sz w:val="22"/>
         </w:rPr>
-        <w:t>Das ist kein dramatischer Satz. Kein grosses Finale, keine transformative Erleuchtung. Für jemanden, der jahrelang diesen Dauergast mit sich getragen hat, ist es trotzdem enorm. Es ist der Unterschied zwischen einem Leben mit dauerhafter Grundanspannung und einem Leben, das sich manchmal — nicht immer, nicht jeden Tag, aber manchmal — einfach anfühlt.</w:t>
+        <w:t>Das ist kein dramatischer Satz. Kein grosses Finale, keine transformative Erleuchtung. Für jemanden, der jahrelang diesen Dauergast mit sich getragen hat, ist es trotzdem enorm. Es ist der Unterschied zwischen einem Leben mit dauerhafter Grundanspannung und einem Leben, das sich manchmal, nicht immer, nicht jeden Tag, aber manchmal, einfach anfühlt.</w:t>
       </w:r>
     </w:p>
     <w:p>
@@ -5233,7 +4740,7 @@
           <w:rFonts w:ascii="Georgia" w:hAnsi="Georgia"/>
           <w:sz w:val="22"/>
         </w:rPr>
-        <w:t>Es bedeutet nicht, kein Gewissen mehr zu haben. Sophia hat noch immer Momente, wo sie merkt, dass sie etwas besser hätte machen können. Wo sie sich aufrichtig entschuldigt, wenn sie jemanden verletzt hat. Wo sie Verantwortung übernimmt für das, was wirklich ihres ist. Das gesunde Gewissen ist noch da. Es kommt, zeigt auf etwas Konkretes, und geht wieder. Es hat ein Ende.</w:t>
+        <w:t>Sophia hat noch immer Momente, wo sie merkt, dass sie etwas besser hätte machen können. Wo sie sich aufrichtig entschuldigt, wenn sie jemanden verletzt hat. Das gesunde Gewissen ist noch da. Es kommt, zeigt auf etwas Konkretes, und geht wieder. Es hat ein Ende.</w:t>
       </w:r>
     </w:p>
     <w:p>
@@ -5269,7 +4776,7 @@
           <w:rFonts w:ascii="Georgia" w:hAnsi="Georgia"/>
           <w:sz w:val="22"/>
         </w:rPr>
-        <w:t>Energie. Echte Energie, nicht erzwungene. Weil so viel davon nicht mehr in die Verwaltung des Dauerschuldgefühls geht — in das Suchen nach Vergehen, das Grübeln über Reaktionen, das Abwägen ob das Nein richtig war, das Entschuldigen für Dinge, die keine Entschuldigung brauchen.</w:t>
+        <w:t>Energie. Echte Energie, nicht erzwungene. Weil so viel davon nicht mehr in die Verwaltung des Dauerschuldgefühls geht, in das Suchen nach Vergehen, das Grübeln über Reaktionen, das Abwägen ob das Nein richtig war, das Entschuldigen für Dinge, die keine Entschuldigung brauchen.</w:t>
       </w:r>
     </w:p>
     <w:p>
@@ -5293,31 +4800,19 @@
           <w:rFonts w:ascii="Georgia" w:hAnsi="Georgia"/>
           <w:sz w:val="22"/>
         </w:rPr>
-        <w:t>Beziehungen, die echter sind. Weil das Geben aus Wahl kommt, nicht aus Pflicht. Weil das Nein möglich ist, wenn es das Richtige ist. Weil man nicht mehr alles auftürmt, um das Schuldgefühl zu besänftigen, und deshalb das, was man gibt, wirklich gibt.</w:t>
-      </w:r>
-    </w:p>
-    <w:p>
-      <w:pPr>
-        <w:spacing w:after="160" w:line="320" w:lineRule="exact"/>
-      </w:pPr>
-      <w:r>
-        <w:rPr>
-          <w:rFonts w:ascii="Georgia" w:hAnsi="Georgia"/>
-          <w:sz w:val="22"/>
-        </w:rPr>
-        <w:t>Und diese merkwürdige, ruhige Möglichkeit, einfach da zu sein. In einem Moment. Ohne den nächsten schon zu verwalten. Ohne das Inventar zu machen, was man noch schuldet, wem man noch was schuldet.</w:t>
-      </w:r>
-    </w:p>
-    <w:p>
-      <w:pPr>
-        <w:spacing w:after="160" w:line="320" w:lineRule="exact"/>
-      </w:pPr>
-      <w:r>
-        <w:rPr>
-          <w:rFonts w:ascii="Georgia" w:hAnsi="Georgia"/>
-          <w:sz w:val="22"/>
-        </w:rPr>
-        <w:t>Das ist kein Endzustand, den man irgendwann erreicht und dann hat. Es ist etwas, das wächst. Das in manchen Wochen stärker ist und in anderen weniger. Das mit dem Weg zusammen entsteht, nicht vor ihm. Das bedeutet, dass du nicht ankommen musst, bevor du anfängst.</w:t>
+        <w:t>Beziehungen, die echter sind. Weil das Geben aus Wahl kommt, nicht aus Pflicht. Weil das Nein möglich ist, wenn es das Richtige ist. Und diese merkwürdige, ruhige Möglichkeit, einfach da zu sein. In einem Moment. Ohne den nächsten schon zu verwalten. Ohne das Inventar zu machen, was man noch schuldet, wem man noch was schuldet.</w:t>
+      </w:r>
+    </w:p>
+    <w:p>
+      <w:pPr>
+        <w:spacing w:after="160" w:line="320" w:lineRule="exact"/>
+      </w:pPr>
+      <w:r>
+        <w:rPr>
+          <w:rFonts w:ascii="Georgia" w:hAnsi="Georgia"/>
+          <w:sz w:val="22"/>
+        </w:rPr>
+        <w:t>Das ist kein Endzustand, den man irgendwann erreicht und dann hat. Es ist etwas, das wächst. Das in manchen Wochen stärker ist und in anderen weniger. Das bedeutet, dass du nicht ankommen musst, bevor du anfängst.</w:t>
       </w:r>
     </w:p>
     <w:p>
@@ -5341,20 +4836,7 @@
           <w:rFonts w:ascii="Georgia" w:hAnsi="Georgia"/>
           <w:sz w:val="22"/>
         </w:rPr>
-        <w:t>Das ist der Unterschied. Und dieser Unterschied — so klein er klingt, so fundamental ist er.</w:t>
-      </w:r>
-    </w:p>
-    <w:p>
-      <w:pPr>
-        <w:spacing w:after="160" w:line="320" w:lineRule="exact"/>
-      </w:pPr>
-      <w:r>
-        <w:rPr>
-          <w:rFonts w:ascii="Georgia" w:hAnsi="Georgia"/>
-          <w:i/>
-          <w:sz w:val="22"/>
-        </w:rPr>
-        <w:t>Fragen zum Nachdenken:</w:t>
+        <w:t>Das ist der Unterschied. Und dieser Unterschied, so klein er klingt, so fundamental ist er.</w:t>
       </w:r>
     </w:p>
     <w:p>
@@ -5475,7 +4957,7 @@
           <w:rFonts w:ascii="Georgia" w:hAnsi="Georgia"/>
           <w:sz w:val="22"/>
         </w:rPr>
-        <w:t>Für Frauen, die chronisch mit dem Schuldgefühl leben, ist das selten selbstverständlich. Zeit für sich nehmen — Zeit, in der man nicht für jemanden da ist, nicht etwas erledigt, nicht verfügbar ist — das ist oft selbst schon ein Akt, der Schuldgefühl produziert. Wenn du dieses Buch gelesen hast, hast du für dich selbst Zeit genommen. Vielleicht mit einem schlechten Gewissen. Vielleicht trotzdem. Das zählt.</w:t>
+        <w:t>Für Frauen, die chronisch mit dem Schuldgefühl leben, ist das selten selbstverständlich. Zeit für sich nehmen, Zeit, in der man nicht für jemanden da ist, nicht etwas erledigt, nicht verfügbar ist, das ist oft selbst schon ein Akt, der Schuldgefühl produziert. Wenn du dieses Buch gelesen hast, hast du für dich selbst Zeit genommen. Vielleicht mit einem schlechten Gewissen. Vielleicht trotzdem. Das zählt.</w:t>
       </w:r>
     </w:p>
     <w:p>
@@ -5535,7 +5017,7 @@
           <w:rFonts w:ascii="Georgia" w:hAnsi="Georgia"/>
           <w:sz w:val="22"/>
         </w:rPr>
-        <w:t>Was ich dir nicht versprechen kann: dass es einfach wird. Dass die Schuldgefühle verschwinden, nachdem du dieses Buch gelesen hast. Dass das Nervensystem sofort anders reagiert. Veränderung passiert nicht durch Lesen — sie passiert durch das, was du danach tust. Durch die kleinen Entscheidungen, die du triffst. Durch das Bleiben beim Nein. Durch das Wahrnehmen des Körpers. Durch die Frage, die du dir stellst, wenn das Schuldgefühl kommt: Ist das meins?</w:t>
+        <w:t>Was ich dir nicht versprechen kann: dass es einfach wird. Dass die Schuldgefühle verschwinden, nachdem du dieses Buch gelesen hast. Dass das Nervensystem sofort anders reagiert. Veränderung passiert nicht durch Lesen. Sie passiert durch das, was du danach tust. Durch die kleinen Entscheidungen, die du triffst. Durch das Bleiben beim Nein. Durch das Wahrnehmen des Körpers. Durch die Frage, die du dir stellst, wenn das Schuldgefühl kommt: Ist das meins?</w:t>
       </w:r>
     </w:p>
     <w:p>
@@ -5676,7 +5158,7 @@
           <w:rFonts w:ascii="Georgia" w:hAnsi="Georgia"/>
           <w:sz w:val="22"/>
         </w:rPr>
-        <w:t>Dieses Buch ist entstanden aus Hunderten von Gesprächen mit Frauen, die mir ihr Vertrauen geschenkt haben. In meiner Praxis, in Kursen, in zufälligen Momenten, in denen jemand etwas gesagt hat, das ich nie vergessen habe. Ihnen gilt mein tiefster Dank. Ohne diese Gespräche wäre dieses Buch nicht möglich gewesen — und ohne die Bereitschaft dieser Frauen, hinzuschauen, wäre es nicht entstanden.</w:t>
+        <w:t>Dieses Buch ist entstanden aus Hunderten von Gesprächen mit Frauen, die mir ihr Vertrauen geschenkt haben. In meiner Praxis, in Kursen, in zufälligen Momenten, in denen jemand etwas gesagt hat, das ich nie vergessen habe. Ihnen gilt mein tiefster Dank. Ohne diese Gespräche wäre dieses Buch nicht möglich gewesen.</w:t>
       </w:r>
     </w:p>
     <w:p>
@@ -5733,7 +5215,7 @@
           <w:rFonts w:ascii="Georgia" w:hAnsi="Georgia"/>
           <w:sz w:val="22"/>
         </w:rPr>
-        <w:t>Sie glaubt daran, dass Verstehen der Anfang von Veränderung ist. Und dass jede Frau das Recht hat, ihr Leben ohne chronisches Schuldgefühl zu leben — nicht weil sie es sich verdient hat, sondern weil sie es schlicht darf.</w:t>
+        <w:t>Sie glaubt daran, dass Verstehen der Anfang von Veränderung ist. Und dass jede Frau das Recht hat, ihr Leben ohne chronisches Schuldgefühl zu leben, nicht weil sie es sich verdient hat, sondern weil sie es schlicht darf.</w:t>
       </w:r>
     </w:p>
     <w:p>
@@ -5802,7 +5284,7 @@
           <w:rFonts w:ascii="Georgia" w:hAnsi="Georgia"/>
           <w:sz w:val="22"/>
         </w:rPr>
-        <w:t>Wenn du das Gefühl hast, dass du Begleitung möchtest — für einen Schritt, der schwerer ist als er von aussen aussieht, für ein Muster, das du nicht allein verändern kannst, für den Raum, in dem jemand wirklich zuhört und nicht bewertet — melde dich gerne direkt.</w:t>
+        <w:t>Wenn du das Gefühl hast, dass du Begleitung möchtest, für einen Schritt, der schwerer ist als er von aussen aussieht, für ein Muster, das du nicht allein verändern kannst, für den Raum, in dem jemand wirklich zuhört und nicht bewertet, melde dich gerne direkt.</w:t>
       </w:r>
     </w:p>
     <w:p>
@@ -5869,47 +5351,17 @@
       <w:r>
         <w:rPr>
           <w:rFonts w:ascii="Georgia" w:hAnsi="Georgia"/>
-          <w:i/>
-          <w:sz w:val="22"/>
-        </w:rPr>
-        <w:t>*Haftungsausschluss*</w:t>
-      </w:r>
-    </w:p>
-    <w:p>
-      <w:pPr>
-        <w:spacing w:after="160" w:line="320" w:lineRule="exact"/>
-      </w:pPr>
-      <w:r>
-        <w:rPr>
-          <w:rFonts w:ascii="Georgia" w:hAnsi="Georgia"/>
-          <w:sz w:val="22"/>
-        </w:rPr>
-        <w:t>Dieses Buch dient der persönlichen Orientierung und Reflexion. Es ersetzt keine professionelle therapeutische oder medizinische Behandlung. Bei ernsthaften psychischen Beschwerden empfehle ich ausdrücklich, professionelle Unterstützung zu suchen. Die Inhalte dieses Buches sind nicht geeignet als alleinige Grundlage für therapeutische oder medizinische Entscheidungen.</w:t>
-      </w:r>
-    </w:p>
-    <w:p>
-      <w:pPr>
-        <w:spacing w:after="160" w:line="320" w:lineRule="exact"/>
-      </w:pPr>
-      <w:r>
-        <w:rPr>
-          <w:rFonts w:ascii="Georgia" w:hAnsi="Georgia"/>
-          <w:i/>
-          <w:sz w:val="22"/>
-        </w:rPr>
-        <w:t>*Hinweis zu Fallbeispielen*</w:t>
-      </w:r>
-    </w:p>
-    <w:p>
-      <w:pPr>
-        <w:spacing w:after="160" w:line="320" w:lineRule="exact"/>
-      </w:pPr>
-      <w:r>
-        <w:rPr>
-          <w:rFonts w:ascii="Georgia" w:hAnsi="Georgia"/>
-          <w:sz w:val="22"/>
-        </w:rPr>
-        <w:t>Alle im Buch beschriebenen Personen und Situationen sind Composite-Darstellungen. Sie basieren auf typischen Erfahrungsmustern aus der therapeutischen Praxis und sind so verfasst, dass keine reale Person erkennbar ist. Namen wurden frei gewählt. Ähnlichkeiten mit lebenden oder verstorbenen Personen sind zufällig und nicht beabsichtigt.</w:t>
+          <w:b/>
+          <w:sz w:val="22"/>
+        </w:rPr>
+        <w:t>Haftungsausschluss:</w:t>
+      </w:r>
+      <w:r>
+        <w:rPr>
+          <w:rFonts w:ascii="Georgia" w:hAnsi="Georgia"/>
+          <w:sz w:val="22"/>
+        </w:rPr>
+        <w:t xml:space="preserve"> Dieses Buch dient der persönlichen Orientierung und Reflexion. Es ersetzt keine professionelle therapeutische oder medizinische Behandlung. Alle beschriebenen Personen und Situationen sind Composite-Darstellungen zum Schutz der Privatsphäre. Ähnlichkeiten mit lebenden oder verstorbenen Personen sind zufällig und nicht beabsichtigt.</w:t>
       </w:r>
     </w:p>
     <w:sectPr>

</xml_diff>

<commit_message>
Buch 4: Herz-Divider korrekt eingebaut (21 Stellen)
</commit_message>
<xml_diff>
--- a/outputs/buch-schuldgefuehle/das-schlechte-gewissen-KDP.docx
+++ b/outputs/buch-schuldgefuehle/das-schlechte-gewissen-KDP.docx
@@ -94,6 +94,52 @@
     </w:p>
     <w:p>
       <w:pPr>
+        <w:spacing w:after="360" w:before="360"/>
+        <w:jc w:val="center"/>
+      </w:pPr>
+      <w:r>
+        <w:drawing>
+          <wp:inline distT="0" distB="0" distL="0" distR="0">
+            <wp:extent cx="1714500" cy="733425"/>
+            <wp:effectExtent t="0" r="0" b="0" l="0"/>
+            <wp:docPr id="1" name="" descr="" title=""/>
+            <wp:cNvGraphicFramePr>
+              <a:graphicFrameLocks xmlns:a="http://schemas.openxmlformats.org/drawingml/2006/main" noChangeAspect="1"/>
+            </wp:cNvGraphicFramePr>
+            <a:graphic xmlns:a="http://schemas.openxmlformats.org/drawingml/2006/main">
+              <a:graphicData uri="http://schemas.openxmlformats.org/drawingml/2006/picture">
+                <pic:pic xmlns:pic="http://schemas.openxmlformats.org/drawingml/2006/picture">
+                  <pic:nvPicPr>
+                    <pic:cNvPr id="0" name="" descr=""/>
+                    <pic:cNvPicPr>
+                      <a:picLocks noChangeAspect="1" noChangeArrowheads="1"/>
+                    </pic:cNvPicPr>
+                  </pic:nvPicPr>
+                  <pic:blipFill>
+                    <a:blip r:embed="rId8" cstate="none"/>
+                    <a:srcRect/>
+                    <a:stretch>
+                      <a:fillRect/>
+                    </a:stretch>
+                  </pic:blipFill>
+                  <pic:spPr bwMode="auto">
+                    <a:xfrm>
+                      <a:off x="0" y="0"/>
+                      <a:ext cx="1714500" cy="733425"/>
+                    </a:xfrm>
+                    <a:prstGeom prst="rect">
+                      <a:avLst/>
+                    </a:prstGeom>
+                  </pic:spPr>
+                </pic:pic>
+              </a:graphicData>
+            </a:graphic>
+          </wp:inline>
+        </w:drawing>
+      </w:r>
+    </w:p>
+    <w:p>
+      <w:pPr>
         <w:spacing w:after="0" w:before="0"/>
       </w:pPr>
       <w:r>
@@ -394,6 +440,52 @@
           <w:szCs w:val="24"/>
         </w:rPr>
         <w:t xml:space="preserve">Petra Tanner</w:t>
+      </w:r>
+    </w:p>
+    <w:p>
+      <w:pPr>
+        <w:spacing w:after="360" w:before="360"/>
+        <w:jc w:val="center"/>
+      </w:pPr>
+      <w:r>
+        <w:drawing>
+          <wp:inline distT="0" distB="0" distL="0" distR="0">
+            <wp:extent cx="1714500" cy="733425"/>
+            <wp:effectExtent t="0" r="0" b="0" l="0"/>
+            <wp:docPr id="1" name="" descr="" title=""/>
+            <wp:cNvGraphicFramePr>
+              <a:graphicFrameLocks xmlns:a="http://schemas.openxmlformats.org/drawingml/2006/main" noChangeAspect="1"/>
+            </wp:cNvGraphicFramePr>
+            <a:graphic xmlns:a="http://schemas.openxmlformats.org/drawingml/2006/main">
+              <a:graphicData uri="http://schemas.openxmlformats.org/drawingml/2006/picture">
+                <pic:pic xmlns:pic="http://schemas.openxmlformats.org/drawingml/2006/picture">
+                  <pic:nvPicPr>
+                    <pic:cNvPr id="0" name="" descr=""/>
+                    <pic:cNvPicPr>
+                      <a:picLocks noChangeAspect="1" noChangeArrowheads="1"/>
+                    </pic:cNvPicPr>
+                  </pic:nvPicPr>
+                  <pic:blipFill>
+                    <a:blip r:embed="rId8" cstate="none"/>
+                    <a:srcRect/>
+                    <a:stretch>
+                      <a:fillRect/>
+                    </a:stretch>
+                  </pic:blipFill>
+                  <pic:spPr bwMode="auto">
+                    <a:xfrm>
+                      <a:off x="0" y="0"/>
+                      <a:ext cx="1714500" cy="733425"/>
+                    </a:xfrm>
+                    <a:prstGeom prst="rect">
+                      <a:avLst/>
+                    </a:prstGeom>
+                  </pic:spPr>
+                </pic:pic>
+              </a:graphicData>
+            </a:graphic>
+          </wp:inline>
+        </w:drawing>
       </w:r>
     </w:p>
     <w:p>
@@ -785,6 +877,52 @@
     </w:p>
     <w:p>
       <w:pPr>
+        <w:spacing w:after="360" w:before="360"/>
+        <w:jc w:val="center"/>
+      </w:pPr>
+      <w:r>
+        <w:drawing>
+          <wp:inline distT="0" distB="0" distL="0" distR="0">
+            <wp:extent cx="1714500" cy="733425"/>
+            <wp:effectExtent t="0" r="0" b="0" l="0"/>
+            <wp:docPr id="1" name="" descr="" title=""/>
+            <wp:cNvGraphicFramePr>
+              <a:graphicFrameLocks xmlns:a="http://schemas.openxmlformats.org/drawingml/2006/main" noChangeAspect="1"/>
+            </wp:cNvGraphicFramePr>
+            <a:graphic xmlns:a="http://schemas.openxmlformats.org/drawingml/2006/main">
+              <a:graphicData uri="http://schemas.openxmlformats.org/drawingml/2006/picture">
+                <pic:pic xmlns:pic="http://schemas.openxmlformats.org/drawingml/2006/picture">
+                  <pic:nvPicPr>
+                    <pic:cNvPr id="0" name="" descr=""/>
+                    <pic:cNvPicPr>
+                      <a:picLocks noChangeAspect="1" noChangeArrowheads="1"/>
+                    </pic:cNvPicPr>
+                  </pic:nvPicPr>
+                  <pic:blipFill>
+                    <a:blip r:embed="rId8" cstate="none"/>
+                    <a:srcRect/>
+                    <a:stretch>
+                      <a:fillRect/>
+                    </a:stretch>
+                  </pic:blipFill>
+                  <pic:spPr bwMode="auto">
+                    <a:xfrm>
+                      <a:off x="0" y="0"/>
+                      <a:ext cx="1714500" cy="733425"/>
+                    </a:xfrm>
+                    <a:prstGeom prst="rect">
+                      <a:avLst/>
+                    </a:prstGeom>
+                  </pic:spPr>
+                </pic:pic>
+              </a:graphicData>
+            </a:graphic>
+          </wp:inline>
+        </w:drawing>
+      </w:r>
+    </w:p>
+    <w:p>
+      <w:pPr>
         <w:spacing w:after="0" w:before="0"/>
       </w:pPr>
       <w:r>
@@ -1202,6 +1340,52 @@
     </w:p>
     <w:p>
       <w:pPr>
+        <w:spacing w:after="360" w:before="360"/>
+        <w:jc w:val="center"/>
+      </w:pPr>
+      <w:r>
+        <w:drawing>
+          <wp:inline distT="0" distB="0" distL="0" distR="0">
+            <wp:extent cx="1714500" cy="733425"/>
+            <wp:effectExtent t="0" r="0" b="0" l="0"/>
+            <wp:docPr id="1" name="" descr="" title=""/>
+            <wp:cNvGraphicFramePr>
+              <a:graphicFrameLocks xmlns:a="http://schemas.openxmlformats.org/drawingml/2006/main" noChangeAspect="1"/>
+            </wp:cNvGraphicFramePr>
+            <a:graphic xmlns:a="http://schemas.openxmlformats.org/drawingml/2006/main">
+              <a:graphicData uri="http://schemas.openxmlformats.org/drawingml/2006/picture">
+                <pic:pic xmlns:pic="http://schemas.openxmlformats.org/drawingml/2006/picture">
+                  <pic:nvPicPr>
+                    <pic:cNvPr id="0" name="" descr=""/>
+                    <pic:cNvPicPr>
+                      <a:picLocks noChangeAspect="1" noChangeArrowheads="1"/>
+                    </pic:cNvPicPr>
+                  </pic:nvPicPr>
+                  <pic:blipFill>
+                    <a:blip r:embed="rId8" cstate="none"/>
+                    <a:srcRect/>
+                    <a:stretch>
+                      <a:fillRect/>
+                    </a:stretch>
+                  </pic:blipFill>
+                  <pic:spPr bwMode="auto">
+                    <a:xfrm>
+                      <a:off x="0" y="0"/>
+                      <a:ext cx="1714500" cy="733425"/>
+                    </a:xfrm>
+                    <a:prstGeom prst="rect">
+                      <a:avLst/>
+                    </a:prstGeom>
+                  </pic:spPr>
+                </pic:pic>
+              </a:graphicData>
+            </a:graphic>
+          </wp:inline>
+        </w:drawing>
+      </w:r>
+    </w:p>
+    <w:p>
+      <w:pPr>
         <w:spacing w:after="0" w:before="0"/>
       </w:pPr>
       <w:r>
@@ -1574,6 +1758,52 @@
     </w:p>
     <w:p>
       <w:pPr>
+        <w:spacing w:after="360" w:before="360"/>
+        <w:jc w:val="center"/>
+      </w:pPr>
+      <w:r>
+        <w:drawing>
+          <wp:inline distT="0" distB="0" distL="0" distR="0">
+            <wp:extent cx="1714500" cy="733425"/>
+            <wp:effectExtent t="0" r="0" b="0" l="0"/>
+            <wp:docPr id="1" name="" descr="" title=""/>
+            <wp:cNvGraphicFramePr>
+              <a:graphicFrameLocks xmlns:a="http://schemas.openxmlformats.org/drawingml/2006/main" noChangeAspect="1"/>
+            </wp:cNvGraphicFramePr>
+            <a:graphic xmlns:a="http://schemas.openxmlformats.org/drawingml/2006/main">
+              <a:graphicData uri="http://schemas.openxmlformats.org/drawingml/2006/picture">
+                <pic:pic xmlns:pic="http://schemas.openxmlformats.org/drawingml/2006/picture">
+                  <pic:nvPicPr>
+                    <pic:cNvPr id="0" name="" descr=""/>
+                    <pic:cNvPicPr>
+                      <a:picLocks noChangeAspect="1" noChangeArrowheads="1"/>
+                    </pic:cNvPicPr>
+                  </pic:nvPicPr>
+                  <pic:blipFill>
+                    <a:blip r:embed="rId8" cstate="none"/>
+                    <a:srcRect/>
+                    <a:stretch>
+                      <a:fillRect/>
+                    </a:stretch>
+                  </pic:blipFill>
+                  <pic:spPr bwMode="auto">
+                    <a:xfrm>
+                      <a:off x="0" y="0"/>
+                      <a:ext cx="1714500" cy="733425"/>
+                    </a:xfrm>
+                    <a:prstGeom prst="rect">
+                      <a:avLst/>
+                    </a:prstGeom>
+                  </pic:spPr>
+                </pic:pic>
+              </a:graphicData>
+            </a:graphic>
+          </wp:inline>
+        </w:drawing>
+      </w:r>
+    </w:p>
+    <w:p>
+      <w:pPr>
         <w:spacing w:after="0" w:before="0"/>
       </w:pPr>
       <w:r>
@@ -1916,6 +2146,52 @@
     </w:p>
     <w:p>
       <w:pPr>
+        <w:spacing w:after="360" w:before="360"/>
+        <w:jc w:val="center"/>
+      </w:pPr>
+      <w:r>
+        <w:drawing>
+          <wp:inline distT="0" distB="0" distL="0" distR="0">
+            <wp:extent cx="1714500" cy="733425"/>
+            <wp:effectExtent t="0" r="0" b="0" l="0"/>
+            <wp:docPr id="1" name="" descr="" title=""/>
+            <wp:cNvGraphicFramePr>
+              <a:graphicFrameLocks xmlns:a="http://schemas.openxmlformats.org/drawingml/2006/main" noChangeAspect="1"/>
+            </wp:cNvGraphicFramePr>
+            <a:graphic xmlns:a="http://schemas.openxmlformats.org/drawingml/2006/main">
+              <a:graphicData uri="http://schemas.openxmlformats.org/drawingml/2006/picture">
+                <pic:pic xmlns:pic="http://schemas.openxmlformats.org/drawingml/2006/picture">
+                  <pic:nvPicPr>
+                    <pic:cNvPr id="0" name="" descr=""/>
+                    <pic:cNvPicPr>
+                      <a:picLocks noChangeAspect="1" noChangeArrowheads="1"/>
+                    </pic:cNvPicPr>
+                  </pic:nvPicPr>
+                  <pic:blipFill>
+                    <a:blip r:embed="rId8" cstate="none"/>
+                    <a:srcRect/>
+                    <a:stretch>
+                      <a:fillRect/>
+                    </a:stretch>
+                  </pic:blipFill>
+                  <pic:spPr bwMode="auto">
+                    <a:xfrm>
+                      <a:off x="0" y="0"/>
+                      <a:ext cx="1714500" cy="733425"/>
+                    </a:xfrm>
+                    <a:prstGeom prst="rect">
+                      <a:avLst/>
+                    </a:prstGeom>
+                  </pic:spPr>
+                </pic:pic>
+              </a:graphicData>
+            </a:graphic>
+          </wp:inline>
+        </w:drawing>
+      </w:r>
+    </w:p>
+    <w:p>
+      <w:pPr>
         <w:spacing w:after="0" w:before="0"/>
       </w:pPr>
       <w:r>
@@ -2243,6 +2519,52 @@
     </w:p>
     <w:p>
       <w:pPr>
+        <w:spacing w:after="360" w:before="360"/>
+        <w:jc w:val="center"/>
+      </w:pPr>
+      <w:r>
+        <w:drawing>
+          <wp:inline distT="0" distB="0" distL="0" distR="0">
+            <wp:extent cx="1714500" cy="733425"/>
+            <wp:effectExtent t="0" r="0" b="0" l="0"/>
+            <wp:docPr id="1" name="" descr="" title=""/>
+            <wp:cNvGraphicFramePr>
+              <a:graphicFrameLocks xmlns:a="http://schemas.openxmlformats.org/drawingml/2006/main" noChangeAspect="1"/>
+            </wp:cNvGraphicFramePr>
+            <a:graphic xmlns:a="http://schemas.openxmlformats.org/drawingml/2006/main">
+              <a:graphicData uri="http://schemas.openxmlformats.org/drawingml/2006/picture">
+                <pic:pic xmlns:pic="http://schemas.openxmlformats.org/drawingml/2006/picture">
+                  <pic:nvPicPr>
+                    <pic:cNvPr id="0" name="" descr=""/>
+                    <pic:cNvPicPr>
+                      <a:picLocks noChangeAspect="1" noChangeArrowheads="1"/>
+                    </pic:cNvPicPr>
+                  </pic:nvPicPr>
+                  <pic:blipFill>
+                    <a:blip r:embed="rId8" cstate="none"/>
+                    <a:srcRect/>
+                    <a:stretch>
+                      <a:fillRect/>
+                    </a:stretch>
+                  </pic:blipFill>
+                  <pic:spPr bwMode="auto">
+                    <a:xfrm>
+                      <a:off x="0" y="0"/>
+                      <a:ext cx="1714500" cy="733425"/>
+                    </a:xfrm>
+                    <a:prstGeom prst="rect">
+                      <a:avLst/>
+                    </a:prstGeom>
+                  </pic:spPr>
+                </pic:pic>
+              </a:graphicData>
+            </a:graphic>
+          </wp:inline>
+        </w:drawing>
+      </w:r>
+    </w:p>
+    <w:p>
+      <w:pPr>
         <w:spacing w:after="0" w:before="0"/>
       </w:pPr>
       <w:r>
@@ -2570,6 +2892,52 @@
     </w:p>
     <w:p>
       <w:pPr>
+        <w:spacing w:after="360" w:before="360"/>
+        <w:jc w:val="center"/>
+      </w:pPr>
+      <w:r>
+        <w:drawing>
+          <wp:inline distT="0" distB="0" distL="0" distR="0">
+            <wp:extent cx="1714500" cy="733425"/>
+            <wp:effectExtent t="0" r="0" b="0" l="0"/>
+            <wp:docPr id="1" name="" descr="" title=""/>
+            <wp:cNvGraphicFramePr>
+              <a:graphicFrameLocks xmlns:a="http://schemas.openxmlformats.org/drawingml/2006/main" noChangeAspect="1"/>
+            </wp:cNvGraphicFramePr>
+            <a:graphic xmlns:a="http://schemas.openxmlformats.org/drawingml/2006/main">
+              <a:graphicData uri="http://schemas.openxmlformats.org/drawingml/2006/picture">
+                <pic:pic xmlns:pic="http://schemas.openxmlformats.org/drawingml/2006/picture">
+                  <pic:nvPicPr>
+                    <pic:cNvPr id="0" name="" descr=""/>
+                    <pic:cNvPicPr>
+                      <a:picLocks noChangeAspect="1" noChangeArrowheads="1"/>
+                    </pic:cNvPicPr>
+                  </pic:nvPicPr>
+                  <pic:blipFill>
+                    <a:blip r:embed="rId8" cstate="none"/>
+                    <a:srcRect/>
+                    <a:stretch>
+                      <a:fillRect/>
+                    </a:stretch>
+                  </pic:blipFill>
+                  <pic:spPr bwMode="auto">
+                    <a:xfrm>
+                      <a:off x="0" y="0"/>
+                      <a:ext cx="1714500" cy="733425"/>
+                    </a:xfrm>
+                    <a:prstGeom prst="rect">
+                      <a:avLst/>
+                    </a:prstGeom>
+                  </pic:spPr>
+                </pic:pic>
+              </a:graphicData>
+            </a:graphic>
+          </wp:inline>
+        </w:drawing>
+      </w:r>
+    </w:p>
+    <w:p>
+      <w:pPr>
         <w:spacing w:after="0" w:before="0"/>
       </w:pPr>
       <w:r>
@@ -2912,6 +3280,52 @@
     </w:p>
     <w:p>
       <w:pPr>
+        <w:spacing w:after="360" w:before="360"/>
+        <w:jc w:val="center"/>
+      </w:pPr>
+      <w:r>
+        <w:drawing>
+          <wp:inline distT="0" distB="0" distL="0" distR="0">
+            <wp:extent cx="1714500" cy="733425"/>
+            <wp:effectExtent t="0" r="0" b="0" l="0"/>
+            <wp:docPr id="1" name="" descr="" title=""/>
+            <wp:cNvGraphicFramePr>
+              <a:graphicFrameLocks xmlns:a="http://schemas.openxmlformats.org/drawingml/2006/main" noChangeAspect="1"/>
+            </wp:cNvGraphicFramePr>
+            <a:graphic xmlns:a="http://schemas.openxmlformats.org/drawingml/2006/main">
+              <a:graphicData uri="http://schemas.openxmlformats.org/drawingml/2006/picture">
+                <pic:pic xmlns:pic="http://schemas.openxmlformats.org/drawingml/2006/picture">
+                  <pic:nvPicPr>
+                    <pic:cNvPr id="0" name="" descr=""/>
+                    <pic:cNvPicPr>
+                      <a:picLocks noChangeAspect="1" noChangeArrowheads="1"/>
+                    </pic:cNvPicPr>
+                  </pic:nvPicPr>
+                  <pic:blipFill>
+                    <a:blip r:embed="rId8" cstate="none"/>
+                    <a:srcRect/>
+                    <a:stretch>
+                      <a:fillRect/>
+                    </a:stretch>
+                  </pic:blipFill>
+                  <pic:spPr bwMode="auto">
+                    <a:xfrm>
+                      <a:off x="0" y="0"/>
+                      <a:ext cx="1714500" cy="733425"/>
+                    </a:xfrm>
+                    <a:prstGeom prst="rect">
+                      <a:avLst/>
+                    </a:prstGeom>
+                  </pic:spPr>
+                </pic:pic>
+              </a:graphicData>
+            </a:graphic>
+          </wp:inline>
+        </w:drawing>
+      </w:r>
+    </w:p>
+    <w:p>
+      <w:pPr>
         <w:spacing w:after="0" w:before="0"/>
       </w:pPr>
       <w:r>
@@ -3239,6 +3653,52 @@
     </w:p>
     <w:p>
       <w:pPr>
+        <w:spacing w:after="360" w:before="360"/>
+        <w:jc w:val="center"/>
+      </w:pPr>
+      <w:r>
+        <w:drawing>
+          <wp:inline distT="0" distB="0" distL="0" distR="0">
+            <wp:extent cx="1714500" cy="733425"/>
+            <wp:effectExtent t="0" r="0" b="0" l="0"/>
+            <wp:docPr id="1" name="" descr="" title=""/>
+            <wp:cNvGraphicFramePr>
+              <a:graphicFrameLocks xmlns:a="http://schemas.openxmlformats.org/drawingml/2006/main" noChangeAspect="1"/>
+            </wp:cNvGraphicFramePr>
+            <a:graphic xmlns:a="http://schemas.openxmlformats.org/drawingml/2006/main">
+              <a:graphicData uri="http://schemas.openxmlformats.org/drawingml/2006/picture">
+                <pic:pic xmlns:pic="http://schemas.openxmlformats.org/drawingml/2006/picture">
+                  <pic:nvPicPr>
+                    <pic:cNvPr id="0" name="" descr=""/>
+                    <pic:cNvPicPr>
+                      <a:picLocks noChangeAspect="1" noChangeArrowheads="1"/>
+                    </pic:cNvPicPr>
+                  </pic:nvPicPr>
+                  <pic:blipFill>
+                    <a:blip r:embed="rId8" cstate="none"/>
+                    <a:srcRect/>
+                    <a:stretch>
+                      <a:fillRect/>
+                    </a:stretch>
+                  </pic:blipFill>
+                  <pic:spPr bwMode="auto">
+                    <a:xfrm>
+                      <a:off x="0" y="0"/>
+                      <a:ext cx="1714500" cy="733425"/>
+                    </a:xfrm>
+                    <a:prstGeom prst="rect">
+                      <a:avLst/>
+                    </a:prstGeom>
+                  </pic:spPr>
+                </pic:pic>
+              </a:graphicData>
+            </a:graphic>
+          </wp:inline>
+        </w:drawing>
+      </w:r>
+    </w:p>
+    <w:p>
+      <w:pPr>
         <w:spacing w:after="0" w:before="0"/>
       </w:pPr>
       <w:r>
@@ -3596,6 +4056,52 @@
     </w:p>
     <w:p>
       <w:pPr>
+        <w:spacing w:after="360" w:before="360"/>
+        <w:jc w:val="center"/>
+      </w:pPr>
+      <w:r>
+        <w:drawing>
+          <wp:inline distT="0" distB="0" distL="0" distR="0">
+            <wp:extent cx="1714500" cy="733425"/>
+            <wp:effectExtent t="0" r="0" b="0" l="0"/>
+            <wp:docPr id="1" name="" descr="" title=""/>
+            <wp:cNvGraphicFramePr>
+              <a:graphicFrameLocks xmlns:a="http://schemas.openxmlformats.org/drawingml/2006/main" noChangeAspect="1"/>
+            </wp:cNvGraphicFramePr>
+            <a:graphic xmlns:a="http://schemas.openxmlformats.org/drawingml/2006/main">
+              <a:graphicData uri="http://schemas.openxmlformats.org/drawingml/2006/picture">
+                <pic:pic xmlns:pic="http://schemas.openxmlformats.org/drawingml/2006/picture">
+                  <pic:nvPicPr>
+                    <pic:cNvPr id="0" name="" descr=""/>
+                    <pic:cNvPicPr>
+                      <a:picLocks noChangeAspect="1" noChangeArrowheads="1"/>
+                    </pic:cNvPicPr>
+                  </pic:nvPicPr>
+                  <pic:blipFill>
+                    <a:blip r:embed="rId8" cstate="none"/>
+                    <a:srcRect/>
+                    <a:stretch>
+                      <a:fillRect/>
+                    </a:stretch>
+                  </pic:blipFill>
+                  <pic:spPr bwMode="auto">
+                    <a:xfrm>
+                      <a:off x="0" y="0"/>
+                      <a:ext cx="1714500" cy="733425"/>
+                    </a:xfrm>
+                    <a:prstGeom prst="rect">
+                      <a:avLst/>
+                    </a:prstGeom>
+                  </pic:spPr>
+                </pic:pic>
+              </a:graphicData>
+            </a:graphic>
+          </wp:inline>
+        </w:drawing>
+      </w:r>
+    </w:p>
+    <w:p>
+      <w:pPr>
         <w:spacing w:after="0" w:before="0"/>
       </w:pPr>
       <w:r>
@@ -3908,6 +4414,52 @@
     </w:p>
     <w:p>
       <w:pPr>
+        <w:spacing w:after="360" w:before="360"/>
+        <w:jc w:val="center"/>
+      </w:pPr>
+      <w:r>
+        <w:drawing>
+          <wp:inline distT="0" distB="0" distL="0" distR="0">
+            <wp:extent cx="1714500" cy="733425"/>
+            <wp:effectExtent t="0" r="0" b="0" l="0"/>
+            <wp:docPr id="1" name="" descr="" title=""/>
+            <wp:cNvGraphicFramePr>
+              <a:graphicFrameLocks xmlns:a="http://schemas.openxmlformats.org/drawingml/2006/main" noChangeAspect="1"/>
+            </wp:cNvGraphicFramePr>
+            <a:graphic xmlns:a="http://schemas.openxmlformats.org/drawingml/2006/main">
+              <a:graphicData uri="http://schemas.openxmlformats.org/drawingml/2006/picture">
+                <pic:pic xmlns:pic="http://schemas.openxmlformats.org/drawingml/2006/picture">
+                  <pic:nvPicPr>
+                    <pic:cNvPr id="0" name="" descr=""/>
+                    <pic:cNvPicPr>
+                      <a:picLocks noChangeAspect="1" noChangeArrowheads="1"/>
+                    </pic:cNvPicPr>
+                  </pic:nvPicPr>
+                  <pic:blipFill>
+                    <a:blip r:embed="rId8" cstate="none"/>
+                    <a:srcRect/>
+                    <a:stretch>
+                      <a:fillRect/>
+                    </a:stretch>
+                  </pic:blipFill>
+                  <pic:spPr bwMode="auto">
+                    <a:xfrm>
+                      <a:off x="0" y="0"/>
+                      <a:ext cx="1714500" cy="733425"/>
+                    </a:xfrm>
+                    <a:prstGeom prst="rect">
+                      <a:avLst/>
+                    </a:prstGeom>
+                  </pic:spPr>
+                </pic:pic>
+              </a:graphicData>
+            </a:graphic>
+          </wp:inline>
+        </w:drawing>
+      </w:r>
+    </w:p>
+    <w:p>
+      <w:pPr>
         <w:spacing w:after="0" w:before="0"/>
       </w:pPr>
       <w:r>
@@ -4235,6 +4787,52 @@
     </w:p>
     <w:p>
       <w:pPr>
+        <w:spacing w:after="360" w:before="360"/>
+        <w:jc w:val="center"/>
+      </w:pPr>
+      <w:r>
+        <w:drawing>
+          <wp:inline distT="0" distB="0" distL="0" distR="0">
+            <wp:extent cx="1714500" cy="733425"/>
+            <wp:effectExtent t="0" r="0" b="0" l="0"/>
+            <wp:docPr id="1" name="" descr="" title=""/>
+            <wp:cNvGraphicFramePr>
+              <a:graphicFrameLocks xmlns:a="http://schemas.openxmlformats.org/drawingml/2006/main" noChangeAspect="1"/>
+            </wp:cNvGraphicFramePr>
+            <a:graphic xmlns:a="http://schemas.openxmlformats.org/drawingml/2006/main">
+              <a:graphicData uri="http://schemas.openxmlformats.org/drawingml/2006/picture">
+                <pic:pic xmlns:pic="http://schemas.openxmlformats.org/drawingml/2006/picture">
+                  <pic:nvPicPr>
+                    <pic:cNvPr id="0" name="" descr=""/>
+                    <pic:cNvPicPr>
+                      <a:picLocks noChangeAspect="1" noChangeArrowheads="1"/>
+                    </pic:cNvPicPr>
+                  </pic:nvPicPr>
+                  <pic:blipFill>
+                    <a:blip r:embed="rId8" cstate="none"/>
+                    <a:srcRect/>
+                    <a:stretch>
+                      <a:fillRect/>
+                    </a:stretch>
+                  </pic:blipFill>
+                  <pic:spPr bwMode="auto">
+                    <a:xfrm>
+                      <a:off x="0" y="0"/>
+                      <a:ext cx="1714500" cy="733425"/>
+                    </a:xfrm>
+                    <a:prstGeom prst="rect">
+                      <a:avLst/>
+                    </a:prstGeom>
+                  </pic:spPr>
+                </pic:pic>
+              </a:graphicData>
+            </a:graphic>
+          </wp:inline>
+        </w:drawing>
+      </w:r>
+    </w:p>
+    <w:p>
+      <w:pPr>
         <w:spacing w:after="0" w:before="0"/>
       </w:pPr>
       <w:r>
@@ -4532,6 +5130,52 @@
     </w:p>
     <w:p>
       <w:pPr>
+        <w:spacing w:after="360" w:before="360"/>
+        <w:jc w:val="center"/>
+      </w:pPr>
+      <w:r>
+        <w:drawing>
+          <wp:inline distT="0" distB="0" distL="0" distR="0">
+            <wp:extent cx="1714500" cy="733425"/>
+            <wp:effectExtent t="0" r="0" b="0" l="0"/>
+            <wp:docPr id="1" name="" descr="" title=""/>
+            <wp:cNvGraphicFramePr>
+              <a:graphicFrameLocks xmlns:a="http://schemas.openxmlformats.org/drawingml/2006/main" noChangeAspect="1"/>
+            </wp:cNvGraphicFramePr>
+            <a:graphic xmlns:a="http://schemas.openxmlformats.org/drawingml/2006/main">
+              <a:graphicData uri="http://schemas.openxmlformats.org/drawingml/2006/picture">
+                <pic:pic xmlns:pic="http://schemas.openxmlformats.org/drawingml/2006/picture">
+                  <pic:nvPicPr>
+                    <pic:cNvPr id="0" name="" descr=""/>
+                    <pic:cNvPicPr>
+                      <a:picLocks noChangeAspect="1" noChangeArrowheads="1"/>
+                    </pic:cNvPicPr>
+                  </pic:nvPicPr>
+                  <pic:blipFill>
+                    <a:blip r:embed="rId8" cstate="none"/>
+                    <a:srcRect/>
+                    <a:stretch>
+                      <a:fillRect/>
+                    </a:stretch>
+                  </pic:blipFill>
+                  <pic:spPr bwMode="auto">
+                    <a:xfrm>
+                      <a:off x="0" y="0"/>
+                      <a:ext cx="1714500" cy="733425"/>
+                    </a:xfrm>
+                    <a:prstGeom prst="rect">
+                      <a:avLst/>
+                    </a:prstGeom>
+                  </pic:spPr>
+                </pic:pic>
+              </a:graphicData>
+            </a:graphic>
+          </wp:inline>
+        </w:drawing>
+      </w:r>
+    </w:p>
+    <w:p>
+      <w:pPr>
         <w:spacing w:after="0" w:before="0"/>
       </w:pPr>
       <w:r>
@@ -4829,6 +5473,52 @@
     </w:p>
     <w:p>
       <w:pPr>
+        <w:spacing w:after="360" w:before="360"/>
+        <w:jc w:val="center"/>
+      </w:pPr>
+      <w:r>
+        <w:drawing>
+          <wp:inline distT="0" distB="0" distL="0" distR="0">
+            <wp:extent cx="1714500" cy="733425"/>
+            <wp:effectExtent t="0" r="0" b="0" l="0"/>
+            <wp:docPr id="1" name="" descr="" title=""/>
+            <wp:cNvGraphicFramePr>
+              <a:graphicFrameLocks xmlns:a="http://schemas.openxmlformats.org/drawingml/2006/main" noChangeAspect="1"/>
+            </wp:cNvGraphicFramePr>
+            <a:graphic xmlns:a="http://schemas.openxmlformats.org/drawingml/2006/main">
+              <a:graphicData uri="http://schemas.openxmlformats.org/drawingml/2006/picture">
+                <pic:pic xmlns:pic="http://schemas.openxmlformats.org/drawingml/2006/picture">
+                  <pic:nvPicPr>
+                    <pic:cNvPr id="0" name="" descr=""/>
+                    <pic:cNvPicPr>
+                      <a:picLocks noChangeAspect="1" noChangeArrowheads="1"/>
+                    </pic:cNvPicPr>
+                  </pic:nvPicPr>
+                  <pic:blipFill>
+                    <a:blip r:embed="rId8" cstate="none"/>
+                    <a:srcRect/>
+                    <a:stretch>
+                      <a:fillRect/>
+                    </a:stretch>
+                  </pic:blipFill>
+                  <pic:spPr bwMode="auto">
+                    <a:xfrm>
+                      <a:off x="0" y="0"/>
+                      <a:ext cx="1714500" cy="733425"/>
+                    </a:xfrm>
+                    <a:prstGeom prst="rect">
+                      <a:avLst/>
+                    </a:prstGeom>
+                  </pic:spPr>
+                </pic:pic>
+              </a:graphicData>
+            </a:graphic>
+          </wp:inline>
+        </w:drawing>
+      </w:r>
+    </w:p>
+    <w:p>
+      <w:pPr>
         <w:spacing w:after="0" w:before="0"/>
       </w:pPr>
       <w:r>
@@ -5188,6 +5878,52 @@
     </w:p>
     <w:p>
       <w:pPr>
+        <w:spacing w:after="360" w:before="360"/>
+        <w:jc w:val="center"/>
+      </w:pPr>
+      <w:r>
+        <w:drawing>
+          <wp:inline distT="0" distB="0" distL="0" distR="0">
+            <wp:extent cx="1714500" cy="733425"/>
+            <wp:effectExtent t="0" r="0" b="0" l="0"/>
+            <wp:docPr id="1" name="" descr="" title=""/>
+            <wp:cNvGraphicFramePr>
+              <a:graphicFrameLocks xmlns:a="http://schemas.openxmlformats.org/drawingml/2006/main" noChangeAspect="1"/>
+            </wp:cNvGraphicFramePr>
+            <a:graphic xmlns:a="http://schemas.openxmlformats.org/drawingml/2006/main">
+              <a:graphicData uri="http://schemas.openxmlformats.org/drawingml/2006/picture">
+                <pic:pic xmlns:pic="http://schemas.openxmlformats.org/drawingml/2006/picture">
+                  <pic:nvPicPr>
+                    <pic:cNvPr id="0" name="" descr=""/>
+                    <pic:cNvPicPr>
+                      <a:picLocks noChangeAspect="1" noChangeArrowheads="1"/>
+                    </pic:cNvPicPr>
+                  </pic:nvPicPr>
+                  <pic:blipFill>
+                    <a:blip r:embed="rId8" cstate="none"/>
+                    <a:srcRect/>
+                    <a:stretch>
+                      <a:fillRect/>
+                    </a:stretch>
+                  </pic:blipFill>
+                  <pic:spPr bwMode="auto">
+                    <a:xfrm>
+                      <a:off x="0" y="0"/>
+                      <a:ext cx="1714500" cy="733425"/>
+                    </a:xfrm>
+                    <a:prstGeom prst="rect">
+                      <a:avLst/>
+                    </a:prstGeom>
+                  </pic:spPr>
+                </pic:pic>
+              </a:graphicData>
+            </a:graphic>
+          </wp:inline>
+        </w:drawing>
+      </w:r>
+    </w:p>
+    <w:p>
+      <w:pPr>
         <w:spacing w:after="0" w:before="0"/>
       </w:pPr>
       <w:r>
@@ -5428,6 +6164,52 @@
     </w:p>
     <w:p>
       <w:pPr>
+        <w:spacing w:after="360" w:before="360"/>
+        <w:jc w:val="center"/>
+      </w:pPr>
+      <w:r>
+        <w:drawing>
+          <wp:inline distT="0" distB="0" distL="0" distR="0">
+            <wp:extent cx="1714500" cy="733425"/>
+            <wp:effectExtent t="0" r="0" b="0" l="0"/>
+            <wp:docPr id="1" name="" descr="" title=""/>
+            <wp:cNvGraphicFramePr>
+              <a:graphicFrameLocks xmlns:a="http://schemas.openxmlformats.org/drawingml/2006/main" noChangeAspect="1"/>
+            </wp:cNvGraphicFramePr>
+            <a:graphic xmlns:a="http://schemas.openxmlformats.org/drawingml/2006/main">
+              <a:graphicData uri="http://schemas.openxmlformats.org/drawingml/2006/picture">
+                <pic:pic xmlns:pic="http://schemas.openxmlformats.org/drawingml/2006/picture">
+                  <pic:nvPicPr>
+                    <pic:cNvPr id="0" name="" descr=""/>
+                    <pic:cNvPicPr>
+                      <a:picLocks noChangeAspect="1" noChangeArrowheads="1"/>
+                    </pic:cNvPicPr>
+                  </pic:nvPicPr>
+                  <pic:blipFill>
+                    <a:blip r:embed="rId8" cstate="none"/>
+                    <a:srcRect/>
+                    <a:stretch>
+                      <a:fillRect/>
+                    </a:stretch>
+                  </pic:blipFill>
+                  <pic:spPr bwMode="auto">
+                    <a:xfrm>
+                      <a:off x="0" y="0"/>
+                      <a:ext cx="1714500" cy="733425"/>
+                    </a:xfrm>
+                    <a:prstGeom prst="rect">
+                      <a:avLst/>
+                    </a:prstGeom>
+                  </pic:spPr>
+                </pic:pic>
+              </a:graphicData>
+            </a:graphic>
+          </wp:inline>
+        </w:drawing>
+      </w:r>
+    </w:p>
+    <w:p>
+      <w:pPr>
         <w:spacing w:after="0" w:before="0"/>
       </w:pPr>
       <w:r>
@@ -5482,6 +6264,52 @@
     </w:p>
     <w:p>
       <w:pPr>
+        <w:spacing w:after="360" w:before="360"/>
+        <w:jc w:val="center"/>
+      </w:pPr>
+      <w:r>
+        <w:drawing>
+          <wp:inline distT="0" distB="0" distL="0" distR="0">
+            <wp:extent cx="1714500" cy="733425"/>
+            <wp:effectExtent t="0" r="0" b="0" l="0"/>
+            <wp:docPr id="1" name="" descr="" title=""/>
+            <wp:cNvGraphicFramePr>
+              <a:graphicFrameLocks xmlns:a="http://schemas.openxmlformats.org/drawingml/2006/main" noChangeAspect="1"/>
+            </wp:cNvGraphicFramePr>
+            <a:graphic xmlns:a="http://schemas.openxmlformats.org/drawingml/2006/main">
+              <a:graphicData uri="http://schemas.openxmlformats.org/drawingml/2006/picture">
+                <pic:pic xmlns:pic="http://schemas.openxmlformats.org/drawingml/2006/picture">
+                  <pic:nvPicPr>
+                    <pic:cNvPr id="0" name="" descr=""/>
+                    <pic:cNvPicPr>
+                      <a:picLocks noChangeAspect="1" noChangeArrowheads="1"/>
+                    </pic:cNvPicPr>
+                  </pic:nvPicPr>
+                  <pic:blipFill>
+                    <a:blip r:embed="rId8" cstate="none"/>
+                    <a:srcRect/>
+                    <a:stretch>
+                      <a:fillRect/>
+                    </a:stretch>
+                  </pic:blipFill>
+                  <pic:spPr bwMode="auto">
+                    <a:xfrm>
+                      <a:off x="0" y="0"/>
+                      <a:ext cx="1714500" cy="733425"/>
+                    </a:xfrm>
+                    <a:prstGeom prst="rect">
+                      <a:avLst/>
+                    </a:prstGeom>
+                  </pic:spPr>
+                </pic:pic>
+              </a:graphicData>
+            </a:graphic>
+          </wp:inline>
+        </w:drawing>
+      </w:r>
+    </w:p>
+    <w:p>
+      <w:pPr>
         <w:spacing w:after="0" w:before="0"/>
       </w:pPr>
       <w:r>
@@ -5565,6 +6393,52 @@
     </w:p>
     <w:p>
       <w:pPr>
+        <w:spacing w:after="360" w:before="360"/>
+        <w:jc w:val="center"/>
+      </w:pPr>
+      <w:r>
+        <w:drawing>
+          <wp:inline distT="0" distB="0" distL="0" distR="0">
+            <wp:extent cx="1714500" cy="733425"/>
+            <wp:effectExtent t="0" r="0" b="0" l="0"/>
+            <wp:docPr id="1" name="" descr="" title=""/>
+            <wp:cNvGraphicFramePr>
+              <a:graphicFrameLocks xmlns:a="http://schemas.openxmlformats.org/drawingml/2006/main" noChangeAspect="1"/>
+            </wp:cNvGraphicFramePr>
+            <a:graphic xmlns:a="http://schemas.openxmlformats.org/drawingml/2006/main">
+              <a:graphicData uri="http://schemas.openxmlformats.org/drawingml/2006/picture">
+                <pic:pic xmlns:pic="http://schemas.openxmlformats.org/drawingml/2006/picture">
+                  <pic:nvPicPr>
+                    <pic:cNvPr id="0" name="" descr=""/>
+                    <pic:cNvPicPr>
+                      <a:picLocks noChangeAspect="1" noChangeArrowheads="1"/>
+                    </pic:cNvPicPr>
+                  </pic:nvPicPr>
+                  <pic:blipFill>
+                    <a:blip r:embed="rId8" cstate="none"/>
+                    <a:srcRect/>
+                    <a:stretch>
+                      <a:fillRect/>
+                    </a:stretch>
+                  </pic:blipFill>
+                  <pic:spPr bwMode="auto">
+                    <a:xfrm>
+                      <a:off x="0" y="0"/>
+                      <a:ext cx="1714500" cy="733425"/>
+                    </a:xfrm>
+                    <a:prstGeom prst="rect">
+                      <a:avLst/>
+                    </a:prstGeom>
+                  </pic:spPr>
+                </pic:pic>
+              </a:graphicData>
+            </a:graphic>
+          </wp:inline>
+        </w:drawing>
+      </w:r>
+    </w:p>
+    <w:p>
+      <w:pPr>
         <w:spacing w:after="0" w:before="0"/>
       </w:pPr>
       <w:r>
@@ -5629,6 +6503,52 @@
           <w:szCs w:val="22"/>
         </w:rPr>
         <w:t xml:space="preserve">beyondlimitsnow25@gmail.com</w:t>
+      </w:r>
+    </w:p>
+    <w:p>
+      <w:pPr>
+        <w:spacing w:after="360" w:before="360"/>
+        <w:jc w:val="center"/>
+      </w:pPr>
+      <w:r>
+        <w:drawing>
+          <wp:inline distT="0" distB="0" distL="0" distR="0">
+            <wp:extent cx="1714500" cy="733425"/>
+            <wp:effectExtent t="0" r="0" b="0" l="0"/>
+            <wp:docPr id="1" name="" descr="" title=""/>
+            <wp:cNvGraphicFramePr>
+              <a:graphicFrameLocks xmlns:a="http://schemas.openxmlformats.org/drawingml/2006/main" noChangeAspect="1"/>
+            </wp:cNvGraphicFramePr>
+            <a:graphic xmlns:a="http://schemas.openxmlformats.org/drawingml/2006/main">
+              <a:graphicData uri="http://schemas.openxmlformats.org/drawingml/2006/picture">
+                <pic:pic xmlns:pic="http://schemas.openxmlformats.org/drawingml/2006/picture">
+                  <pic:nvPicPr>
+                    <pic:cNvPr id="0" name="" descr=""/>
+                    <pic:cNvPicPr>
+                      <a:picLocks noChangeAspect="1" noChangeArrowheads="1"/>
+                    </pic:cNvPicPr>
+                  </pic:nvPicPr>
+                  <pic:blipFill>
+                    <a:blip r:embed="rId8" cstate="none"/>
+                    <a:srcRect/>
+                    <a:stretch>
+                      <a:fillRect/>
+                    </a:stretch>
+                  </pic:blipFill>
+                  <pic:spPr bwMode="auto">
+                    <a:xfrm>
+                      <a:off x="0" y="0"/>
+                      <a:ext cx="1714500" cy="733425"/>
+                    </a:xfrm>
+                    <a:prstGeom prst="rect">
+                      <a:avLst/>
+                    </a:prstGeom>
+                  </pic:spPr>
+                </pic:pic>
+              </a:graphicData>
+            </a:graphic>
+          </wp:inline>
+        </w:drawing>
       </w:r>
     </w:p>
     <w:p>

</xml_diff>

<commit_message>
Buch 4: Abstände harmonisiert, Impressum rechtssicher, '2. Buch in der Reihe'
</commit_message>
<xml_diff>
--- a/outputs/buch-schuldgefuehle/das-schlechte-gewissen-KDP.docx
+++ b/outputs/buch-schuldgefuehle/das-schlechte-gewissen-KDP.docx
@@ -94,13 +94,13 @@
     </w:p>
     <w:p>
       <w:pPr>
-        <w:spacing w:after="360" w:before="360"/>
+        <w:spacing w:after="200" w:before="200"/>
         <w:jc w:val="center"/>
       </w:pPr>
       <w:r>
         <w:drawing>
           <wp:inline distT="0" distB="0" distL="0" distR="0">
-            <wp:extent cx="1714500" cy="733425"/>
+            <wp:extent cx="1524000" cy="647700"/>
             <wp:effectExtent t="0" r="0" b="0" l="0"/>
             <wp:docPr id="1" name="" descr="" title=""/>
             <wp:cNvGraphicFramePr>
@@ -125,7 +125,7 @@
                   <pic:spPr bwMode="auto">
                     <a:xfrm>
                       <a:off x="0" y="0"/>
-                      <a:ext cx="1714500" cy="733425"/>
+                      <a:ext cx="1524000" cy="647700"/>
                     </a:xfrm>
                     <a:prstGeom prst="rect">
                       <a:avLst/>
@@ -148,12 +148,7 @@
     </w:p>
     <w:p>
       <w:pPr>
-        <w:spacing w:after="0" w:before="0"/>
-      </w:pPr>
-    </w:p>
-    <w:p>
-      <w:pPr>
-        <w:spacing w:after="200" w:before="480"/>
+        <w:spacing w:after="200" w:before="160"/>
       </w:pPr>
       <w:r>
         <w:rPr>
@@ -444,13 +439,13 @@
     </w:p>
     <w:p>
       <w:pPr>
-        <w:spacing w:after="360" w:before="360"/>
+        <w:spacing w:after="200" w:before="200"/>
         <w:jc w:val="center"/>
       </w:pPr>
       <w:r>
         <w:drawing>
           <wp:inline distT="0" distB="0" distL="0" distR="0">
-            <wp:extent cx="1714500" cy="733425"/>
+            <wp:extent cx="1524000" cy="647700"/>
             <wp:effectExtent t="0" r="0" b="0" l="0"/>
             <wp:docPr id="1" name="" descr="" title=""/>
             <wp:cNvGraphicFramePr>
@@ -475,7 +470,7 @@
                   <pic:spPr bwMode="auto">
                     <a:xfrm>
                       <a:off x="0" y="0"/>
-                      <a:ext cx="1714500" cy="733425"/>
+                      <a:ext cx="1524000" cy="647700"/>
                     </a:xfrm>
                     <a:prstGeom prst="rect">
                       <a:avLst/>
@@ -498,12 +493,7 @@
     </w:p>
     <w:p>
       <w:pPr>
-        <w:spacing w:after="0" w:before="0"/>
-      </w:pPr>
-    </w:p>
-    <w:p>
-      <w:pPr>
-        <w:spacing w:after="80" w:before="480"/>
+        <w:spacing w:after="80" w:before="160"/>
       </w:pPr>
       <w:r>
         <w:rPr>
@@ -877,13 +867,13 @@
     </w:p>
     <w:p>
       <w:pPr>
-        <w:spacing w:after="360" w:before="360"/>
+        <w:spacing w:after="200" w:before="200"/>
         <w:jc w:val="center"/>
       </w:pPr>
       <w:r>
         <w:drawing>
           <wp:inline distT="0" distB="0" distL="0" distR="0">
-            <wp:extent cx="1714500" cy="733425"/>
+            <wp:extent cx="1524000" cy="647700"/>
             <wp:effectExtent t="0" r="0" b="0" l="0"/>
             <wp:docPr id="1" name="" descr="" title=""/>
             <wp:cNvGraphicFramePr>
@@ -908,7 +898,7 @@
                   <pic:spPr bwMode="auto">
                     <a:xfrm>
                       <a:off x="0" y="0"/>
-                      <a:ext cx="1714500" cy="733425"/>
+                      <a:ext cx="1524000" cy="647700"/>
                     </a:xfrm>
                     <a:prstGeom prst="rect">
                       <a:avLst/>
@@ -931,12 +921,7 @@
     </w:p>
     <w:p>
       <w:pPr>
-        <w:spacing w:after="0" w:before="0"/>
-      </w:pPr>
-    </w:p>
-    <w:p>
-      <w:pPr>
-        <w:spacing w:after="80" w:before="480"/>
+        <w:spacing w:after="80" w:before="160"/>
       </w:pPr>
       <w:r>
         <w:rPr>
@@ -1340,13 +1325,13 @@
     </w:p>
     <w:p>
       <w:pPr>
-        <w:spacing w:after="360" w:before="360"/>
+        <w:spacing w:after="200" w:before="200"/>
         <w:jc w:val="center"/>
       </w:pPr>
       <w:r>
         <w:drawing>
           <wp:inline distT="0" distB="0" distL="0" distR="0">
-            <wp:extent cx="1714500" cy="733425"/>
+            <wp:extent cx="1524000" cy="647700"/>
             <wp:effectExtent t="0" r="0" b="0" l="0"/>
             <wp:docPr id="1" name="" descr="" title=""/>
             <wp:cNvGraphicFramePr>
@@ -1371,7 +1356,7 @@
                   <pic:spPr bwMode="auto">
                     <a:xfrm>
                       <a:off x="0" y="0"/>
-                      <a:ext cx="1714500" cy="733425"/>
+                      <a:ext cx="1524000" cy="647700"/>
                     </a:xfrm>
                     <a:prstGeom prst="rect">
                       <a:avLst/>
@@ -1394,12 +1379,7 @@
     </w:p>
     <w:p>
       <w:pPr>
-        <w:spacing w:after="0" w:before="0"/>
-      </w:pPr>
-    </w:p>
-    <w:p>
-      <w:pPr>
-        <w:spacing w:after="80" w:before="480"/>
+        <w:spacing w:after="80" w:before="160"/>
       </w:pPr>
       <w:r>
         <w:rPr>
@@ -1758,13 +1738,13 @@
     </w:p>
     <w:p>
       <w:pPr>
-        <w:spacing w:after="360" w:before="360"/>
+        <w:spacing w:after="200" w:before="200"/>
         <w:jc w:val="center"/>
       </w:pPr>
       <w:r>
         <w:drawing>
           <wp:inline distT="0" distB="0" distL="0" distR="0">
-            <wp:extent cx="1714500" cy="733425"/>
+            <wp:extent cx="1524000" cy="647700"/>
             <wp:effectExtent t="0" r="0" b="0" l="0"/>
             <wp:docPr id="1" name="" descr="" title=""/>
             <wp:cNvGraphicFramePr>
@@ -1789,7 +1769,7 @@
                   <pic:spPr bwMode="auto">
                     <a:xfrm>
                       <a:off x="0" y="0"/>
-                      <a:ext cx="1714500" cy="733425"/>
+                      <a:ext cx="1524000" cy="647700"/>
                     </a:xfrm>
                     <a:prstGeom prst="rect">
                       <a:avLst/>
@@ -1812,12 +1792,7 @@
     </w:p>
     <w:p>
       <w:pPr>
-        <w:spacing w:after="0" w:before="0"/>
-      </w:pPr>
-    </w:p>
-    <w:p>
-      <w:pPr>
-        <w:spacing w:after="80" w:before="480"/>
+        <w:spacing w:after="80" w:before="160"/>
       </w:pPr>
       <w:r>
         <w:rPr>
@@ -2146,13 +2121,13 @@
     </w:p>
     <w:p>
       <w:pPr>
-        <w:spacing w:after="360" w:before="360"/>
+        <w:spacing w:after="200" w:before="200"/>
         <w:jc w:val="center"/>
       </w:pPr>
       <w:r>
         <w:drawing>
           <wp:inline distT="0" distB="0" distL="0" distR="0">
-            <wp:extent cx="1714500" cy="733425"/>
+            <wp:extent cx="1524000" cy="647700"/>
             <wp:effectExtent t="0" r="0" b="0" l="0"/>
             <wp:docPr id="1" name="" descr="" title=""/>
             <wp:cNvGraphicFramePr>
@@ -2177,7 +2152,7 @@
                   <pic:spPr bwMode="auto">
                     <a:xfrm>
                       <a:off x="0" y="0"/>
-                      <a:ext cx="1714500" cy="733425"/>
+                      <a:ext cx="1524000" cy="647700"/>
                     </a:xfrm>
                     <a:prstGeom prst="rect">
                       <a:avLst/>
@@ -2200,12 +2175,7 @@
     </w:p>
     <w:p>
       <w:pPr>
-        <w:spacing w:after="0" w:before="0"/>
-      </w:pPr>
-    </w:p>
-    <w:p>
-      <w:pPr>
-        <w:spacing w:after="80" w:before="480"/>
+        <w:spacing w:after="80" w:before="160"/>
       </w:pPr>
       <w:r>
         <w:rPr>
@@ -2519,13 +2489,13 @@
     </w:p>
     <w:p>
       <w:pPr>
-        <w:spacing w:after="360" w:before="360"/>
+        <w:spacing w:after="200" w:before="200"/>
         <w:jc w:val="center"/>
       </w:pPr>
       <w:r>
         <w:drawing>
           <wp:inline distT="0" distB="0" distL="0" distR="0">
-            <wp:extent cx="1714500" cy="733425"/>
+            <wp:extent cx="1524000" cy="647700"/>
             <wp:effectExtent t="0" r="0" b="0" l="0"/>
             <wp:docPr id="1" name="" descr="" title=""/>
             <wp:cNvGraphicFramePr>
@@ -2550,7 +2520,7 @@
                   <pic:spPr bwMode="auto">
                     <a:xfrm>
                       <a:off x="0" y="0"/>
-                      <a:ext cx="1714500" cy="733425"/>
+                      <a:ext cx="1524000" cy="647700"/>
                     </a:xfrm>
                     <a:prstGeom prst="rect">
                       <a:avLst/>
@@ -2573,12 +2543,7 @@
     </w:p>
     <w:p>
       <w:pPr>
-        <w:spacing w:after="0" w:before="0"/>
-      </w:pPr>
-    </w:p>
-    <w:p>
-      <w:pPr>
-        <w:spacing w:after="80" w:before="480"/>
+        <w:spacing w:after="80" w:before="160"/>
       </w:pPr>
       <w:r>
         <w:rPr>
@@ -2892,13 +2857,13 @@
     </w:p>
     <w:p>
       <w:pPr>
-        <w:spacing w:after="360" w:before="360"/>
+        <w:spacing w:after="200" w:before="200"/>
         <w:jc w:val="center"/>
       </w:pPr>
       <w:r>
         <w:drawing>
           <wp:inline distT="0" distB="0" distL="0" distR="0">
-            <wp:extent cx="1714500" cy="733425"/>
+            <wp:extent cx="1524000" cy="647700"/>
             <wp:effectExtent t="0" r="0" b="0" l="0"/>
             <wp:docPr id="1" name="" descr="" title=""/>
             <wp:cNvGraphicFramePr>
@@ -2923,7 +2888,7 @@
                   <pic:spPr bwMode="auto">
                     <a:xfrm>
                       <a:off x="0" y="0"/>
-                      <a:ext cx="1714500" cy="733425"/>
+                      <a:ext cx="1524000" cy="647700"/>
                     </a:xfrm>
                     <a:prstGeom prst="rect">
                       <a:avLst/>
@@ -2946,12 +2911,7 @@
     </w:p>
     <w:p>
       <w:pPr>
-        <w:spacing w:after="0" w:before="0"/>
-      </w:pPr>
-    </w:p>
-    <w:p>
-      <w:pPr>
-        <w:spacing w:after="80" w:before="480"/>
+        <w:spacing w:after="80" w:before="160"/>
       </w:pPr>
       <w:r>
         <w:rPr>
@@ -3280,13 +3240,13 @@
     </w:p>
     <w:p>
       <w:pPr>
-        <w:spacing w:after="360" w:before="360"/>
+        <w:spacing w:after="200" w:before="200"/>
         <w:jc w:val="center"/>
       </w:pPr>
       <w:r>
         <w:drawing>
           <wp:inline distT="0" distB="0" distL="0" distR="0">
-            <wp:extent cx="1714500" cy="733425"/>
+            <wp:extent cx="1524000" cy="647700"/>
             <wp:effectExtent t="0" r="0" b="0" l="0"/>
             <wp:docPr id="1" name="" descr="" title=""/>
             <wp:cNvGraphicFramePr>
@@ -3311,7 +3271,7 @@
                   <pic:spPr bwMode="auto">
                     <a:xfrm>
                       <a:off x="0" y="0"/>
-                      <a:ext cx="1714500" cy="733425"/>
+                      <a:ext cx="1524000" cy="647700"/>
                     </a:xfrm>
                     <a:prstGeom prst="rect">
                       <a:avLst/>
@@ -3334,12 +3294,7 @@
     </w:p>
     <w:p>
       <w:pPr>
-        <w:spacing w:after="0" w:before="0"/>
-      </w:pPr>
-    </w:p>
-    <w:p>
-      <w:pPr>
-        <w:spacing w:after="80" w:before="480"/>
+        <w:spacing w:after="80" w:before="160"/>
       </w:pPr>
       <w:r>
         <w:rPr>
@@ -3653,13 +3608,13 @@
     </w:p>
     <w:p>
       <w:pPr>
-        <w:spacing w:after="360" w:before="360"/>
+        <w:spacing w:after="200" w:before="200"/>
         <w:jc w:val="center"/>
       </w:pPr>
       <w:r>
         <w:drawing>
           <wp:inline distT="0" distB="0" distL="0" distR="0">
-            <wp:extent cx="1714500" cy="733425"/>
+            <wp:extent cx="1524000" cy="647700"/>
             <wp:effectExtent t="0" r="0" b="0" l="0"/>
             <wp:docPr id="1" name="" descr="" title=""/>
             <wp:cNvGraphicFramePr>
@@ -3684,7 +3639,7 @@
                   <pic:spPr bwMode="auto">
                     <a:xfrm>
                       <a:off x="0" y="0"/>
-                      <a:ext cx="1714500" cy="733425"/>
+                      <a:ext cx="1524000" cy="647700"/>
                     </a:xfrm>
                     <a:prstGeom prst="rect">
                       <a:avLst/>
@@ -3707,12 +3662,7 @@
     </w:p>
     <w:p>
       <w:pPr>
-        <w:spacing w:after="0" w:before="0"/>
-      </w:pPr>
-    </w:p>
-    <w:p>
-      <w:pPr>
-        <w:spacing w:after="80" w:before="480"/>
+        <w:spacing w:after="80" w:before="160"/>
       </w:pPr>
       <w:r>
         <w:rPr>
@@ -4056,13 +4006,13 @@
     </w:p>
     <w:p>
       <w:pPr>
-        <w:spacing w:after="360" w:before="360"/>
+        <w:spacing w:after="200" w:before="200"/>
         <w:jc w:val="center"/>
       </w:pPr>
       <w:r>
         <w:drawing>
           <wp:inline distT="0" distB="0" distL="0" distR="0">
-            <wp:extent cx="1714500" cy="733425"/>
+            <wp:extent cx="1524000" cy="647700"/>
             <wp:effectExtent t="0" r="0" b="0" l="0"/>
             <wp:docPr id="1" name="" descr="" title=""/>
             <wp:cNvGraphicFramePr>
@@ -4087,7 +4037,7 @@
                   <pic:spPr bwMode="auto">
                     <a:xfrm>
                       <a:off x="0" y="0"/>
-                      <a:ext cx="1714500" cy="733425"/>
+                      <a:ext cx="1524000" cy="647700"/>
                     </a:xfrm>
                     <a:prstGeom prst="rect">
                       <a:avLst/>
@@ -4110,12 +4060,7 @@
     </w:p>
     <w:p>
       <w:pPr>
-        <w:spacing w:after="0" w:before="0"/>
-      </w:pPr>
-    </w:p>
-    <w:p>
-      <w:pPr>
-        <w:spacing w:after="80" w:before="480"/>
+        <w:spacing w:after="80" w:before="160"/>
       </w:pPr>
       <w:r>
         <w:rPr>
@@ -4414,13 +4359,13 @@
     </w:p>
     <w:p>
       <w:pPr>
-        <w:spacing w:after="360" w:before="360"/>
+        <w:spacing w:after="200" w:before="200"/>
         <w:jc w:val="center"/>
       </w:pPr>
       <w:r>
         <w:drawing>
           <wp:inline distT="0" distB="0" distL="0" distR="0">
-            <wp:extent cx="1714500" cy="733425"/>
+            <wp:extent cx="1524000" cy="647700"/>
             <wp:effectExtent t="0" r="0" b="0" l="0"/>
             <wp:docPr id="1" name="" descr="" title=""/>
             <wp:cNvGraphicFramePr>
@@ -4445,7 +4390,7 @@
                   <pic:spPr bwMode="auto">
                     <a:xfrm>
                       <a:off x="0" y="0"/>
-                      <a:ext cx="1714500" cy="733425"/>
+                      <a:ext cx="1524000" cy="647700"/>
                     </a:xfrm>
                     <a:prstGeom prst="rect">
                       <a:avLst/>
@@ -4468,12 +4413,7 @@
     </w:p>
     <w:p>
       <w:pPr>
-        <w:spacing w:after="0" w:before="0"/>
-      </w:pPr>
-    </w:p>
-    <w:p>
-      <w:pPr>
-        <w:spacing w:after="80" w:before="480"/>
+        <w:spacing w:after="80" w:before="160"/>
       </w:pPr>
       <w:r>
         <w:rPr>
@@ -4787,13 +4727,13 @@
     </w:p>
     <w:p>
       <w:pPr>
-        <w:spacing w:after="360" w:before="360"/>
+        <w:spacing w:after="200" w:before="200"/>
         <w:jc w:val="center"/>
       </w:pPr>
       <w:r>
         <w:drawing>
           <wp:inline distT="0" distB="0" distL="0" distR="0">
-            <wp:extent cx="1714500" cy="733425"/>
+            <wp:extent cx="1524000" cy="647700"/>
             <wp:effectExtent t="0" r="0" b="0" l="0"/>
             <wp:docPr id="1" name="" descr="" title=""/>
             <wp:cNvGraphicFramePr>
@@ -4818,7 +4758,7 @@
                   <pic:spPr bwMode="auto">
                     <a:xfrm>
                       <a:off x="0" y="0"/>
-                      <a:ext cx="1714500" cy="733425"/>
+                      <a:ext cx="1524000" cy="647700"/>
                     </a:xfrm>
                     <a:prstGeom prst="rect">
                       <a:avLst/>
@@ -4841,12 +4781,7 @@
     </w:p>
     <w:p>
       <w:pPr>
-        <w:spacing w:after="0" w:before="0"/>
-      </w:pPr>
-    </w:p>
-    <w:p>
-      <w:pPr>
-        <w:spacing w:after="80" w:before="480"/>
+        <w:spacing w:after="80" w:before="160"/>
       </w:pPr>
       <w:r>
         <w:rPr>
@@ -5130,13 +5065,13 @@
     </w:p>
     <w:p>
       <w:pPr>
-        <w:spacing w:after="360" w:before="360"/>
+        <w:spacing w:after="200" w:before="200"/>
         <w:jc w:val="center"/>
       </w:pPr>
       <w:r>
         <w:drawing>
           <wp:inline distT="0" distB="0" distL="0" distR="0">
-            <wp:extent cx="1714500" cy="733425"/>
+            <wp:extent cx="1524000" cy="647700"/>
             <wp:effectExtent t="0" r="0" b="0" l="0"/>
             <wp:docPr id="1" name="" descr="" title=""/>
             <wp:cNvGraphicFramePr>
@@ -5161,7 +5096,7 @@
                   <pic:spPr bwMode="auto">
                     <a:xfrm>
                       <a:off x="0" y="0"/>
-                      <a:ext cx="1714500" cy="733425"/>
+                      <a:ext cx="1524000" cy="647700"/>
                     </a:xfrm>
                     <a:prstGeom prst="rect">
                       <a:avLst/>
@@ -5184,12 +5119,7 @@
     </w:p>
     <w:p>
       <w:pPr>
-        <w:spacing w:after="0" w:before="0"/>
-      </w:pPr>
-    </w:p>
-    <w:p>
-      <w:pPr>
-        <w:spacing w:after="80" w:before="480"/>
+        <w:spacing w:after="80" w:before="160"/>
       </w:pPr>
       <w:r>
         <w:rPr>
@@ -5473,13 +5403,13 @@
     </w:p>
     <w:p>
       <w:pPr>
-        <w:spacing w:after="360" w:before="360"/>
+        <w:spacing w:after="200" w:before="200"/>
         <w:jc w:val="center"/>
       </w:pPr>
       <w:r>
         <w:drawing>
           <wp:inline distT="0" distB="0" distL="0" distR="0">
-            <wp:extent cx="1714500" cy="733425"/>
+            <wp:extent cx="1524000" cy="647700"/>
             <wp:effectExtent t="0" r="0" b="0" l="0"/>
             <wp:docPr id="1" name="" descr="" title=""/>
             <wp:cNvGraphicFramePr>
@@ -5504,7 +5434,7 @@
                   <pic:spPr bwMode="auto">
                     <a:xfrm>
                       <a:off x="0" y="0"/>
-                      <a:ext cx="1714500" cy="733425"/>
+                      <a:ext cx="1524000" cy="647700"/>
                     </a:xfrm>
                     <a:prstGeom prst="rect">
                       <a:avLst/>
@@ -5527,12 +5457,7 @@
     </w:p>
     <w:p>
       <w:pPr>
-        <w:spacing w:after="0" w:before="0"/>
-      </w:pPr>
-    </w:p>
-    <w:p>
-      <w:pPr>
-        <w:spacing w:after="80" w:before="480"/>
+        <w:spacing w:after="80" w:before="160"/>
       </w:pPr>
       <w:r>
         <w:rPr>
@@ -5878,13 +5803,13 @@
     </w:p>
     <w:p>
       <w:pPr>
-        <w:spacing w:after="360" w:before="360"/>
+        <w:spacing w:after="200" w:before="200"/>
         <w:jc w:val="center"/>
       </w:pPr>
       <w:r>
         <w:drawing>
           <wp:inline distT="0" distB="0" distL="0" distR="0">
-            <wp:extent cx="1714500" cy="733425"/>
+            <wp:extent cx="1524000" cy="647700"/>
             <wp:effectExtent t="0" r="0" b="0" l="0"/>
             <wp:docPr id="1" name="" descr="" title=""/>
             <wp:cNvGraphicFramePr>
@@ -5909,7 +5834,7 @@
                   <pic:spPr bwMode="auto">
                     <a:xfrm>
                       <a:off x="0" y="0"/>
-                      <a:ext cx="1714500" cy="733425"/>
+                      <a:ext cx="1524000" cy="647700"/>
                     </a:xfrm>
                     <a:prstGeom prst="rect">
                       <a:avLst/>
@@ -5932,7 +5857,7 @@
     </w:p>
     <w:p>
       <w:pPr>
-        <w:spacing w:after="200" w:before="480"/>
+        <w:spacing w:after="200" w:before="160"/>
       </w:pPr>
       <w:r>
         <w:rPr>
@@ -6164,13 +6089,13 @@
     </w:p>
     <w:p>
       <w:pPr>
-        <w:spacing w:after="360" w:before="360"/>
+        <w:spacing w:after="200" w:before="200"/>
         <w:jc w:val="center"/>
       </w:pPr>
       <w:r>
         <w:drawing>
           <wp:inline distT="0" distB="0" distL="0" distR="0">
-            <wp:extent cx="1714500" cy="733425"/>
+            <wp:extent cx="1524000" cy="647700"/>
             <wp:effectExtent t="0" r="0" b="0" l="0"/>
             <wp:docPr id="1" name="" descr="" title=""/>
             <wp:cNvGraphicFramePr>
@@ -6195,7 +6120,7 @@
                   <pic:spPr bwMode="auto">
                     <a:xfrm>
                       <a:off x="0" y="0"/>
-                      <a:ext cx="1714500" cy="733425"/>
+                      <a:ext cx="1524000" cy="647700"/>
                     </a:xfrm>
                     <a:prstGeom prst="rect">
                       <a:avLst/>
@@ -6218,7 +6143,7 @@
     </w:p>
     <w:p>
       <w:pPr>
-        <w:spacing w:after="200" w:before="480"/>
+        <w:spacing w:after="200" w:before="160"/>
       </w:pPr>
       <w:r>
         <w:rPr>
@@ -6264,13 +6189,13 @@
     </w:p>
     <w:p>
       <w:pPr>
-        <w:spacing w:after="360" w:before="360"/>
+        <w:spacing w:after="200" w:before="200"/>
         <w:jc w:val="center"/>
       </w:pPr>
       <w:r>
         <w:drawing>
           <wp:inline distT="0" distB="0" distL="0" distR="0">
-            <wp:extent cx="1714500" cy="733425"/>
+            <wp:extent cx="1524000" cy="647700"/>
             <wp:effectExtent t="0" r="0" b="0" l="0"/>
             <wp:docPr id="1" name="" descr="" title=""/>
             <wp:cNvGraphicFramePr>
@@ -6295,7 +6220,7 @@
                   <pic:spPr bwMode="auto">
                     <a:xfrm>
                       <a:off x="0" y="0"/>
-                      <a:ext cx="1714500" cy="733425"/>
+                      <a:ext cx="1524000" cy="647700"/>
                     </a:xfrm>
                     <a:prstGeom prst="rect">
                       <a:avLst/>
@@ -6318,7 +6243,7 @@
     </w:p>
     <w:p>
       <w:pPr>
-        <w:spacing w:after="200" w:before="480"/>
+        <w:spacing w:after="200" w:before="160"/>
       </w:pPr>
       <w:r>
         <w:rPr>
@@ -6374,7 +6299,7 @@
           <w:sz w:val="24"/>
           <w:szCs w:val="24"/>
         </w:rPr>
-        <w:t xml:space="preserve">„Das schlechte Gewissen" ist ihr viertes Buch.</w:t>
+        <w:t xml:space="preserve">„Das schlechte Gewissen“ ist ihr zweites Buch in der Safe to Thrive Reihe.</w:t>
       </w:r>
     </w:p>
     <w:p>
@@ -6393,13 +6318,13 @@
     </w:p>
     <w:p>
       <w:pPr>
-        <w:spacing w:after="360" w:before="360"/>
+        <w:spacing w:after="200" w:before="200"/>
         <w:jc w:val="center"/>
       </w:pPr>
       <w:r>
         <w:drawing>
           <wp:inline distT="0" distB="0" distL="0" distR="0">
-            <wp:extent cx="1714500" cy="733425"/>
+            <wp:extent cx="1524000" cy="647700"/>
             <wp:effectExtent t="0" r="0" b="0" l="0"/>
             <wp:docPr id="1" name="" descr="" title=""/>
             <wp:cNvGraphicFramePr>
@@ -6424,7 +6349,7 @@
                   <pic:spPr bwMode="auto">
                     <a:xfrm>
                       <a:off x="0" y="0"/>
-                      <a:ext cx="1714500" cy="733425"/>
+                      <a:ext cx="1524000" cy="647700"/>
                     </a:xfrm>
                     <a:prstGeom prst="rect">
                       <a:avLst/>
@@ -6447,7 +6372,7 @@
     </w:p>
     <w:p>
       <w:pPr>
-        <w:spacing w:after="200" w:before="480"/>
+        <w:spacing w:after="200" w:before="160"/>
       </w:pPr>
       <w:r>
         <w:rPr>
@@ -6507,13 +6432,13 @@
     </w:p>
     <w:p>
       <w:pPr>
-        <w:spacing w:after="360" w:before="360"/>
+        <w:spacing w:after="200" w:before="200"/>
         <w:jc w:val="center"/>
       </w:pPr>
       <w:r>
         <w:drawing>
           <wp:inline distT="0" distB="0" distL="0" distR="0">
-            <wp:extent cx="1714500" cy="733425"/>
+            <wp:extent cx="1524000" cy="647700"/>
             <wp:effectExtent t="0" r="0" b="0" l="0"/>
             <wp:docPr id="1" name="" descr="" title=""/>
             <wp:cNvGraphicFramePr>
@@ -6538,7 +6463,7 @@
                   <pic:spPr bwMode="auto">
                     <a:xfrm>
                       <a:off x="0" y="0"/>
-                      <a:ext cx="1714500" cy="733425"/>
+                      <a:ext cx="1524000" cy="647700"/>
                     </a:xfrm>
                     <a:prstGeom prst="rect">
                       <a:avLst/>
@@ -6561,7 +6486,7 @@
     </w:p>
     <w:p>
       <w:pPr>
-        <w:spacing w:after="200" w:before="480"/>
+        <w:spacing w:after="200" w:before="160"/>
       </w:pPr>
       <w:r>
         <w:rPr>
@@ -6617,7 +6542,7 @@
           <w:sz w:val="24"/>
           <w:szCs w:val="24"/>
         </w:rPr>
-        <w:t xml:space="preserve">Alle Rechte vorbehalten.</w:t>
+        <w:t xml:space="preserve">Alle Rechte vorbehalten. Kein Teil dieses Werkes darf ohne schriftliche Genehmigung der Autorin reproduziert, in einem Abrufsystem gespeichert oder in irgendeiner Form übertragen werden.</w:t>
       </w:r>
     </w:p>
     <w:p>
@@ -6646,7 +6571,22 @@
           <w:sz w:val="24"/>
           <w:szCs w:val="24"/>
         </w:rPr>
-        <w:t xml:space="preserve">Haftungsausschluss: Dieses Buch dient der persönlichen Orientierung und Reflexion. Es ersetzt keine professionelle therapeutische oder medizinische Behandlung. Alle beschriebenen Personen und Situationen sind Composite-Darstellungen zum Schutz der Privatsphäre. Ähnlichkeiten mit lebenden oder verstorbenen Personen sind zufällig und nicht beabsichtigt.</w:t>
+        <w:t xml:space="preserve">1. Auflage 2026</w:t>
+      </w:r>
+    </w:p>
+    <w:p>
+      <w:pPr>
+        <w:spacing w:after="180" w:before="0" w:line="360" w:lineRule="auto"/>
+        <w:jc w:val="both"/>
+      </w:pPr>
+      <w:r>
+        <w:rPr>
+          <w:rFonts w:ascii="Georgia" w:cs="Georgia" w:eastAsia="Georgia" w:hAnsi="Georgia"/>
+          <w:color w:val="2C2C2C"/>
+          <w:sz w:val="24"/>
+          <w:szCs w:val="24"/>
+        </w:rPr>
+        <w:t xml:space="preserve">Haftungsausschluss: Dieses Buch dient ausschliesslich der persönlichen Orientierung und Reflexion. Es stellt keine psychologische Beratung, Psychotherapie oder medizinische Behandlung dar und ersetzt diese nicht. Bei psychischen oder körperlichen Beschwerden wende dich bitte an eine qualifizierte Fachperson. Alle im Buch geschilderten Personen und Situationen sind Composite-Darstellungen, die zum Schutz der Privatsphäre verändert wurden. Ähnlichkeiten mit lebenden oder verstorbenen Personen sind rein zufällig und nicht beabsichtigt. Die Autorin übernimmt keine Haftung für Handlungen, die auf Grundlage der Buchinhalte vorgenommen werden.</w:t>
       </w:r>
     </w:p>
     <w:sectPr>

</xml_diff>

<commit_message>
Buch 4: Herz-Divider auf 1. und letztes reduziert
</commit_message>
<xml_diff>
--- a/outputs/buch-schuldgefuehle/das-schlechte-gewissen-KDP.docx
+++ b/outputs/buch-schuldgefuehle/das-schlechte-gewissen-KDP.docx
@@ -439,52 +439,6 @@
     </w:p>
     <w:p>
       <w:pPr>
-        <w:spacing w:after="200" w:before="200"/>
-        <w:jc w:val="center"/>
-      </w:pPr>
-      <w:r>
-        <w:drawing>
-          <wp:inline distT="0" distB="0" distL="0" distR="0">
-            <wp:extent cx="1524000" cy="647700"/>
-            <wp:effectExtent t="0" r="0" b="0" l="0"/>
-            <wp:docPr id="1" name="" descr="" title=""/>
-            <wp:cNvGraphicFramePr>
-              <a:graphicFrameLocks xmlns:a="http://schemas.openxmlformats.org/drawingml/2006/main" noChangeAspect="1"/>
-            </wp:cNvGraphicFramePr>
-            <a:graphic xmlns:a="http://schemas.openxmlformats.org/drawingml/2006/main">
-              <a:graphicData uri="http://schemas.openxmlformats.org/drawingml/2006/picture">
-                <pic:pic xmlns:pic="http://schemas.openxmlformats.org/drawingml/2006/picture">
-                  <pic:nvPicPr>
-                    <pic:cNvPr id="0" name="" descr=""/>
-                    <pic:cNvPicPr>
-                      <a:picLocks noChangeAspect="1" noChangeArrowheads="1"/>
-                    </pic:cNvPicPr>
-                  </pic:nvPicPr>
-                  <pic:blipFill>
-                    <a:blip r:embed="rId8" cstate="none"/>
-                    <a:srcRect/>
-                    <a:stretch>
-                      <a:fillRect/>
-                    </a:stretch>
-                  </pic:blipFill>
-                  <pic:spPr bwMode="auto">
-                    <a:xfrm>
-                      <a:off x="0" y="0"/>
-                      <a:ext cx="1524000" cy="647700"/>
-                    </a:xfrm>
-                    <a:prstGeom prst="rect">
-                      <a:avLst/>
-                    </a:prstGeom>
-                  </pic:spPr>
-                </pic:pic>
-              </a:graphicData>
-            </a:graphic>
-          </wp:inline>
-        </w:drawing>
-      </w:r>
-    </w:p>
-    <w:p>
-      <w:pPr>
         <w:spacing w:after="0" w:before="0"/>
       </w:pPr>
       <w:r>
@@ -867,52 +821,6 @@
     </w:p>
     <w:p>
       <w:pPr>
-        <w:spacing w:after="200" w:before="200"/>
-        <w:jc w:val="center"/>
-      </w:pPr>
-      <w:r>
-        <w:drawing>
-          <wp:inline distT="0" distB="0" distL="0" distR="0">
-            <wp:extent cx="1524000" cy="647700"/>
-            <wp:effectExtent t="0" r="0" b="0" l="0"/>
-            <wp:docPr id="1" name="" descr="" title=""/>
-            <wp:cNvGraphicFramePr>
-              <a:graphicFrameLocks xmlns:a="http://schemas.openxmlformats.org/drawingml/2006/main" noChangeAspect="1"/>
-            </wp:cNvGraphicFramePr>
-            <a:graphic xmlns:a="http://schemas.openxmlformats.org/drawingml/2006/main">
-              <a:graphicData uri="http://schemas.openxmlformats.org/drawingml/2006/picture">
-                <pic:pic xmlns:pic="http://schemas.openxmlformats.org/drawingml/2006/picture">
-                  <pic:nvPicPr>
-                    <pic:cNvPr id="0" name="" descr=""/>
-                    <pic:cNvPicPr>
-                      <a:picLocks noChangeAspect="1" noChangeArrowheads="1"/>
-                    </pic:cNvPicPr>
-                  </pic:nvPicPr>
-                  <pic:blipFill>
-                    <a:blip r:embed="rId8" cstate="none"/>
-                    <a:srcRect/>
-                    <a:stretch>
-                      <a:fillRect/>
-                    </a:stretch>
-                  </pic:blipFill>
-                  <pic:spPr bwMode="auto">
-                    <a:xfrm>
-                      <a:off x="0" y="0"/>
-                      <a:ext cx="1524000" cy="647700"/>
-                    </a:xfrm>
-                    <a:prstGeom prst="rect">
-                      <a:avLst/>
-                    </a:prstGeom>
-                  </pic:spPr>
-                </pic:pic>
-              </a:graphicData>
-            </a:graphic>
-          </wp:inline>
-        </w:drawing>
-      </w:r>
-    </w:p>
-    <w:p>
-      <w:pPr>
         <w:spacing w:after="0" w:before="0"/>
       </w:pPr>
       <w:r>
@@ -1325,52 +1233,6 @@
     </w:p>
     <w:p>
       <w:pPr>
-        <w:spacing w:after="200" w:before="200"/>
-        <w:jc w:val="center"/>
-      </w:pPr>
-      <w:r>
-        <w:drawing>
-          <wp:inline distT="0" distB="0" distL="0" distR="0">
-            <wp:extent cx="1524000" cy="647700"/>
-            <wp:effectExtent t="0" r="0" b="0" l="0"/>
-            <wp:docPr id="1" name="" descr="" title=""/>
-            <wp:cNvGraphicFramePr>
-              <a:graphicFrameLocks xmlns:a="http://schemas.openxmlformats.org/drawingml/2006/main" noChangeAspect="1"/>
-            </wp:cNvGraphicFramePr>
-            <a:graphic xmlns:a="http://schemas.openxmlformats.org/drawingml/2006/main">
-              <a:graphicData uri="http://schemas.openxmlformats.org/drawingml/2006/picture">
-                <pic:pic xmlns:pic="http://schemas.openxmlformats.org/drawingml/2006/picture">
-                  <pic:nvPicPr>
-                    <pic:cNvPr id="0" name="" descr=""/>
-                    <pic:cNvPicPr>
-                      <a:picLocks noChangeAspect="1" noChangeArrowheads="1"/>
-                    </pic:cNvPicPr>
-                  </pic:nvPicPr>
-                  <pic:blipFill>
-                    <a:blip r:embed="rId8" cstate="none"/>
-                    <a:srcRect/>
-                    <a:stretch>
-                      <a:fillRect/>
-                    </a:stretch>
-                  </pic:blipFill>
-                  <pic:spPr bwMode="auto">
-                    <a:xfrm>
-                      <a:off x="0" y="0"/>
-                      <a:ext cx="1524000" cy="647700"/>
-                    </a:xfrm>
-                    <a:prstGeom prst="rect">
-                      <a:avLst/>
-                    </a:prstGeom>
-                  </pic:spPr>
-                </pic:pic>
-              </a:graphicData>
-            </a:graphic>
-          </wp:inline>
-        </w:drawing>
-      </w:r>
-    </w:p>
-    <w:p>
-      <w:pPr>
         <w:spacing w:after="0" w:before="0"/>
       </w:pPr>
       <w:r>
@@ -1738,52 +1600,6 @@
     </w:p>
     <w:p>
       <w:pPr>
-        <w:spacing w:after="200" w:before="200"/>
-        <w:jc w:val="center"/>
-      </w:pPr>
-      <w:r>
-        <w:drawing>
-          <wp:inline distT="0" distB="0" distL="0" distR="0">
-            <wp:extent cx="1524000" cy="647700"/>
-            <wp:effectExtent t="0" r="0" b="0" l="0"/>
-            <wp:docPr id="1" name="" descr="" title=""/>
-            <wp:cNvGraphicFramePr>
-              <a:graphicFrameLocks xmlns:a="http://schemas.openxmlformats.org/drawingml/2006/main" noChangeAspect="1"/>
-            </wp:cNvGraphicFramePr>
-            <a:graphic xmlns:a="http://schemas.openxmlformats.org/drawingml/2006/main">
-              <a:graphicData uri="http://schemas.openxmlformats.org/drawingml/2006/picture">
-                <pic:pic xmlns:pic="http://schemas.openxmlformats.org/drawingml/2006/picture">
-                  <pic:nvPicPr>
-                    <pic:cNvPr id="0" name="" descr=""/>
-                    <pic:cNvPicPr>
-                      <a:picLocks noChangeAspect="1" noChangeArrowheads="1"/>
-                    </pic:cNvPicPr>
-                  </pic:nvPicPr>
-                  <pic:blipFill>
-                    <a:blip r:embed="rId8" cstate="none"/>
-                    <a:srcRect/>
-                    <a:stretch>
-                      <a:fillRect/>
-                    </a:stretch>
-                  </pic:blipFill>
-                  <pic:spPr bwMode="auto">
-                    <a:xfrm>
-                      <a:off x="0" y="0"/>
-                      <a:ext cx="1524000" cy="647700"/>
-                    </a:xfrm>
-                    <a:prstGeom prst="rect">
-                      <a:avLst/>
-                    </a:prstGeom>
-                  </pic:spPr>
-                </pic:pic>
-              </a:graphicData>
-            </a:graphic>
-          </wp:inline>
-        </w:drawing>
-      </w:r>
-    </w:p>
-    <w:p>
-      <w:pPr>
         <w:spacing w:after="0" w:before="0"/>
       </w:pPr>
       <w:r>
@@ -2121,52 +1937,6 @@
     </w:p>
     <w:p>
       <w:pPr>
-        <w:spacing w:after="200" w:before="200"/>
-        <w:jc w:val="center"/>
-      </w:pPr>
-      <w:r>
-        <w:drawing>
-          <wp:inline distT="0" distB="0" distL="0" distR="0">
-            <wp:extent cx="1524000" cy="647700"/>
-            <wp:effectExtent t="0" r="0" b="0" l="0"/>
-            <wp:docPr id="1" name="" descr="" title=""/>
-            <wp:cNvGraphicFramePr>
-              <a:graphicFrameLocks xmlns:a="http://schemas.openxmlformats.org/drawingml/2006/main" noChangeAspect="1"/>
-            </wp:cNvGraphicFramePr>
-            <a:graphic xmlns:a="http://schemas.openxmlformats.org/drawingml/2006/main">
-              <a:graphicData uri="http://schemas.openxmlformats.org/drawingml/2006/picture">
-                <pic:pic xmlns:pic="http://schemas.openxmlformats.org/drawingml/2006/picture">
-                  <pic:nvPicPr>
-                    <pic:cNvPr id="0" name="" descr=""/>
-                    <pic:cNvPicPr>
-                      <a:picLocks noChangeAspect="1" noChangeArrowheads="1"/>
-                    </pic:cNvPicPr>
-                  </pic:nvPicPr>
-                  <pic:blipFill>
-                    <a:blip r:embed="rId8" cstate="none"/>
-                    <a:srcRect/>
-                    <a:stretch>
-                      <a:fillRect/>
-                    </a:stretch>
-                  </pic:blipFill>
-                  <pic:spPr bwMode="auto">
-                    <a:xfrm>
-                      <a:off x="0" y="0"/>
-                      <a:ext cx="1524000" cy="647700"/>
-                    </a:xfrm>
-                    <a:prstGeom prst="rect">
-                      <a:avLst/>
-                    </a:prstGeom>
-                  </pic:spPr>
-                </pic:pic>
-              </a:graphicData>
-            </a:graphic>
-          </wp:inline>
-        </w:drawing>
-      </w:r>
-    </w:p>
-    <w:p>
-      <w:pPr>
         <w:spacing w:after="0" w:before="0"/>
       </w:pPr>
       <w:r>
@@ -2489,52 +2259,6 @@
     </w:p>
     <w:p>
       <w:pPr>
-        <w:spacing w:after="200" w:before="200"/>
-        <w:jc w:val="center"/>
-      </w:pPr>
-      <w:r>
-        <w:drawing>
-          <wp:inline distT="0" distB="0" distL="0" distR="0">
-            <wp:extent cx="1524000" cy="647700"/>
-            <wp:effectExtent t="0" r="0" b="0" l="0"/>
-            <wp:docPr id="1" name="" descr="" title=""/>
-            <wp:cNvGraphicFramePr>
-              <a:graphicFrameLocks xmlns:a="http://schemas.openxmlformats.org/drawingml/2006/main" noChangeAspect="1"/>
-            </wp:cNvGraphicFramePr>
-            <a:graphic xmlns:a="http://schemas.openxmlformats.org/drawingml/2006/main">
-              <a:graphicData uri="http://schemas.openxmlformats.org/drawingml/2006/picture">
-                <pic:pic xmlns:pic="http://schemas.openxmlformats.org/drawingml/2006/picture">
-                  <pic:nvPicPr>
-                    <pic:cNvPr id="0" name="" descr=""/>
-                    <pic:cNvPicPr>
-                      <a:picLocks noChangeAspect="1" noChangeArrowheads="1"/>
-                    </pic:cNvPicPr>
-                  </pic:nvPicPr>
-                  <pic:blipFill>
-                    <a:blip r:embed="rId8" cstate="none"/>
-                    <a:srcRect/>
-                    <a:stretch>
-                      <a:fillRect/>
-                    </a:stretch>
-                  </pic:blipFill>
-                  <pic:spPr bwMode="auto">
-                    <a:xfrm>
-                      <a:off x="0" y="0"/>
-                      <a:ext cx="1524000" cy="647700"/>
-                    </a:xfrm>
-                    <a:prstGeom prst="rect">
-                      <a:avLst/>
-                    </a:prstGeom>
-                  </pic:spPr>
-                </pic:pic>
-              </a:graphicData>
-            </a:graphic>
-          </wp:inline>
-        </w:drawing>
-      </w:r>
-    </w:p>
-    <w:p>
-      <w:pPr>
         <w:spacing w:after="0" w:before="0"/>
       </w:pPr>
       <w:r>
@@ -2857,52 +2581,6 @@
     </w:p>
     <w:p>
       <w:pPr>
-        <w:spacing w:after="200" w:before="200"/>
-        <w:jc w:val="center"/>
-      </w:pPr>
-      <w:r>
-        <w:drawing>
-          <wp:inline distT="0" distB="0" distL="0" distR="0">
-            <wp:extent cx="1524000" cy="647700"/>
-            <wp:effectExtent t="0" r="0" b="0" l="0"/>
-            <wp:docPr id="1" name="" descr="" title=""/>
-            <wp:cNvGraphicFramePr>
-              <a:graphicFrameLocks xmlns:a="http://schemas.openxmlformats.org/drawingml/2006/main" noChangeAspect="1"/>
-            </wp:cNvGraphicFramePr>
-            <a:graphic xmlns:a="http://schemas.openxmlformats.org/drawingml/2006/main">
-              <a:graphicData uri="http://schemas.openxmlformats.org/drawingml/2006/picture">
-                <pic:pic xmlns:pic="http://schemas.openxmlformats.org/drawingml/2006/picture">
-                  <pic:nvPicPr>
-                    <pic:cNvPr id="0" name="" descr=""/>
-                    <pic:cNvPicPr>
-                      <a:picLocks noChangeAspect="1" noChangeArrowheads="1"/>
-                    </pic:cNvPicPr>
-                  </pic:nvPicPr>
-                  <pic:blipFill>
-                    <a:blip r:embed="rId8" cstate="none"/>
-                    <a:srcRect/>
-                    <a:stretch>
-                      <a:fillRect/>
-                    </a:stretch>
-                  </pic:blipFill>
-                  <pic:spPr bwMode="auto">
-                    <a:xfrm>
-                      <a:off x="0" y="0"/>
-                      <a:ext cx="1524000" cy="647700"/>
-                    </a:xfrm>
-                    <a:prstGeom prst="rect">
-                      <a:avLst/>
-                    </a:prstGeom>
-                  </pic:spPr>
-                </pic:pic>
-              </a:graphicData>
-            </a:graphic>
-          </wp:inline>
-        </w:drawing>
-      </w:r>
-    </w:p>
-    <w:p>
-      <w:pPr>
         <w:spacing w:after="0" w:before="0"/>
       </w:pPr>
       <w:r>
@@ -3240,52 +2918,6 @@
     </w:p>
     <w:p>
       <w:pPr>
-        <w:spacing w:after="200" w:before="200"/>
-        <w:jc w:val="center"/>
-      </w:pPr>
-      <w:r>
-        <w:drawing>
-          <wp:inline distT="0" distB="0" distL="0" distR="0">
-            <wp:extent cx="1524000" cy="647700"/>
-            <wp:effectExtent t="0" r="0" b="0" l="0"/>
-            <wp:docPr id="1" name="" descr="" title=""/>
-            <wp:cNvGraphicFramePr>
-              <a:graphicFrameLocks xmlns:a="http://schemas.openxmlformats.org/drawingml/2006/main" noChangeAspect="1"/>
-            </wp:cNvGraphicFramePr>
-            <a:graphic xmlns:a="http://schemas.openxmlformats.org/drawingml/2006/main">
-              <a:graphicData uri="http://schemas.openxmlformats.org/drawingml/2006/picture">
-                <pic:pic xmlns:pic="http://schemas.openxmlformats.org/drawingml/2006/picture">
-                  <pic:nvPicPr>
-                    <pic:cNvPr id="0" name="" descr=""/>
-                    <pic:cNvPicPr>
-                      <a:picLocks noChangeAspect="1" noChangeArrowheads="1"/>
-                    </pic:cNvPicPr>
-                  </pic:nvPicPr>
-                  <pic:blipFill>
-                    <a:blip r:embed="rId8" cstate="none"/>
-                    <a:srcRect/>
-                    <a:stretch>
-                      <a:fillRect/>
-                    </a:stretch>
-                  </pic:blipFill>
-                  <pic:spPr bwMode="auto">
-                    <a:xfrm>
-                      <a:off x="0" y="0"/>
-                      <a:ext cx="1524000" cy="647700"/>
-                    </a:xfrm>
-                    <a:prstGeom prst="rect">
-                      <a:avLst/>
-                    </a:prstGeom>
-                  </pic:spPr>
-                </pic:pic>
-              </a:graphicData>
-            </a:graphic>
-          </wp:inline>
-        </w:drawing>
-      </w:r>
-    </w:p>
-    <w:p>
-      <w:pPr>
         <w:spacing w:after="0" w:before="0"/>
       </w:pPr>
       <w:r>
@@ -3608,52 +3240,6 @@
     </w:p>
     <w:p>
       <w:pPr>
-        <w:spacing w:after="200" w:before="200"/>
-        <w:jc w:val="center"/>
-      </w:pPr>
-      <w:r>
-        <w:drawing>
-          <wp:inline distT="0" distB="0" distL="0" distR="0">
-            <wp:extent cx="1524000" cy="647700"/>
-            <wp:effectExtent t="0" r="0" b="0" l="0"/>
-            <wp:docPr id="1" name="" descr="" title=""/>
-            <wp:cNvGraphicFramePr>
-              <a:graphicFrameLocks xmlns:a="http://schemas.openxmlformats.org/drawingml/2006/main" noChangeAspect="1"/>
-            </wp:cNvGraphicFramePr>
-            <a:graphic xmlns:a="http://schemas.openxmlformats.org/drawingml/2006/main">
-              <a:graphicData uri="http://schemas.openxmlformats.org/drawingml/2006/picture">
-                <pic:pic xmlns:pic="http://schemas.openxmlformats.org/drawingml/2006/picture">
-                  <pic:nvPicPr>
-                    <pic:cNvPr id="0" name="" descr=""/>
-                    <pic:cNvPicPr>
-                      <a:picLocks noChangeAspect="1" noChangeArrowheads="1"/>
-                    </pic:cNvPicPr>
-                  </pic:nvPicPr>
-                  <pic:blipFill>
-                    <a:blip r:embed="rId8" cstate="none"/>
-                    <a:srcRect/>
-                    <a:stretch>
-                      <a:fillRect/>
-                    </a:stretch>
-                  </pic:blipFill>
-                  <pic:spPr bwMode="auto">
-                    <a:xfrm>
-                      <a:off x="0" y="0"/>
-                      <a:ext cx="1524000" cy="647700"/>
-                    </a:xfrm>
-                    <a:prstGeom prst="rect">
-                      <a:avLst/>
-                    </a:prstGeom>
-                  </pic:spPr>
-                </pic:pic>
-              </a:graphicData>
-            </a:graphic>
-          </wp:inline>
-        </w:drawing>
-      </w:r>
-    </w:p>
-    <w:p>
-      <w:pPr>
         <w:spacing w:after="0" w:before="0"/>
       </w:pPr>
       <w:r>
@@ -4006,52 +3592,6 @@
     </w:p>
     <w:p>
       <w:pPr>
-        <w:spacing w:after="200" w:before="200"/>
-        <w:jc w:val="center"/>
-      </w:pPr>
-      <w:r>
-        <w:drawing>
-          <wp:inline distT="0" distB="0" distL="0" distR="0">
-            <wp:extent cx="1524000" cy="647700"/>
-            <wp:effectExtent t="0" r="0" b="0" l="0"/>
-            <wp:docPr id="1" name="" descr="" title=""/>
-            <wp:cNvGraphicFramePr>
-              <a:graphicFrameLocks xmlns:a="http://schemas.openxmlformats.org/drawingml/2006/main" noChangeAspect="1"/>
-            </wp:cNvGraphicFramePr>
-            <a:graphic xmlns:a="http://schemas.openxmlformats.org/drawingml/2006/main">
-              <a:graphicData uri="http://schemas.openxmlformats.org/drawingml/2006/picture">
-                <pic:pic xmlns:pic="http://schemas.openxmlformats.org/drawingml/2006/picture">
-                  <pic:nvPicPr>
-                    <pic:cNvPr id="0" name="" descr=""/>
-                    <pic:cNvPicPr>
-                      <a:picLocks noChangeAspect="1" noChangeArrowheads="1"/>
-                    </pic:cNvPicPr>
-                  </pic:nvPicPr>
-                  <pic:blipFill>
-                    <a:blip r:embed="rId8" cstate="none"/>
-                    <a:srcRect/>
-                    <a:stretch>
-                      <a:fillRect/>
-                    </a:stretch>
-                  </pic:blipFill>
-                  <pic:spPr bwMode="auto">
-                    <a:xfrm>
-                      <a:off x="0" y="0"/>
-                      <a:ext cx="1524000" cy="647700"/>
-                    </a:xfrm>
-                    <a:prstGeom prst="rect">
-                      <a:avLst/>
-                    </a:prstGeom>
-                  </pic:spPr>
-                </pic:pic>
-              </a:graphicData>
-            </a:graphic>
-          </wp:inline>
-        </w:drawing>
-      </w:r>
-    </w:p>
-    <w:p>
-      <w:pPr>
         <w:spacing w:after="0" w:before="0"/>
       </w:pPr>
       <w:r>
@@ -4359,52 +3899,6 @@
     </w:p>
     <w:p>
       <w:pPr>
-        <w:spacing w:after="200" w:before="200"/>
-        <w:jc w:val="center"/>
-      </w:pPr>
-      <w:r>
-        <w:drawing>
-          <wp:inline distT="0" distB="0" distL="0" distR="0">
-            <wp:extent cx="1524000" cy="647700"/>
-            <wp:effectExtent t="0" r="0" b="0" l="0"/>
-            <wp:docPr id="1" name="" descr="" title=""/>
-            <wp:cNvGraphicFramePr>
-              <a:graphicFrameLocks xmlns:a="http://schemas.openxmlformats.org/drawingml/2006/main" noChangeAspect="1"/>
-            </wp:cNvGraphicFramePr>
-            <a:graphic xmlns:a="http://schemas.openxmlformats.org/drawingml/2006/main">
-              <a:graphicData uri="http://schemas.openxmlformats.org/drawingml/2006/picture">
-                <pic:pic xmlns:pic="http://schemas.openxmlformats.org/drawingml/2006/picture">
-                  <pic:nvPicPr>
-                    <pic:cNvPr id="0" name="" descr=""/>
-                    <pic:cNvPicPr>
-                      <a:picLocks noChangeAspect="1" noChangeArrowheads="1"/>
-                    </pic:cNvPicPr>
-                  </pic:nvPicPr>
-                  <pic:blipFill>
-                    <a:blip r:embed="rId8" cstate="none"/>
-                    <a:srcRect/>
-                    <a:stretch>
-                      <a:fillRect/>
-                    </a:stretch>
-                  </pic:blipFill>
-                  <pic:spPr bwMode="auto">
-                    <a:xfrm>
-                      <a:off x="0" y="0"/>
-                      <a:ext cx="1524000" cy="647700"/>
-                    </a:xfrm>
-                    <a:prstGeom prst="rect">
-                      <a:avLst/>
-                    </a:prstGeom>
-                  </pic:spPr>
-                </pic:pic>
-              </a:graphicData>
-            </a:graphic>
-          </wp:inline>
-        </w:drawing>
-      </w:r>
-    </w:p>
-    <w:p>
-      <w:pPr>
         <w:spacing w:after="0" w:before="0"/>
       </w:pPr>
       <w:r>
@@ -4727,52 +4221,6 @@
     </w:p>
     <w:p>
       <w:pPr>
-        <w:spacing w:after="200" w:before="200"/>
-        <w:jc w:val="center"/>
-      </w:pPr>
-      <w:r>
-        <w:drawing>
-          <wp:inline distT="0" distB="0" distL="0" distR="0">
-            <wp:extent cx="1524000" cy="647700"/>
-            <wp:effectExtent t="0" r="0" b="0" l="0"/>
-            <wp:docPr id="1" name="" descr="" title=""/>
-            <wp:cNvGraphicFramePr>
-              <a:graphicFrameLocks xmlns:a="http://schemas.openxmlformats.org/drawingml/2006/main" noChangeAspect="1"/>
-            </wp:cNvGraphicFramePr>
-            <a:graphic xmlns:a="http://schemas.openxmlformats.org/drawingml/2006/main">
-              <a:graphicData uri="http://schemas.openxmlformats.org/drawingml/2006/picture">
-                <pic:pic xmlns:pic="http://schemas.openxmlformats.org/drawingml/2006/picture">
-                  <pic:nvPicPr>
-                    <pic:cNvPr id="0" name="" descr=""/>
-                    <pic:cNvPicPr>
-                      <a:picLocks noChangeAspect="1" noChangeArrowheads="1"/>
-                    </pic:cNvPicPr>
-                  </pic:nvPicPr>
-                  <pic:blipFill>
-                    <a:blip r:embed="rId8" cstate="none"/>
-                    <a:srcRect/>
-                    <a:stretch>
-                      <a:fillRect/>
-                    </a:stretch>
-                  </pic:blipFill>
-                  <pic:spPr bwMode="auto">
-                    <a:xfrm>
-                      <a:off x="0" y="0"/>
-                      <a:ext cx="1524000" cy="647700"/>
-                    </a:xfrm>
-                    <a:prstGeom prst="rect">
-                      <a:avLst/>
-                    </a:prstGeom>
-                  </pic:spPr>
-                </pic:pic>
-              </a:graphicData>
-            </a:graphic>
-          </wp:inline>
-        </w:drawing>
-      </w:r>
-    </w:p>
-    <w:p>
-      <w:pPr>
         <w:spacing w:after="0" w:before="0"/>
       </w:pPr>
       <w:r>
@@ -5065,52 +4513,6 @@
     </w:p>
     <w:p>
       <w:pPr>
-        <w:spacing w:after="200" w:before="200"/>
-        <w:jc w:val="center"/>
-      </w:pPr>
-      <w:r>
-        <w:drawing>
-          <wp:inline distT="0" distB="0" distL="0" distR="0">
-            <wp:extent cx="1524000" cy="647700"/>
-            <wp:effectExtent t="0" r="0" b="0" l="0"/>
-            <wp:docPr id="1" name="" descr="" title=""/>
-            <wp:cNvGraphicFramePr>
-              <a:graphicFrameLocks xmlns:a="http://schemas.openxmlformats.org/drawingml/2006/main" noChangeAspect="1"/>
-            </wp:cNvGraphicFramePr>
-            <a:graphic xmlns:a="http://schemas.openxmlformats.org/drawingml/2006/main">
-              <a:graphicData uri="http://schemas.openxmlformats.org/drawingml/2006/picture">
-                <pic:pic xmlns:pic="http://schemas.openxmlformats.org/drawingml/2006/picture">
-                  <pic:nvPicPr>
-                    <pic:cNvPr id="0" name="" descr=""/>
-                    <pic:cNvPicPr>
-                      <a:picLocks noChangeAspect="1" noChangeArrowheads="1"/>
-                    </pic:cNvPicPr>
-                  </pic:nvPicPr>
-                  <pic:blipFill>
-                    <a:blip r:embed="rId8" cstate="none"/>
-                    <a:srcRect/>
-                    <a:stretch>
-                      <a:fillRect/>
-                    </a:stretch>
-                  </pic:blipFill>
-                  <pic:spPr bwMode="auto">
-                    <a:xfrm>
-                      <a:off x="0" y="0"/>
-                      <a:ext cx="1524000" cy="647700"/>
-                    </a:xfrm>
-                    <a:prstGeom prst="rect">
-                      <a:avLst/>
-                    </a:prstGeom>
-                  </pic:spPr>
-                </pic:pic>
-              </a:graphicData>
-            </a:graphic>
-          </wp:inline>
-        </w:drawing>
-      </w:r>
-    </w:p>
-    <w:p>
-      <w:pPr>
         <w:spacing w:after="0" w:before="0"/>
       </w:pPr>
       <w:r>
@@ -5403,52 +4805,6 @@
     </w:p>
     <w:p>
       <w:pPr>
-        <w:spacing w:after="200" w:before="200"/>
-        <w:jc w:val="center"/>
-      </w:pPr>
-      <w:r>
-        <w:drawing>
-          <wp:inline distT="0" distB="0" distL="0" distR="0">
-            <wp:extent cx="1524000" cy="647700"/>
-            <wp:effectExtent t="0" r="0" b="0" l="0"/>
-            <wp:docPr id="1" name="" descr="" title=""/>
-            <wp:cNvGraphicFramePr>
-              <a:graphicFrameLocks xmlns:a="http://schemas.openxmlformats.org/drawingml/2006/main" noChangeAspect="1"/>
-            </wp:cNvGraphicFramePr>
-            <a:graphic xmlns:a="http://schemas.openxmlformats.org/drawingml/2006/main">
-              <a:graphicData uri="http://schemas.openxmlformats.org/drawingml/2006/picture">
-                <pic:pic xmlns:pic="http://schemas.openxmlformats.org/drawingml/2006/picture">
-                  <pic:nvPicPr>
-                    <pic:cNvPr id="0" name="" descr=""/>
-                    <pic:cNvPicPr>
-                      <a:picLocks noChangeAspect="1" noChangeArrowheads="1"/>
-                    </pic:cNvPicPr>
-                  </pic:nvPicPr>
-                  <pic:blipFill>
-                    <a:blip r:embed="rId8" cstate="none"/>
-                    <a:srcRect/>
-                    <a:stretch>
-                      <a:fillRect/>
-                    </a:stretch>
-                  </pic:blipFill>
-                  <pic:spPr bwMode="auto">
-                    <a:xfrm>
-                      <a:off x="0" y="0"/>
-                      <a:ext cx="1524000" cy="647700"/>
-                    </a:xfrm>
-                    <a:prstGeom prst="rect">
-                      <a:avLst/>
-                    </a:prstGeom>
-                  </pic:spPr>
-                </pic:pic>
-              </a:graphicData>
-            </a:graphic>
-          </wp:inline>
-        </w:drawing>
-      </w:r>
-    </w:p>
-    <w:p>
-      <w:pPr>
         <w:spacing w:after="0" w:before="0"/>
       </w:pPr>
       <w:r>
@@ -5803,52 +5159,6 @@
     </w:p>
     <w:p>
       <w:pPr>
-        <w:spacing w:after="200" w:before="200"/>
-        <w:jc w:val="center"/>
-      </w:pPr>
-      <w:r>
-        <w:drawing>
-          <wp:inline distT="0" distB="0" distL="0" distR="0">
-            <wp:extent cx="1524000" cy="647700"/>
-            <wp:effectExtent t="0" r="0" b="0" l="0"/>
-            <wp:docPr id="1" name="" descr="" title=""/>
-            <wp:cNvGraphicFramePr>
-              <a:graphicFrameLocks xmlns:a="http://schemas.openxmlformats.org/drawingml/2006/main" noChangeAspect="1"/>
-            </wp:cNvGraphicFramePr>
-            <a:graphic xmlns:a="http://schemas.openxmlformats.org/drawingml/2006/main">
-              <a:graphicData uri="http://schemas.openxmlformats.org/drawingml/2006/picture">
-                <pic:pic xmlns:pic="http://schemas.openxmlformats.org/drawingml/2006/picture">
-                  <pic:nvPicPr>
-                    <pic:cNvPr id="0" name="" descr=""/>
-                    <pic:cNvPicPr>
-                      <a:picLocks noChangeAspect="1" noChangeArrowheads="1"/>
-                    </pic:cNvPicPr>
-                  </pic:nvPicPr>
-                  <pic:blipFill>
-                    <a:blip r:embed="rId8" cstate="none"/>
-                    <a:srcRect/>
-                    <a:stretch>
-                      <a:fillRect/>
-                    </a:stretch>
-                  </pic:blipFill>
-                  <pic:spPr bwMode="auto">
-                    <a:xfrm>
-                      <a:off x="0" y="0"/>
-                      <a:ext cx="1524000" cy="647700"/>
-                    </a:xfrm>
-                    <a:prstGeom prst="rect">
-                      <a:avLst/>
-                    </a:prstGeom>
-                  </pic:spPr>
-                </pic:pic>
-              </a:graphicData>
-            </a:graphic>
-          </wp:inline>
-        </w:drawing>
-      </w:r>
-    </w:p>
-    <w:p>
-      <w:pPr>
         <w:spacing w:after="0" w:before="0"/>
       </w:pPr>
       <w:r>
@@ -6089,52 +5399,6 @@
     </w:p>
     <w:p>
       <w:pPr>
-        <w:spacing w:after="200" w:before="200"/>
-        <w:jc w:val="center"/>
-      </w:pPr>
-      <w:r>
-        <w:drawing>
-          <wp:inline distT="0" distB="0" distL="0" distR="0">
-            <wp:extent cx="1524000" cy="647700"/>
-            <wp:effectExtent t="0" r="0" b="0" l="0"/>
-            <wp:docPr id="1" name="" descr="" title=""/>
-            <wp:cNvGraphicFramePr>
-              <a:graphicFrameLocks xmlns:a="http://schemas.openxmlformats.org/drawingml/2006/main" noChangeAspect="1"/>
-            </wp:cNvGraphicFramePr>
-            <a:graphic xmlns:a="http://schemas.openxmlformats.org/drawingml/2006/main">
-              <a:graphicData uri="http://schemas.openxmlformats.org/drawingml/2006/picture">
-                <pic:pic xmlns:pic="http://schemas.openxmlformats.org/drawingml/2006/picture">
-                  <pic:nvPicPr>
-                    <pic:cNvPr id="0" name="" descr=""/>
-                    <pic:cNvPicPr>
-                      <a:picLocks noChangeAspect="1" noChangeArrowheads="1"/>
-                    </pic:cNvPicPr>
-                  </pic:nvPicPr>
-                  <pic:blipFill>
-                    <a:blip r:embed="rId8" cstate="none"/>
-                    <a:srcRect/>
-                    <a:stretch>
-                      <a:fillRect/>
-                    </a:stretch>
-                  </pic:blipFill>
-                  <pic:spPr bwMode="auto">
-                    <a:xfrm>
-                      <a:off x="0" y="0"/>
-                      <a:ext cx="1524000" cy="647700"/>
-                    </a:xfrm>
-                    <a:prstGeom prst="rect">
-                      <a:avLst/>
-                    </a:prstGeom>
-                  </pic:spPr>
-                </pic:pic>
-              </a:graphicData>
-            </a:graphic>
-          </wp:inline>
-        </w:drawing>
-      </w:r>
-    </w:p>
-    <w:p>
-      <w:pPr>
         <w:spacing w:after="0" w:before="0"/>
       </w:pPr>
       <w:r>
@@ -6189,52 +5453,6 @@
     </w:p>
     <w:p>
       <w:pPr>
-        <w:spacing w:after="200" w:before="200"/>
-        <w:jc w:val="center"/>
-      </w:pPr>
-      <w:r>
-        <w:drawing>
-          <wp:inline distT="0" distB="0" distL="0" distR="0">
-            <wp:extent cx="1524000" cy="647700"/>
-            <wp:effectExtent t="0" r="0" b="0" l="0"/>
-            <wp:docPr id="1" name="" descr="" title=""/>
-            <wp:cNvGraphicFramePr>
-              <a:graphicFrameLocks xmlns:a="http://schemas.openxmlformats.org/drawingml/2006/main" noChangeAspect="1"/>
-            </wp:cNvGraphicFramePr>
-            <a:graphic xmlns:a="http://schemas.openxmlformats.org/drawingml/2006/main">
-              <a:graphicData uri="http://schemas.openxmlformats.org/drawingml/2006/picture">
-                <pic:pic xmlns:pic="http://schemas.openxmlformats.org/drawingml/2006/picture">
-                  <pic:nvPicPr>
-                    <pic:cNvPr id="0" name="" descr=""/>
-                    <pic:cNvPicPr>
-                      <a:picLocks noChangeAspect="1" noChangeArrowheads="1"/>
-                    </pic:cNvPicPr>
-                  </pic:nvPicPr>
-                  <pic:blipFill>
-                    <a:blip r:embed="rId8" cstate="none"/>
-                    <a:srcRect/>
-                    <a:stretch>
-                      <a:fillRect/>
-                    </a:stretch>
-                  </pic:blipFill>
-                  <pic:spPr bwMode="auto">
-                    <a:xfrm>
-                      <a:off x="0" y="0"/>
-                      <a:ext cx="1524000" cy="647700"/>
-                    </a:xfrm>
-                    <a:prstGeom prst="rect">
-                      <a:avLst/>
-                    </a:prstGeom>
-                  </pic:spPr>
-                </pic:pic>
-              </a:graphicData>
-            </a:graphic>
-          </wp:inline>
-        </w:drawing>
-      </w:r>
-    </w:p>
-    <w:p>
-      <w:pPr>
         <w:spacing w:after="0" w:before="0"/>
       </w:pPr>
       <w:r>
@@ -6314,52 +5532,6 @@
           <w:szCs w:val="22"/>
         </w:rPr>
         <w:t xml:space="preserve">beyondlimitsnow25@gmail.com</w:t>
-      </w:r>
-    </w:p>
-    <w:p>
-      <w:pPr>
-        <w:spacing w:after="200" w:before="200"/>
-        <w:jc w:val="center"/>
-      </w:pPr>
-      <w:r>
-        <w:drawing>
-          <wp:inline distT="0" distB="0" distL="0" distR="0">
-            <wp:extent cx="1524000" cy="647700"/>
-            <wp:effectExtent t="0" r="0" b="0" l="0"/>
-            <wp:docPr id="1" name="" descr="" title=""/>
-            <wp:cNvGraphicFramePr>
-              <a:graphicFrameLocks xmlns:a="http://schemas.openxmlformats.org/drawingml/2006/main" noChangeAspect="1"/>
-            </wp:cNvGraphicFramePr>
-            <a:graphic xmlns:a="http://schemas.openxmlformats.org/drawingml/2006/main">
-              <a:graphicData uri="http://schemas.openxmlformats.org/drawingml/2006/picture">
-                <pic:pic xmlns:pic="http://schemas.openxmlformats.org/drawingml/2006/picture">
-                  <pic:nvPicPr>
-                    <pic:cNvPr id="0" name="" descr=""/>
-                    <pic:cNvPicPr>
-                      <a:picLocks noChangeAspect="1" noChangeArrowheads="1"/>
-                    </pic:cNvPicPr>
-                  </pic:nvPicPr>
-                  <pic:blipFill>
-                    <a:blip r:embed="rId8" cstate="none"/>
-                    <a:srcRect/>
-                    <a:stretch>
-                      <a:fillRect/>
-                    </a:stretch>
-                  </pic:blipFill>
-                  <pic:spPr bwMode="auto">
-                    <a:xfrm>
-                      <a:off x="0" y="0"/>
-                      <a:ext cx="1524000" cy="647700"/>
-                    </a:xfrm>
-                    <a:prstGeom prst="rect">
-                      <a:avLst/>
-                    </a:prstGeom>
-                  </pic:spPr>
-                </pic:pic>
-              </a:graphicData>
-            </a:graphic>
-          </wp:inline>
-        </w:drawing>
       </w:r>
     </w:p>
     <w:p>

</xml_diff>

<commit_message>
Buch 4: Leerseiten behoben, pageBreakBefore für Kapitel, Titelseite kompakter
</commit_message>
<xml_diff>
--- a/outputs/buch-schuldgefuehle/das-schlechte-gewissen-KDP.docx
+++ b/outputs/buch-schuldgefuehle/das-schlechte-gewissen-KDP.docx
@@ -4,7 +4,7 @@
   <w:body>
     <w:p>
       <w:pPr>
-        <w:spacing w:after="1152" w:before="0"/>
+        <w:spacing w:after="288" w:before="0"/>
       </w:pPr>
     </w:p>
     <w:p>
@@ -60,7 +60,7 @@
     </w:p>
     <w:p>
       <w:pPr>
-        <w:spacing w:after="480" w:before="0"/>
+        <w:spacing w:after="200" w:before="0"/>
         <w:jc w:val="center"/>
       </w:pPr>
       <w:r>
@@ -148,7 +148,7 @@
     </w:p>
     <w:p>
       <w:pPr>
-        <w:spacing w:after="200" w:before="160"/>
+        <w:spacing w:after="200" w:before="120"/>
       </w:pPr>
       <w:r>
         <w:rPr>
@@ -439,15 +439,8 @@
     </w:p>
     <w:p>
       <w:pPr>
-        <w:spacing w:after="0" w:before="0"/>
-      </w:pPr>
-      <w:r>
-        <w:br w:type="page"/>
-      </w:r>
-    </w:p>
-    <w:p>
-      <w:pPr>
-        <w:spacing w:after="80" w:before="160"/>
+        <w:pageBreakBefore/>
+        <w:spacing w:after="80" w:before="120"/>
       </w:pPr>
       <w:r>
         <w:rPr>
@@ -821,15 +814,8 @@
     </w:p>
     <w:p>
       <w:pPr>
-        <w:spacing w:after="0" w:before="0"/>
-      </w:pPr>
-      <w:r>
-        <w:br w:type="page"/>
-      </w:r>
-    </w:p>
-    <w:p>
-      <w:pPr>
-        <w:spacing w:after="80" w:before="160"/>
+        <w:pageBreakBefore/>
+        <w:spacing w:after="80" w:before="120"/>
       </w:pPr>
       <w:r>
         <w:rPr>
@@ -1233,15 +1219,8 @@
     </w:p>
     <w:p>
       <w:pPr>
-        <w:spacing w:after="0" w:before="0"/>
-      </w:pPr>
-      <w:r>
-        <w:br w:type="page"/>
-      </w:r>
-    </w:p>
-    <w:p>
-      <w:pPr>
-        <w:spacing w:after="80" w:before="160"/>
+        <w:pageBreakBefore/>
+        <w:spacing w:after="80" w:before="120"/>
       </w:pPr>
       <w:r>
         <w:rPr>
@@ -1600,15 +1579,8 @@
     </w:p>
     <w:p>
       <w:pPr>
-        <w:spacing w:after="0" w:before="0"/>
-      </w:pPr>
-      <w:r>
-        <w:br w:type="page"/>
-      </w:r>
-    </w:p>
-    <w:p>
-      <w:pPr>
-        <w:spacing w:after="80" w:before="160"/>
+        <w:pageBreakBefore/>
+        <w:spacing w:after="80" w:before="120"/>
       </w:pPr>
       <w:r>
         <w:rPr>
@@ -1937,15 +1909,8 @@
     </w:p>
     <w:p>
       <w:pPr>
-        <w:spacing w:after="0" w:before="0"/>
-      </w:pPr>
-      <w:r>
-        <w:br w:type="page"/>
-      </w:r>
-    </w:p>
-    <w:p>
-      <w:pPr>
-        <w:spacing w:after="80" w:before="160"/>
+        <w:pageBreakBefore/>
+        <w:spacing w:after="80" w:before="120"/>
       </w:pPr>
       <w:r>
         <w:rPr>
@@ -2259,15 +2224,8 @@
     </w:p>
     <w:p>
       <w:pPr>
-        <w:spacing w:after="0" w:before="0"/>
-      </w:pPr>
-      <w:r>
-        <w:br w:type="page"/>
-      </w:r>
-    </w:p>
-    <w:p>
-      <w:pPr>
-        <w:spacing w:after="80" w:before="160"/>
+        <w:pageBreakBefore/>
+        <w:spacing w:after="80" w:before="120"/>
       </w:pPr>
       <w:r>
         <w:rPr>
@@ -2581,15 +2539,8 @@
     </w:p>
     <w:p>
       <w:pPr>
-        <w:spacing w:after="0" w:before="0"/>
-      </w:pPr>
-      <w:r>
-        <w:br w:type="page"/>
-      </w:r>
-    </w:p>
-    <w:p>
-      <w:pPr>
-        <w:spacing w:after="80" w:before="160"/>
+        <w:pageBreakBefore/>
+        <w:spacing w:after="80" w:before="120"/>
       </w:pPr>
       <w:r>
         <w:rPr>
@@ -2918,15 +2869,8 @@
     </w:p>
     <w:p>
       <w:pPr>
-        <w:spacing w:after="0" w:before="0"/>
-      </w:pPr>
-      <w:r>
-        <w:br w:type="page"/>
-      </w:r>
-    </w:p>
-    <w:p>
-      <w:pPr>
-        <w:spacing w:after="80" w:before="160"/>
+        <w:pageBreakBefore/>
+        <w:spacing w:after="80" w:before="120"/>
       </w:pPr>
       <w:r>
         <w:rPr>
@@ -3240,15 +3184,8 @@
     </w:p>
     <w:p>
       <w:pPr>
-        <w:spacing w:after="0" w:before="0"/>
-      </w:pPr>
-      <w:r>
-        <w:br w:type="page"/>
-      </w:r>
-    </w:p>
-    <w:p>
-      <w:pPr>
-        <w:spacing w:after="80" w:before="160"/>
+        <w:pageBreakBefore/>
+        <w:spacing w:after="80" w:before="120"/>
       </w:pPr>
       <w:r>
         <w:rPr>
@@ -3592,15 +3529,8 @@
     </w:p>
     <w:p>
       <w:pPr>
-        <w:spacing w:after="0" w:before="0"/>
-      </w:pPr>
-      <w:r>
-        <w:br w:type="page"/>
-      </w:r>
-    </w:p>
-    <w:p>
-      <w:pPr>
-        <w:spacing w:after="80" w:before="160"/>
+        <w:pageBreakBefore/>
+        <w:spacing w:after="80" w:before="120"/>
       </w:pPr>
       <w:r>
         <w:rPr>
@@ -3899,15 +3829,8 @@
     </w:p>
     <w:p>
       <w:pPr>
-        <w:spacing w:after="0" w:before="0"/>
-      </w:pPr>
-      <w:r>
-        <w:br w:type="page"/>
-      </w:r>
-    </w:p>
-    <w:p>
-      <w:pPr>
-        <w:spacing w:after="80" w:before="160"/>
+        <w:pageBreakBefore/>
+        <w:spacing w:after="80" w:before="120"/>
       </w:pPr>
       <w:r>
         <w:rPr>
@@ -4221,15 +4144,8 @@
     </w:p>
     <w:p>
       <w:pPr>
-        <w:spacing w:after="0" w:before="0"/>
-      </w:pPr>
-      <w:r>
-        <w:br w:type="page"/>
-      </w:r>
-    </w:p>
-    <w:p>
-      <w:pPr>
-        <w:spacing w:after="80" w:before="160"/>
+        <w:pageBreakBefore/>
+        <w:spacing w:after="80" w:before="120"/>
       </w:pPr>
       <w:r>
         <w:rPr>
@@ -4513,15 +4429,8 @@
     </w:p>
     <w:p>
       <w:pPr>
-        <w:spacing w:after="0" w:before="0"/>
-      </w:pPr>
-      <w:r>
-        <w:br w:type="page"/>
-      </w:r>
-    </w:p>
-    <w:p>
-      <w:pPr>
-        <w:spacing w:after="80" w:before="160"/>
+        <w:pageBreakBefore/>
+        <w:spacing w:after="80" w:before="120"/>
       </w:pPr>
       <w:r>
         <w:rPr>
@@ -4805,15 +4714,8 @@
     </w:p>
     <w:p>
       <w:pPr>
-        <w:spacing w:after="0" w:before="0"/>
-      </w:pPr>
-      <w:r>
-        <w:br w:type="page"/>
-      </w:r>
-    </w:p>
-    <w:p>
-      <w:pPr>
-        <w:spacing w:after="80" w:before="160"/>
+        <w:pageBreakBefore/>
+        <w:spacing w:after="80" w:before="120"/>
       </w:pPr>
       <w:r>
         <w:rPr>
@@ -5159,15 +5061,8 @@
     </w:p>
     <w:p>
       <w:pPr>
-        <w:spacing w:after="0" w:before="0"/>
-      </w:pPr>
-      <w:r>
-        <w:br w:type="page"/>
-      </w:r>
-    </w:p>
-    <w:p>
-      <w:pPr>
-        <w:spacing w:after="200" w:before="160"/>
+        <w:pageBreakBefore/>
+        <w:spacing w:after="200" w:before="120"/>
       </w:pPr>
       <w:r>
         <w:rPr>
@@ -5399,15 +5294,8 @@
     </w:p>
     <w:p>
       <w:pPr>
-        <w:spacing w:after="0" w:before="0"/>
-      </w:pPr>
-      <w:r>
-        <w:br w:type="page"/>
-      </w:r>
-    </w:p>
-    <w:p>
-      <w:pPr>
-        <w:spacing w:after="200" w:before="160"/>
+        <w:pageBreakBefore/>
+        <w:spacing w:after="200" w:before="120"/>
       </w:pPr>
       <w:r>
         <w:rPr>
@@ -5453,15 +5341,8 @@
     </w:p>
     <w:p>
       <w:pPr>
-        <w:spacing w:after="0" w:before="0"/>
-      </w:pPr>
-      <w:r>
-        <w:br w:type="page"/>
-      </w:r>
-    </w:p>
-    <w:p>
-      <w:pPr>
-        <w:spacing w:after="200" w:before="160"/>
+        <w:pageBreakBefore/>
+        <w:spacing w:after="200" w:before="120"/>
       </w:pPr>
       <w:r>
         <w:rPr>
@@ -5536,15 +5417,8 @@
     </w:p>
     <w:p>
       <w:pPr>
-        <w:spacing w:after="0" w:before="0"/>
-      </w:pPr>
-      <w:r>
-        <w:br w:type="page"/>
-      </w:r>
-    </w:p>
-    <w:p>
-      <w:pPr>
-        <w:spacing w:after="200" w:before="160"/>
+        <w:pageBreakBefore/>
+        <w:spacing w:after="200" w:before="120"/>
       </w:pPr>
       <w:r>
         <w:rPr>
@@ -5650,15 +5524,8 @@
     </w:p>
     <w:p>
       <w:pPr>
-        <w:spacing w:after="0" w:before="0"/>
-      </w:pPr>
-      <w:r>
-        <w:br w:type="page"/>
-      </w:r>
-    </w:p>
-    <w:p>
-      <w:pPr>
-        <w:spacing w:after="200" w:before="160"/>
+        <w:pageBreakBefore/>
+        <w:spacing w:after="200" w:before="120"/>
       </w:pPr>
       <w:r>
         <w:rPr>

</xml_diff>

<commit_message>
Buch 4: Titelseite mit keepNext zusammengehalten, Leerseiten entfernt
</commit_message>
<xml_diff>
--- a/outputs/buch-schuldgefuehle/das-schlechte-gewissen-KDP.docx
+++ b/outputs/buch-schuldgefuehle/das-schlechte-gewissen-KDP.docx
@@ -4,12 +4,14 @@
   <w:body>
     <w:p>
       <w:pPr>
-        <w:spacing w:after="288" w:before="0"/>
-      </w:pPr>
-    </w:p>
-    <w:p>
-      <w:pPr>
-        <w:spacing w:after="200" w:before="0"/>
+        <w:keepNext/>
+        <w:spacing w:after="215" w:before="0"/>
+      </w:pPr>
+    </w:p>
+    <w:p>
+      <w:pPr>
+        <w:keepNext/>
+        <w:spacing w:after="180" w:before="0"/>
         <w:jc w:val="center"/>
       </w:pPr>
       <w:r>
@@ -26,7 +28,8 @@
     </w:p>
     <w:p>
       <w:pPr>
-        <w:spacing w:after="160" w:before="0"/>
+        <w:keepNext/>
+        <w:spacing w:after="140" w:before="0"/>
         <w:jc w:val="center"/>
       </w:pPr>
       <w:r>
@@ -43,7 +46,8 @@
     </w:p>
     <w:p>
       <w:pPr>
-        <w:spacing w:after="60" w:before="0"/>
+        <w:keepNext/>
+        <w:spacing w:after="40" w:before="0"/>
         <w:jc w:val="center"/>
       </w:pPr>
       <w:r>
@@ -60,7 +64,8 @@
     </w:p>
     <w:p>
       <w:pPr>
-        <w:spacing w:after="200" w:before="0"/>
+        <w:keepNext/>
+        <w:spacing w:after="180" w:before="0"/>
         <w:jc w:val="center"/>
       </w:pPr>
       <w:r>
@@ -77,6 +82,7 @@
     </w:p>
     <w:p>
       <w:pPr>
+        <w:keepNext/>
         <w:spacing w:after="0" w:before="0"/>
         <w:jc w:val="center"/>
       </w:pPr>

</xml_diff>

<commit_message>
Buch 4: Inhaltsverzeichnis hinzugefügt
</commit_message>
<xml_diff>
--- a/outputs/buch-schuldgefuehle/das-schlechte-gewissen-KDP.docx
+++ b/outputs/buch-schuldgefuehle/das-schlechte-gewissen-KDP.docx
@@ -150,6 +150,454 @@
       </w:pPr>
       <w:r>
         <w:br w:type="page"/>
+      </w:r>
+    </w:p>
+    <w:p>
+      <w:pPr>
+        <w:spacing w:after="360" w:before="120"/>
+      </w:pPr>
+      <w:r>
+        <w:rPr>
+          <w:rFonts w:ascii="Georgia" w:cs="Georgia" w:eastAsia="Georgia" w:hAnsi="Georgia"/>
+          <w:b/>
+          <w:bCs/>
+          <w:color w:val="2C2C2C"/>
+          <w:sz w:val="32"/>
+          <w:szCs w:val="32"/>
+        </w:rPr>
+        <w:t xml:space="preserve">Inhaltsverzeichnis</w:t>
+      </w:r>
+    </w:p>
+    <w:p>
+      <w:pPr>
+        <w:spacing w:after="60" w:before="60"/>
+        <w:ind/>
+      </w:pPr>
+      <w:r>
+        <w:rPr>
+          <w:rFonts w:ascii="Georgia" w:cs="Georgia" w:eastAsia="Georgia" w:hAnsi="Georgia"/>
+          <w:b/>
+          <w:bCs/>
+          <w:color w:val="2C2C2C"/>
+          <w:sz w:val="20"/>
+          <w:szCs w:val="20"/>
+        </w:rPr>
+        <w:t xml:space="preserve">Bevor wir anfangen</w:t>
+      </w:r>
+    </w:p>
+    <w:p>
+      <w:pPr>
+        <w:spacing w:after="60" w:before="60"/>
+        <w:ind w:left="0"/>
+      </w:pPr>
+      <w:r>
+        <w:rPr>
+          <w:rFonts w:ascii="Georgia" w:cs="Georgia" w:eastAsia="Georgia" w:hAnsi="Georgia"/>
+          <w:i/>
+          <w:iCs/>
+          <w:color w:val="C0848A"/>
+          <w:sz w:val="20"/>
+          <w:szCs w:val="20"/>
+        </w:rPr>
+        <w:t xml:space="preserve">Kapitel 1</w:t>
+      </w:r>
+      <w:r>
+        <w:rPr>
+          <w:rFonts w:ascii="Georgia" w:cs="Georgia" w:eastAsia="Georgia" w:hAnsi="Georgia"/>
+          <w:color w:val="2C2C2C"/>
+          <w:sz w:val="20"/>
+          <w:szCs w:val="20"/>
+        </w:rPr>
+        <w:t xml:space="preserve">  Das Gewissen, das nie schläft</w:t>
+      </w:r>
+    </w:p>
+    <w:p>
+      <w:pPr>
+        <w:spacing w:after="60" w:before="60"/>
+        <w:ind w:left="0"/>
+      </w:pPr>
+      <w:r>
+        <w:rPr>
+          <w:rFonts w:ascii="Georgia" w:cs="Georgia" w:eastAsia="Georgia" w:hAnsi="Georgia"/>
+          <w:i/>
+          <w:iCs/>
+          <w:color w:val="C0848A"/>
+          <w:sz w:val="20"/>
+          <w:szCs w:val="20"/>
+        </w:rPr>
+        <w:t xml:space="preserve">Kapitel 2</w:t>
+      </w:r>
+      <w:r>
+        <w:rPr>
+          <w:rFonts w:ascii="Georgia" w:cs="Georgia" w:eastAsia="Georgia" w:hAnsi="Georgia"/>
+          <w:color w:val="2C2C2C"/>
+          <w:sz w:val="20"/>
+          <w:szCs w:val="20"/>
+        </w:rPr>
+        <w:t xml:space="preserve">  Woher das kommt</w:t>
+      </w:r>
+    </w:p>
+    <w:p>
+      <w:pPr>
+        <w:spacing w:after="60" w:before="60"/>
+        <w:ind w:left="0"/>
+      </w:pPr>
+      <w:r>
+        <w:rPr>
+          <w:rFonts w:ascii="Georgia" w:cs="Georgia" w:eastAsia="Georgia" w:hAnsi="Georgia"/>
+          <w:i/>
+          <w:iCs/>
+          <w:color w:val="C0848A"/>
+          <w:sz w:val="20"/>
+          <w:szCs w:val="20"/>
+        </w:rPr>
+        <w:t xml:space="preserve">Kapitel 3</w:t>
+      </w:r>
+      <w:r>
+        <w:rPr>
+          <w:rFonts w:ascii="Georgia" w:cs="Georgia" w:eastAsia="Georgia" w:hAnsi="Georgia"/>
+          <w:color w:val="2C2C2C"/>
+          <w:sz w:val="20"/>
+          <w:szCs w:val="20"/>
+        </w:rPr>
+        <w:t xml:space="preserve">  Echte Schuld und falsches Gewissen</w:t>
+      </w:r>
+    </w:p>
+    <w:p>
+      <w:pPr>
+        <w:spacing w:after="60" w:before="60"/>
+        <w:ind w:left="0"/>
+      </w:pPr>
+      <w:r>
+        <w:rPr>
+          <w:rFonts w:ascii="Georgia" w:cs="Georgia" w:eastAsia="Georgia" w:hAnsi="Georgia"/>
+          <w:i/>
+          <w:iCs/>
+          <w:color w:val="C0848A"/>
+          <w:sz w:val="20"/>
+          <w:szCs w:val="20"/>
+        </w:rPr>
+        <w:t xml:space="preserve">Kapitel 4</w:t>
+      </w:r>
+      <w:r>
+        <w:rPr>
+          <w:rFonts w:ascii="Georgia" w:cs="Georgia" w:eastAsia="Georgia" w:hAnsi="Georgia"/>
+          <w:color w:val="2C2C2C"/>
+          <w:sz w:val="20"/>
+          <w:szCs w:val="20"/>
+        </w:rPr>
+        <w:t xml:space="preserve">  Das Gewissen in Beziehungen</w:t>
+      </w:r>
+    </w:p>
+    <w:p>
+      <w:pPr>
+        <w:spacing w:after="60" w:before="60"/>
+        <w:ind w:left="0"/>
+      </w:pPr>
+      <w:r>
+        <w:rPr>
+          <w:rFonts w:ascii="Georgia" w:cs="Georgia" w:eastAsia="Georgia" w:hAnsi="Georgia"/>
+          <w:i/>
+          <w:iCs/>
+          <w:color w:val="C0848A"/>
+          <w:sz w:val="20"/>
+          <w:szCs w:val="20"/>
+        </w:rPr>
+        <w:t xml:space="preserve">Kapitel 5</w:t>
+      </w:r>
+      <w:r>
+        <w:rPr>
+          <w:rFonts w:ascii="Georgia" w:cs="Georgia" w:eastAsia="Georgia" w:hAnsi="Georgia"/>
+          <w:color w:val="2C2C2C"/>
+          <w:sz w:val="20"/>
+          <w:szCs w:val="20"/>
+        </w:rPr>
+        <w:t xml:space="preserve">  Schuldgefühle als Mutter</w:t>
+      </w:r>
+    </w:p>
+    <w:p>
+      <w:pPr>
+        <w:spacing w:after="60" w:before="60"/>
+        <w:ind w:left="0"/>
+      </w:pPr>
+      <w:r>
+        <w:rPr>
+          <w:rFonts w:ascii="Georgia" w:cs="Georgia" w:eastAsia="Georgia" w:hAnsi="Georgia"/>
+          <w:i/>
+          <w:iCs/>
+          <w:color w:val="C0848A"/>
+          <w:sz w:val="20"/>
+          <w:szCs w:val="20"/>
+        </w:rPr>
+        <w:t xml:space="preserve">Kapitel 6</w:t>
+      </w:r>
+      <w:r>
+        <w:rPr>
+          <w:rFonts w:ascii="Georgia" w:cs="Georgia" w:eastAsia="Georgia" w:hAnsi="Georgia"/>
+          <w:color w:val="2C2C2C"/>
+          <w:sz w:val="20"/>
+          <w:szCs w:val="20"/>
+        </w:rPr>
+        <w:t xml:space="preserve">  Wenn die Familie das Gewissen benutzt</w:t>
+      </w:r>
+    </w:p>
+    <w:p>
+      <w:pPr>
+        <w:spacing w:after="60" w:before="60"/>
+        <w:ind w:left="0"/>
+      </w:pPr>
+      <w:r>
+        <w:rPr>
+          <w:rFonts w:ascii="Georgia" w:cs="Georgia" w:eastAsia="Georgia" w:hAnsi="Georgia"/>
+          <w:i/>
+          <w:iCs/>
+          <w:color w:val="C0848A"/>
+          <w:sz w:val="20"/>
+          <w:szCs w:val="20"/>
+        </w:rPr>
+        <w:t xml:space="preserve">Kapitel 7</w:t>
+      </w:r>
+      <w:r>
+        <w:rPr>
+          <w:rFonts w:ascii="Georgia" w:cs="Georgia" w:eastAsia="Georgia" w:hAnsi="Georgia"/>
+          <w:color w:val="2C2C2C"/>
+          <w:sz w:val="20"/>
+          <w:szCs w:val="20"/>
+        </w:rPr>
+        <w:t xml:space="preserve">  Nein sagen und trotzdem schlafen</w:t>
+      </w:r>
+    </w:p>
+    <w:p>
+      <w:pPr>
+        <w:spacing w:after="60" w:before="60"/>
+        <w:ind w:left="0"/>
+      </w:pPr>
+      <w:r>
+        <w:rPr>
+          <w:rFonts w:ascii="Georgia" w:cs="Georgia" w:eastAsia="Georgia" w:hAnsi="Georgia"/>
+          <w:i/>
+          <w:iCs/>
+          <w:color w:val="C0848A"/>
+          <w:sz w:val="20"/>
+          <w:szCs w:val="20"/>
+        </w:rPr>
+        <w:t xml:space="preserve">Kapitel 8</w:t>
+      </w:r>
+      <w:r>
+        <w:rPr>
+          <w:rFonts w:ascii="Georgia" w:cs="Georgia" w:eastAsia="Georgia" w:hAnsi="Georgia"/>
+          <w:color w:val="2C2C2C"/>
+          <w:sz w:val="20"/>
+          <w:szCs w:val="20"/>
+        </w:rPr>
+        <w:t xml:space="preserve">  Der Körper führt Buch</w:t>
+      </w:r>
+    </w:p>
+    <w:p>
+      <w:pPr>
+        <w:spacing w:after="60" w:before="60"/>
+        <w:ind w:left="0"/>
+      </w:pPr>
+      <w:r>
+        <w:rPr>
+          <w:rFonts w:ascii="Georgia" w:cs="Georgia" w:eastAsia="Georgia" w:hAnsi="Georgia"/>
+          <w:i/>
+          <w:iCs/>
+          <w:color w:val="C0848A"/>
+          <w:sz w:val="20"/>
+          <w:szCs w:val="20"/>
+        </w:rPr>
+        <w:t xml:space="preserve">Kapitel 9</w:t>
+      </w:r>
+      <w:r>
+        <w:rPr>
+          <w:rFonts w:ascii="Georgia" w:cs="Georgia" w:eastAsia="Georgia" w:hAnsi="Georgia"/>
+          <w:color w:val="2C2C2C"/>
+          <w:sz w:val="20"/>
+          <w:szCs w:val="20"/>
+        </w:rPr>
+        <w:t xml:space="preserve">  Schuldgefühle und Wut</w:t>
+      </w:r>
+    </w:p>
+    <w:p>
+      <w:pPr>
+        <w:spacing w:after="60" w:before="60"/>
+        <w:ind w:left="0"/>
+      </w:pPr>
+      <w:r>
+        <w:rPr>
+          <w:rFonts w:ascii="Georgia" w:cs="Georgia" w:eastAsia="Georgia" w:hAnsi="Georgia"/>
+          <w:i/>
+          <w:iCs/>
+          <w:color w:val="C0848A"/>
+          <w:sz w:val="20"/>
+          <w:szCs w:val="20"/>
+        </w:rPr>
+        <w:t xml:space="preserve">Kapitel 10</w:t>
+      </w:r>
+      <w:r>
+        <w:rPr>
+          <w:rFonts w:ascii="Georgia" w:cs="Georgia" w:eastAsia="Georgia" w:hAnsi="Georgia"/>
+          <w:color w:val="2C2C2C"/>
+          <w:sz w:val="20"/>
+          <w:szCs w:val="20"/>
+        </w:rPr>
+        <w:t xml:space="preserve">  Perfektion als Schutz</w:t>
+      </w:r>
+    </w:p>
+    <w:p>
+      <w:pPr>
+        <w:spacing w:after="60" w:before="60"/>
+        <w:ind w:left="0"/>
+      </w:pPr>
+      <w:r>
+        <w:rPr>
+          <w:rFonts w:ascii="Georgia" w:cs="Georgia" w:eastAsia="Georgia" w:hAnsi="Georgia"/>
+          <w:i/>
+          <w:iCs/>
+          <w:color w:val="C0848A"/>
+          <w:sz w:val="20"/>
+          <w:szCs w:val="20"/>
+        </w:rPr>
+        <w:t xml:space="preserve">Kapitel 11</w:t>
+      </w:r>
+      <w:r>
+        <w:rPr>
+          <w:rFonts w:ascii="Georgia" w:cs="Georgia" w:eastAsia="Georgia" w:hAnsi="Georgia"/>
+          <w:color w:val="2C2C2C"/>
+          <w:sz w:val="20"/>
+          <w:szCs w:val="20"/>
+        </w:rPr>
+        <w:t xml:space="preserve">  Verantwortung ja, Schuld nein</w:t>
+      </w:r>
+    </w:p>
+    <w:p>
+      <w:pPr>
+        <w:spacing w:after="60" w:before="60"/>
+        <w:ind w:left="0"/>
+      </w:pPr>
+      <w:r>
+        <w:rPr>
+          <w:rFonts w:ascii="Georgia" w:cs="Georgia" w:eastAsia="Georgia" w:hAnsi="Georgia"/>
+          <w:i/>
+          <w:iCs/>
+          <w:color w:val="C0848A"/>
+          <w:sz w:val="20"/>
+          <w:szCs w:val="20"/>
+        </w:rPr>
+        <w:t xml:space="preserve">Kapitel 12</w:t>
+      </w:r>
+      <w:r>
+        <w:rPr>
+          <w:rFonts w:ascii="Georgia" w:cs="Georgia" w:eastAsia="Georgia" w:hAnsi="Georgia"/>
+          <w:color w:val="2C2C2C"/>
+          <w:sz w:val="20"/>
+          <w:szCs w:val="20"/>
+        </w:rPr>
+        <w:t xml:space="preserve">  Was du dir selbst schuldest</w:t>
+      </w:r>
+    </w:p>
+    <w:p>
+      <w:pPr>
+        <w:spacing w:after="60" w:before="60"/>
+        <w:ind w:left="0"/>
+      </w:pPr>
+      <w:r>
+        <w:rPr>
+          <w:rFonts w:ascii="Georgia" w:cs="Georgia" w:eastAsia="Georgia" w:hAnsi="Georgia"/>
+          <w:i/>
+          <w:iCs/>
+          <w:color w:val="C0848A"/>
+          <w:sz w:val="20"/>
+          <w:szCs w:val="20"/>
+        </w:rPr>
+        <w:t xml:space="preserve">Kapitel 13</w:t>
+      </w:r>
+      <w:r>
+        <w:rPr>
+          <w:rFonts w:ascii="Georgia" w:cs="Georgia" w:eastAsia="Georgia" w:hAnsi="Georgia"/>
+          <w:color w:val="2C2C2C"/>
+          <w:sz w:val="20"/>
+          <w:szCs w:val="20"/>
+        </w:rPr>
+        <w:t xml:space="preserve">  Sich selbst vergeben</w:t>
+      </w:r>
+    </w:p>
+    <w:p>
+      <w:pPr>
+        <w:spacing w:after="60" w:before="60"/>
+        <w:ind w:left="0"/>
+      </w:pPr>
+      <w:r>
+        <w:rPr>
+          <w:rFonts w:ascii="Georgia" w:cs="Georgia" w:eastAsia="Georgia" w:hAnsi="Georgia"/>
+          <w:i/>
+          <w:iCs/>
+          <w:color w:val="C0848A"/>
+          <w:sz w:val="20"/>
+          <w:szCs w:val="20"/>
+        </w:rPr>
+        <w:t xml:space="preserve">Kapitel 14</w:t>
+      </w:r>
+      <w:r>
+        <w:rPr>
+          <w:rFonts w:ascii="Georgia" w:cs="Georgia" w:eastAsia="Georgia" w:hAnsi="Georgia"/>
+          <w:color w:val="2C2C2C"/>
+          <w:sz w:val="20"/>
+          <w:szCs w:val="20"/>
+        </w:rPr>
+        <w:t xml:space="preserve">  Ein Leben ohne das schlechte Gewissen als Dauergast</w:t>
+      </w:r>
+    </w:p>
+    <w:p>
+      <w:pPr>
+        <w:spacing w:after="60" w:before="60"/>
+        <w:ind/>
+      </w:pPr>
+      <w:r>
+        <w:rPr>
+          <w:rFonts w:ascii="Georgia" w:cs="Georgia" w:eastAsia="Georgia" w:hAnsi="Georgia"/>
+          <w:b/>
+          <w:bCs/>
+          <w:color w:val="2C2C2C"/>
+          <w:sz w:val="20"/>
+          <w:szCs w:val="20"/>
+        </w:rPr>
+        <w:t xml:space="preserve">Ein Brief an dich</w:t>
+      </w:r>
+    </w:p>
+    <w:p>
+      <w:pPr>
+        <w:spacing w:after="60" w:before="60"/>
+        <w:ind/>
+      </w:pPr>
+      <w:r>
+        <w:rPr>
+          <w:rFonts w:ascii="Georgia" w:cs="Georgia" w:eastAsia="Georgia" w:hAnsi="Georgia"/>
+          <w:b/>
+          <w:bCs/>
+          <w:color w:val="2C2C2C"/>
+          <w:sz w:val="20"/>
+          <w:szCs w:val="20"/>
+        </w:rPr>
+        <w:t xml:space="preserve">Danksagung</w:t>
+      </w:r>
+    </w:p>
+    <w:p>
+      <w:pPr>
+        <w:spacing w:after="60" w:before="60"/>
+        <w:ind/>
+      </w:pPr>
+      <w:r>
+        <w:rPr>
+          <w:rFonts w:ascii="Georgia" w:cs="Georgia" w:eastAsia="Georgia" w:hAnsi="Georgia"/>
+          <w:b/>
+          <w:bCs/>
+          <w:color w:val="2C2C2C"/>
+          <w:sz w:val="20"/>
+          <w:szCs w:val="20"/>
+        </w:rPr>
+        <w:t xml:space="preserve">Über die Autorin</w:t>
       </w:r>
     </w:p>
     <w:p>

</xml_diff>